<commit_message>
Add gold contract template
</commit_message>
<xml_diff>
--- a/public/files/contract_gold_template.docx
+++ b/public/files/contract_gold_template.docx
@@ -154,33 +154,7 @@
           <w:color w:val="000000" w:themeColor="text1"/>
           <w:lang w:val="en-GB"/>
         </w:rPr>
-        <w:t>${</w:t>
-      </w:r>
-      <w:proofErr w:type="spellStart"/>
-      <w:r>
-        <w:rPr>
-          <w:rFonts w:ascii="Times New Roman" w:eastAsia="Times New Roman" w:hAnsi="Times New Roman" w:cs="Times New Roman"/>
-          <w:b/>
-          <w:bCs/>
-          <w:i/>
-          <w:iCs/>
-          <w:color w:val="000000" w:themeColor="text1"/>
-          <w:lang w:val="en-GB"/>
-        </w:rPr>
-        <w:t>num</w:t>
-      </w:r>
-      <w:proofErr w:type="spellEnd"/>
-      <w:r>
-        <w:rPr>
-          <w:rFonts w:ascii="Times New Roman" w:eastAsia="Times New Roman" w:hAnsi="Times New Roman" w:cs="Times New Roman"/>
-          <w:b/>
-          <w:bCs/>
-          <w:i/>
-          <w:iCs/>
-          <w:color w:val="000000" w:themeColor="text1"/>
-          <w:lang w:val="en-GB"/>
-        </w:rPr>
-        <w:t>}</w:t>
+        <w:t>${num}</w:t>
       </w:r>
     </w:p>
     <w:tbl>
@@ -397,86 +371,8 @@
           <w:szCs w:val="18"/>
           <w:lang w:val="en-GB"/>
         </w:rPr>
-        <w:t xml:space="preserve">53 </w:t>
-      </w:r>
-      <w:proofErr w:type="spellStart"/>
-      <w:r>
-        <w:rPr>
-          <w:rFonts w:ascii="Times New Roman" w:eastAsia="Times New Roman" w:hAnsi="Times New Roman" w:cs="Times New Roman"/>
-          <w:color w:val="000000" w:themeColor="text1"/>
-          <w:sz w:val="18"/>
-          <w:szCs w:val="18"/>
-          <w:lang w:val="en-GB"/>
-        </w:rPr>
-        <w:t>շենք</w:t>
-      </w:r>
-      <w:proofErr w:type="spellEnd"/>
-      <w:r>
-        <w:rPr>
-          <w:rFonts w:ascii="Times New Roman" w:eastAsia="Times New Roman" w:hAnsi="Times New Roman" w:cs="Times New Roman"/>
-          <w:color w:val="000000" w:themeColor="text1"/>
-          <w:sz w:val="18"/>
-          <w:szCs w:val="18"/>
-          <w:lang w:val="en-GB"/>
-        </w:rPr>
-        <w:t xml:space="preserve">, 35 </w:t>
-      </w:r>
-      <w:proofErr w:type="spellStart"/>
-      <w:r>
-        <w:rPr>
-          <w:rFonts w:ascii="Times New Roman" w:eastAsia="Times New Roman" w:hAnsi="Times New Roman" w:cs="Times New Roman"/>
-          <w:color w:val="000000" w:themeColor="text1"/>
-          <w:sz w:val="18"/>
-          <w:szCs w:val="18"/>
-          <w:lang w:val="en-GB"/>
-        </w:rPr>
-        <w:t>ոչ</w:t>
-      </w:r>
-      <w:proofErr w:type="spellEnd"/>
-      <w:r>
-        <w:rPr>
-          <w:rFonts w:ascii="Times New Roman" w:eastAsia="Times New Roman" w:hAnsi="Times New Roman" w:cs="Times New Roman"/>
-          <w:color w:val="000000" w:themeColor="text1"/>
-          <w:sz w:val="18"/>
-          <w:szCs w:val="18"/>
-          <w:lang w:val="en-GB"/>
-        </w:rPr>
-        <w:t xml:space="preserve"> </w:t>
-      </w:r>
-      <w:proofErr w:type="spellStart"/>
-      <w:r>
-        <w:rPr>
-          <w:rFonts w:ascii="Times New Roman" w:eastAsia="Times New Roman" w:hAnsi="Times New Roman" w:cs="Times New Roman"/>
-          <w:color w:val="000000" w:themeColor="text1"/>
-          <w:sz w:val="18"/>
-          <w:szCs w:val="18"/>
-          <w:lang w:val="en-GB"/>
-        </w:rPr>
-        <w:t>բնակելի</w:t>
-      </w:r>
-      <w:proofErr w:type="spellEnd"/>
-      <w:r>
-        <w:rPr>
-          <w:rFonts w:ascii="Times New Roman" w:eastAsia="Times New Roman" w:hAnsi="Times New Roman" w:cs="Times New Roman"/>
-          <w:color w:val="000000" w:themeColor="text1"/>
-          <w:sz w:val="18"/>
-          <w:szCs w:val="18"/>
-          <w:lang w:val="en-GB"/>
-        </w:rPr>
-        <w:t xml:space="preserve"> </w:t>
-      </w:r>
-      <w:proofErr w:type="spellStart"/>
-      <w:r>
-        <w:rPr>
-          <w:rFonts w:ascii="Times New Roman" w:eastAsia="Times New Roman" w:hAnsi="Times New Roman" w:cs="Times New Roman"/>
-          <w:color w:val="000000" w:themeColor="text1"/>
-          <w:sz w:val="18"/>
-          <w:szCs w:val="18"/>
-          <w:lang w:val="en-GB"/>
-        </w:rPr>
-        <w:t>տարածք</w:t>
-      </w:r>
-      <w:proofErr w:type="spellEnd"/>
+        <w:t>53 շենք, 35 ոչ բնակելի տարածք</w:t>
+      </w:r>
       <w:r>
         <w:rPr>
           <w:rFonts w:ascii="Times New Roman" w:eastAsia="Times New Roman" w:hAnsi="Times New Roman" w:cs="Times New Roman"/>
@@ -1402,9 +1298,8 @@
                 <w:szCs w:val="16"/>
                 <w:lang w:val="en-GB"/>
               </w:rPr>
-              <w:t>${</w:t>
-            </w:r>
-            <w:proofErr w:type="spellStart"/>
+              <w:t>${contra</w:t>
+            </w:r>
             <w:r>
               <w:rPr>
                 <w:rFonts w:ascii="Times New Roman" w:hAnsi="Times New Roman" w:cs="Times New Roman"/>
@@ -1414,7 +1309,7 @@
                 <w:szCs w:val="16"/>
                 <w:lang w:val="en-GB"/>
               </w:rPr>
-              <w:t>contra</w:t>
+              <w:t>c</w:t>
             </w:r>
             <w:r>
               <w:rPr>
@@ -1425,30 +1320,7 @@
                 <w:szCs w:val="16"/>
                 <w:lang w:val="en-GB"/>
               </w:rPr>
-              <w:t>c</w:t>
-            </w:r>
-            <w:r>
-              <w:rPr>
-                <w:rFonts w:ascii="Times New Roman" w:hAnsi="Times New Roman" w:cs="Times New Roman"/>
-                <w:b/>
-                <w:i/>
-                <w:sz w:val="16"/>
-                <w:szCs w:val="16"/>
-                <w:lang w:val="en-GB"/>
-              </w:rPr>
-              <w:t>t_amount</w:t>
-            </w:r>
-            <w:proofErr w:type="spellEnd"/>
-            <w:r>
-              <w:rPr>
-                <w:rFonts w:ascii="Times New Roman" w:hAnsi="Times New Roman" w:cs="Times New Roman"/>
-                <w:b/>
-                <w:i/>
-                <w:sz w:val="16"/>
-                <w:szCs w:val="16"/>
-                <w:lang w:val="en-GB"/>
-              </w:rPr>
-              <w:t>}</w:t>
+              <w:t>t_amount}</w:t>
             </w:r>
             <w:r>
               <w:rPr>
@@ -1659,31 +1531,7 @@
                 <w:szCs w:val="16"/>
                 <w:lang w:val="en-GB"/>
               </w:rPr>
-              <w:t>${</w:t>
-            </w:r>
-            <w:proofErr w:type="spellStart"/>
-            <w:r>
-              <w:rPr>
-                <w:rFonts w:ascii="Times New Roman" w:hAnsi="Times New Roman" w:cs="Times New Roman"/>
-                <w:b/>
-                <w:i/>
-                <w:sz w:val="16"/>
-                <w:szCs w:val="16"/>
-                <w:lang w:val="en-GB"/>
-              </w:rPr>
-              <w:t>effective_annual_rate</w:t>
-            </w:r>
-            <w:proofErr w:type="spellEnd"/>
-            <w:r>
-              <w:rPr>
-                <w:rFonts w:ascii="Times New Roman" w:hAnsi="Times New Roman" w:cs="Times New Roman"/>
-                <w:b/>
-                <w:i/>
-                <w:sz w:val="16"/>
-                <w:szCs w:val="16"/>
-                <w:lang w:val="en-GB"/>
-              </w:rPr>
-              <w:t>}</w:t>
+              <w:t>${effective_annual_rate}</w:t>
             </w:r>
           </w:p>
         </w:tc>
@@ -3061,9 +2909,8 @@
                 <w:szCs w:val="16"/>
                 <w:lang w:val="en-GB"/>
               </w:rPr>
-              <w:t>${</w:t>
-            </w:r>
-            <w:proofErr w:type="spellStart"/>
+              <w:t>${mother_amount}</w:t>
+            </w:r>
             <w:r>
               <w:rPr>
                 <w:rFonts w:ascii="Times New Roman" w:hAnsi="Times New Roman" w:cs="Times New Roman"/>
@@ -3073,19 +2920,7 @@
                 <w:szCs w:val="16"/>
                 <w:lang w:val="en-GB"/>
               </w:rPr>
-              <w:t>mother_amount</w:t>
-            </w:r>
-            <w:proofErr w:type="spellEnd"/>
-            <w:r>
-              <w:rPr>
-                <w:rFonts w:ascii="Times New Roman" w:hAnsi="Times New Roman" w:cs="Times New Roman"/>
-                <w:bCs/>
-                <w:iCs/>
-                <w:sz w:val="16"/>
-                <w:szCs w:val="16"/>
-                <w:lang w:val="en-GB"/>
-              </w:rPr>
-              <w:t xml:space="preserve">} </w:t>
+              <w:t xml:space="preserve"> </w:t>
             </w:r>
             <w:r>
               <w:rPr>
@@ -7373,7 +7208,6 @@
                 <w:lang w:val="en-GB"/>
               </w:rPr>
             </w:pPr>
-            <w:proofErr w:type="spellStart"/>
             <w:r>
               <w:rPr>
                 <w:rFonts w:ascii="Times New Roman" w:hAnsi="Times New Roman" w:cs="Times New Roman"/>
@@ -7383,9 +7217,8 @@
                 <w:szCs w:val="18"/>
                 <w:lang w:val="en-GB"/>
               </w:rPr>
-              <w:t>Քարտի</w:t>
-            </w:r>
-            <w:proofErr w:type="spellEnd"/>
+              <w:t xml:space="preserve">Քարտի համար՝ </w:t>
+            </w:r>
             <w:r>
               <w:rPr>
                 <w:rFonts w:ascii="Times New Roman" w:hAnsi="Times New Roman" w:cs="Times New Roman"/>
@@ -7395,66 +7228,7 @@
                 <w:szCs w:val="18"/>
                 <w:lang w:val="en-GB"/>
               </w:rPr>
-              <w:t xml:space="preserve"> </w:t>
-            </w:r>
-            <w:proofErr w:type="spellStart"/>
-            <w:r>
-              <w:rPr>
-                <w:rFonts w:ascii="Times New Roman" w:hAnsi="Times New Roman" w:cs="Times New Roman"/>
-                <w:b/>
-                <w:bCs/>
-                <w:sz w:val="18"/>
-                <w:szCs w:val="18"/>
-                <w:lang w:val="en-GB"/>
-              </w:rPr>
-              <w:t>համար</w:t>
-            </w:r>
-            <w:proofErr w:type="spellEnd"/>
-            <w:r>
-              <w:rPr>
-                <w:rFonts w:ascii="Times New Roman" w:hAnsi="Times New Roman" w:cs="Times New Roman"/>
-                <w:b/>
-                <w:bCs/>
-                <w:sz w:val="18"/>
-                <w:szCs w:val="18"/>
-                <w:lang w:val="en-GB"/>
-              </w:rPr>
-              <w:t xml:space="preserve">՝ </w:t>
-            </w:r>
-            <w:r>
-              <w:rPr>
-                <w:rFonts w:ascii="Times New Roman" w:hAnsi="Times New Roman" w:cs="Times New Roman"/>
-                <w:b/>
-                <w:bCs/>
-                <w:sz w:val="18"/>
-                <w:szCs w:val="18"/>
-                <w:lang w:val="en-GB"/>
-              </w:rPr>
-              <w:t>${</w:t>
-            </w:r>
-            <w:proofErr w:type="spellStart"/>
-            <w:r>
-              <w:rPr>
-                <w:rFonts w:ascii="Times New Roman" w:hAnsi="Times New Roman" w:cs="Times New Roman"/>
-                <w:b/>
-                <w:bCs/>
-                <w:sz w:val="18"/>
-                <w:szCs w:val="18"/>
-                <w:lang w:val="en-GB"/>
-              </w:rPr>
-              <w:t>card_number</w:t>
-            </w:r>
-            <w:proofErr w:type="spellEnd"/>
-            <w:r>
-              <w:rPr>
-                <w:rFonts w:ascii="Times New Roman" w:hAnsi="Times New Roman" w:cs="Times New Roman"/>
-                <w:b/>
-                <w:bCs/>
-                <w:sz w:val="18"/>
-                <w:szCs w:val="18"/>
-                <w:lang w:val="en-GB"/>
-              </w:rPr>
-              <w:t>}</w:t>
+              <w:t>${card_number}</w:t>
             </w:r>
           </w:p>
           <w:p>
@@ -8055,7 +7829,6 @@
           <w:lang w:val="en-GB"/>
         </w:rPr>
       </w:pPr>
-      <w:proofErr w:type="spellStart"/>
       <w:r>
         <w:rPr>
           <w:rFonts w:ascii="Times New Roman" w:eastAsia="Times New Roman" w:hAnsi="Times New Roman" w:cs="Times New Roman"/>
@@ -8066,10 +7839,13 @@
           <w:szCs w:val="13"/>
           <w:lang w:val="en-GB"/>
         </w:rPr>
-        <w:t>Վարկային</w:t>
-      </w:r>
-      <w:proofErr w:type="spellEnd"/>
-      <w:r>
+        <w:t xml:space="preserve">Վարկային կոդ՝ </w:t>
+      </w:r>
+    </w:p>
+    <w:p>
+      <w:pPr>
+        <w:spacing w:after="0" w:line="276" w:lineRule="auto"/>
+        <w:jc w:val="right"/>
         <w:rPr>
           <w:rFonts w:ascii="Times New Roman" w:eastAsia="Times New Roman" w:hAnsi="Times New Roman" w:cs="Times New Roman"/>
           <w:i/>
@@ -8079,9 +7855,7 @@
           <w:szCs w:val="13"/>
           <w:lang w:val="en-GB"/>
         </w:rPr>
-        <w:t xml:space="preserve"> </w:t>
-      </w:r>
-      <w:proofErr w:type="spellStart"/>
+      </w:pPr>
       <w:r>
         <w:rPr>
           <w:rFonts w:ascii="Times New Roman" w:eastAsia="Times New Roman" w:hAnsi="Times New Roman" w:cs="Times New Roman"/>
@@ -8090,11 +7864,10 @@
           <w:color w:val="000000" w:themeColor="text1"/>
           <w:sz w:val="18"/>
           <w:szCs w:val="13"/>
-          <w:lang w:val="en-GB"/>
-        </w:rPr>
-        <w:t>կոդ</w:t>
-      </w:r>
-      <w:proofErr w:type="spellEnd"/>
+          <w:lang w:val="hy-AM"/>
+        </w:rPr>
+        <w:t xml:space="preserve">Վարկային և ոսկյա իրերի գրավի խառը պայմանագիր </w:t>
+      </w:r>
       <w:r>
         <w:rPr>
           <w:rFonts w:ascii="Times New Roman" w:eastAsia="Times New Roman" w:hAnsi="Times New Roman" w:cs="Times New Roman"/>
@@ -8103,15 +7876,11 @@
           <w:color w:val="000000" w:themeColor="text1"/>
           <w:sz w:val="18"/>
           <w:szCs w:val="13"/>
-          <w:lang w:val="en-GB"/>
-        </w:rPr>
-        <w:t xml:space="preserve">՝ </w:t>
-      </w:r>
-    </w:p>
-    <w:p>
-      <w:pPr>
-        <w:spacing w:after="0" w:line="276" w:lineRule="auto"/>
-        <w:jc w:val="right"/>
+          <w:lang w:val="hy-AM"/>
+        </w:rPr>
+        <w:t xml:space="preserve">№ </w:t>
+      </w:r>
+      <w:r>
         <w:rPr>
           <w:rFonts w:ascii="Times New Roman" w:eastAsia="Times New Roman" w:hAnsi="Times New Roman" w:cs="Times New Roman"/>
           <w:i/>
@@ -8121,68 +7890,7 @@
           <w:szCs w:val="13"/>
           <w:lang w:val="en-GB"/>
         </w:rPr>
-      </w:pPr>
-      <w:r>
-        <w:rPr>
-          <w:rFonts w:ascii="Times New Roman" w:eastAsia="Times New Roman" w:hAnsi="Times New Roman" w:cs="Times New Roman"/>
-          <w:i/>
-          <w:iCs/>
-          <w:color w:val="000000" w:themeColor="text1"/>
-          <w:sz w:val="18"/>
-          <w:szCs w:val="13"/>
-          <w:lang w:val="hy-AM"/>
-        </w:rPr>
-        <w:t xml:space="preserve">Վարկային և ոսկյա իրերի գրավի խառը պայմանագիր </w:t>
-      </w:r>
-      <w:r>
-        <w:rPr>
-          <w:rFonts w:ascii="Times New Roman" w:eastAsia="Times New Roman" w:hAnsi="Times New Roman" w:cs="Times New Roman"/>
-          <w:i/>
-          <w:iCs/>
-          <w:color w:val="000000" w:themeColor="text1"/>
-          <w:sz w:val="18"/>
-          <w:szCs w:val="13"/>
-          <w:lang w:val="hy-AM"/>
-        </w:rPr>
-        <w:t xml:space="preserve">№ </w:t>
-      </w:r>
-      <w:r>
-        <w:rPr>
-          <w:rFonts w:ascii="Times New Roman" w:eastAsia="Times New Roman" w:hAnsi="Times New Roman" w:cs="Times New Roman"/>
-          <w:i/>
-          <w:iCs/>
-          <w:color w:val="000000" w:themeColor="text1"/>
-          <w:sz w:val="18"/>
-          <w:szCs w:val="13"/>
-          <w:lang w:val="en-GB"/>
-        </w:rPr>
-        <w:t>${</w:t>
-      </w:r>
-      <w:proofErr w:type="spellStart"/>
-      <w:r>
-        <w:rPr>
-          <w:rFonts w:ascii="Times New Roman" w:eastAsia="Times New Roman" w:hAnsi="Times New Roman" w:cs="Times New Roman"/>
-          <w:i/>
-          <w:iCs/>
-          <w:color w:val="000000" w:themeColor="text1"/>
-          <w:sz w:val="18"/>
-          <w:szCs w:val="13"/>
-          <w:lang w:val="en-GB"/>
-        </w:rPr>
-        <w:t>num</w:t>
-      </w:r>
-      <w:proofErr w:type="spellEnd"/>
-      <w:r>
-        <w:rPr>
-          <w:rFonts w:ascii="Times New Roman" w:eastAsia="Times New Roman" w:hAnsi="Times New Roman" w:cs="Times New Roman"/>
-          <w:i/>
-          <w:iCs/>
-          <w:color w:val="000000" w:themeColor="text1"/>
-          <w:sz w:val="18"/>
-          <w:szCs w:val="13"/>
-          <w:lang w:val="en-GB"/>
-        </w:rPr>
-        <w:t>}</w:t>
+        <w:t>${num}</w:t>
       </w:r>
     </w:p>
     <w:p>
@@ -8727,7 +8435,6 @@
           <w:lang w:val="en-GB"/>
         </w:rPr>
       </w:pPr>
-      <w:proofErr w:type="spellStart"/>
       <w:r>
         <w:rPr>
           <w:rFonts w:ascii="Times New Roman" w:eastAsia="Times New Roman" w:hAnsi="Times New Roman" w:cs="Times New Roman"/>
@@ -8738,46 +8445,7 @@
           <w:szCs w:val="13"/>
           <w:lang w:val="en-GB"/>
         </w:rPr>
-        <w:t>Վարկային</w:t>
-      </w:r>
-      <w:proofErr w:type="spellEnd"/>
-      <w:r>
-        <w:rPr>
-          <w:rFonts w:ascii="Times New Roman" w:eastAsia="Times New Roman" w:hAnsi="Times New Roman" w:cs="Times New Roman"/>
-          <w:i/>
-          <w:iCs/>
-          <w:color w:val="000000" w:themeColor="text1"/>
-          <w:sz w:val="18"/>
-          <w:szCs w:val="13"/>
-          <w:lang w:val="en-GB"/>
-        </w:rPr>
-        <w:t xml:space="preserve"> </w:t>
-      </w:r>
-      <w:proofErr w:type="spellStart"/>
-      <w:r>
-        <w:rPr>
-          <w:rFonts w:ascii="Times New Roman" w:eastAsia="Times New Roman" w:hAnsi="Times New Roman" w:cs="Times New Roman"/>
-          <w:i/>
-          <w:iCs/>
-          <w:color w:val="000000" w:themeColor="text1"/>
-          <w:sz w:val="18"/>
-          <w:szCs w:val="13"/>
-          <w:lang w:val="en-GB"/>
-        </w:rPr>
-        <w:t>կոդ</w:t>
-      </w:r>
-      <w:proofErr w:type="spellEnd"/>
-      <w:r>
-        <w:rPr>
-          <w:rFonts w:ascii="Times New Roman" w:eastAsia="Times New Roman" w:hAnsi="Times New Roman" w:cs="Times New Roman"/>
-          <w:i/>
-          <w:iCs/>
-          <w:color w:val="000000" w:themeColor="text1"/>
-          <w:sz w:val="18"/>
-          <w:szCs w:val="13"/>
-          <w:lang w:val="en-GB"/>
-        </w:rPr>
-        <w:t>՝</w:t>
+        <w:t>Վարկային կոդ՝</w:t>
       </w:r>
     </w:p>
     <w:p>
@@ -8946,45 +8614,8 @@
                 <w:highlight w:val="yellow"/>
                 <w:lang w:val="en-GB"/>
               </w:rPr>
-              <w:t xml:space="preserve">2026 </w:t>
-            </w:r>
-            <w:proofErr w:type="spellStart"/>
-            <w:r>
-              <w:rPr>
-                <w:rFonts w:ascii="Times New Roman" w:eastAsia="Times New Roman" w:hAnsi="Times New Roman" w:cs="Times New Roman"/>
-                <w:color w:val="000000" w:themeColor="text1"/>
-                <w:sz w:val="18"/>
-                <w:szCs w:val="18"/>
-                <w:highlight w:val="yellow"/>
-                <w:lang w:val="en-GB"/>
-              </w:rPr>
-              <w:t>թվականի</w:t>
-            </w:r>
-            <w:proofErr w:type="spellEnd"/>
-            <w:r>
-              <w:rPr>
-                <w:rFonts w:ascii="Times New Roman" w:eastAsia="Times New Roman" w:hAnsi="Times New Roman" w:cs="Times New Roman"/>
-                <w:color w:val="000000" w:themeColor="text1"/>
-                <w:sz w:val="18"/>
-                <w:szCs w:val="18"/>
-                <w:highlight w:val="yellow"/>
-                <w:lang w:val="en-GB"/>
-              </w:rPr>
-              <w:t xml:space="preserve"> </w:t>
-            </w:r>
-            <w:proofErr w:type="spellStart"/>
-            <w:r>
-              <w:rPr>
-                <w:rFonts w:ascii="Times New Roman" w:eastAsia="Times New Roman" w:hAnsi="Times New Roman" w:cs="Times New Roman"/>
-                <w:color w:val="000000" w:themeColor="text1"/>
-                <w:sz w:val="18"/>
-                <w:szCs w:val="18"/>
-                <w:highlight w:val="yellow"/>
-                <w:lang w:val="en-GB"/>
-              </w:rPr>
-              <w:t>հունվար</w:t>
-            </w:r>
-            <w:proofErr w:type="spellEnd"/>
+              <w:t>2026 թվականի հունվար</w:t>
+            </w:r>
             <w:r>
               <w:rPr>
                 <w:rFonts w:ascii="Times New Roman" w:eastAsia="Times New Roman" w:hAnsi="Times New Roman" w:cs="Times New Roman"/>
@@ -9058,52 +8689,14 @@
                 <w:szCs w:val="16"/>
               </w:rPr>
             </w:pPr>
-            <w:proofErr w:type="spellStart"/>
-            <w:r>
-              <w:rPr>
-                <w:rFonts w:ascii="Times New Roman" w:hAnsi="Times New Roman" w:cs="Times New Roman"/>
-                <w:sz w:val="16"/>
-                <w:szCs w:val="16"/>
-              </w:rPr>
-              <w:t>Գրավի</w:t>
-            </w:r>
-            <w:proofErr w:type="spellEnd"/>
-            <w:r>
-              <w:rPr>
-                <w:rFonts w:ascii="Times New Roman" w:hAnsi="Times New Roman" w:cs="Times New Roman"/>
-                <w:sz w:val="16"/>
-                <w:szCs w:val="16"/>
-              </w:rPr>
-              <w:t xml:space="preserve"> </w:t>
-            </w:r>
-            <w:proofErr w:type="spellStart"/>
-            <w:r>
-              <w:rPr>
-                <w:rFonts w:ascii="Times New Roman" w:hAnsi="Times New Roman" w:cs="Times New Roman"/>
-                <w:sz w:val="16"/>
-                <w:szCs w:val="16"/>
-              </w:rPr>
-              <w:t>առարկայի</w:t>
-            </w:r>
-            <w:proofErr w:type="spellEnd"/>
-            <w:r>
-              <w:rPr>
-                <w:rFonts w:ascii="Times New Roman" w:hAnsi="Times New Roman" w:cs="Times New Roman"/>
-                <w:sz w:val="16"/>
-                <w:szCs w:val="16"/>
-              </w:rPr>
-              <w:t xml:space="preserve"> </w:t>
-            </w:r>
-            <w:proofErr w:type="spellStart"/>
-            <w:r>
-              <w:rPr>
-                <w:rFonts w:ascii="Times New Roman" w:hAnsi="Times New Roman" w:cs="Times New Roman"/>
-                <w:sz w:val="16"/>
-                <w:szCs w:val="16"/>
-              </w:rPr>
-              <w:t>նկարագիրը</w:t>
-            </w:r>
-            <w:proofErr w:type="spellEnd"/>
+            <w:r>
+              <w:rPr>
+                <w:rFonts w:ascii="Times New Roman" w:hAnsi="Times New Roman" w:cs="Times New Roman"/>
+                <w:sz w:val="16"/>
+                <w:szCs w:val="16"/>
+              </w:rPr>
+              <w:t>Գրավի առարկայի նկարագիրը</w:t>
+            </w:r>
           </w:p>
         </w:tc>
         <w:tc>
@@ -9121,7 +8714,6 @@
                 <w:szCs w:val="16"/>
               </w:rPr>
             </w:pPr>
-            <w:proofErr w:type="spellStart"/>
             <w:r>
               <w:rPr>
                 <w:rFonts w:ascii="Times New Roman" w:hAnsi="Times New Roman" w:cs="Times New Roman"/>
@@ -9130,7 +8722,6 @@
               </w:rPr>
               <w:t>Քանակը</w:t>
             </w:r>
-            <w:proofErr w:type="spellEnd"/>
           </w:p>
           <w:p>
             <w:pPr>
@@ -9141,7 +8732,6 @@
                 <w:szCs w:val="16"/>
               </w:rPr>
             </w:pPr>
-            <w:proofErr w:type="spellStart"/>
             <w:r>
               <w:rPr>
                 <w:rFonts w:ascii="Times New Roman" w:hAnsi="Times New Roman" w:cs="Times New Roman"/>
@@ -9150,7 +8740,6 @@
               </w:rPr>
               <w:t>հատ</w:t>
             </w:r>
-            <w:proofErr w:type="spellEnd"/>
           </w:p>
         </w:tc>
         <w:tc>
@@ -9171,7 +8760,6 @@
                 <w:szCs w:val="16"/>
               </w:rPr>
             </w:pPr>
-            <w:proofErr w:type="spellStart"/>
             <w:r>
               <w:rPr>
                 <w:rFonts w:ascii="Times New Roman" w:hAnsi="Times New Roman" w:cs="Times New Roman"/>
@@ -9180,7 +8768,6 @@
               </w:rPr>
               <w:t>Զանգվածը</w:t>
             </w:r>
-            <w:proofErr w:type="spellEnd"/>
           </w:p>
           <w:p>
             <w:pPr>
@@ -9191,7 +8778,6 @@
                 <w:szCs w:val="16"/>
               </w:rPr>
             </w:pPr>
-            <w:proofErr w:type="spellStart"/>
             <w:r>
               <w:rPr>
                 <w:rFonts w:ascii="Times New Roman" w:hAnsi="Times New Roman" w:cs="Times New Roman"/>
@@ -9200,7 +8786,6 @@
               </w:rPr>
               <w:t>գրամ</w:t>
             </w:r>
-            <w:proofErr w:type="spellEnd"/>
           </w:p>
         </w:tc>
         <w:tc>
@@ -9218,7 +8803,6 @@
                 <w:szCs w:val="16"/>
               </w:rPr>
             </w:pPr>
-            <w:proofErr w:type="spellStart"/>
             <w:r>
               <w:rPr>
                 <w:rFonts w:ascii="Times New Roman" w:hAnsi="Times New Roman" w:cs="Times New Roman"/>
@@ -9227,7 +8811,6 @@
               </w:rPr>
               <w:t>Հարգը</w:t>
             </w:r>
-            <w:proofErr w:type="spellEnd"/>
           </w:p>
         </w:tc>
         <w:tc>
@@ -9245,70 +8828,14 @@
                 <w:szCs w:val="16"/>
               </w:rPr>
             </w:pPr>
-            <w:proofErr w:type="spellStart"/>
-            <w:r>
-              <w:rPr>
-                <w:rFonts w:ascii="Times New Roman" w:hAnsi="Times New Roman" w:cs="Times New Roman"/>
-                <w:sz w:val="16"/>
-                <w:szCs w:val="16"/>
-              </w:rPr>
-              <w:t>Մեկ</w:t>
-            </w:r>
-            <w:proofErr w:type="spellEnd"/>
-            <w:r>
-              <w:rPr>
-                <w:rFonts w:ascii="Times New Roman" w:hAnsi="Times New Roman" w:cs="Times New Roman"/>
-                <w:sz w:val="16"/>
-                <w:szCs w:val="16"/>
-              </w:rPr>
-              <w:t xml:space="preserve"> </w:t>
-            </w:r>
-            <w:proofErr w:type="spellStart"/>
-            <w:r>
-              <w:rPr>
-                <w:rFonts w:ascii="Times New Roman" w:hAnsi="Times New Roman" w:cs="Times New Roman"/>
-                <w:sz w:val="16"/>
-                <w:szCs w:val="16"/>
-              </w:rPr>
-              <w:t>գրամի</w:t>
-            </w:r>
-            <w:proofErr w:type="spellEnd"/>
-            <w:r>
-              <w:rPr>
-                <w:rFonts w:ascii="Times New Roman" w:hAnsi="Times New Roman" w:cs="Times New Roman"/>
-                <w:sz w:val="16"/>
-                <w:szCs w:val="16"/>
-              </w:rPr>
-              <w:t xml:space="preserve"> </w:t>
-            </w:r>
-            <w:proofErr w:type="spellStart"/>
-            <w:r>
-              <w:rPr>
-                <w:rFonts w:ascii="Times New Roman" w:hAnsi="Times New Roman" w:cs="Times New Roman"/>
-                <w:sz w:val="16"/>
-                <w:szCs w:val="16"/>
-              </w:rPr>
-              <w:t>արժեքը</w:t>
-            </w:r>
-            <w:proofErr w:type="spellEnd"/>
-            <w:r>
-              <w:rPr>
-                <w:rFonts w:ascii="Times New Roman" w:hAnsi="Times New Roman" w:cs="Times New Roman"/>
-                <w:sz w:val="16"/>
-                <w:szCs w:val="16"/>
-              </w:rPr>
-              <w:t xml:space="preserve"> ՀՀ </w:t>
-            </w:r>
-            <w:proofErr w:type="spellStart"/>
-            <w:r>
-              <w:rPr>
-                <w:rFonts w:ascii="Times New Roman" w:hAnsi="Times New Roman" w:cs="Times New Roman"/>
-                <w:sz w:val="16"/>
-                <w:szCs w:val="16"/>
-              </w:rPr>
-              <w:t>դրամով</w:t>
-            </w:r>
-            <w:proofErr w:type="spellEnd"/>
+            <w:r>
+              <w:rPr>
+                <w:rFonts w:ascii="Times New Roman" w:hAnsi="Times New Roman" w:cs="Times New Roman"/>
+                <w:sz w:val="16"/>
+                <w:szCs w:val="16"/>
+              </w:rPr>
+              <w:t>Մեկ գրամի արժեքը ՀՀ դրամով</w:t>
+            </w:r>
           </w:p>
         </w:tc>
         <w:tc>
@@ -9326,52 +8853,14 @@
                 <w:szCs w:val="16"/>
               </w:rPr>
             </w:pPr>
-            <w:proofErr w:type="spellStart"/>
-            <w:r>
-              <w:rPr>
-                <w:rFonts w:ascii="Times New Roman" w:hAnsi="Times New Roman" w:cs="Times New Roman"/>
-                <w:sz w:val="16"/>
-                <w:szCs w:val="16"/>
-              </w:rPr>
-              <w:t>Ընդհանւոր</w:t>
-            </w:r>
-            <w:proofErr w:type="spellEnd"/>
-            <w:r>
-              <w:rPr>
-                <w:rFonts w:ascii="Times New Roman" w:hAnsi="Times New Roman" w:cs="Times New Roman"/>
-                <w:sz w:val="16"/>
-                <w:szCs w:val="16"/>
-              </w:rPr>
-              <w:t xml:space="preserve"> </w:t>
-            </w:r>
-            <w:proofErr w:type="spellStart"/>
-            <w:r>
-              <w:rPr>
-                <w:rFonts w:ascii="Times New Roman" w:hAnsi="Times New Roman" w:cs="Times New Roman"/>
-                <w:sz w:val="16"/>
-                <w:szCs w:val="16"/>
-              </w:rPr>
-              <w:t>գումարի</w:t>
-            </w:r>
-            <w:proofErr w:type="spellEnd"/>
-            <w:r>
-              <w:rPr>
-                <w:rFonts w:ascii="Times New Roman" w:hAnsi="Times New Roman" w:cs="Times New Roman"/>
-                <w:sz w:val="16"/>
-                <w:szCs w:val="16"/>
-              </w:rPr>
-              <w:t xml:space="preserve"> </w:t>
-            </w:r>
-            <w:proofErr w:type="spellStart"/>
-            <w:r>
-              <w:rPr>
-                <w:rFonts w:ascii="Times New Roman" w:hAnsi="Times New Roman" w:cs="Times New Roman"/>
-                <w:sz w:val="16"/>
-                <w:szCs w:val="16"/>
-              </w:rPr>
-              <w:t>չափը</w:t>
-            </w:r>
-            <w:proofErr w:type="spellEnd"/>
+            <w:r>
+              <w:rPr>
+                <w:rFonts w:ascii="Times New Roman" w:hAnsi="Times New Roman" w:cs="Times New Roman"/>
+                <w:sz w:val="16"/>
+                <w:szCs w:val="16"/>
+              </w:rPr>
+              <w:t>Ընդհանւոր գումարի չափը</w:t>
+            </w:r>
           </w:p>
         </w:tc>
       </w:tr>
@@ -9427,34 +8916,14 @@
                 <w:szCs w:val="16"/>
               </w:rPr>
             </w:pPr>
-            <w:proofErr w:type="spellStart"/>
-            <w:r>
-              <w:rPr>
-                <w:rFonts w:ascii="Times New Roman" w:hAnsi="Times New Roman" w:cs="Times New Roman"/>
-                <w:sz w:val="16"/>
-                <w:szCs w:val="16"/>
-              </w:rPr>
-              <w:t>Ընդհանուր</w:t>
-            </w:r>
-            <w:proofErr w:type="spellEnd"/>
-            <w:r>
-              <w:rPr>
-                <w:rFonts w:ascii="Times New Roman" w:hAnsi="Times New Roman" w:cs="Times New Roman"/>
-                <w:sz w:val="16"/>
-                <w:szCs w:val="16"/>
-              </w:rPr>
-              <w:t xml:space="preserve"> </w:t>
-            </w:r>
-            <w:proofErr w:type="spellStart"/>
-            <w:r>
-              <w:rPr>
-                <w:rFonts w:ascii="Times New Roman" w:hAnsi="Times New Roman" w:cs="Times New Roman"/>
-                <w:sz w:val="16"/>
-                <w:szCs w:val="16"/>
-              </w:rPr>
-              <w:t>քաշ</w:t>
-            </w:r>
-            <w:proofErr w:type="spellEnd"/>
+            <w:r>
+              <w:rPr>
+                <w:rFonts w:ascii="Times New Roman" w:hAnsi="Times New Roman" w:cs="Times New Roman"/>
+                <w:sz w:val="16"/>
+                <w:szCs w:val="16"/>
+              </w:rPr>
+              <w:t>Ընդհանուր քաշ</w:t>
+            </w:r>
           </w:p>
         </w:tc>
         <w:tc>
@@ -9474,34 +8943,14 @@
                 <w:szCs w:val="16"/>
               </w:rPr>
             </w:pPr>
-            <w:proofErr w:type="spellStart"/>
-            <w:r>
-              <w:rPr>
-                <w:rFonts w:ascii="Times New Roman" w:hAnsi="Times New Roman" w:cs="Times New Roman"/>
-                <w:sz w:val="16"/>
-                <w:szCs w:val="16"/>
-              </w:rPr>
-              <w:t>մաքուր</w:t>
-            </w:r>
-            <w:proofErr w:type="spellEnd"/>
-            <w:r>
-              <w:rPr>
-                <w:rFonts w:ascii="Times New Roman" w:hAnsi="Times New Roman" w:cs="Times New Roman"/>
-                <w:sz w:val="16"/>
-                <w:szCs w:val="16"/>
-              </w:rPr>
-              <w:t xml:space="preserve"> </w:t>
-            </w:r>
-            <w:proofErr w:type="spellStart"/>
-            <w:r>
-              <w:rPr>
-                <w:rFonts w:ascii="Times New Roman" w:hAnsi="Times New Roman" w:cs="Times New Roman"/>
-                <w:sz w:val="16"/>
-                <w:szCs w:val="16"/>
-              </w:rPr>
-              <w:t>քաշ</w:t>
-            </w:r>
-            <w:proofErr w:type="spellEnd"/>
+            <w:r>
+              <w:rPr>
+                <w:rFonts w:ascii="Times New Roman" w:hAnsi="Times New Roman" w:cs="Times New Roman"/>
+                <w:sz w:val="16"/>
+                <w:szCs w:val="16"/>
+              </w:rPr>
+              <w:t>մաքուր քաշ</w:t>
+            </w:r>
           </w:p>
         </w:tc>
         <w:tc>
@@ -10259,23 +9708,13 @@
                 <w:szCs w:val="16"/>
               </w:rPr>
             </w:pPr>
-            <w:proofErr w:type="spellStart"/>
-            <w:r>
-              <w:rPr>
-                <w:rFonts w:ascii="Times New Roman" w:hAnsi="Times New Roman" w:cs="Times New Roman"/>
-                <w:sz w:val="16"/>
-                <w:szCs w:val="16"/>
-              </w:rPr>
-              <w:t>Ընդամենը</w:t>
-            </w:r>
-            <w:proofErr w:type="spellEnd"/>
-            <w:r>
-              <w:rPr>
-                <w:rFonts w:ascii="Times New Roman" w:hAnsi="Times New Roman" w:cs="Times New Roman"/>
-                <w:sz w:val="16"/>
-                <w:szCs w:val="16"/>
-              </w:rPr>
-              <w:t>՝</w:t>
+            <w:r>
+              <w:rPr>
+                <w:rFonts w:ascii="Times New Roman" w:hAnsi="Times New Roman" w:cs="Times New Roman"/>
+                <w:sz w:val="16"/>
+                <w:szCs w:val="16"/>
+              </w:rPr>
+              <w:t>Ընդամենը՝</w:t>
             </w:r>
           </w:p>
         </w:tc>
@@ -10419,7 +9858,6 @@
           <w:szCs w:val="22"/>
         </w:rPr>
       </w:pPr>
-      <w:proofErr w:type="spellStart"/>
       <w:r>
         <w:rPr>
           <w:sz w:val="18"/>
@@ -10432,121 +9870,15 @@
           <w:sz w:val="18"/>
           <w:szCs w:val="22"/>
         </w:rPr>
-        <w:t>ը</w:t>
-      </w:r>
-      <w:proofErr w:type="spellEnd"/>
+        <w:t>ը խարտելու և թթվային թեստի եղանակով ստուգեց</w:t>
+      </w:r>
       <w:r>
         <w:rPr>
           <w:sz w:val="18"/>
           <w:szCs w:val="22"/>
         </w:rPr>
-        <w:t xml:space="preserve"> </w:t>
-      </w:r>
-      <w:proofErr w:type="spellStart"/>
-      <w:r>
-        <w:rPr>
-          <w:sz w:val="18"/>
-          <w:szCs w:val="22"/>
-        </w:rPr>
-        <w:t>խարտելու</w:t>
-      </w:r>
-      <w:proofErr w:type="spellEnd"/>
-      <w:r>
-        <w:rPr>
-          <w:sz w:val="18"/>
-          <w:szCs w:val="22"/>
-        </w:rPr>
-        <w:t xml:space="preserve"> և </w:t>
-      </w:r>
-      <w:proofErr w:type="spellStart"/>
-      <w:r>
-        <w:rPr>
-          <w:sz w:val="18"/>
-          <w:szCs w:val="22"/>
-        </w:rPr>
-        <w:t>թթվային</w:t>
-      </w:r>
-      <w:proofErr w:type="spellEnd"/>
-      <w:r>
-        <w:rPr>
-          <w:sz w:val="18"/>
-          <w:szCs w:val="22"/>
-        </w:rPr>
-        <w:t xml:space="preserve"> </w:t>
-      </w:r>
-      <w:proofErr w:type="spellStart"/>
-      <w:r>
-        <w:rPr>
-          <w:sz w:val="18"/>
-          <w:szCs w:val="22"/>
-        </w:rPr>
-        <w:t>թեստի</w:t>
-      </w:r>
-      <w:proofErr w:type="spellEnd"/>
-      <w:r>
-        <w:rPr>
-          <w:sz w:val="18"/>
-          <w:szCs w:val="22"/>
-        </w:rPr>
-        <w:t xml:space="preserve"> </w:t>
-      </w:r>
-      <w:proofErr w:type="spellStart"/>
-      <w:r>
-        <w:rPr>
-          <w:sz w:val="18"/>
-          <w:szCs w:val="22"/>
-        </w:rPr>
-        <w:t>եղանակով</w:t>
-      </w:r>
-      <w:proofErr w:type="spellEnd"/>
-      <w:r>
-        <w:rPr>
-          <w:sz w:val="18"/>
-          <w:szCs w:val="22"/>
-        </w:rPr>
-        <w:t xml:space="preserve"> </w:t>
-      </w:r>
-      <w:proofErr w:type="spellStart"/>
-      <w:r>
-        <w:rPr>
-          <w:sz w:val="18"/>
-          <w:szCs w:val="22"/>
-        </w:rPr>
-        <w:t>ստուգեց</w:t>
-      </w:r>
-      <w:proofErr w:type="spellEnd"/>
-      <w:r>
-        <w:rPr>
-          <w:sz w:val="18"/>
-          <w:szCs w:val="22"/>
-        </w:rPr>
-        <w:t xml:space="preserve"> </w:t>
-      </w:r>
-      <w:proofErr w:type="spellStart"/>
-      <w:r>
-        <w:rPr>
-          <w:sz w:val="18"/>
-          <w:szCs w:val="22"/>
-        </w:rPr>
-        <w:t>Ոսկյա</w:t>
-      </w:r>
-      <w:proofErr w:type="spellEnd"/>
-      <w:r>
-        <w:rPr>
-          <w:sz w:val="18"/>
-          <w:szCs w:val="22"/>
-        </w:rPr>
-        <w:t xml:space="preserve"> </w:t>
-      </w:r>
-      <w:proofErr w:type="spellStart"/>
-      <w:r>
-        <w:rPr>
-          <w:sz w:val="18"/>
-          <w:szCs w:val="22"/>
-        </w:rPr>
-        <w:t>իրերը</w:t>
-      </w:r>
-      <w:proofErr w:type="spellEnd"/>
+        <w:t xml:space="preserve"> Ոսկյա իրերը</w:t>
+      </w:r>
       <w:r>
         <w:rPr>
           <w:sz w:val="18"/>
@@ -10564,58 +9896,21 @@
           <w:szCs w:val="22"/>
         </w:rPr>
       </w:pPr>
-      <w:proofErr w:type="spellStart"/>
       <w:r>
         <w:rPr>
           <w:sz w:val="18"/>
           <w:szCs w:val="22"/>
         </w:rPr>
-        <w:t>Պայմանագրով</w:t>
-      </w:r>
-      <w:proofErr w:type="spellEnd"/>
-      <w:r>
-        <w:rPr>
-          <w:sz w:val="18"/>
-          <w:szCs w:val="22"/>
-        </w:rPr>
-        <w:t xml:space="preserve"> </w:t>
-      </w:r>
-      <w:proofErr w:type="spellStart"/>
-      <w:r>
-        <w:rPr>
-          <w:sz w:val="18"/>
-          <w:szCs w:val="22"/>
-        </w:rPr>
-        <w:t>Գրավատուն</w:t>
-      </w:r>
-      <w:proofErr w:type="spellEnd"/>
+        <w:t>Պայմանագրով Գրավատուն</w:t>
+      </w:r>
       <w:r>
         <w:rPr>
           <w:sz w:val="18"/>
           <w:szCs w:val="22"/>
           <w:lang w:val="en-GB"/>
         </w:rPr>
-        <w:t xml:space="preserve"> (</w:t>
-      </w:r>
-      <w:proofErr w:type="spellStart"/>
-      <w:r>
-        <w:rPr>
-          <w:sz w:val="18"/>
-          <w:szCs w:val="22"/>
-          <w:lang w:val="en-GB"/>
-        </w:rPr>
-        <w:t>այսուհետ</w:t>
-      </w:r>
-      <w:proofErr w:type="spellEnd"/>
-      <w:r>
-        <w:rPr>
-          <w:sz w:val="18"/>
-          <w:szCs w:val="22"/>
-          <w:lang w:val="en-GB"/>
-        </w:rPr>
-        <w:t xml:space="preserve">՝ </w:t>
-      </w:r>
-      <w:proofErr w:type="spellStart"/>
+        <w:t xml:space="preserve"> (այսուհետ՝ </w:t>
+      </w:r>
       <w:r>
         <w:rPr>
           <w:b/>
@@ -10625,173 +9920,12 @@
         </w:rPr>
         <w:t>Հանձնող</w:t>
       </w:r>
-      <w:proofErr w:type="spellEnd"/>
       <w:r>
         <w:rPr>
           <w:sz w:val="18"/>
           <w:szCs w:val="22"/>
         </w:rPr>
-        <w:t xml:space="preserve">) </w:t>
-      </w:r>
-      <w:proofErr w:type="spellStart"/>
-      <w:r>
-        <w:rPr>
-          <w:sz w:val="18"/>
-          <w:szCs w:val="22"/>
-        </w:rPr>
-        <w:t>հանձնեց</w:t>
-      </w:r>
-      <w:proofErr w:type="spellEnd"/>
-      <w:r>
-        <w:rPr>
-          <w:sz w:val="18"/>
-          <w:szCs w:val="22"/>
-        </w:rPr>
-        <w:t xml:space="preserve">, </w:t>
-      </w:r>
-      <w:proofErr w:type="spellStart"/>
-      <w:r>
-        <w:rPr>
-          <w:sz w:val="18"/>
-          <w:szCs w:val="22"/>
-        </w:rPr>
-        <w:t>իսկ</w:t>
-      </w:r>
-      <w:proofErr w:type="spellEnd"/>
-      <w:r>
-        <w:rPr>
-          <w:sz w:val="18"/>
-          <w:szCs w:val="22"/>
-        </w:rPr>
-        <w:t xml:space="preserve"> </w:t>
-      </w:r>
-      <w:proofErr w:type="spellStart"/>
-      <w:r>
-        <w:rPr>
-          <w:sz w:val="18"/>
-          <w:szCs w:val="22"/>
-        </w:rPr>
-        <w:t>Գրավառուն</w:t>
-      </w:r>
-      <w:proofErr w:type="spellEnd"/>
-      <w:r>
-        <w:rPr>
-          <w:sz w:val="18"/>
-          <w:szCs w:val="22"/>
-        </w:rPr>
-        <w:t xml:space="preserve"> </w:t>
-      </w:r>
-      <w:proofErr w:type="spellStart"/>
-      <w:r>
-        <w:rPr>
-          <w:sz w:val="18"/>
-          <w:szCs w:val="22"/>
-        </w:rPr>
-        <w:t>ընդունեց</w:t>
-      </w:r>
-      <w:proofErr w:type="spellEnd"/>
-      <w:r>
-        <w:rPr>
-          <w:sz w:val="18"/>
-          <w:szCs w:val="22"/>
-        </w:rPr>
-        <w:t xml:space="preserve"> </w:t>
-      </w:r>
-      <w:proofErr w:type="spellStart"/>
-      <w:r>
-        <w:rPr>
-          <w:sz w:val="18"/>
-          <w:szCs w:val="22"/>
-        </w:rPr>
-        <w:t>վերը</w:t>
-      </w:r>
-      <w:proofErr w:type="spellEnd"/>
-      <w:r>
-        <w:rPr>
-          <w:sz w:val="18"/>
-          <w:szCs w:val="22"/>
-        </w:rPr>
-        <w:t xml:space="preserve"> </w:t>
-      </w:r>
-      <w:proofErr w:type="spellStart"/>
-      <w:r>
-        <w:rPr>
-          <w:sz w:val="18"/>
-          <w:szCs w:val="22"/>
-        </w:rPr>
-        <w:t>նշված</w:t>
-      </w:r>
-      <w:proofErr w:type="spellEnd"/>
-      <w:r>
-        <w:rPr>
-          <w:sz w:val="18"/>
-          <w:szCs w:val="22"/>
-        </w:rPr>
-        <w:t xml:space="preserve"> </w:t>
-      </w:r>
-      <w:proofErr w:type="spellStart"/>
-      <w:r>
-        <w:rPr>
-          <w:sz w:val="18"/>
-          <w:szCs w:val="22"/>
-        </w:rPr>
-        <w:t>աղյուսակում</w:t>
-      </w:r>
-      <w:proofErr w:type="spellEnd"/>
-      <w:r>
-        <w:rPr>
-          <w:sz w:val="18"/>
-          <w:szCs w:val="22"/>
-        </w:rPr>
-        <w:t xml:space="preserve"> </w:t>
-      </w:r>
-      <w:proofErr w:type="spellStart"/>
-      <w:r>
-        <w:rPr>
-          <w:sz w:val="18"/>
-          <w:szCs w:val="22"/>
-        </w:rPr>
-        <w:t>թվարկված</w:t>
-      </w:r>
-      <w:proofErr w:type="spellEnd"/>
-      <w:r>
-        <w:rPr>
-          <w:sz w:val="18"/>
-          <w:szCs w:val="22"/>
-        </w:rPr>
-        <w:t xml:space="preserve"> </w:t>
-      </w:r>
-      <w:proofErr w:type="spellStart"/>
-      <w:r>
-        <w:rPr>
-          <w:sz w:val="18"/>
-          <w:szCs w:val="22"/>
-        </w:rPr>
-        <w:t>ոսկյա</w:t>
-      </w:r>
-      <w:proofErr w:type="spellEnd"/>
-      <w:r>
-        <w:rPr>
-          <w:sz w:val="18"/>
-          <w:szCs w:val="22"/>
-        </w:rPr>
-        <w:t xml:space="preserve"> </w:t>
-      </w:r>
-      <w:proofErr w:type="spellStart"/>
-      <w:r>
-        <w:rPr>
-          <w:sz w:val="18"/>
-          <w:szCs w:val="22"/>
-        </w:rPr>
-        <w:t>իրերը</w:t>
-      </w:r>
-      <w:proofErr w:type="spellEnd"/>
-      <w:r>
-        <w:rPr>
-          <w:sz w:val="18"/>
-          <w:szCs w:val="22"/>
-        </w:rPr>
-        <w:t>։</w:t>
+        <w:t>) հանձնեց, իսկ Գրավառուն ընդունեց վերը նշված աղյուսակում թվարկված ոսկյա իրերը։</w:t>
       </w:r>
     </w:p>
     <w:p>
@@ -10803,255 +9937,13 @@
           <w:szCs w:val="22"/>
         </w:rPr>
       </w:pPr>
-      <w:proofErr w:type="spellStart"/>
       <w:r>
         <w:rPr>
           <w:sz w:val="18"/>
           <w:szCs w:val="22"/>
         </w:rPr>
-        <w:t>Հանձնողը</w:t>
-      </w:r>
-      <w:proofErr w:type="spellEnd"/>
-      <w:r>
-        <w:rPr>
-          <w:sz w:val="18"/>
-          <w:szCs w:val="22"/>
-        </w:rPr>
-        <w:t xml:space="preserve"> </w:t>
-      </w:r>
-      <w:proofErr w:type="spellStart"/>
-      <w:r>
-        <w:rPr>
-          <w:sz w:val="18"/>
-          <w:szCs w:val="22"/>
-        </w:rPr>
-        <w:t>հավաստիացնում</w:t>
-      </w:r>
-      <w:proofErr w:type="spellEnd"/>
-      <w:r>
-        <w:rPr>
-          <w:sz w:val="18"/>
-          <w:szCs w:val="22"/>
-        </w:rPr>
-        <w:t xml:space="preserve"> է, </w:t>
-      </w:r>
-      <w:proofErr w:type="spellStart"/>
-      <w:r>
-        <w:rPr>
-          <w:sz w:val="18"/>
-          <w:szCs w:val="22"/>
-        </w:rPr>
-        <w:t>որ</w:t>
-      </w:r>
-      <w:proofErr w:type="spellEnd"/>
-      <w:r>
-        <w:rPr>
-          <w:sz w:val="18"/>
-          <w:szCs w:val="22"/>
-        </w:rPr>
-        <w:t xml:space="preserve"> </w:t>
-      </w:r>
-      <w:proofErr w:type="spellStart"/>
-      <w:r>
-        <w:rPr>
-          <w:sz w:val="18"/>
-          <w:szCs w:val="22"/>
-        </w:rPr>
-        <w:t>գրավի</w:t>
-      </w:r>
-      <w:proofErr w:type="spellEnd"/>
-      <w:r>
-        <w:rPr>
-          <w:sz w:val="18"/>
-          <w:szCs w:val="22"/>
-        </w:rPr>
-        <w:t xml:space="preserve"> </w:t>
-      </w:r>
-      <w:proofErr w:type="spellStart"/>
-      <w:r>
-        <w:rPr>
-          <w:sz w:val="18"/>
-          <w:szCs w:val="22"/>
-        </w:rPr>
-        <w:t>առարկաները</w:t>
-      </w:r>
-      <w:proofErr w:type="spellEnd"/>
-      <w:r>
-        <w:rPr>
-          <w:sz w:val="18"/>
-          <w:szCs w:val="22"/>
-        </w:rPr>
-        <w:t xml:space="preserve"> </w:t>
-      </w:r>
-      <w:proofErr w:type="spellStart"/>
-      <w:r>
-        <w:rPr>
-          <w:sz w:val="18"/>
-          <w:szCs w:val="22"/>
-        </w:rPr>
-        <w:t>ամբողջությամբ</w:t>
-      </w:r>
-      <w:proofErr w:type="spellEnd"/>
-      <w:r>
-        <w:rPr>
-          <w:sz w:val="18"/>
-          <w:szCs w:val="22"/>
-        </w:rPr>
-        <w:t xml:space="preserve"> </w:t>
-      </w:r>
-      <w:proofErr w:type="spellStart"/>
-      <w:r>
-        <w:rPr>
-          <w:sz w:val="18"/>
-          <w:szCs w:val="22"/>
-        </w:rPr>
-        <w:t>սեփականության</w:t>
-      </w:r>
-      <w:proofErr w:type="spellEnd"/>
-      <w:r>
-        <w:rPr>
-          <w:sz w:val="18"/>
-          <w:szCs w:val="22"/>
-        </w:rPr>
-        <w:t xml:space="preserve"> </w:t>
-      </w:r>
-      <w:proofErr w:type="spellStart"/>
-      <w:r>
-        <w:rPr>
-          <w:sz w:val="18"/>
-          <w:szCs w:val="22"/>
-        </w:rPr>
-        <w:t>իրավունքով</w:t>
-      </w:r>
-      <w:proofErr w:type="spellEnd"/>
-      <w:r>
-        <w:rPr>
-          <w:sz w:val="18"/>
-          <w:szCs w:val="22"/>
-        </w:rPr>
-        <w:t xml:space="preserve"> </w:t>
-      </w:r>
-      <w:proofErr w:type="spellStart"/>
-      <w:r>
-        <w:rPr>
-          <w:sz w:val="18"/>
-          <w:szCs w:val="22"/>
-        </w:rPr>
-        <w:t>պատկանում</w:t>
-      </w:r>
-      <w:proofErr w:type="spellEnd"/>
-      <w:r>
-        <w:rPr>
-          <w:sz w:val="18"/>
-          <w:szCs w:val="22"/>
-        </w:rPr>
-        <w:t xml:space="preserve"> </w:t>
-      </w:r>
-      <w:proofErr w:type="spellStart"/>
-      <w:r>
-        <w:rPr>
-          <w:sz w:val="18"/>
-          <w:szCs w:val="22"/>
-        </w:rPr>
-        <w:t>են</w:t>
-      </w:r>
-      <w:proofErr w:type="spellEnd"/>
-      <w:r>
-        <w:rPr>
-          <w:sz w:val="18"/>
-          <w:szCs w:val="22"/>
-        </w:rPr>
-        <w:t xml:space="preserve"> </w:t>
-      </w:r>
-      <w:proofErr w:type="spellStart"/>
-      <w:r>
-        <w:rPr>
-          <w:sz w:val="18"/>
-          <w:szCs w:val="22"/>
-        </w:rPr>
-        <w:t>իրեն</w:t>
-      </w:r>
-      <w:proofErr w:type="spellEnd"/>
-      <w:r>
-        <w:rPr>
-          <w:sz w:val="18"/>
-          <w:szCs w:val="22"/>
-        </w:rPr>
-        <w:t xml:space="preserve">, </w:t>
-      </w:r>
-      <w:proofErr w:type="spellStart"/>
-      <w:r>
-        <w:rPr>
-          <w:sz w:val="18"/>
-          <w:szCs w:val="22"/>
-        </w:rPr>
-        <w:t>ազատ</w:t>
-      </w:r>
-      <w:proofErr w:type="spellEnd"/>
-      <w:r>
-        <w:rPr>
-          <w:sz w:val="18"/>
-          <w:szCs w:val="22"/>
-        </w:rPr>
-        <w:t xml:space="preserve"> </w:t>
-      </w:r>
-      <w:proofErr w:type="spellStart"/>
-      <w:r>
-        <w:rPr>
-          <w:sz w:val="18"/>
-          <w:szCs w:val="22"/>
-        </w:rPr>
-        <w:t>են</w:t>
-      </w:r>
-      <w:proofErr w:type="spellEnd"/>
-      <w:r>
-        <w:rPr>
-          <w:sz w:val="18"/>
-          <w:szCs w:val="22"/>
-        </w:rPr>
-        <w:t xml:space="preserve"> </w:t>
-      </w:r>
-      <w:proofErr w:type="spellStart"/>
-      <w:r>
-        <w:rPr>
-          <w:sz w:val="18"/>
-          <w:szCs w:val="22"/>
-        </w:rPr>
-        <w:t>այլ</w:t>
-      </w:r>
-      <w:proofErr w:type="spellEnd"/>
-      <w:r>
-        <w:rPr>
-          <w:sz w:val="18"/>
-          <w:szCs w:val="22"/>
-        </w:rPr>
-        <w:t xml:space="preserve"> </w:t>
-      </w:r>
-      <w:proofErr w:type="spellStart"/>
-      <w:r>
-        <w:rPr>
-          <w:sz w:val="18"/>
-          <w:szCs w:val="22"/>
-        </w:rPr>
-        <w:t>անձանց</w:t>
-      </w:r>
-      <w:proofErr w:type="spellEnd"/>
-      <w:r>
-        <w:rPr>
-          <w:sz w:val="18"/>
-          <w:szCs w:val="22"/>
-        </w:rPr>
-        <w:t xml:space="preserve"> </w:t>
-      </w:r>
-      <w:proofErr w:type="spellStart"/>
-      <w:r>
-        <w:rPr>
-          <w:sz w:val="18"/>
-          <w:szCs w:val="22"/>
-        </w:rPr>
-        <w:t>պահանջներից</w:t>
-      </w:r>
-      <w:proofErr w:type="spellEnd"/>
+        <w:t>Հանձնողը հավաստիացնում է, որ գրավի առարկաները ամբողջությամբ սեփականության իրավունքով պատկանում են իրեն, ազատ են այլ անձանց պահանջներից</w:t>
+      </w:r>
       <w:r>
         <w:rPr>
           <w:sz w:val="18"/>
@@ -11106,65 +9998,68 @@
                 <w:szCs w:val="18"/>
               </w:rPr>
             </w:pPr>
-            <w:proofErr w:type="spellStart"/>
             <w:r>
               <w:rPr>
                 <w:rFonts w:ascii="Times New Roman" w:hAnsi="Times New Roman" w:cs="Times New Roman"/>
                 <w:sz w:val="18"/>
                 <w:szCs w:val="18"/>
               </w:rPr>
-              <w:t>Ընդունեցին</w:t>
-            </w:r>
-            <w:proofErr w:type="spellEnd"/>
-            <w:r>
+              <w:t>Ընդունեցին՝</w:t>
+            </w:r>
+          </w:p>
+        </w:tc>
+        <w:tc>
+          <w:tcPr>
+            <w:tcW w:w="4189" w:type="dxa"/>
+            <w:gridSpan w:val="3"/>
+          </w:tcPr>
+          <w:p>
+            <w:pPr>
+              <w:spacing w:line="276" w:lineRule="auto"/>
               <w:rPr>
                 <w:rFonts w:ascii="Times New Roman" w:hAnsi="Times New Roman" w:cs="Times New Roman"/>
                 <w:sz w:val="18"/>
                 <w:szCs w:val="18"/>
               </w:rPr>
-              <w:t>՝</w:t>
-            </w:r>
-          </w:p>
-        </w:tc>
-        <w:tc>
-          <w:tcPr>
-            <w:tcW w:w="4189" w:type="dxa"/>
-            <w:gridSpan w:val="3"/>
-          </w:tcPr>
-          <w:p>
-            <w:pPr>
-              <w:spacing w:line="276" w:lineRule="auto"/>
+            </w:pPr>
+            <w:r>
               <w:rPr>
                 <w:rFonts w:ascii="Times New Roman" w:hAnsi="Times New Roman" w:cs="Times New Roman"/>
                 <w:sz w:val="18"/>
                 <w:szCs w:val="18"/>
               </w:rPr>
-            </w:pPr>
-            <w:proofErr w:type="spellStart"/>
-            <w:r>
+              <w:t xml:space="preserve">Հանձնեց՝      </w:t>
+            </w:r>
+          </w:p>
+        </w:tc>
+      </w:tr>
+      <w:tr>
+        <w:tc>
+          <w:tcPr>
+            <w:tcW w:w="1817" w:type="dxa"/>
+          </w:tcPr>
+          <w:p>
+            <w:pPr>
+              <w:spacing w:line="276" w:lineRule="auto"/>
               <w:rPr>
                 <w:rFonts w:ascii="Times New Roman" w:hAnsi="Times New Roman" w:cs="Times New Roman"/>
                 <w:sz w:val="18"/>
                 <w:szCs w:val="18"/>
               </w:rPr>
-              <w:t>Հանձնեց</w:t>
-            </w:r>
-            <w:proofErr w:type="spellEnd"/>
+            </w:pPr>
             <w:r>
               <w:rPr>
                 <w:rFonts w:ascii="Times New Roman" w:hAnsi="Times New Roman" w:cs="Times New Roman"/>
                 <w:sz w:val="18"/>
                 <w:szCs w:val="18"/>
               </w:rPr>
-              <w:t xml:space="preserve">՝      </w:t>
-            </w:r>
-          </w:p>
-        </w:tc>
-      </w:tr>
-      <w:tr>
-        <w:tc>
-          <w:tcPr>
-            <w:tcW w:w="1817" w:type="dxa"/>
+              <w:t>Գլխավոր տնօրեն</w:t>
+            </w:r>
+          </w:p>
+        </w:tc>
+        <w:tc>
+          <w:tcPr>
+            <w:tcW w:w="1174" w:type="dxa"/>
           </w:tcPr>
           <w:p>
             <w:pPr>
@@ -11175,118 +10070,53 @@
                 <w:szCs w:val="18"/>
               </w:rPr>
             </w:pPr>
-            <w:proofErr w:type="spellStart"/>
-            <w:r>
+          </w:p>
+        </w:tc>
+        <w:tc>
+          <w:tcPr>
+            <w:tcW w:w="2596" w:type="dxa"/>
+          </w:tcPr>
+          <w:p>
+            <w:pPr>
+              <w:spacing w:line="276" w:lineRule="auto"/>
+              <w:ind w:left="77"/>
               <w:rPr>
                 <w:rFonts w:ascii="Times New Roman" w:hAnsi="Times New Roman" w:cs="Times New Roman"/>
                 <w:sz w:val="18"/>
                 <w:szCs w:val="18"/>
               </w:rPr>
-              <w:t>Գլխավոր</w:t>
-            </w:r>
-            <w:proofErr w:type="spellEnd"/>
+            </w:pPr>
             <w:r>
               <w:rPr>
                 <w:rFonts w:ascii="Times New Roman" w:hAnsi="Times New Roman" w:cs="Times New Roman"/>
                 <w:sz w:val="18"/>
                 <w:szCs w:val="18"/>
               </w:rPr>
-              <w:t xml:space="preserve"> </w:t>
-            </w:r>
-            <w:proofErr w:type="spellStart"/>
-            <w:r>
+              <w:t>Գրիգոր Սահականը</w:t>
+            </w:r>
+          </w:p>
+        </w:tc>
+        <w:tc>
+          <w:tcPr>
+            <w:tcW w:w="1120" w:type="dxa"/>
+          </w:tcPr>
+          <w:p>
+            <w:pPr>
+              <w:spacing w:line="276" w:lineRule="auto"/>
               <w:rPr>
                 <w:rFonts w:ascii="Times New Roman" w:hAnsi="Times New Roman" w:cs="Times New Roman"/>
                 <w:sz w:val="18"/>
                 <w:szCs w:val="18"/>
               </w:rPr>
-              <w:t>տնօրեն</w:t>
-            </w:r>
-            <w:proofErr w:type="spellEnd"/>
-          </w:p>
-        </w:tc>
-        <w:tc>
-          <w:tcPr>
-            <w:tcW w:w="1174" w:type="dxa"/>
-          </w:tcPr>
-          <w:p>
-            <w:pPr>
-              <w:spacing w:line="276" w:lineRule="auto"/>
+            </w:pPr>
+            <w:r>
               <w:rPr>
                 <w:rFonts w:ascii="Times New Roman" w:hAnsi="Times New Roman" w:cs="Times New Roman"/>
                 <w:sz w:val="18"/>
                 <w:szCs w:val="18"/>
               </w:rPr>
-            </w:pPr>
-          </w:p>
-        </w:tc>
-        <w:tc>
-          <w:tcPr>
-            <w:tcW w:w="2596" w:type="dxa"/>
-          </w:tcPr>
-          <w:p>
-            <w:pPr>
-              <w:spacing w:line="276" w:lineRule="auto"/>
-              <w:ind w:left="77"/>
-              <w:rPr>
-                <w:rFonts w:ascii="Times New Roman" w:hAnsi="Times New Roman" w:cs="Times New Roman"/>
-                <w:sz w:val="18"/>
-                <w:szCs w:val="18"/>
-              </w:rPr>
-            </w:pPr>
-            <w:proofErr w:type="spellStart"/>
-            <w:r>
-              <w:rPr>
-                <w:rFonts w:ascii="Times New Roman" w:hAnsi="Times New Roman" w:cs="Times New Roman"/>
-                <w:sz w:val="18"/>
-                <w:szCs w:val="18"/>
-              </w:rPr>
-              <w:t>Գրիգոր</w:t>
-            </w:r>
-            <w:proofErr w:type="spellEnd"/>
-            <w:r>
-              <w:rPr>
-                <w:rFonts w:ascii="Times New Roman" w:hAnsi="Times New Roman" w:cs="Times New Roman"/>
-                <w:sz w:val="18"/>
-                <w:szCs w:val="18"/>
-              </w:rPr>
-              <w:t xml:space="preserve"> </w:t>
-            </w:r>
-            <w:proofErr w:type="spellStart"/>
-            <w:r>
-              <w:rPr>
-                <w:rFonts w:ascii="Times New Roman" w:hAnsi="Times New Roman" w:cs="Times New Roman"/>
-                <w:sz w:val="18"/>
-                <w:szCs w:val="18"/>
-              </w:rPr>
-              <w:t>Սահականը</w:t>
-            </w:r>
-            <w:proofErr w:type="spellEnd"/>
-          </w:p>
-        </w:tc>
-        <w:tc>
-          <w:tcPr>
-            <w:tcW w:w="1120" w:type="dxa"/>
-          </w:tcPr>
-          <w:p>
-            <w:pPr>
-              <w:spacing w:line="276" w:lineRule="auto"/>
-              <w:rPr>
-                <w:rFonts w:ascii="Times New Roman" w:hAnsi="Times New Roman" w:cs="Times New Roman"/>
-                <w:sz w:val="18"/>
-                <w:szCs w:val="18"/>
-              </w:rPr>
-            </w:pPr>
-            <w:proofErr w:type="spellStart"/>
-            <w:r>
-              <w:rPr>
-                <w:rFonts w:ascii="Times New Roman" w:hAnsi="Times New Roman" w:cs="Times New Roman"/>
-                <w:sz w:val="18"/>
-                <w:szCs w:val="18"/>
-              </w:rPr>
               <w:t>Գրավատու</w:t>
             </w:r>
-            <w:proofErr w:type="spellEnd"/>
           </w:p>
         </w:tc>
         <w:tc>
@@ -11368,7 +10198,6 @@
                 <w:szCs w:val="18"/>
               </w:rPr>
             </w:pPr>
-            <w:proofErr w:type="spellStart"/>
             <w:r>
               <w:rPr>
                 <w:rFonts w:ascii="Times New Roman" w:hAnsi="Times New Roman" w:cs="Times New Roman"/>
@@ -11377,7 +10206,6 @@
               </w:rPr>
               <w:t>Ոսկերիչ-մասնագետ</w:t>
             </w:r>
-            <w:proofErr w:type="spellEnd"/>
           </w:p>
         </w:tc>
         <w:tc>
@@ -11557,7 +10385,7 @@
               </wp:anchor>
             </w:drawing>
           </mc:Choice>
-          <mc:Fallback xmlns:w16sdtfl="http://schemas.microsoft.com/office/word/2024/wordml/sdtformatlock" xmlns:w16du="http://schemas.microsoft.com/office/word/2023/wordml/word16du">
+          <mc:Fallback xmlns:w16du="http://schemas.microsoft.com/office/word/2023/wordml/word16du" xmlns:w16sdtfl="http://schemas.microsoft.com/office/word/2024/wordml/sdtformatlock">
             <w:pict>
               <v:line w14:anchorId="6A9B0DF6" id="Straight Connector 2" o:spid="_x0000_s1026" style="position:absolute;z-index:251659264;visibility:visible;mso-wrap-style:square;mso-wrap-distance-left:9pt;mso-wrap-distance-top:0;mso-wrap-distance-right:9pt;mso-wrap-distance-bottom:0;mso-position-horizontal:absolute;mso-position-horizontal-relative:text;mso-position-vertical:absolute;mso-position-vertical-relative:text" from="-2.8pt,12.7pt" to="488.9pt,12.7pt" o:gfxdata="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" strokecolor="black [3213]" strokeweight="1.25pt">
                 <v:stroke linestyle="thinThick" joinstyle="miter"/>
@@ -11581,7 +10409,6 @@
           <w:lang w:val="en-GB"/>
         </w:rPr>
       </w:pPr>
-      <w:proofErr w:type="spellStart"/>
       <w:r>
         <w:rPr>
           <w:rFonts w:ascii="Times New Roman" w:hAnsi="Times New Roman" w:cs="Times New Roman"/>
@@ -11593,9 +10420,8 @@
           <w:szCs w:val="18"/>
           <w:lang w:val="en-GB"/>
         </w:rPr>
-        <w:t>Ոսկյա</w:t>
-      </w:r>
-      <w:proofErr w:type="spellEnd"/>
+        <w:t>Ոսկյա իրերի պարկի բացման և ս</w:t>
+      </w:r>
       <w:r>
         <w:rPr>
           <w:rFonts w:ascii="Times New Roman" w:hAnsi="Times New Roman" w:cs="Times New Roman"/>
@@ -11607,160 +10433,7 @@
           <w:szCs w:val="18"/>
           <w:lang w:val="en-GB"/>
         </w:rPr>
-        <w:t xml:space="preserve"> </w:t>
-      </w:r>
-      <w:proofErr w:type="spellStart"/>
-      <w:r>
-        <w:rPr>
-          <w:rFonts w:ascii="Times New Roman" w:hAnsi="Times New Roman" w:cs="Times New Roman"/>
-          <w:b/>
-          <w:bCs/>
-          <w:i/>
-          <w:iCs/>
-          <w:sz w:val="18"/>
-          <w:szCs w:val="18"/>
-          <w:lang w:val="en-GB"/>
-        </w:rPr>
-        <w:t>իրերի</w:t>
-      </w:r>
-      <w:proofErr w:type="spellEnd"/>
-      <w:r>
-        <w:rPr>
-          <w:rFonts w:ascii="Times New Roman" w:hAnsi="Times New Roman" w:cs="Times New Roman"/>
-          <w:b/>
-          <w:bCs/>
-          <w:i/>
-          <w:iCs/>
-          <w:sz w:val="18"/>
-          <w:szCs w:val="18"/>
-          <w:lang w:val="en-GB"/>
-        </w:rPr>
-        <w:t xml:space="preserve"> </w:t>
-      </w:r>
-      <w:proofErr w:type="spellStart"/>
-      <w:r>
-        <w:rPr>
-          <w:rFonts w:ascii="Times New Roman" w:hAnsi="Times New Roman" w:cs="Times New Roman"/>
-          <w:b/>
-          <w:bCs/>
-          <w:i/>
-          <w:iCs/>
-          <w:sz w:val="18"/>
-          <w:szCs w:val="18"/>
-          <w:lang w:val="en-GB"/>
-        </w:rPr>
-        <w:t>պարկի</w:t>
-      </w:r>
-      <w:proofErr w:type="spellEnd"/>
-      <w:r>
-        <w:rPr>
-          <w:rFonts w:ascii="Times New Roman" w:hAnsi="Times New Roman" w:cs="Times New Roman"/>
-          <w:b/>
-          <w:bCs/>
-          <w:i/>
-          <w:iCs/>
-          <w:sz w:val="18"/>
-          <w:szCs w:val="18"/>
-          <w:lang w:val="en-GB"/>
-        </w:rPr>
-        <w:t xml:space="preserve"> </w:t>
-      </w:r>
-      <w:proofErr w:type="spellStart"/>
-      <w:r>
-        <w:rPr>
-          <w:rFonts w:ascii="Times New Roman" w:hAnsi="Times New Roman" w:cs="Times New Roman"/>
-          <w:b/>
-          <w:bCs/>
-          <w:i/>
-          <w:iCs/>
-          <w:sz w:val="18"/>
-          <w:szCs w:val="18"/>
-          <w:lang w:val="en-GB"/>
-        </w:rPr>
-        <w:t>բացման</w:t>
-      </w:r>
-      <w:proofErr w:type="spellEnd"/>
-      <w:r>
-        <w:rPr>
-          <w:rFonts w:ascii="Times New Roman" w:hAnsi="Times New Roman" w:cs="Times New Roman"/>
-          <w:b/>
-          <w:bCs/>
-          <w:i/>
-          <w:iCs/>
-          <w:sz w:val="18"/>
-          <w:szCs w:val="18"/>
-          <w:lang w:val="en-GB"/>
-        </w:rPr>
-        <w:t xml:space="preserve"> և </w:t>
-      </w:r>
-      <w:proofErr w:type="spellStart"/>
-      <w:r>
-        <w:rPr>
-          <w:rFonts w:ascii="Times New Roman" w:hAnsi="Times New Roman" w:cs="Times New Roman"/>
-          <w:b/>
-          <w:bCs/>
-          <w:i/>
-          <w:iCs/>
-          <w:sz w:val="18"/>
-          <w:szCs w:val="18"/>
-          <w:lang w:val="en-GB"/>
-        </w:rPr>
-        <w:t>ս</w:t>
-      </w:r>
-      <w:r>
-        <w:rPr>
-          <w:rFonts w:ascii="Times New Roman" w:hAnsi="Times New Roman" w:cs="Times New Roman"/>
-          <w:b/>
-          <w:bCs/>
-          <w:i/>
-          <w:iCs/>
-          <w:sz w:val="18"/>
-          <w:szCs w:val="18"/>
-          <w:lang w:val="en-GB"/>
-        </w:rPr>
-        <w:t>տուգման</w:t>
-      </w:r>
-      <w:proofErr w:type="spellEnd"/>
-      <w:r>
-        <w:rPr>
-          <w:rFonts w:ascii="Times New Roman" w:hAnsi="Times New Roman" w:cs="Times New Roman"/>
-          <w:b/>
-          <w:bCs/>
-          <w:i/>
-          <w:iCs/>
-          <w:sz w:val="18"/>
-          <w:szCs w:val="18"/>
-          <w:lang w:val="en-GB"/>
-        </w:rPr>
-        <w:t xml:space="preserve"> </w:t>
-      </w:r>
-      <w:proofErr w:type="spellStart"/>
-      <w:r>
-        <w:rPr>
-          <w:rFonts w:ascii="Times New Roman" w:hAnsi="Times New Roman" w:cs="Times New Roman"/>
-          <w:b/>
-          <w:bCs/>
-          <w:i/>
-          <w:iCs/>
-          <w:sz w:val="18"/>
-          <w:szCs w:val="18"/>
-          <w:lang w:val="en-GB"/>
-        </w:rPr>
-        <w:t>արձանագրություն</w:t>
-      </w:r>
-      <w:proofErr w:type="spellEnd"/>
-      <w:r>
-        <w:rPr>
-          <w:rFonts w:ascii="Times New Roman" w:hAnsi="Times New Roman" w:cs="Times New Roman"/>
-          <w:b/>
-          <w:bCs/>
-          <w:i/>
-          <w:iCs/>
-          <w:sz w:val="18"/>
-          <w:szCs w:val="18"/>
-          <w:lang w:val="en-GB"/>
-        </w:rPr>
-        <w:t xml:space="preserve"> </w:t>
+        <w:t xml:space="preserve">տուգման արձանագրություն </w:t>
       </w:r>
     </w:p>
     <w:p>
@@ -11773,95 +10446,13 @@
           <w:lang w:val="en-GB"/>
         </w:rPr>
       </w:pPr>
-      <w:proofErr w:type="spellStart"/>
-      <w:r>
-        <w:rPr>
-          <w:rFonts w:ascii="Times New Roman" w:hAnsi="Times New Roman" w:cs="Times New Roman"/>
-          <w:sz w:val="18"/>
-          <w:szCs w:val="18"/>
-        </w:rPr>
-        <w:t>Ստուգման</w:t>
-      </w:r>
-      <w:proofErr w:type="spellEnd"/>
-      <w:r>
-        <w:rPr>
-          <w:rFonts w:ascii="Times New Roman" w:hAnsi="Times New Roman" w:cs="Times New Roman"/>
-          <w:sz w:val="18"/>
-          <w:szCs w:val="18"/>
-        </w:rPr>
-        <w:t xml:space="preserve"> </w:t>
-      </w:r>
-      <w:proofErr w:type="spellStart"/>
-      <w:r>
-        <w:rPr>
-          <w:rFonts w:ascii="Times New Roman" w:hAnsi="Times New Roman" w:cs="Times New Roman"/>
-          <w:sz w:val="18"/>
-          <w:szCs w:val="18"/>
-        </w:rPr>
-        <w:t>նպատակով</w:t>
-      </w:r>
-      <w:proofErr w:type="spellEnd"/>
-      <w:r>
-        <w:rPr>
-          <w:rFonts w:ascii="Times New Roman" w:hAnsi="Times New Roman" w:cs="Times New Roman"/>
-          <w:sz w:val="18"/>
-          <w:szCs w:val="18"/>
-        </w:rPr>
-        <w:t xml:space="preserve"> </w:t>
-      </w:r>
-      <w:proofErr w:type="spellStart"/>
-      <w:r>
-        <w:rPr>
-          <w:rFonts w:ascii="Times New Roman" w:hAnsi="Times New Roman" w:cs="Times New Roman"/>
-          <w:sz w:val="18"/>
-          <w:szCs w:val="18"/>
-        </w:rPr>
-        <w:t>պարկի</w:t>
-      </w:r>
-      <w:proofErr w:type="spellEnd"/>
-      <w:r>
-        <w:rPr>
-          <w:rFonts w:ascii="Times New Roman" w:hAnsi="Times New Roman" w:cs="Times New Roman"/>
-          <w:sz w:val="18"/>
-          <w:szCs w:val="18"/>
-        </w:rPr>
-        <w:t xml:space="preserve"> </w:t>
-      </w:r>
-      <w:proofErr w:type="spellStart"/>
-      <w:r>
-        <w:rPr>
-          <w:rFonts w:ascii="Times New Roman" w:hAnsi="Times New Roman" w:cs="Times New Roman"/>
-          <w:sz w:val="18"/>
-          <w:szCs w:val="18"/>
-        </w:rPr>
-        <w:t>բացման</w:t>
-      </w:r>
-      <w:proofErr w:type="spellEnd"/>
-      <w:r>
-        <w:rPr>
-          <w:rFonts w:ascii="Times New Roman" w:hAnsi="Times New Roman" w:cs="Times New Roman"/>
-          <w:sz w:val="18"/>
-          <w:szCs w:val="18"/>
-        </w:rPr>
-        <w:t xml:space="preserve"> </w:t>
-      </w:r>
-      <w:proofErr w:type="spellStart"/>
-      <w:r>
-        <w:rPr>
-          <w:rFonts w:ascii="Times New Roman" w:hAnsi="Times New Roman" w:cs="Times New Roman"/>
-          <w:sz w:val="18"/>
-          <w:szCs w:val="18"/>
-        </w:rPr>
-        <w:t>ամսաթիվը</w:t>
-      </w:r>
-      <w:proofErr w:type="spellEnd"/>
-      <w:r>
-        <w:rPr>
-          <w:rFonts w:ascii="Times New Roman" w:hAnsi="Times New Roman" w:cs="Times New Roman"/>
-          <w:sz w:val="18"/>
-          <w:szCs w:val="18"/>
-        </w:rPr>
-        <w:t xml:space="preserve">    __</w:t>
+      <w:r>
+        <w:rPr>
+          <w:rFonts w:ascii="Times New Roman" w:hAnsi="Times New Roman" w:cs="Times New Roman"/>
+          <w:sz w:val="18"/>
+          <w:szCs w:val="18"/>
+        </w:rPr>
+        <w:t>Ստուգման նպատակով պարկի բացման ամսաթիվը    __</w:t>
       </w:r>
       <w:r>
         <w:rPr>
@@ -11956,136 +10547,76 @@
                 <w:szCs w:val="18"/>
               </w:rPr>
             </w:pPr>
-            <w:proofErr w:type="spellStart"/>
             <w:r>
               <w:rPr>
                 <w:rFonts w:ascii="Times New Roman" w:hAnsi="Times New Roman" w:cs="Times New Roman"/>
                 <w:sz w:val="18"/>
                 <w:szCs w:val="18"/>
               </w:rPr>
-              <w:t>Գլխավոր</w:t>
-            </w:r>
-            <w:proofErr w:type="spellEnd"/>
-            <w:r>
+              <w:t>Գլխավոր տնօրեն</w:t>
+            </w:r>
+          </w:p>
+        </w:tc>
+        <w:tc>
+          <w:tcPr>
+            <w:tcW w:w="1174" w:type="dxa"/>
+          </w:tcPr>
+          <w:p>
+            <w:pPr>
+              <w:spacing w:line="276" w:lineRule="auto"/>
               <w:rPr>
                 <w:rFonts w:ascii="Times New Roman" w:hAnsi="Times New Roman" w:cs="Times New Roman"/>
                 <w:sz w:val="18"/>
                 <w:szCs w:val="18"/>
               </w:rPr>
-              <w:t xml:space="preserve"> </w:t>
-            </w:r>
-            <w:proofErr w:type="spellStart"/>
-            <w:r>
+            </w:pPr>
+          </w:p>
+        </w:tc>
+        <w:tc>
+          <w:tcPr>
+            <w:tcW w:w="2112" w:type="dxa"/>
+          </w:tcPr>
+          <w:p>
+            <w:pPr>
+              <w:spacing w:line="276" w:lineRule="auto"/>
+              <w:ind w:left="77"/>
               <w:rPr>
                 <w:rFonts w:ascii="Times New Roman" w:hAnsi="Times New Roman" w:cs="Times New Roman"/>
                 <w:sz w:val="18"/>
                 <w:szCs w:val="18"/>
               </w:rPr>
-              <w:t>տնօրեն</w:t>
-            </w:r>
-            <w:proofErr w:type="spellEnd"/>
-          </w:p>
-        </w:tc>
-        <w:tc>
-          <w:tcPr>
-            <w:tcW w:w="1174" w:type="dxa"/>
-          </w:tcPr>
-          <w:p>
-            <w:pPr>
-              <w:spacing w:line="276" w:lineRule="auto"/>
+            </w:pPr>
+            <w:r>
               <w:rPr>
                 <w:rFonts w:ascii="Times New Roman" w:hAnsi="Times New Roman" w:cs="Times New Roman"/>
                 <w:sz w:val="18"/>
                 <w:szCs w:val="18"/>
               </w:rPr>
-            </w:pPr>
-          </w:p>
-        </w:tc>
-        <w:tc>
-          <w:tcPr>
-            <w:tcW w:w="2112" w:type="dxa"/>
+              <w:t>Գրիգոր Սահականը</w:t>
+            </w:r>
+          </w:p>
+        </w:tc>
+        <w:tc>
+          <w:tcPr>
+            <w:tcW w:w="1985" w:type="dxa"/>
           </w:tcPr>
           <w:p>
             <w:pPr>
               <w:spacing w:line="276" w:lineRule="auto"/>
-              <w:ind w:left="77"/>
               <w:rPr>
                 <w:rFonts w:ascii="Times New Roman" w:hAnsi="Times New Roman" w:cs="Times New Roman"/>
                 <w:sz w:val="18"/>
                 <w:szCs w:val="18"/>
               </w:rPr>
             </w:pPr>
-            <w:proofErr w:type="spellStart"/>
             <w:r>
               <w:rPr>
                 <w:rFonts w:ascii="Times New Roman" w:hAnsi="Times New Roman" w:cs="Times New Roman"/>
                 <w:sz w:val="18"/>
                 <w:szCs w:val="18"/>
               </w:rPr>
-              <w:t>Գրիգոր</w:t>
-            </w:r>
-            <w:proofErr w:type="spellEnd"/>
-            <w:r>
-              <w:rPr>
-                <w:rFonts w:ascii="Times New Roman" w:hAnsi="Times New Roman" w:cs="Times New Roman"/>
-                <w:sz w:val="18"/>
-                <w:szCs w:val="18"/>
-              </w:rPr>
-              <w:t xml:space="preserve"> </w:t>
-            </w:r>
-            <w:proofErr w:type="spellStart"/>
-            <w:r>
-              <w:rPr>
-                <w:rFonts w:ascii="Times New Roman" w:hAnsi="Times New Roman" w:cs="Times New Roman"/>
-                <w:sz w:val="18"/>
-                <w:szCs w:val="18"/>
-              </w:rPr>
-              <w:t>Սահականը</w:t>
-            </w:r>
-            <w:proofErr w:type="spellEnd"/>
-          </w:p>
-        </w:tc>
-        <w:tc>
-          <w:tcPr>
-            <w:tcW w:w="1985" w:type="dxa"/>
-          </w:tcPr>
-          <w:p>
-            <w:pPr>
-              <w:spacing w:line="276" w:lineRule="auto"/>
-              <w:rPr>
-                <w:rFonts w:ascii="Times New Roman" w:hAnsi="Times New Roman" w:cs="Times New Roman"/>
-                <w:sz w:val="18"/>
-                <w:szCs w:val="18"/>
-              </w:rPr>
-            </w:pPr>
-            <w:proofErr w:type="spellStart"/>
-            <w:r>
-              <w:rPr>
-                <w:rFonts w:ascii="Times New Roman" w:hAnsi="Times New Roman" w:cs="Times New Roman"/>
-                <w:sz w:val="18"/>
-                <w:szCs w:val="18"/>
-              </w:rPr>
-              <w:t>Վարկային</w:t>
-            </w:r>
-            <w:proofErr w:type="spellEnd"/>
-            <w:r>
-              <w:rPr>
-                <w:rFonts w:ascii="Times New Roman" w:hAnsi="Times New Roman" w:cs="Times New Roman"/>
-                <w:sz w:val="18"/>
-                <w:szCs w:val="18"/>
-              </w:rPr>
-              <w:t xml:space="preserve"> </w:t>
-            </w:r>
-            <w:proofErr w:type="spellStart"/>
-            <w:r>
-              <w:rPr>
-                <w:rFonts w:ascii="Times New Roman" w:hAnsi="Times New Roman" w:cs="Times New Roman"/>
-                <w:sz w:val="18"/>
-                <w:szCs w:val="18"/>
-              </w:rPr>
-              <w:t>մասնագետ</w:t>
-            </w:r>
-            <w:proofErr w:type="spellEnd"/>
+              <w:t>Վարկային մասնագետ</w:t>
+            </w:r>
           </w:p>
         </w:tc>
         <w:tc>
@@ -12156,7 +10687,6 @@
                 <w:szCs w:val="18"/>
               </w:rPr>
             </w:pPr>
-            <w:proofErr w:type="spellStart"/>
             <w:r>
               <w:rPr>
                 <w:rFonts w:ascii="Times New Roman" w:hAnsi="Times New Roman" w:cs="Times New Roman"/>
@@ -12165,7 +10695,6 @@
               </w:rPr>
               <w:t>Ոսկերիչ-մասնագետ</w:t>
             </w:r>
-            <w:proofErr w:type="spellEnd"/>
           </w:p>
         </w:tc>
         <w:tc>
@@ -12258,7 +10787,6 @@
                 <w:szCs w:val="18"/>
               </w:rPr>
             </w:pPr>
-            <w:proofErr w:type="spellStart"/>
             <w:r>
               <w:rPr>
                 <w:rFonts w:ascii="Times New Roman" w:hAnsi="Times New Roman" w:cs="Times New Roman"/>
@@ -12267,7 +10795,6 @@
               </w:rPr>
               <w:t>Գրավատու</w:t>
             </w:r>
-            <w:proofErr w:type="spellEnd"/>
           </w:p>
         </w:tc>
         <w:tc>
@@ -12376,7 +10903,7 @@
               </wp:anchor>
             </w:drawing>
           </mc:Choice>
-          <mc:Fallback xmlns:w16sdtfl="http://schemas.microsoft.com/office/word/2024/wordml/sdtformatlock" xmlns:w16du="http://schemas.microsoft.com/office/word/2023/wordml/word16du">
+          <mc:Fallback xmlns:w16du="http://schemas.microsoft.com/office/word/2023/wordml/word16du" xmlns:w16sdtfl="http://schemas.microsoft.com/office/word/2024/wordml/sdtformatlock">
             <w:pict>
               <v:line w14:anchorId="58052DD5" id="Straight Connector 2" o:spid="_x0000_s1026" style="position:absolute;z-index:251661312;visibility:visible;mso-wrap-style:square;mso-wrap-distance-left:9pt;mso-wrap-distance-top:0;mso-wrap-distance-right:9pt;mso-wrap-distance-bottom:0;mso-position-horizontal:absolute;mso-position-horizontal-relative:text;mso-position-vertical:absolute;mso-position-vertical-relative:text" from="0,13.4pt" to="491.7pt,13.4pt" o:gfxdata="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" strokecolor="black [3213]" strokeweight="1.25pt">
                 <v:stroke linestyle="thinThick" joinstyle="miter"/>
@@ -12401,7 +10928,6 @@
           <w:lang w:val="en-GB"/>
         </w:rPr>
       </w:pPr>
-      <w:proofErr w:type="spellStart"/>
       <w:r>
         <w:rPr>
           <w:rFonts w:ascii="Times New Roman" w:hAnsi="Times New Roman" w:cs="Times New Roman"/>
@@ -12413,37 +10939,8 @@
           <w:szCs w:val="18"/>
           <w:lang w:val="en-GB"/>
         </w:rPr>
-        <w:t>Վերադարձման</w:t>
-      </w:r>
-      <w:proofErr w:type="spellEnd"/>
-      <w:r>
-        <w:rPr>
-          <w:rFonts w:ascii="Times New Roman" w:hAnsi="Times New Roman" w:cs="Times New Roman"/>
-          <w:b/>
-          <w:bCs/>
-          <w:i/>
-          <w:iCs/>
-          <w:sz w:val="18"/>
-          <w:szCs w:val="18"/>
-          <w:lang w:val="en-GB"/>
-        </w:rPr>
-        <w:t xml:space="preserve"> </w:t>
-      </w:r>
-      <w:proofErr w:type="spellStart"/>
-      <w:r>
-        <w:rPr>
-          <w:rFonts w:ascii="Times New Roman" w:hAnsi="Times New Roman" w:cs="Times New Roman"/>
-          <w:b/>
-          <w:bCs/>
-          <w:i/>
-          <w:iCs/>
-          <w:sz w:val="18"/>
-          <w:szCs w:val="18"/>
-          <w:lang w:val="en-GB"/>
-        </w:rPr>
-        <w:t>ակտ</w:t>
-      </w:r>
-      <w:proofErr w:type="spellEnd"/>
+        <w:t>Վերադարձման ակտ</w:t>
+      </w:r>
     </w:p>
     <w:p>
       <w:pPr>
@@ -12468,204 +10965,19 @@
           <w:szCs w:val="22"/>
         </w:rPr>
       </w:pPr>
-      <w:proofErr w:type="spellStart"/>
       <w:r>
         <w:rPr>
           <w:sz w:val="18"/>
           <w:szCs w:val="22"/>
         </w:rPr>
-        <w:t>Գրավի</w:t>
-      </w:r>
-      <w:proofErr w:type="spellEnd"/>
+        <w:t>Գրավի ստուգման և Ընդունման-Հանձնման ակտ</w:t>
+      </w:r>
       <w:r>
         <w:rPr>
           <w:sz w:val="18"/>
           <w:szCs w:val="22"/>
         </w:rPr>
-        <w:t xml:space="preserve"> </w:t>
-      </w:r>
-      <w:proofErr w:type="spellStart"/>
-      <w:r>
-        <w:rPr>
-          <w:sz w:val="18"/>
-          <w:szCs w:val="22"/>
-        </w:rPr>
-        <w:t>ստուգման</w:t>
-      </w:r>
-      <w:proofErr w:type="spellEnd"/>
-      <w:r>
-        <w:rPr>
-          <w:sz w:val="18"/>
-          <w:szCs w:val="22"/>
-        </w:rPr>
-        <w:t xml:space="preserve"> և </w:t>
-      </w:r>
-      <w:proofErr w:type="spellStart"/>
-      <w:r>
-        <w:rPr>
-          <w:sz w:val="18"/>
-          <w:szCs w:val="22"/>
-        </w:rPr>
-        <w:t>Ընդունման-Հանձնման</w:t>
-      </w:r>
-      <w:proofErr w:type="spellEnd"/>
-      <w:r>
-        <w:rPr>
-          <w:sz w:val="18"/>
-          <w:szCs w:val="22"/>
-        </w:rPr>
-        <w:t xml:space="preserve"> </w:t>
-      </w:r>
-      <w:proofErr w:type="spellStart"/>
-      <w:r>
-        <w:rPr>
-          <w:sz w:val="18"/>
-          <w:szCs w:val="22"/>
-        </w:rPr>
-        <w:t>ակտ</w:t>
-      </w:r>
-      <w:r>
-        <w:rPr>
-          <w:sz w:val="18"/>
-          <w:szCs w:val="22"/>
-        </w:rPr>
-        <w:t>ում</w:t>
-      </w:r>
-      <w:proofErr w:type="spellEnd"/>
-      <w:r>
-        <w:rPr>
-          <w:sz w:val="18"/>
-          <w:szCs w:val="22"/>
-        </w:rPr>
-        <w:t xml:space="preserve"> </w:t>
-      </w:r>
-      <w:proofErr w:type="spellStart"/>
-      <w:r>
-        <w:rPr>
-          <w:sz w:val="18"/>
-          <w:szCs w:val="22"/>
-        </w:rPr>
-        <w:t>նշված</w:t>
-      </w:r>
-      <w:proofErr w:type="spellEnd"/>
-      <w:r>
-        <w:rPr>
-          <w:sz w:val="18"/>
-          <w:szCs w:val="22"/>
-        </w:rPr>
-        <w:t xml:space="preserve"> </w:t>
-      </w:r>
-      <w:proofErr w:type="spellStart"/>
-      <w:r>
-        <w:rPr>
-          <w:sz w:val="18"/>
-          <w:szCs w:val="22"/>
-        </w:rPr>
-        <w:t>Ոսկյա</w:t>
-      </w:r>
-      <w:proofErr w:type="spellEnd"/>
-      <w:r>
-        <w:rPr>
-          <w:sz w:val="18"/>
-          <w:szCs w:val="22"/>
-        </w:rPr>
-        <w:t xml:space="preserve"> </w:t>
-      </w:r>
-      <w:proofErr w:type="spellStart"/>
-      <w:r>
-        <w:rPr>
-          <w:sz w:val="18"/>
-          <w:szCs w:val="22"/>
-        </w:rPr>
-        <w:t>իրերը</w:t>
-      </w:r>
-      <w:proofErr w:type="spellEnd"/>
-      <w:r>
-        <w:rPr>
-          <w:sz w:val="18"/>
-          <w:szCs w:val="22"/>
-        </w:rPr>
-        <w:t xml:space="preserve"> </w:t>
-      </w:r>
-      <w:proofErr w:type="spellStart"/>
-      <w:r>
-        <w:rPr>
-          <w:sz w:val="18"/>
-          <w:szCs w:val="22"/>
-        </w:rPr>
-        <w:t>Գրավառուն</w:t>
-      </w:r>
-      <w:proofErr w:type="spellEnd"/>
-      <w:r>
-        <w:rPr>
-          <w:sz w:val="18"/>
-          <w:szCs w:val="22"/>
-        </w:rPr>
-        <w:t xml:space="preserve"> </w:t>
-      </w:r>
-      <w:proofErr w:type="spellStart"/>
-      <w:r>
-        <w:rPr>
-          <w:sz w:val="18"/>
-          <w:szCs w:val="22"/>
-        </w:rPr>
-        <w:t>ամբողջությամբ</w:t>
-      </w:r>
-      <w:proofErr w:type="spellEnd"/>
-      <w:r>
-        <w:rPr>
-          <w:sz w:val="18"/>
-          <w:szCs w:val="22"/>
-        </w:rPr>
-        <w:t xml:space="preserve">, </w:t>
-      </w:r>
-      <w:proofErr w:type="spellStart"/>
-      <w:r>
-        <w:rPr>
-          <w:sz w:val="18"/>
-          <w:szCs w:val="22"/>
-        </w:rPr>
-        <w:t>անվնաս</w:t>
-      </w:r>
-      <w:proofErr w:type="spellEnd"/>
-      <w:r>
-        <w:rPr>
-          <w:sz w:val="18"/>
-          <w:szCs w:val="22"/>
-        </w:rPr>
-        <w:t xml:space="preserve"> </w:t>
-      </w:r>
-      <w:proofErr w:type="spellStart"/>
-      <w:r>
-        <w:rPr>
-          <w:sz w:val="18"/>
-          <w:szCs w:val="22"/>
-        </w:rPr>
-        <w:t>հանձնեց</w:t>
-      </w:r>
-      <w:proofErr w:type="spellEnd"/>
-      <w:r>
-        <w:rPr>
-          <w:sz w:val="18"/>
-          <w:szCs w:val="22"/>
-        </w:rPr>
-        <w:t xml:space="preserve"> </w:t>
-      </w:r>
-      <w:proofErr w:type="spellStart"/>
-      <w:r>
-        <w:rPr>
-          <w:sz w:val="18"/>
-          <w:szCs w:val="22"/>
-        </w:rPr>
-        <w:t>Գրավատուին</w:t>
-      </w:r>
-      <w:proofErr w:type="spellEnd"/>
-      <w:r>
-        <w:rPr>
-          <w:sz w:val="18"/>
-          <w:szCs w:val="22"/>
-        </w:rPr>
-        <w:t xml:space="preserve">։ </w:t>
+        <w:t xml:space="preserve">ում նշված Ոսկյա իրերը Գրավառուն ամբողջությամբ, անվնաս հանձնեց Գրավատուին։ </w:t>
       </w:r>
     </w:p>
     <w:p>
@@ -12681,101 +10993,12 @@
           <w:szCs w:val="22"/>
         </w:rPr>
       </w:pPr>
-      <w:proofErr w:type="spellStart"/>
       <w:r>
         <w:rPr>
           <w:sz w:val="18"/>
           <w:szCs w:val="22"/>
         </w:rPr>
-        <w:t>Գրավատուն</w:t>
-      </w:r>
-      <w:proofErr w:type="spellEnd"/>
-      <w:r>
-        <w:rPr>
-          <w:sz w:val="18"/>
-          <w:szCs w:val="22"/>
-        </w:rPr>
-        <w:t xml:space="preserve"> </w:t>
-      </w:r>
-      <w:proofErr w:type="spellStart"/>
-      <w:r>
-        <w:rPr>
-          <w:sz w:val="18"/>
-          <w:szCs w:val="22"/>
-        </w:rPr>
-        <w:t>հավաստիացնում</w:t>
-      </w:r>
-      <w:proofErr w:type="spellEnd"/>
-      <w:r>
-        <w:rPr>
-          <w:sz w:val="18"/>
-          <w:szCs w:val="22"/>
-        </w:rPr>
-        <w:t xml:space="preserve"> է, </w:t>
-      </w:r>
-      <w:proofErr w:type="spellStart"/>
-      <w:r>
-        <w:rPr>
-          <w:sz w:val="18"/>
-          <w:szCs w:val="22"/>
-        </w:rPr>
-        <w:t>որ</w:t>
-      </w:r>
-      <w:proofErr w:type="spellEnd"/>
-      <w:r>
-        <w:rPr>
-          <w:sz w:val="18"/>
-          <w:szCs w:val="22"/>
-        </w:rPr>
-        <w:t xml:space="preserve"> </w:t>
-      </w:r>
-      <w:proofErr w:type="spellStart"/>
-      <w:r>
-        <w:rPr>
-          <w:sz w:val="18"/>
-          <w:szCs w:val="22"/>
-        </w:rPr>
-        <w:t>չունի</w:t>
-      </w:r>
-      <w:proofErr w:type="spellEnd"/>
-      <w:r>
-        <w:rPr>
-          <w:sz w:val="18"/>
-          <w:szCs w:val="22"/>
-        </w:rPr>
-        <w:t xml:space="preserve"> </w:t>
-      </w:r>
-      <w:proofErr w:type="spellStart"/>
-      <w:r>
-        <w:rPr>
-          <w:sz w:val="18"/>
-          <w:szCs w:val="22"/>
-        </w:rPr>
-        <w:t>որևէ</w:t>
-      </w:r>
-      <w:proofErr w:type="spellEnd"/>
-      <w:r>
-        <w:rPr>
-          <w:sz w:val="18"/>
-          <w:szCs w:val="22"/>
-        </w:rPr>
-        <w:t xml:space="preserve"> </w:t>
-      </w:r>
-      <w:proofErr w:type="spellStart"/>
-      <w:r>
-        <w:rPr>
-          <w:sz w:val="18"/>
-          <w:szCs w:val="22"/>
-        </w:rPr>
-        <w:t>պահանջ</w:t>
-      </w:r>
-      <w:proofErr w:type="spellEnd"/>
-      <w:r>
-        <w:rPr>
-          <w:sz w:val="18"/>
-          <w:szCs w:val="22"/>
-        </w:rPr>
-        <w:t xml:space="preserve">։ </w:t>
+        <w:t xml:space="preserve">Գրավատուն հավաստիացնում է, որ չունի որևէ պահանջ։ </w:t>
       </w:r>
     </w:p>
     <w:p>
@@ -12817,51 +11040,39 @@
                 <w:szCs w:val="18"/>
               </w:rPr>
             </w:pPr>
-            <w:proofErr w:type="spellStart"/>
             <w:r>
               <w:rPr>
                 <w:rFonts w:ascii="Times New Roman" w:hAnsi="Times New Roman" w:cs="Times New Roman"/>
                 <w:sz w:val="18"/>
                 <w:szCs w:val="18"/>
               </w:rPr>
-              <w:t>Հանձնեց</w:t>
-            </w:r>
-            <w:proofErr w:type="spellEnd"/>
-            <w:r>
+              <w:t>Հանձնեց՝</w:t>
+            </w:r>
+          </w:p>
+        </w:tc>
+      </w:tr>
+      <w:tr>
+        <w:tc>
+          <w:tcPr>
+            <w:tcW w:w="1817" w:type="dxa"/>
+          </w:tcPr>
+          <w:p>
+            <w:pPr>
+              <w:spacing w:line="276" w:lineRule="auto"/>
               <w:rPr>
                 <w:rFonts w:ascii="Times New Roman" w:hAnsi="Times New Roman" w:cs="Times New Roman"/>
                 <w:sz w:val="18"/>
                 <w:szCs w:val="18"/>
               </w:rPr>
-              <w:t>՝</w:t>
-            </w:r>
-          </w:p>
-        </w:tc>
-      </w:tr>
-      <w:tr>
-        <w:tc>
-          <w:tcPr>
-            <w:tcW w:w="1817" w:type="dxa"/>
-          </w:tcPr>
-          <w:p>
-            <w:pPr>
-              <w:spacing w:line="276" w:lineRule="auto"/>
+            </w:pPr>
+            <w:r>
               <w:rPr>
                 <w:rFonts w:ascii="Times New Roman" w:hAnsi="Times New Roman" w:cs="Times New Roman"/>
                 <w:sz w:val="18"/>
                 <w:szCs w:val="18"/>
               </w:rPr>
-            </w:pPr>
-            <w:proofErr w:type="spellStart"/>
-            <w:r>
-              <w:rPr>
-                <w:rFonts w:ascii="Times New Roman" w:hAnsi="Times New Roman" w:cs="Times New Roman"/>
-                <w:sz w:val="18"/>
-                <w:szCs w:val="18"/>
-              </w:rPr>
               <w:t>Ոսկերիչ-մասնագետ</w:t>
             </w:r>
-            <w:proofErr w:type="spellEnd"/>
           </w:p>
         </w:tc>
         <w:tc>
@@ -12917,7 +11128,6 @@
           <w:lang w:val="en-GB"/>
         </w:rPr>
       </w:pPr>
-      <w:proofErr w:type="spellStart"/>
       <w:r>
         <w:rPr>
           <w:rFonts w:ascii="Times New Roman" w:hAnsi="Times New Roman" w:cs="Times New Roman"/>
@@ -12926,7 +11136,6 @@
         </w:rPr>
         <w:t>Ես</w:t>
       </w:r>
-      <w:proofErr w:type="spellEnd"/>
       <w:r>
         <w:rPr>
           <w:rFonts w:ascii="Times New Roman" w:hAnsi="Times New Roman" w:cs="Times New Roman"/>
@@ -12942,347 +11151,7 @@
           <w:szCs w:val="18"/>
           <w:lang w:val="en-GB"/>
         </w:rPr>
-        <w:t xml:space="preserve">_____________________________________________________, </w:t>
-      </w:r>
-      <w:proofErr w:type="spellStart"/>
-      <w:r>
-        <w:rPr>
-          <w:rFonts w:ascii="Times New Roman" w:hAnsi="Times New Roman" w:cs="Times New Roman"/>
-          <w:sz w:val="18"/>
-          <w:szCs w:val="18"/>
-          <w:lang w:val="en-GB"/>
-        </w:rPr>
-        <w:t>ստացա</w:t>
-      </w:r>
-      <w:proofErr w:type="spellEnd"/>
-      <w:r>
-        <w:rPr>
-          <w:rFonts w:ascii="Times New Roman" w:hAnsi="Times New Roman" w:cs="Times New Roman"/>
-          <w:sz w:val="18"/>
-          <w:szCs w:val="18"/>
-          <w:lang w:val="en-GB"/>
-        </w:rPr>
-        <w:t xml:space="preserve"> </w:t>
-      </w:r>
-      <w:proofErr w:type="spellStart"/>
-      <w:r>
-        <w:rPr>
-          <w:rFonts w:ascii="Times New Roman" w:hAnsi="Times New Roman" w:cs="Times New Roman"/>
-          <w:sz w:val="18"/>
-          <w:szCs w:val="18"/>
-          <w:lang w:val="en-GB"/>
-        </w:rPr>
-        <w:t>Գրավի</w:t>
-      </w:r>
-      <w:proofErr w:type="spellEnd"/>
-      <w:r>
-        <w:rPr>
-          <w:rFonts w:ascii="Times New Roman" w:hAnsi="Times New Roman" w:cs="Times New Roman"/>
-          <w:sz w:val="18"/>
-          <w:szCs w:val="18"/>
-          <w:lang w:val="en-GB"/>
-        </w:rPr>
-        <w:t xml:space="preserve"> </w:t>
-      </w:r>
-      <w:proofErr w:type="spellStart"/>
-      <w:r>
-        <w:rPr>
-          <w:rFonts w:ascii="Times New Roman" w:hAnsi="Times New Roman" w:cs="Times New Roman"/>
-          <w:sz w:val="18"/>
-          <w:szCs w:val="18"/>
-          <w:lang w:val="en-GB"/>
-        </w:rPr>
-        <w:t>առարկան</w:t>
-      </w:r>
-      <w:proofErr w:type="spellEnd"/>
-      <w:r>
-        <w:rPr>
-          <w:rFonts w:ascii="Times New Roman" w:hAnsi="Times New Roman" w:cs="Times New Roman"/>
-          <w:sz w:val="18"/>
-          <w:szCs w:val="18"/>
-          <w:lang w:val="en-GB"/>
-        </w:rPr>
-        <w:t xml:space="preserve"> </w:t>
-      </w:r>
-      <w:proofErr w:type="spellStart"/>
-      <w:r>
-        <w:rPr>
-          <w:rFonts w:ascii="Times New Roman" w:hAnsi="Times New Roman" w:cs="Times New Roman"/>
-          <w:sz w:val="18"/>
-          <w:szCs w:val="18"/>
-          <w:lang w:val="en-GB"/>
-        </w:rPr>
-        <w:t>ամբողջությամբ</w:t>
-      </w:r>
-      <w:proofErr w:type="spellEnd"/>
-      <w:r>
-        <w:rPr>
-          <w:rFonts w:ascii="Times New Roman" w:hAnsi="Times New Roman" w:cs="Times New Roman"/>
-          <w:sz w:val="18"/>
-          <w:szCs w:val="18"/>
-          <w:lang w:val="en-GB"/>
-        </w:rPr>
-        <w:t xml:space="preserve">, </w:t>
-      </w:r>
-      <w:proofErr w:type="spellStart"/>
-      <w:r>
-        <w:rPr>
-          <w:rFonts w:ascii="Times New Roman" w:hAnsi="Times New Roman" w:cs="Times New Roman"/>
-          <w:sz w:val="18"/>
-          <w:szCs w:val="18"/>
-          <w:lang w:val="en-GB"/>
-        </w:rPr>
-        <w:t>այն</w:t>
-      </w:r>
-      <w:proofErr w:type="spellEnd"/>
-      <w:r>
-        <w:rPr>
-          <w:rFonts w:ascii="Times New Roman" w:hAnsi="Times New Roman" w:cs="Times New Roman"/>
-          <w:sz w:val="18"/>
-          <w:szCs w:val="18"/>
-          <w:lang w:val="en-GB"/>
-        </w:rPr>
-        <w:t xml:space="preserve"> </w:t>
-      </w:r>
-      <w:proofErr w:type="spellStart"/>
-      <w:r>
-        <w:rPr>
-          <w:rFonts w:ascii="Times New Roman" w:hAnsi="Times New Roman" w:cs="Times New Roman"/>
-          <w:sz w:val="18"/>
-          <w:szCs w:val="18"/>
-          <w:lang w:val="en-GB"/>
-        </w:rPr>
-        <w:t>վիճակում</w:t>
-      </w:r>
-      <w:proofErr w:type="spellEnd"/>
-      <w:r>
-        <w:rPr>
-          <w:rFonts w:ascii="Times New Roman" w:hAnsi="Times New Roman" w:cs="Times New Roman"/>
-          <w:sz w:val="18"/>
-          <w:szCs w:val="18"/>
-          <w:lang w:val="en-GB"/>
-        </w:rPr>
-        <w:t xml:space="preserve">, </w:t>
-      </w:r>
-      <w:proofErr w:type="spellStart"/>
-      <w:r>
-        <w:rPr>
-          <w:rFonts w:ascii="Times New Roman" w:hAnsi="Times New Roman" w:cs="Times New Roman"/>
-          <w:sz w:val="18"/>
-          <w:szCs w:val="18"/>
-          <w:lang w:val="en-GB"/>
-        </w:rPr>
-        <w:t>ինչպես</w:t>
-      </w:r>
-      <w:proofErr w:type="spellEnd"/>
-      <w:r>
-        <w:rPr>
-          <w:rFonts w:ascii="Times New Roman" w:hAnsi="Times New Roman" w:cs="Times New Roman"/>
-          <w:sz w:val="18"/>
-          <w:szCs w:val="18"/>
-          <w:lang w:val="en-GB"/>
-        </w:rPr>
-        <w:t xml:space="preserve"> </w:t>
-      </w:r>
-      <w:proofErr w:type="spellStart"/>
-      <w:r>
-        <w:rPr>
-          <w:rFonts w:ascii="Times New Roman" w:hAnsi="Times New Roman" w:cs="Times New Roman"/>
-          <w:sz w:val="18"/>
-          <w:szCs w:val="18"/>
-          <w:lang w:val="en-GB"/>
-        </w:rPr>
-        <w:t>հանձնել</w:t>
-      </w:r>
-      <w:proofErr w:type="spellEnd"/>
-      <w:r>
-        <w:rPr>
-          <w:rFonts w:ascii="Times New Roman" w:hAnsi="Times New Roman" w:cs="Times New Roman"/>
-          <w:sz w:val="18"/>
-          <w:szCs w:val="18"/>
-          <w:lang w:val="en-GB"/>
-        </w:rPr>
-        <w:t xml:space="preserve"> </w:t>
-      </w:r>
-      <w:proofErr w:type="spellStart"/>
-      <w:r>
-        <w:rPr>
-          <w:rFonts w:ascii="Times New Roman" w:hAnsi="Times New Roman" w:cs="Times New Roman"/>
-          <w:sz w:val="18"/>
-          <w:szCs w:val="18"/>
-          <w:lang w:val="en-GB"/>
-        </w:rPr>
-        <w:t>եմ</w:t>
-      </w:r>
-      <w:proofErr w:type="spellEnd"/>
-      <w:r>
-        <w:rPr>
-          <w:rFonts w:ascii="Times New Roman" w:hAnsi="Times New Roman" w:cs="Times New Roman"/>
-          <w:sz w:val="18"/>
-          <w:szCs w:val="18"/>
-          <w:lang w:val="en-GB"/>
-        </w:rPr>
-        <w:t xml:space="preserve"> </w:t>
-      </w:r>
-      <w:proofErr w:type="spellStart"/>
-      <w:r>
-        <w:rPr>
-          <w:rFonts w:ascii="Times New Roman" w:hAnsi="Times New Roman" w:cs="Times New Roman"/>
-          <w:sz w:val="18"/>
-          <w:szCs w:val="18"/>
-          <w:lang w:val="en-GB"/>
-        </w:rPr>
-        <w:t>Գրավի</w:t>
-      </w:r>
-      <w:proofErr w:type="spellEnd"/>
-      <w:r>
-        <w:rPr>
-          <w:rFonts w:ascii="Times New Roman" w:hAnsi="Times New Roman" w:cs="Times New Roman"/>
-          <w:sz w:val="18"/>
-          <w:szCs w:val="18"/>
-          <w:lang w:val="en-GB"/>
-        </w:rPr>
-        <w:t xml:space="preserve"> </w:t>
-      </w:r>
-      <w:proofErr w:type="spellStart"/>
-      <w:r>
-        <w:rPr>
-          <w:rFonts w:ascii="Times New Roman" w:hAnsi="Times New Roman" w:cs="Times New Roman"/>
-          <w:sz w:val="18"/>
-          <w:szCs w:val="18"/>
-          <w:lang w:val="en-GB"/>
-        </w:rPr>
-        <w:t>ստուգման</w:t>
-      </w:r>
-      <w:proofErr w:type="spellEnd"/>
-      <w:r>
-        <w:rPr>
-          <w:rFonts w:ascii="Times New Roman" w:hAnsi="Times New Roman" w:cs="Times New Roman"/>
-          <w:sz w:val="18"/>
-          <w:szCs w:val="18"/>
-          <w:lang w:val="en-GB"/>
-        </w:rPr>
-        <w:t xml:space="preserve"> և </w:t>
-      </w:r>
-      <w:proofErr w:type="spellStart"/>
-      <w:r>
-        <w:rPr>
-          <w:rFonts w:ascii="Times New Roman" w:hAnsi="Times New Roman" w:cs="Times New Roman"/>
-          <w:sz w:val="18"/>
-          <w:szCs w:val="18"/>
-          <w:lang w:val="en-GB"/>
-        </w:rPr>
-        <w:t>Ընդունման-Հանձնման</w:t>
-      </w:r>
-      <w:proofErr w:type="spellEnd"/>
-      <w:r>
-        <w:rPr>
-          <w:rFonts w:ascii="Times New Roman" w:hAnsi="Times New Roman" w:cs="Times New Roman"/>
-          <w:sz w:val="18"/>
-          <w:szCs w:val="18"/>
-          <w:lang w:val="en-GB"/>
-        </w:rPr>
-        <w:t xml:space="preserve"> </w:t>
-      </w:r>
-      <w:proofErr w:type="spellStart"/>
-      <w:r>
-        <w:rPr>
-          <w:rFonts w:ascii="Times New Roman" w:hAnsi="Times New Roman" w:cs="Times New Roman"/>
-          <w:sz w:val="18"/>
-          <w:szCs w:val="18"/>
-          <w:lang w:val="en-GB"/>
-        </w:rPr>
-        <w:t>ակտով</w:t>
-      </w:r>
-      <w:proofErr w:type="spellEnd"/>
-      <w:r>
-        <w:rPr>
-          <w:rFonts w:ascii="Times New Roman" w:hAnsi="Times New Roman" w:cs="Times New Roman"/>
-          <w:sz w:val="18"/>
-          <w:szCs w:val="18"/>
-          <w:lang w:val="en-GB"/>
-        </w:rPr>
-        <w:t xml:space="preserve">, </w:t>
-      </w:r>
-      <w:proofErr w:type="spellStart"/>
-      <w:r>
-        <w:rPr>
-          <w:rFonts w:ascii="Times New Roman" w:hAnsi="Times New Roman" w:cs="Times New Roman"/>
-          <w:sz w:val="18"/>
-          <w:szCs w:val="18"/>
-          <w:lang w:val="en-GB"/>
-        </w:rPr>
-        <w:t>որի</w:t>
-      </w:r>
-      <w:proofErr w:type="spellEnd"/>
-      <w:r>
-        <w:rPr>
-          <w:rFonts w:ascii="Times New Roman" w:hAnsi="Times New Roman" w:cs="Times New Roman"/>
-          <w:sz w:val="18"/>
-          <w:szCs w:val="18"/>
-          <w:lang w:val="en-GB"/>
-        </w:rPr>
-        <w:t xml:space="preserve"> </w:t>
-      </w:r>
-      <w:proofErr w:type="spellStart"/>
-      <w:r>
-        <w:rPr>
-          <w:rFonts w:ascii="Times New Roman" w:hAnsi="Times New Roman" w:cs="Times New Roman"/>
-          <w:sz w:val="18"/>
-          <w:szCs w:val="18"/>
-          <w:lang w:val="en-GB"/>
-        </w:rPr>
-        <w:t>համար</w:t>
-      </w:r>
-      <w:proofErr w:type="spellEnd"/>
-      <w:r>
-        <w:rPr>
-          <w:rFonts w:ascii="Times New Roman" w:hAnsi="Times New Roman" w:cs="Times New Roman"/>
-          <w:sz w:val="18"/>
-          <w:szCs w:val="18"/>
-          <w:lang w:val="en-GB"/>
-        </w:rPr>
-        <w:t xml:space="preserve"> </w:t>
-      </w:r>
-      <w:proofErr w:type="spellStart"/>
-      <w:r>
-        <w:rPr>
-          <w:rFonts w:ascii="Times New Roman" w:hAnsi="Times New Roman" w:cs="Times New Roman"/>
-          <w:sz w:val="18"/>
-          <w:szCs w:val="18"/>
-          <w:lang w:val="en-GB"/>
-        </w:rPr>
-        <w:t>ստորագրում</w:t>
-      </w:r>
-      <w:proofErr w:type="spellEnd"/>
-      <w:r>
-        <w:rPr>
-          <w:rFonts w:ascii="Times New Roman" w:hAnsi="Times New Roman" w:cs="Times New Roman"/>
-          <w:sz w:val="18"/>
-          <w:szCs w:val="18"/>
-          <w:lang w:val="en-GB"/>
-        </w:rPr>
-        <w:t xml:space="preserve"> </w:t>
-      </w:r>
-      <w:proofErr w:type="spellStart"/>
-      <w:r>
-        <w:rPr>
-          <w:rFonts w:ascii="Times New Roman" w:hAnsi="Times New Roman" w:cs="Times New Roman"/>
-          <w:sz w:val="18"/>
-          <w:szCs w:val="18"/>
-          <w:lang w:val="en-GB"/>
-        </w:rPr>
-        <w:t>եմ</w:t>
-      </w:r>
-      <w:proofErr w:type="spellEnd"/>
-      <w:r>
-        <w:rPr>
-          <w:rFonts w:ascii="Times New Roman" w:hAnsi="Times New Roman" w:cs="Times New Roman"/>
-          <w:sz w:val="18"/>
-          <w:szCs w:val="18"/>
-          <w:lang w:val="en-GB"/>
-        </w:rPr>
-        <w:t xml:space="preserve">։ </w:t>
+        <w:t xml:space="preserve">_____________________________________________________, ստացա Գրավի առարկան ամբողջությամբ, այն վիճակում, ինչպես հանձնել եմ Գրավի ստուգման և Ընդունման-Հանձնման ակտով, որի համար ստորագրում եմ։ </w:t>
       </w:r>
     </w:p>
     <w:tbl>
@@ -13319,51 +11188,39 @@
                 <w:szCs w:val="18"/>
               </w:rPr>
             </w:pPr>
-            <w:proofErr w:type="spellStart"/>
             <w:r>
               <w:rPr>
                 <w:rFonts w:ascii="Times New Roman" w:hAnsi="Times New Roman" w:cs="Times New Roman"/>
                 <w:sz w:val="18"/>
                 <w:szCs w:val="18"/>
               </w:rPr>
-              <w:t>Ընդունեց</w:t>
-            </w:r>
-            <w:proofErr w:type="spellEnd"/>
-            <w:r>
+              <w:t xml:space="preserve">Ընդունեց՝      </w:t>
+            </w:r>
+          </w:p>
+        </w:tc>
+      </w:tr>
+      <w:tr>
+        <w:tc>
+          <w:tcPr>
+            <w:tcW w:w="1120" w:type="dxa"/>
+          </w:tcPr>
+          <w:p>
+            <w:pPr>
+              <w:spacing w:line="276" w:lineRule="auto"/>
               <w:rPr>
                 <w:rFonts w:ascii="Times New Roman" w:hAnsi="Times New Roman" w:cs="Times New Roman"/>
                 <w:sz w:val="18"/>
                 <w:szCs w:val="18"/>
               </w:rPr>
-              <w:t xml:space="preserve">՝      </w:t>
-            </w:r>
-          </w:p>
-        </w:tc>
-      </w:tr>
-      <w:tr>
-        <w:tc>
-          <w:tcPr>
-            <w:tcW w:w="1120" w:type="dxa"/>
-          </w:tcPr>
-          <w:p>
-            <w:pPr>
-              <w:spacing w:line="276" w:lineRule="auto"/>
+            </w:pPr>
+            <w:r>
               <w:rPr>
                 <w:rFonts w:ascii="Times New Roman" w:hAnsi="Times New Roman" w:cs="Times New Roman"/>
                 <w:sz w:val="18"/>
                 <w:szCs w:val="18"/>
               </w:rPr>
-            </w:pPr>
-            <w:proofErr w:type="spellStart"/>
-            <w:r>
-              <w:rPr>
-                <w:rFonts w:ascii="Times New Roman" w:hAnsi="Times New Roman" w:cs="Times New Roman"/>
-                <w:sz w:val="18"/>
-                <w:szCs w:val="18"/>
-              </w:rPr>
               <w:t>Գրավատու</w:t>
             </w:r>
-            <w:proofErr w:type="spellEnd"/>
           </w:p>
         </w:tc>
         <w:tc>

</xml_diff>

<commit_message>
fix gold contract template
</commit_message>
<xml_diff>
--- a/public/files/contract_gold_template.docx
+++ b/public/files/contract_gold_template.docx
@@ -154,33 +154,7 @@
           <w:color w:val="000000" w:themeColor="text1"/>
           <w:lang w:val="en-GB"/>
         </w:rPr>
-        <w:t>${</w:t>
-      </w:r>
-      <w:proofErr w:type="spellStart"/>
-      <w:r>
-        <w:rPr>
-          <w:rFonts w:ascii="Times New Roman" w:eastAsia="Times New Roman" w:hAnsi="Times New Roman" w:cs="Times New Roman"/>
-          <w:b/>
-          <w:bCs/>
-          <w:i/>
-          <w:iCs/>
-          <w:color w:val="000000" w:themeColor="text1"/>
-          <w:lang w:val="en-GB"/>
-        </w:rPr>
-        <w:t>num</w:t>
-      </w:r>
-      <w:proofErr w:type="spellEnd"/>
-      <w:r>
-        <w:rPr>
-          <w:rFonts w:ascii="Times New Roman" w:eastAsia="Times New Roman" w:hAnsi="Times New Roman" w:cs="Times New Roman"/>
-          <w:b/>
-          <w:bCs/>
-          <w:i/>
-          <w:iCs/>
-          <w:color w:val="000000" w:themeColor="text1"/>
-          <w:lang w:val="en-GB"/>
-        </w:rPr>
-        <w:t>}</w:t>
+        <w:t>${num}</w:t>
       </w:r>
     </w:p>
     <w:tbl>
@@ -397,86 +371,8 @@
           <w:szCs w:val="18"/>
           <w:lang w:val="en-GB"/>
         </w:rPr>
-        <w:t xml:space="preserve">53 </w:t>
-      </w:r>
-      <w:proofErr w:type="spellStart"/>
-      <w:r>
-        <w:rPr>
-          <w:rFonts w:ascii="Times New Roman" w:eastAsia="Times New Roman" w:hAnsi="Times New Roman" w:cs="Times New Roman"/>
-          <w:color w:val="000000" w:themeColor="text1"/>
-          <w:sz w:val="18"/>
-          <w:szCs w:val="18"/>
-          <w:lang w:val="en-GB"/>
-        </w:rPr>
-        <w:t>շենք</w:t>
-      </w:r>
-      <w:proofErr w:type="spellEnd"/>
-      <w:r>
-        <w:rPr>
-          <w:rFonts w:ascii="Times New Roman" w:eastAsia="Times New Roman" w:hAnsi="Times New Roman" w:cs="Times New Roman"/>
-          <w:color w:val="000000" w:themeColor="text1"/>
-          <w:sz w:val="18"/>
-          <w:szCs w:val="18"/>
-          <w:lang w:val="en-GB"/>
-        </w:rPr>
-        <w:t xml:space="preserve">, 35 </w:t>
-      </w:r>
-      <w:proofErr w:type="spellStart"/>
-      <w:r>
-        <w:rPr>
-          <w:rFonts w:ascii="Times New Roman" w:eastAsia="Times New Roman" w:hAnsi="Times New Roman" w:cs="Times New Roman"/>
-          <w:color w:val="000000" w:themeColor="text1"/>
-          <w:sz w:val="18"/>
-          <w:szCs w:val="18"/>
-          <w:lang w:val="en-GB"/>
-        </w:rPr>
-        <w:t>ոչ</w:t>
-      </w:r>
-      <w:proofErr w:type="spellEnd"/>
-      <w:r>
-        <w:rPr>
-          <w:rFonts w:ascii="Times New Roman" w:eastAsia="Times New Roman" w:hAnsi="Times New Roman" w:cs="Times New Roman"/>
-          <w:color w:val="000000" w:themeColor="text1"/>
-          <w:sz w:val="18"/>
-          <w:szCs w:val="18"/>
-          <w:lang w:val="en-GB"/>
-        </w:rPr>
-        <w:t xml:space="preserve"> </w:t>
-      </w:r>
-      <w:proofErr w:type="spellStart"/>
-      <w:r>
-        <w:rPr>
-          <w:rFonts w:ascii="Times New Roman" w:eastAsia="Times New Roman" w:hAnsi="Times New Roman" w:cs="Times New Roman"/>
-          <w:color w:val="000000" w:themeColor="text1"/>
-          <w:sz w:val="18"/>
-          <w:szCs w:val="18"/>
-          <w:lang w:val="en-GB"/>
-        </w:rPr>
-        <w:t>բնակելի</w:t>
-      </w:r>
-      <w:proofErr w:type="spellEnd"/>
-      <w:r>
-        <w:rPr>
-          <w:rFonts w:ascii="Times New Roman" w:eastAsia="Times New Roman" w:hAnsi="Times New Roman" w:cs="Times New Roman"/>
-          <w:color w:val="000000" w:themeColor="text1"/>
-          <w:sz w:val="18"/>
-          <w:szCs w:val="18"/>
-          <w:lang w:val="en-GB"/>
-        </w:rPr>
-        <w:t xml:space="preserve"> </w:t>
-      </w:r>
-      <w:proofErr w:type="spellStart"/>
-      <w:r>
-        <w:rPr>
-          <w:rFonts w:ascii="Times New Roman" w:eastAsia="Times New Roman" w:hAnsi="Times New Roman" w:cs="Times New Roman"/>
-          <w:color w:val="000000" w:themeColor="text1"/>
-          <w:sz w:val="18"/>
-          <w:szCs w:val="18"/>
-          <w:lang w:val="en-GB"/>
-        </w:rPr>
-        <w:t>տարածք</w:t>
-      </w:r>
-      <w:proofErr w:type="spellEnd"/>
+        <w:t>53 շենք, 35 ոչ բնակելի տարածք</w:t>
+      </w:r>
       <w:r>
         <w:rPr>
           <w:rFonts w:ascii="Times New Roman" w:eastAsia="Times New Roman" w:hAnsi="Times New Roman" w:cs="Times New Roman"/>
@@ -1402,9 +1298,8 @@
                 <w:szCs w:val="16"/>
                 <w:lang w:val="en-GB"/>
               </w:rPr>
-              <w:t>${</w:t>
-            </w:r>
-            <w:proofErr w:type="spellStart"/>
+              <w:t>${contra</w:t>
+            </w:r>
             <w:r>
               <w:rPr>
                 <w:rFonts w:ascii="Times New Roman" w:hAnsi="Times New Roman" w:cs="Times New Roman"/>
@@ -1414,7 +1309,7 @@
                 <w:szCs w:val="16"/>
                 <w:lang w:val="en-GB"/>
               </w:rPr>
-              <w:t>contra</w:t>
+              <w:t>c</w:t>
             </w:r>
             <w:r>
               <w:rPr>
@@ -1425,30 +1320,7 @@
                 <w:szCs w:val="16"/>
                 <w:lang w:val="en-GB"/>
               </w:rPr>
-              <w:t>c</w:t>
-            </w:r>
-            <w:r>
-              <w:rPr>
-                <w:rFonts w:ascii="Times New Roman" w:hAnsi="Times New Roman" w:cs="Times New Roman"/>
-                <w:b/>
-                <w:i/>
-                <w:sz w:val="16"/>
-                <w:szCs w:val="16"/>
-                <w:lang w:val="en-GB"/>
-              </w:rPr>
-              <w:t>t_amount</w:t>
-            </w:r>
-            <w:proofErr w:type="spellEnd"/>
-            <w:r>
-              <w:rPr>
-                <w:rFonts w:ascii="Times New Roman" w:hAnsi="Times New Roman" w:cs="Times New Roman"/>
-                <w:b/>
-                <w:i/>
-                <w:sz w:val="16"/>
-                <w:szCs w:val="16"/>
-                <w:lang w:val="en-GB"/>
-              </w:rPr>
-              <w:t>}</w:t>
+              <w:t>t_amount}</w:t>
             </w:r>
             <w:r>
               <w:rPr>
@@ -1659,31 +1531,7 @@
                 <w:szCs w:val="16"/>
                 <w:lang w:val="en-GB"/>
               </w:rPr>
-              <w:t>${</w:t>
-            </w:r>
-            <w:proofErr w:type="spellStart"/>
-            <w:r>
-              <w:rPr>
-                <w:rFonts w:ascii="Times New Roman" w:hAnsi="Times New Roman" w:cs="Times New Roman"/>
-                <w:b/>
-                <w:i/>
-                <w:sz w:val="16"/>
-                <w:szCs w:val="16"/>
-                <w:lang w:val="en-GB"/>
-              </w:rPr>
-              <w:t>effective_annual_rate</w:t>
-            </w:r>
-            <w:proofErr w:type="spellEnd"/>
-            <w:r>
-              <w:rPr>
-                <w:rFonts w:ascii="Times New Roman" w:hAnsi="Times New Roman" w:cs="Times New Roman"/>
-                <w:b/>
-                <w:i/>
-                <w:sz w:val="16"/>
-                <w:szCs w:val="16"/>
-                <w:lang w:val="en-GB"/>
-              </w:rPr>
-              <w:t>}</w:t>
+              <w:t>${effective_annual_rate}</w:t>
             </w:r>
           </w:p>
         </w:tc>
@@ -3061,31 +2909,7 @@
                 <w:szCs w:val="16"/>
                 <w:lang w:val="en-GB"/>
               </w:rPr>
-              <w:t>${</w:t>
-            </w:r>
-            <w:proofErr w:type="spellStart"/>
-            <w:r>
-              <w:rPr>
-                <w:rFonts w:ascii="Times New Roman" w:hAnsi="Times New Roman" w:cs="Times New Roman"/>
-                <w:bCs/>
-                <w:iCs/>
-                <w:sz w:val="16"/>
-                <w:szCs w:val="16"/>
-                <w:lang w:val="en-GB"/>
-              </w:rPr>
-              <w:t>mother_amount</w:t>
-            </w:r>
-            <w:proofErr w:type="spellEnd"/>
-            <w:r>
-              <w:rPr>
-                <w:rFonts w:ascii="Times New Roman" w:hAnsi="Times New Roman" w:cs="Times New Roman"/>
-                <w:bCs/>
-                <w:iCs/>
-                <w:sz w:val="16"/>
-                <w:szCs w:val="16"/>
-                <w:lang w:val="en-GB"/>
-              </w:rPr>
-              <w:t>}</w:t>
+              <w:t>${mother_amount}</w:t>
             </w:r>
             <w:r>
               <w:rPr>
@@ -7384,7 +7208,6 @@
                 <w:lang w:val="en-GB"/>
               </w:rPr>
             </w:pPr>
-            <w:proofErr w:type="spellStart"/>
             <w:r>
               <w:rPr>
                 <w:rFonts w:ascii="Times New Roman" w:hAnsi="Times New Roman" w:cs="Times New Roman"/>
@@ -7394,9 +7217,8 @@
                 <w:szCs w:val="18"/>
                 <w:lang w:val="en-GB"/>
               </w:rPr>
-              <w:t>Քարտի</w:t>
-            </w:r>
-            <w:proofErr w:type="spellEnd"/>
+              <w:t xml:space="preserve">Քարտի համար՝ </w:t>
+            </w:r>
             <w:r>
               <w:rPr>
                 <w:rFonts w:ascii="Times New Roman" w:hAnsi="Times New Roman" w:cs="Times New Roman"/>
@@ -7406,66 +7228,7 @@
                 <w:szCs w:val="18"/>
                 <w:lang w:val="en-GB"/>
               </w:rPr>
-              <w:t xml:space="preserve"> </w:t>
-            </w:r>
-            <w:proofErr w:type="spellStart"/>
-            <w:r>
-              <w:rPr>
-                <w:rFonts w:ascii="Times New Roman" w:hAnsi="Times New Roman" w:cs="Times New Roman"/>
-                <w:b/>
-                <w:bCs/>
-                <w:sz w:val="18"/>
-                <w:szCs w:val="18"/>
-                <w:lang w:val="en-GB"/>
-              </w:rPr>
-              <w:t>համար</w:t>
-            </w:r>
-            <w:proofErr w:type="spellEnd"/>
-            <w:r>
-              <w:rPr>
-                <w:rFonts w:ascii="Times New Roman" w:hAnsi="Times New Roman" w:cs="Times New Roman"/>
-                <w:b/>
-                <w:bCs/>
-                <w:sz w:val="18"/>
-                <w:szCs w:val="18"/>
-                <w:lang w:val="en-GB"/>
-              </w:rPr>
-              <w:t xml:space="preserve">՝ </w:t>
-            </w:r>
-            <w:r>
-              <w:rPr>
-                <w:rFonts w:ascii="Times New Roman" w:hAnsi="Times New Roman" w:cs="Times New Roman"/>
-                <w:b/>
-                <w:bCs/>
-                <w:sz w:val="18"/>
-                <w:szCs w:val="18"/>
-                <w:lang w:val="en-GB"/>
-              </w:rPr>
-              <w:t>${</w:t>
-            </w:r>
-            <w:proofErr w:type="spellStart"/>
-            <w:r>
-              <w:rPr>
-                <w:rFonts w:ascii="Times New Roman" w:hAnsi="Times New Roman" w:cs="Times New Roman"/>
-                <w:b/>
-                <w:bCs/>
-                <w:sz w:val="18"/>
-                <w:szCs w:val="18"/>
-                <w:lang w:val="en-GB"/>
-              </w:rPr>
-              <w:t>card_number</w:t>
-            </w:r>
-            <w:proofErr w:type="spellEnd"/>
-            <w:r>
-              <w:rPr>
-                <w:rFonts w:ascii="Times New Roman" w:hAnsi="Times New Roman" w:cs="Times New Roman"/>
-                <w:b/>
-                <w:bCs/>
-                <w:sz w:val="18"/>
-                <w:szCs w:val="18"/>
-                <w:lang w:val="en-GB"/>
-              </w:rPr>
-              <w:t>}</w:t>
+              <w:t>${card_number}</w:t>
             </w:r>
           </w:p>
           <w:p>
@@ -7916,7 +7679,6 @@
                 <w:iCs/>
                 <w:sz w:val="18"/>
                 <w:szCs w:val="18"/>
-                <w:lang w:val="hy-AM"/>
               </w:rPr>
             </w:pPr>
             <w:r>
@@ -7927,9 +7689,8 @@
                 <w:iCs/>
                 <w:sz w:val="18"/>
                 <w:szCs w:val="18"/>
-                <w:lang w:val="hy-AM"/>
-              </w:rPr>
-              <w:t>Պողոս Պողոսյան</w:t>
+              </w:rPr>
+              <w:t>${client}</w:t>
             </w:r>
           </w:p>
         </w:tc>
@@ -8066,7 +7827,6 @@
           <w:lang w:val="en-GB"/>
         </w:rPr>
       </w:pPr>
-      <w:proofErr w:type="spellStart"/>
       <w:r>
         <w:rPr>
           <w:rFonts w:ascii="Times New Roman" w:eastAsia="Times New Roman" w:hAnsi="Times New Roman" w:cs="Times New Roman"/>
@@ -8077,10 +7837,13 @@
           <w:szCs w:val="13"/>
           <w:lang w:val="en-GB"/>
         </w:rPr>
-        <w:t>Վարկային</w:t>
-      </w:r>
-      <w:proofErr w:type="spellEnd"/>
-      <w:r>
+        <w:t xml:space="preserve">Վարկային կոդ՝ </w:t>
+      </w:r>
+    </w:p>
+    <w:p>
+      <w:pPr>
+        <w:spacing w:after="0" w:line="276" w:lineRule="auto"/>
+        <w:jc w:val="right"/>
         <w:rPr>
           <w:rFonts w:ascii="Times New Roman" w:eastAsia="Times New Roman" w:hAnsi="Times New Roman" w:cs="Times New Roman"/>
           <w:i/>
@@ -8090,9 +7853,7 @@
           <w:szCs w:val="13"/>
           <w:lang w:val="en-GB"/>
         </w:rPr>
-        <w:t xml:space="preserve"> </w:t>
-      </w:r>
-      <w:proofErr w:type="spellStart"/>
+      </w:pPr>
       <w:r>
         <w:rPr>
           <w:rFonts w:ascii="Times New Roman" w:eastAsia="Times New Roman" w:hAnsi="Times New Roman" w:cs="Times New Roman"/>
@@ -8101,11 +7862,10 @@
           <w:color w:val="000000" w:themeColor="text1"/>
           <w:sz w:val="18"/>
           <w:szCs w:val="13"/>
-          <w:lang w:val="en-GB"/>
-        </w:rPr>
-        <w:t>կոդ</w:t>
-      </w:r>
-      <w:proofErr w:type="spellEnd"/>
+          <w:lang w:val="hy-AM"/>
+        </w:rPr>
+        <w:t xml:space="preserve">Վարկային և ոսկյա իրերի գրավի խառը պայմանագիր </w:t>
+      </w:r>
       <w:r>
         <w:rPr>
           <w:rFonts w:ascii="Times New Roman" w:eastAsia="Times New Roman" w:hAnsi="Times New Roman" w:cs="Times New Roman"/>
@@ -8114,15 +7874,11 @@
           <w:color w:val="000000" w:themeColor="text1"/>
           <w:sz w:val="18"/>
           <w:szCs w:val="13"/>
-          <w:lang w:val="en-GB"/>
-        </w:rPr>
-        <w:t xml:space="preserve">՝ </w:t>
-      </w:r>
-    </w:p>
-    <w:p>
-      <w:pPr>
-        <w:spacing w:after="0" w:line="276" w:lineRule="auto"/>
-        <w:jc w:val="right"/>
+          <w:lang w:val="hy-AM"/>
+        </w:rPr>
+        <w:t xml:space="preserve">№ </w:t>
+      </w:r>
+      <w:r>
         <w:rPr>
           <w:rFonts w:ascii="Times New Roman" w:eastAsia="Times New Roman" w:hAnsi="Times New Roman" w:cs="Times New Roman"/>
           <w:i/>
@@ -8132,68 +7888,7 @@
           <w:szCs w:val="13"/>
           <w:lang w:val="en-GB"/>
         </w:rPr>
-      </w:pPr>
-      <w:r>
-        <w:rPr>
-          <w:rFonts w:ascii="Times New Roman" w:eastAsia="Times New Roman" w:hAnsi="Times New Roman" w:cs="Times New Roman"/>
-          <w:i/>
-          <w:iCs/>
-          <w:color w:val="000000" w:themeColor="text1"/>
-          <w:sz w:val="18"/>
-          <w:szCs w:val="13"/>
-          <w:lang w:val="hy-AM"/>
-        </w:rPr>
-        <w:t xml:space="preserve">Վարկային և ոսկյա իրերի գրավի խառը պայմանագիր </w:t>
-      </w:r>
-      <w:r>
-        <w:rPr>
-          <w:rFonts w:ascii="Times New Roman" w:eastAsia="Times New Roman" w:hAnsi="Times New Roman" w:cs="Times New Roman"/>
-          <w:i/>
-          <w:iCs/>
-          <w:color w:val="000000" w:themeColor="text1"/>
-          <w:sz w:val="18"/>
-          <w:szCs w:val="13"/>
-          <w:lang w:val="hy-AM"/>
-        </w:rPr>
-        <w:t xml:space="preserve">№ </w:t>
-      </w:r>
-      <w:r>
-        <w:rPr>
-          <w:rFonts w:ascii="Times New Roman" w:eastAsia="Times New Roman" w:hAnsi="Times New Roman" w:cs="Times New Roman"/>
-          <w:i/>
-          <w:iCs/>
-          <w:color w:val="000000" w:themeColor="text1"/>
-          <w:sz w:val="18"/>
-          <w:szCs w:val="13"/>
-          <w:lang w:val="en-GB"/>
-        </w:rPr>
-        <w:t>${</w:t>
-      </w:r>
-      <w:proofErr w:type="spellStart"/>
-      <w:r>
-        <w:rPr>
-          <w:rFonts w:ascii="Times New Roman" w:eastAsia="Times New Roman" w:hAnsi="Times New Roman" w:cs="Times New Roman"/>
-          <w:i/>
-          <w:iCs/>
-          <w:color w:val="000000" w:themeColor="text1"/>
-          <w:sz w:val="18"/>
-          <w:szCs w:val="13"/>
-          <w:lang w:val="en-GB"/>
-        </w:rPr>
-        <w:t>num</w:t>
-      </w:r>
-      <w:proofErr w:type="spellEnd"/>
-      <w:r>
-        <w:rPr>
-          <w:rFonts w:ascii="Times New Roman" w:eastAsia="Times New Roman" w:hAnsi="Times New Roman" w:cs="Times New Roman"/>
-          <w:i/>
-          <w:iCs/>
-          <w:color w:val="000000" w:themeColor="text1"/>
-          <w:sz w:val="18"/>
-          <w:szCs w:val="13"/>
-          <w:lang w:val="en-GB"/>
-        </w:rPr>
-        <w:t>}</w:t>
+        <w:t>${num}</w:t>
       </w:r>
     </w:p>
     <w:p>
@@ -8738,7 +8433,6 @@
           <w:lang w:val="en-GB"/>
         </w:rPr>
       </w:pPr>
-      <w:proofErr w:type="spellStart"/>
       <w:r>
         <w:rPr>
           <w:rFonts w:ascii="Times New Roman" w:eastAsia="Times New Roman" w:hAnsi="Times New Roman" w:cs="Times New Roman"/>
@@ -8749,10 +8443,13 @@
           <w:szCs w:val="13"/>
           <w:lang w:val="en-GB"/>
         </w:rPr>
-        <w:t>Վարկային</w:t>
-      </w:r>
-      <w:proofErr w:type="spellEnd"/>
-      <w:r>
+        <w:t>Վարկային կոդ՝</w:t>
+      </w:r>
+    </w:p>
+    <w:p>
+      <w:pPr>
+        <w:spacing w:after="0" w:line="276" w:lineRule="auto"/>
+        <w:jc w:val="right"/>
         <w:rPr>
           <w:rFonts w:ascii="Times New Roman" w:eastAsia="Times New Roman" w:hAnsi="Times New Roman" w:cs="Times New Roman"/>
           <w:i/>
@@ -8762,9 +8459,7 @@
           <w:szCs w:val="13"/>
           <w:lang w:val="en-GB"/>
         </w:rPr>
-        <w:t xml:space="preserve"> </w:t>
-      </w:r>
-      <w:proofErr w:type="spellStart"/>
+      </w:pPr>
       <w:r>
         <w:rPr>
           <w:rFonts w:ascii="Times New Roman" w:eastAsia="Times New Roman" w:hAnsi="Times New Roman" w:cs="Times New Roman"/>
@@ -8773,11 +8468,10 @@
           <w:color w:val="000000" w:themeColor="text1"/>
           <w:sz w:val="18"/>
           <w:szCs w:val="13"/>
-          <w:lang w:val="en-GB"/>
-        </w:rPr>
-        <w:t>կոդ</w:t>
-      </w:r>
-      <w:proofErr w:type="spellEnd"/>
+          <w:lang w:val="hy-AM"/>
+        </w:rPr>
+        <w:t xml:space="preserve">Վարկային և ոսկյա իրերի գրավի խառը պայմանագիր </w:t>
+      </w:r>
       <w:r>
         <w:rPr>
           <w:rFonts w:ascii="Times New Roman" w:eastAsia="Times New Roman" w:hAnsi="Times New Roman" w:cs="Times New Roman"/>
@@ -8786,15 +8480,11 @@
           <w:color w:val="000000" w:themeColor="text1"/>
           <w:sz w:val="18"/>
           <w:szCs w:val="13"/>
-          <w:lang w:val="en-GB"/>
-        </w:rPr>
-        <w:t>՝</w:t>
-      </w:r>
-    </w:p>
-    <w:p>
-      <w:pPr>
-        <w:spacing w:after="0" w:line="276" w:lineRule="auto"/>
-        <w:jc w:val="right"/>
+          <w:lang w:val="hy-AM"/>
+        </w:rPr>
+        <w:t xml:space="preserve">№ </w:t>
+      </w:r>
+      <w:r>
         <w:rPr>
           <w:rFonts w:ascii="Times New Roman" w:eastAsia="Times New Roman" w:hAnsi="Times New Roman" w:cs="Times New Roman"/>
           <w:i/>
@@ -8802,9 +8492,10 @@
           <w:color w:val="000000" w:themeColor="text1"/>
           <w:sz w:val="18"/>
           <w:szCs w:val="13"/>
-          <w:lang w:val="en-GB"/>
-        </w:rPr>
-      </w:pPr>
+          <w:lang w:val="hy-AM"/>
+        </w:rPr>
+        <w:t>$</w:t>
+      </w:r>
       <w:r>
         <w:rPr>
           <w:rFonts w:ascii="Times New Roman" w:eastAsia="Times New Roman" w:hAnsi="Times New Roman" w:cs="Times New Roman"/>
@@ -8813,71 +8504,9 @@
           <w:color w:val="000000" w:themeColor="text1"/>
           <w:sz w:val="18"/>
           <w:szCs w:val="13"/>
-          <w:lang w:val="hy-AM"/>
-        </w:rPr>
-        <w:t xml:space="preserve">Վարկային և ոսկյա իրերի գրավի խառը պայմանագիր </w:t>
-      </w:r>
-      <w:r>
-        <w:rPr>
-          <w:rFonts w:ascii="Times New Roman" w:eastAsia="Times New Roman" w:hAnsi="Times New Roman" w:cs="Times New Roman"/>
-          <w:i/>
-          <w:iCs/>
-          <w:color w:val="000000" w:themeColor="text1"/>
-          <w:sz w:val="18"/>
-          <w:szCs w:val="13"/>
-          <w:lang w:val="hy-AM"/>
-        </w:rPr>
-        <w:t xml:space="preserve">№ </w:t>
-      </w:r>
-      <w:r>
-        <w:rPr>
-          <w:rFonts w:ascii="Times New Roman" w:eastAsia="Times New Roman" w:hAnsi="Times New Roman" w:cs="Times New Roman"/>
-          <w:i/>
-          <w:iCs/>
-          <w:color w:val="000000" w:themeColor="text1"/>
-          <w:sz w:val="18"/>
-          <w:szCs w:val="13"/>
-          <w:lang w:val="hy-AM"/>
-        </w:rPr>
-        <w:t>$</w:t>
-      </w:r>
-      <w:r>
-        <w:rPr>
-          <w:rFonts w:ascii="Times New Roman" w:eastAsia="Times New Roman" w:hAnsi="Times New Roman" w:cs="Times New Roman"/>
-          <w:i/>
-          <w:iCs/>
-          <w:color w:val="000000" w:themeColor="text1"/>
-          <w:sz w:val="18"/>
-          <w:szCs w:val="13"/>
           <w:lang w:val="en-GB"/>
         </w:rPr>
-        <w:t>{</w:t>
-      </w:r>
-      <w:proofErr w:type="spellStart"/>
-      <w:r>
-        <w:rPr>
-          <w:rFonts w:ascii="Times New Roman" w:eastAsia="Times New Roman" w:hAnsi="Times New Roman" w:cs="Times New Roman"/>
-          <w:i/>
-          <w:iCs/>
-          <w:color w:val="000000" w:themeColor="text1"/>
-          <w:sz w:val="18"/>
-          <w:szCs w:val="13"/>
-          <w:lang w:val="en-GB"/>
-        </w:rPr>
-        <w:t>num</w:t>
-      </w:r>
-      <w:proofErr w:type="spellEnd"/>
-      <w:r>
-        <w:rPr>
-          <w:rFonts w:ascii="Times New Roman" w:eastAsia="Times New Roman" w:hAnsi="Times New Roman" w:cs="Times New Roman"/>
-          <w:i/>
-          <w:iCs/>
-          <w:color w:val="000000" w:themeColor="text1"/>
-          <w:sz w:val="18"/>
-          <w:szCs w:val="13"/>
-          <w:lang w:val="en-GB"/>
-        </w:rPr>
-        <w:t>}</w:t>
+        <w:t>{num}</w:t>
       </w:r>
     </w:p>
     <w:p>
@@ -9048,52 +8677,14 @@
                 <w:szCs w:val="16"/>
               </w:rPr>
             </w:pPr>
-            <w:proofErr w:type="spellStart"/>
-            <w:r>
-              <w:rPr>
-                <w:rFonts w:ascii="Times New Roman" w:hAnsi="Times New Roman" w:cs="Times New Roman"/>
-                <w:sz w:val="16"/>
-                <w:szCs w:val="16"/>
-              </w:rPr>
-              <w:t>Գրավի</w:t>
-            </w:r>
-            <w:proofErr w:type="spellEnd"/>
-            <w:r>
-              <w:rPr>
-                <w:rFonts w:ascii="Times New Roman" w:hAnsi="Times New Roman" w:cs="Times New Roman"/>
-                <w:sz w:val="16"/>
-                <w:szCs w:val="16"/>
-              </w:rPr>
-              <w:t xml:space="preserve"> </w:t>
-            </w:r>
-            <w:proofErr w:type="spellStart"/>
-            <w:r>
-              <w:rPr>
-                <w:rFonts w:ascii="Times New Roman" w:hAnsi="Times New Roman" w:cs="Times New Roman"/>
-                <w:sz w:val="16"/>
-                <w:szCs w:val="16"/>
-              </w:rPr>
-              <w:t>առարկայի</w:t>
-            </w:r>
-            <w:proofErr w:type="spellEnd"/>
-            <w:r>
-              <w:rPr>
-                <w:rFonts w:ascii="Times New Roman" w:hAnsi="Times New Roman" w:cs="Times New Roman"/>
-                <w:sz w:val="16"/>
-                <w:szCs w:val="16"/>
-              </w:rPr>
-              <w:t xml:space="preserve"> </w:t>
-            </w:r>
-            <w:proofErr w:type="spellStart"/>
-            <w:r>
-              <w:rPr>
-                <w:rFonts w:ascii="Times New Roman" w:hAnsi="Times New Roman" w:cs="Times New Roman"/>
-                <w:sz w:val="16"/>
-                <w:szCs w:val="16"/>
-              </w:rPr>
-              <w:t>նկարագիրը</w:t>
-            </w:r>
-            <w:proofErr w:type="spellEnd"/>
+            <w:r>
+              <w:rPr>
+                <w:rFonts w:ascii="Times New Roman" w:hAnsi="Times New Roman" w:cs="Times New Roman"/>
+                <w:sz w:val="16"/>
+                <w:szCs w:val="16"/>
+              </w:rPr>
+              <w:t>Գրավի առարկայի նկարագիրը</w:t>
+            </w:r>
           </w:p>
         </w:tc>
         <w:tc>
@@ -9111,7 +8702,6 @@
                 <w:szCs w:val="16"/>
               </w:rPr>
             </w:pPr>
-            <w:proofErr w:type="spellStart"/>
             <w:r>
               <w:rPr>
                 <w:rFonts w:ascii="Times New Roman" w:hAnsi="Times New Roman" w:cs="Times New Roman"/>
@@ -9120,7 +8710,6 @@
               </w:rPr>
               <w:t>Քանակը</w:t>
             </w:r>
-            <w:proofErr w:type="spellEnd"/>
           </w:p>
           <w:p>
             <w:pPr>
@@ -9131,7 +8720,6 @@
                 <w:szCs w:val="16"/>
               </w:rPr>
             </w:pPr>
-            <w:proofErr w:type="spellStart"/>
             <w:r>
               <w:rPr>
                 <w:rFonts w:ascii="Times New Roman" w:hAnsi="Times New Roman" w:cs="Times New Roman"/>
@@ -9140,7 +8728,6 @@
               </w:rPr>
               <w:t>հատ</w:t>
             </w:r>
-            <w:proofErr w:type="spellEnd"/>
           </w:p>
         </w:tc>
         <w:tc>
@@ -9161,7 +8748,6 @@
                 <w:szCs w:val="16"/>
               </w:rPr>
             </w:pPr>
-            <w:proofErr w:type="spellStart"/>
             <w:r>
               <w:rPr>
                 <w:rFonts w:ascii="Times New Roman" w:hAnsi="Times New Roman" w:cs="Times New Roman"/>
@@ -9170,7 +8756,6 @@
               </w:rPr>
               <w:t>Զանգվածը</w:t>
             </w:r>
-            <w:proofErr w:type="spellEnd"/>
           </w:p>
           <w:p>
             <w:pPr>
@@ -9181,7 +8766,6 @@
                 <w:szCs w:val="16"/>
               </w:rPr>
             </w:pPr>
-            <w:proofErr w:type="spellStart"/>
             <w:r>
               <w:rPr>
                 <w:rFonts w:ascii="Times New Roman" w:hAnsi="Times New Roman" w:cs="Times New Roman"/>
@@ -9190,7 +8774,6 @@
               </w:rPr>
               <w:t>գրամ</w:t>
             </w:r>
-            <w:proofErr w:type="spellEnd"/>
           </w:p>
         </w:tc>
         <w:tc>
@@ -9208,7 +8791,6 @@
                 <w:szCs w:val="16"/>
               </w:rPr>
             </w:pPr>
-            <w:proofErr w:type="spellStart"/>
             <w:r>
               <w:rPr>
                 <w:rFonts w:ascii="Times New Roman" w:hAnsi="Times New Roman" w:cs="Times New Roman"/>
@@ -9217,7 +8799,6 @@
               </w:rPr>
               <w:t>Հարգը</w:t>
             </w:r>
-            <w:proofErr w:type="spellEnd"/>
           </w:p>
         </w:tc>
         <w:tc>
@@ -9235,70 +8816,14 @@
                 <w:szCs w:val="16"/>
               </w:rPr>
             </w:pPr>
-            <w:proofErr w:type="spellStart"/>
-            <w:r>
-              <w:rPr>
-                <w:rFonts w:ascii="Times New Roman" w:hAnsi="Times New Roman" w:cs="Times New Roman"/>
-                <w:sz w:val="16"/>
-                <w:szCs w:val="16"/>
-              </w:rPr>
-              <w:t>Մեկ</w:t>
-            </w:r>
-            <w:proofErr w:type="spellEnd"/>
-            <w:r>
-              <w:rPr>
-                <w:rFonts w:ascii="Times New Roman" w:hAnsi="Times New Roman" w:cs="Times New Roman"/>
-                <w:sz w:val="16"/>
-                <w:szCs w:val="16"/>
-              </w:rPr>
-              <w:t xml:space="preserve"> </w:t>
-            </w:r>
-            <w:proofErr w:type="spellStart"/>
-            <w:r>
-              <w:rPr>
-                <w:rFonts w:ascii="Times New Roman" w:hAnsi="Times New Roman" w:cs="Times New Roman"/>
-                <w:sz w:val="16"/>
-                <w:szCs w:val="16"/>
-              </w:rPr>
-              <w:t>գրամի</w:t>
-            </w:r>
-            <w:proofErr w:type="spellEnd"/>
-            <w:r>
-              <w:rPr>
-                <w:rFonts w:ascii="Times New Roman" w:hAnsi="Times New Roman" w:cs="Times New Roman"/>
-                <w:sz w:val="16"/>
-                <w:szCs w:val="16"/>
-              </w:rPr>
-              <w:t xml:space="preserve"> </w:t>
-            </w:r>
-            <w:proofErr w:type="spellStart"/>
-            <w:r>
-              <w:rPr>
-                <w:rFonts w:ascii="Times New Roman" w:hAnsi="Times New Roman" w:cs="Times New Roman"/>
-                <w:sz w:val="16"/>
-                <w:szCs w:val="16"/>
-              </w:rPr>
-              <w:t>արժեքը</w:t>
-            </w:r>
-            <w:proofErr w:type="spellEnd"/>
-            <w:r>
-              <w:rPr>
-                <w:rFonts w:ascii="Times New Roman" w:hAnsi="Times New Roman" w:cs="Times New Roman"/>
-                <w:sz w:val="16"/>
-                <w:szCs w:val="16"/>
-              </w:rPr>
-              <w:t xml:space="preserve"> ՀՀ </w:t>
-            </w:r>
-            <w:proofErr w:type="spellStart"/>
-            <w:r>
-              <w:rPr>
-                <w:rFonts w:ascii="Times New Roman" w:hAnsi="Times New Roman" w:cs="Times New Roman"/>
-                <w:sz w:val="16"/>
-                <w:szCs w:val="16"/>
-              </w:rPr>
-              <w:t>դրամով</w:t>
-            </w:r>
-            <w:proofErr w:type="spellEnd"/>
+            <w:r>
+              <w:rPr>
+                <w:rFonts w:ascii="Times New Roman" w:hAnsi="Times New Roman" w:cs="Times New Roman"/>
+                <w:sz w:val="16"/>
+                <w:szCs w:val="16"/>
+              </w:rPr>
+              <w:t>Մեկ գրամի արժեքը ՀՀ դրամով</w:t>
+            </w:r>
           </w:p>
         </w:tc>
         <w:tc>
@@ -9316,52 +8841,14 @@
                 <w:szCs w:val="16"/>
               </w:rPr>
             </w:pPr>
-            <w:proofErr w:type="spellStart"/>
-            <w:r>
-              <w:rPr>
-                <w:rFonts w:ascii="Times New Roman" w:hAnsi="Times New Roman" w:cs="Times New Roman"/>
-                <w:sz w:val="16"/>
-                <w:szCs w:val="16"/>
-              </w:rPr>
-              <w:t>Ընդհանւոր</w:t>
-            </w:r>
-            <w:proofErr w:type="spellEnd"/>
-            <w:r>
-              <w:rPr>
-                <w:rFonts w:ascii="Times New Roman" w:hAnsi="Times New Roman" w:cs="Times New Roman"/>
-                <w:sz w:val="16"/>
-                <w:szCs w:val="16"/>
-              </w:rPr>
-              <w:t xml:space="preserve"> </w:t>
-            </w:r>
-            <w:proofErr w:type="spellStart"/>
-            <w:r>
-              <w:rPr>
-                <w:rFonts w:ascii="Times New Roman" w:hAnsi="Times New Roman" w:cs="Times New Roman"/>
-                <w:sz w:val="16"/>
-                <w:szCs w:val="16"/>
-              </w:rPr>
-              <w:t>գումարի</w:t>
-            </w:r>
-            <w:proofErr w:type="spellEnd"/>
-            <w:r>
-              <w:rPr>
-                <w:rFonts w:ascii="Times New Roman" w:hAnsi="Times New Roman" w:cs="Times New Roman"/>
-                <w:sz w:val="16"/>
-                <w:szCs w:val="16"/>
-              </w:rPr>
-              <w:t xml:space="preserve"> </w:t>
-            </w:r>
-            <w:proofErr w:type="spellStart"/>
-            <w:r>
-              <w:rPr>
-                <w:rFonts w:ascii="Times New Roman" w:hAnsi="Times New Roman" w:cs="Times New Roman"/>
-                <w:sz w:val="16"/>
-                <w:szCs w:val="16"/>
-              </w:rPr>
-              <w:t>չափը</w:t>
-            </w:r>
-            <w:proofErr w:type="spellEnd"/>
+            <w:r>
+              <w:rPr>
+                <w:rFonts w:ascii="Times New Roman" w:hAnsi="Times New Roman" w:cs="Times New Roman"/>
+                <w:sz w:val="16"/>
+                <w:szCs w:val="16"/>
+              </w:rPr>
+              <w:t>Ընդհանւոր գումարի չափը</w:t>
+            </w:r>
           </w:p>
         </w:tc>
       </w:tr>
@@ -9417,34 +8904,14 @@
                 <w:szCs w:val="16"/>
               </w:rPr>
             </w:pPr>
-            <w:proofErr w:type="spellStart"/>
-            <w:r>
-              <w:rPr>
-                <w:rFonts w:ascii="Times New Roman" w:hAnsi="Times New Roman" w:cs="Times New Roman"/>
-                <w:sz w:val="16"/>
-                <w:szCs w:val="16"/>
-              </w:rPr>
-              <w:t>Ընդհանուր</w:t>
-            </w:r>
-            <w:proofErr w:type="spellEnd"/>
-            <w:r>
-              <w:rPr>
-                <w:rFonts w:ascii="Times New Roman" w:hAnsi="Times New Roman" w:cs="Times New Roman"/>
-                <w:sz w:val="16"/>
-                <w:szCs w:val="16"/>
-              </w:rPr>
-              <w:t xml:space="preserve"> </w:t>
-            </w:r>
-            <w:proofErr w:type="spellStart"/>
-            <w:r>
-              <w:rPr>
-                <w:rFonts w:ascii="Times New Roman" w:hAnsi="Times New Roman" w:cs="Times New Roman"/>
-                <w:sz w:val="16"/>
-                <w:szCs w:val="16"/>
-              </w:rPr>
-              <w:t>քաշ</w:t>
-            </w:r>
-            <w:proofErr w:type="spellEnd"/>
+            <w:r>
+              <w:rPr>
+                <w:rFonts w:ascii="Times New Roman" w:hAnsi="Times New Roman" w:cs="Times New Roman"/>
+                <w:sz w:val="16"/>
+                <w:szCs w:val="16"/>
+              </w:rPr>
+              <w:t>Ընդհանուր քաշ</w:t>
+            </w:r>
           </w:p>
         </w:tc>
         <w:tc>
@@ -9464,34 +8931,14 @@
                 <w:szCs w:val="16"/>
               </w:rPr>
             </w:pPr>
-            <w:proofErr w:type="spellStart"/>
-            <w:r>
-              <w:rPr>
-                <w:rFonts w:ascii="Times New Roman" w:hAnsi="Times New Roman" w:cs="Times New Roman"/>
-                <w:sz w:val="16"/>
-                <w:szCs w:val="16"/>
-              </w:rPr>
-              <w:t>մաքուր</w:t>
-            </w:r>
-            <w:proofErr w:type="spellEnd"/>
-            <w:r>
-              <w:rPr>
-                <w:rFonts w:ascii="Times New Roman" w:hAnsi="Times New Roman" w:cs="Times New Roman"/>
-                <w:sz w:val="16"/>
-                <w:szCs w:val="16"/>
-              </w:rPr>
-              <w:t xml:space="preserve"> </w:t>
-            </w:r>
-            <w:proofErr w:type="spellStart"/>
-            <w:r>
-              <w:rPr>
-                <w:rFonts w:ascii="Times New Roman" w:hAnsi="Times New Roman" w:cs="Times New Roman"/>
-                <w:sz w:val="16"/>
-                <w:szCs w:val="16"/>
-              </w:rPr>
-              <w:t>քաշ</w:t>
-            </w:r>
-            <w:proofErr w:type="spellEnd"/>
+            <w:r>
+              <w:rPr>
+                <w:rFonts w:ascii="Times New Roman" w:hAnsi="Times New Roman" w:cs="Times New Roman"/>
+                <w:sz w:val="16"/>
+                <w:szCs w:val="16"/>
+              </w:rPr>
+              <w:t>մաքուր քաշ</w:t>
+            </w:r>
           </w:p>
         </w:tc>
         <w:tc>
@@ -9568,25 +9015,7 @@
                 <w:sz w:val="16"/>
                 <w:szCs w:val="16"/>
               </w:rPr>
-              <w:t>${</w:t>
-            </w:r>
-            <w:proofErr w:type="spellStart"/>
-            <w:r>
-              <w:rPr>
-                <w:rFonts w:ascii="Times New Roman" w:hAnsi="Times New Roman" w:cs="Times New Roman"/>
-                <w:sz w:val="16"/>
-                <w:szCs w:val="16"/>
-              </w:rPr>
-              <w:t>i_desc</w:t>
-            </w:r>
-            <w:proofErr w:type="spellEnd"/>
-            <w:r>
-              <w:rPr>
-                <w:rFonts w:ascii="Times New Roman" w:hAnsi="Times New Roman" w:cs="Times New Roman"/>
-                <w:sz w:val="16"/>
-                <w:szCs w:val="16"/>
-              </w:rPr>
-              <w:t>}</w:t>
+              <w:t>${i_desc}</w:t>
             </w:r>
           </w:p>
         </w:tc>
@@ -9608,25 +9037,7 @@
                 <w:sz w:val="16"/>
                 <w:szCs w:val="16"/>
               </w:rPr>
-              <w:t>${</w:t>
-            </w:r>
-            <w:proofErr w:type="spellStart"/>
-            <w:r>
-              <w:rPr>
-                <w:rFonts w:ascii="Times New Roman" w:hAnsi="Times New Roman" w:cs="Times New Roman"/>
-                <w:sz w:val="16"/>
-                <w:szCs w:val="16"/>
-              </w:rPr>
-              <w:t>i_c</w:t>
-            </w:r>
-            <w:proofErr w:type="spellEnd"/>
-            <w:r>
-              <w:rPr>
-                <w:rFonts w:ascii="Times New Roman" w:hAnsi="Times New Roman" w:cs="Times New Roman"/>
-                <w:sz w:val="16"/>
-                <w:szCs w:val="16"/>
-              </w:rPr>
-              <w:t>}</w:t>
+              <w:t>${i_c}</w:t>
             </w:r>
           </w:p>
         </w:tc>
@@ -9648,25 +9059,7 @@
                 <w:sz w:val="16"/>
                 <w:szCs w:val="16"/>
               </w:rPr>
-              <w:t>${</w:t>
-            </w:r>
-            <w:proofErr w:type="spellStart"/>
-            <w:r>
-              <w:rPr>
-                <w:rFonts w:ascii="Times New Roman" w:hAnsi="Times New Roman" w:cs="Times New Roman"/>
-                <w:sz w:val="16"/>
-                <w:szCs w:val="16"/>
-              </w:rPr>
-              <w:t>i_w</w:t>
-            </w:r>
-            <w:proofErr w:type="spellEnd"/>
-            <w:r>
-              <w:rPr>
-                <w:rFonts w:ascii="Times New Roman" w:hAnsi="Times New Roman" w:cs="Times New Roman"/>
-                <w:sz w:val="16"/>
-                <w:szCs w:val="16"/>
-              </w:rPr>
-              <w:t>}</w:t>
+              <w:t>${i_w}</w:t>
             </w:r>
           </w:p>
         </w:tc>
@@ -9688,25 +9081,7 @@
                 <w:sz w:val="16"/>
                 <w:szCs w:val="16"/>
               </w:rPr>
-              <w:t>${</w:t>
-            </w:r>
-            <w:proofErr w:type="spellStart"/>
-            <w:r>
-              <w:rPr>
-                <w:rFonts w:ascii="Times New Roman" w:hAnsi="Times New Roman" w:cs="Times New Roman"/>
-                <w:sz w:val="16"/>
-                <w:szCs w:val="16"/>
-              </w:rPr>
-              <w:t>i_cw</w:t>
-            </w:r>
-            <w:proofErr w:type="spellEnd"/>
-            <w:r>
-              <w:rPr>
-                <w:rFonts w:ascii="Times New Roman" w:hAnsi="Times New Roman" w:cs="Times New Roman"/>
-                <w:sz w:val="16"/>
-                <w:szCs w:val="16"/>
-              </w:rPr>
-              <w:t>}</w:t>
+              <w:t>${i_cw}</w:t>
             </w:r>
           </w:p>
         </w:tc>
@@ -9728,25 +9103,7 @@
                 <w:sz w:val="16"/>
                 <w:szCs w:val="16"/>
               </w:rPr>
-              <w:t>${</w:t>
-            </w:r>
-            <w:proofErr w:type="spellStart"/>
-            <w:r>
-              <w:rPr>
-                <w:rFonts w:ascii="Times New Roman" w:hAnsi="Times New Roman" w:cs="Times New Roman"/>
-                <w:sz w:val="16"/>
-                <w:szCs w:val="16"/>
-              </w:rPr>
-              <w:t>i_h</w:t>
-            </w:r>
-            <w:proofErr w:type="spellEnd"/>
-            <w:r>
-              <w:rPr>
-                <w:rFonts w:ascii="Times New Roman" w:hAnsi="Times New Roman" w:cs="Times New Roman"/>
-                <w:sz w:val="16"/>
-                <w:szCs w:val="16"/>
-              </w:rPr>
-              <w:t>}</w:t>
+              <w:t>${i_h}</w:t>
             </w:r>
           </w:p>
         </w:tc>
@@ -9782,25 +9139,7 @@
                 <w:sz w:val="16"/>
                 <w:szCs w:val="16"/>
               </w:rPr>
-              <w:t>${</w:t>
-            </w:r>
-            <w:proofErr w:type="spellStart"/>
-            <w:r>
-              <w:rPr>
-                <w:rFonts w:ascii="Times New Roman" w:hAnsi="Times New Roman" w:cs="Times New Roman"/>
-                <w:sz w:val="16"/>
-                <w:szCs w:val="16"/>
-              </w:rPr>
-              <w:t>i_a</w:t>
-            </w:r>
-            <w:proofErr w:type="spellEnd"/>
-            <w:r>
-              <w:rPr>
-                <w:rFonts w:ascii="Times New Roman" w:hAnsi="Times New Roman" w:cs="Times New Roman"/>
-                <w:sz w:val="16"/>
-                <w:szCs w:val="16"/>
-              </w:rPr>
-              <w:t>}</w:t>
+              <w:t>${i_a}</w:t>
             </w:r>
           </w:p>
         </w:tc>
@@ -10405,23 +9744,13 @@
                 <w:szCs w:val="16"/>
               </w:rPr>
             </w:pPr>
-            <w:proofErr w:type="spellStart"/>
-            <w:r>
-              <w:rPr>
-                <w:rFonts w:ascii="Times New Roman" w:hAnsi="Times New Roman" w:cs="Times New Roman"/>
-                <w:sz w:val="16"/>
-                <w:szCs w:val="16"/>
-              </w:rPr>
-              <w:t>Ընդամենը</w:t>
-            </w:r>
-            <w:proofErr w:type="spellEnd"/>
-            <w:r>
-              <w:rPr>
-                <w:rFonts w:ascii="Times New Roman" w:hAnsi="Times New Roman" w:cs="Times New Roman"/>
-                <w:sz w:val="16"/>
-                <w:szCs w:val="16"/>
-              </w:rPr>
-              <w:t>՝</w:t>
+            <w:r>
+              <w:rPr>
+                <w:rFonts w:ascii="Times New Roman" w:hAnsi="Times New Roman" w:cs="Times New Roman"/>
+                <w:sz w:val="16"/>
+                <w:szCs w:val="16"/>
+              </w:rPr>
+              <w:t>Ընդամենը՝</w:t>
             </w:r>
           </w:p>
         </w:tc>
@@ -10565,7 +9894,6 @@
           <w:szCs w:val="22"/>
         </w:rPr>
       </w:pPr>
-      <w:proofErr w:type="spellStart"/>
       <w:r>
         <w:rPr>
           <w:sz w:val="18"/>
@@ -10578,121 +9906,15 @@
           <w:sz w:val="18"/>
           <w:szCs w:val="22"/>
         </w:rPr>
-        <w:t>ը</w:t>
-      </w:r>
-      <w:proofErr w:type="spellEnd"/>
+        <w:t>ը խարտելու և թթվային թեստի եղանակով ստուգեց</w:t>
+      </w:r>
       <w:r>
         <w:rPr>
           <w:sz w:val="18"/>
           <w:szCs w:val="22"/>
         </w:rPr>
-        <w:t xml:space="preserve"> </w:t>
-      </w:r>
-      <w:proofErr w:type="spellStart"/>
-      <w:r>
-        <w:rPr>
-          <w:sz w:val="18"/>
-          <w:szCs w:val="22"/>
-        </w:rPr>
-        <w:t>խարտելու</w:t>
-      </w:r>
-      <w:proofErr w:type="spellEnd"/>
-      <w:r>
-        <w:rPr>
-          <w:sz w:val="18"/>
-          <w:szCs w:val="22"/>
-        </w:rPr>
-        <w:t xml:space="preserve"> և </w:t>
-      </w:r>
-      <w:proofErr w:type="spellStart"/>
-      <w:r>
-        <w:rPr>
-          <w:sz w:val="18"/>
-          <w:szCs w:val="22"/>
-        </w:rPr>
-        <w:t>թթվային</w:t>
-      </w:r>
-      <w:proofErr w:type="spellEnd"/>
-      <w:r>
-        <w:rPr>
-          <w:sz w:val="18"/>
-          <w:szCs w:val="22"/>
-        </w:rPr>
-        <w:t xml:space="preserve"> </w:t>
-      </w:r>
-      <w:proofErr w:type="spellStart"/>
-      <w:r>
-        <w:rPr>
-          <w:sz w:val="18"/>
-          <w:szCs w:val="22"/>
-        </w:rPr>
-        <w:t>թեստի</w:t>
-      </w:r>
-      <w:proofErr w:type="spellEnd"/>
-      <w:r>
-        <w:rPr>
-          <w:sz w:val="18"/>
-          <w:szCs w:val="22"/>
-        </w:rPr>
-        <w:t xml:space="preserve"> </w:t>
-      </w:r>
-      <w:proofErr w:type="spellStart"/>
-      <w:r>
-        <w:rPr>
-          <w:sz w:val="18"/>
-          <w:szCs w:val="22"/>
-        </w:rPr>
-        <w:t>եղանակով</w:t>
-      </w:r>
-      <w:proofErr w:type="spellEnd"/>
-      <w:r>
-        <w:rPr>
-          <w:sz w:val="18"/>
-          <w:szCs w:val="22"/>
-        </w:rPr>
-        <w:t xml:space="preserve"> </w:t>
-      </w:r>
-      <w:proofErr w:type="spellStart"/>
-      <w:r>
-        <w:rPr>
-          <w:sz w:val="18"/>
-          <w:szCs w:val="22"/>
-        </w:rPr>
-        <w:t>ստուգեց</w:t>
-      </w:r>
-      <w:proofErr w:type="spellEnd"/>
-      <w:r>
-        <w:rPr>
-          <w:sz w:val="18"/>
-          <w:szCs w:val="22"/>
-        </w:rPr>
-        <w:t xml:space="preserve"> </w:t>
-      </w:r>
-      <w:proofErr w:type="spellStart"/>
-      <w:r>
-        <w:rPr>
-          <w:sz w:val="18"/>
-          <w:szCs w:val="22"/>
-        </w:rPr>
-        <w:t>Ոսկյա</w:t>
-      </w:r>
-      <w:proofErr w:type="spellEnd"/>
-      <w:r>
-        <w:rPr>
-          <w:sz w:val="18"/>
-          <w:szCs w:val="22"/>
-        </w:rPr>
-        <w:t xml:space="preserve"> </w:t>
-      </w:r>
-      <w:proofErr w:type="spellStart"/>
-      <w:r>
-        <w:rPr>
-          <w:sz w:val="18"/>
-          <w:szCs w:val="22"/>
-        </w:rPr>
-        <w:t>իրերը</w:t>
-      </w:r>
-      <w:proofErr w:type="spellEnd"/>
+        <w:t xml:space="preserve"> Ոսկյա իրերը</w:t>
+      </w:r>
       <w:r>
         <w:rPr>
           <w:sz w:val="18"/>
@@ -10710,58 +9932,21 @@
           <w:szCs w:val="22"/>
         </w:rPr>
       </w:pPr>
-      <w:proofErr w:type="spellStart"/>
       <w:r>
         <w:rPr>
           <w:sz w:val="18"/>
           <w:szCs w:val="22"/>
         </w:rPr>
-        <w:t>Պայմանագրով</w:t>
-      </w:r>
-      <w:proofErr w:type="spellEnd"/>
-      <w:r>
-        <w:rPr>
-          <w:sz w:val="18"/>
-          <w:szCs w:val="22"/>
-        </w:rPr>
-        <w:t xml:space="preserve"> </w:t>
-      </w:r>
-      <w:proofErr w:type="spellStart"/>
-      <w:r>
-        <w:rPr>
-          <w:sz w:val="18"/>
-          <w:szCs w:val="22"/>
-        </w:rPr>
-        <w:t>Գրավատուն</w:t>
-      </w:r>
-      <w:proofErr w:type="spellEnd"/>
+        <w:t>Պայմանագրով Գրավատուն</w:t>
+      </w:r>
       <w:r>
         <w:rPr>
           <w:sz w:val="18"/>
           <w:szCs w:val="22"/>
           <w:lang w:val="en-GB"/>
         </w:rPr>
-        <w:t xml:space="preserve"> (</w:t>
-      </w:r>
-      <w:proofErr w:type="spellStart"/>
-      <w:r>
-        <w:rPr>
-          <w:sz w:val="18"/>
-          <w:szCs w:val="22"/>
-          <w:lang w:val="en-GB"/>
-        </w:rPr>
-        <w:t>այսուհետ</w:t>
-      </w:r>
-      <w:proofErr w:type="spellEnd"/>
-      <w:r>
-        <w:rPr>
-          <w:sz w:val="18"/>
-          <w:szCs w:val="22"/>
-          <w:lang w:val="en-GB"/>
-        </w:rPr>
-        <w:t xml:space="preserve">՝ </w:t>
-      </w:r>
-      <w:proofErr w:type="spellStart"/>
+        <w:t xml:space="preserve"> (այսուհետ՝ </w:t>
+      </w:r>
       <w:r>
         <w:rPr>
           <w:b/>
@@ -10771,173 +9956,12 @@
         </w:rPr>
         <w:t>Հանձնող</w:t>
       </w:r>
-      <w:proofErr w:type="spellEnd"/>
       <w:r>
         <w:rPr>
           <w:sz w:val="18"/>
           <w:szCs w:val="22"/>
         </w:rPr>
-        <w:t xml:space="preserve">) </w:t>
-      </w:r>
-      <w:proofErr w:type="spellStart"/>
-      <w:r>
-        <w:rPr>
-          <w:sz w:val="18"/>
-          <w:szCs w:val="22"/>
-        </w:rPr>
-        <w:t>հանձնեց</w:t>
-      </w:r>
-      <w:proofErr w:type="spellEnd"/>
-      <w:r>
-        <w:rPr>
-          <w:sz w:val="18"/>
-          <w:szCs w:val="22"/>
-        </w:rPr>
-        <w:t xml:space="preserve">, </w:t>
-      </w:r>
-      <w:proofErr w:type="spellStart"/>
-      <w:r>
-        <w:rPr>
-          <w:sz w:val="18"/>
-          <w:szCs w:val="22"/>
-        </w:rPr>
-        <w:t>իսկ</w:t>
-      </w:r>
-      <w:proofErr w:type="spellEnd"/>
-      <w:r>
-        <w:rPr>
-          <w:sz w:val="18"/>
-          <w:szCs w:val="22"/>
-        </w:rPr>
-        <w:t xml:space="preserve"> </w:t>
-      </w:r>
-      <w:proofErr w:type="spellStart"/>
-      <w:r>
-        <w:rPr>
-          <w:sz w:val="18"/>
-          <w:szCs w:val="22"/>
-        </w:rPr>
-        <w:t>Գրավառուն</w:t>
-      </w:r>
-      <w:proofErr w:type="spellEnd"/>
-      <w:r>
-        <w:rPr>
-          <w:sz w:val="18"/>
-          <w:szCs w:val="22"/>
-        </w:rPr>
-        <w:t xml:space="preserve"> </w:t>
-      </w:r>
-      <w:proofErr w:type="spellStart"/>
-      <w:r>
-        <w:rPr>
-          <w:sz w:val="18"/>
-          <w:szCs w:val="22"/>
-        </w:rPr>
-        <w:t>ընդունեց</w:t>
-      </w:r>
-      <w:proofErr w:type="spellEnd"/>
-      <w:r>
-        <w:rPr>
-          <w:sz w:val="18"/>
-          <w:szCs w:val="22"/>
-        </w:rPr>
-        <w:t xml:space="preserve"> </w:t>
-      </w:r>
-      <w:proofErr w:type="spellStart"/>
-      <w:r>
-        <w:rPr>
-          <w:sz w:val="18"/>
-          <w:szCs w:val="22"/>
-        </w:rPr>
-        <w:t>վերը</w:t>
-      </w:r>
-      <w:proofErr w:type="spellEnd"/>
-      <w:r>
-        <w:rPr>
-          <w:sz w:val="18"/>
-          <w:szCs w:val="22"/>
-        </w:rPr>
-        <w:t xml:space="preserve"> </w:t>
-      </w:r>
-      <w:proofErr w:type="spellStart"/>
-      <w:r>
-        <w:rPr>
-          <w:sz w:val="18"/>
-          <w:szCs w:val="22"/>
-        </w:rPr>
-        <w:t>նշված</w:t>
-      </w:r>
-      <w:proofErr w:type="spellEnd"/>
-      <w:r>
-        <w:rPr>
-          <w:sz w:val="18"/>
-          <w:szCs w:val="22"/>
-        </w:rPr>
-        <w:t xml:space="preserve"> </w:t>
-      </w:r>
-      <w:proofErr w:type="spellStart"/>
-      <w:r>
-        <w:rPr>
-          <w:sz w:val="18"/>
-          <w:szCs w:val="22"/>
-        </w:rPr>
-        <w:t>աղյուսակում</w:t>
-      </w:r>
-      <w:proofErr w:type="spellEnd"/>
-      <w:r>
-        <w:rPr>
-          <w:sz w:val="18"/>
-          <w:szCs w:val="22"/>
-        </w:rPr>
-        <w:t xml:space="preserve"> </w:t>
-      </w:r>
-      <w:proofErr w:type="spellStart"/>
-      <w:r>
-        <w:rPr>
-          <w:sz w:val="18"/>
-          <w:szCs w:val="22"/>
-        </w:rPr>
-        <w:t>թվարկված</w:t>
-      </w:r>
-      <w:proofErr w:type="spellEnd"/>
-      <w:r>
-        <w:rPr>
-          <w:sz w:val="18"/>
-          <w:szCs w:val="22"/>
-        </w:rPr>
-        <w:t xml:space="preserve"> </w:t>
-      </w:r>
-      <w:proofErr w:type="spellStart"/>
-      <w:r>
-        <w:rPr>
-          <w:sz w:val="18"/>
-          <w:szCs w:val="22"/>
-        </w:rPr>
-        <w:t>ոսկյա</w:t>
-      </w:r>
-      <w:proofErr w:type="spellEnd"/>
-      <w:r>
-        <w:rPr>
-          <w:sz w:val="18"/>
-          <w:szCs w:val="22"/>
-        </w:rPr>
-        <w:t xml:space="preserve"> </w:t>
-      </w:r>
-      <w:proofErr w:type="spellStart"/>
-      <w:r>
-        <w:rPr>
-          <w:sz w:val="18"/>
-          <w:szCs w:val="22"/>
-        </w:rPr>
-        <w:t>իրերը</w:t>
-      </w:r>
-      <w:proofErr w:type="spellEnd"/>
-      <w:r>
-        <w:rPr>
-          <w:sz w:val="18"/>
-          <w:szCs w:val="22"/>
-        </w:rPr>
-        <w:t>։</w:t>
+        <w:t>) հանձնեց, իսկ Գրավառուն ընդունեց վերը նշված աղյուսակում թվարկված ոսկյա իրերը։</w:t>
       </w:r>
     </w:p>
     <w:p>
@@ -10949,255 +9973,13 @@
           <w:szCs w:val="22"/>
         </w:rPr>
       </w:pPr>
-      <w:proofErr w:type="spellStart"/>
       <w:r>
         <w:rPr>
           <w:sz w:val="18"/>
           <w:szCs w:val="22"/>
         </w:rPr>
-        <w:t>Հանձնողը</w:t>
-      </w:r>
-      <w:proofErr w:type="spellEnd"/>
-      <w:r>
-        <w:rPr>
-          <w:sz w:val="18"/>
-          <w:szCs w:val="22"/>
-        </w:rPr>
-        <w:t xml:space="preserve"> </w:t>
-      </w:r>
-      <w:proofErr w:type="spellStart"/>
-      <w:r>
-        <w:rPr>
-          <w:sz w:val="18"/>
-          <w:szCs w:val="22"/>
-        </w:rPr>
-        <w:t>հավաստիացնում</w:t>
-      </w:r>
-      <w:proofErr w:type="spellEnd"/>
-      <w:r>
-        <w:rPr>
-          <w:sz w:val="18"/>
-          <w:szCs w:val="22"/>
-        </w:rPr>
-        <w:t xml:space="preserve"> է, </w:t>
-      </w:r>
-      <w:proofErr w:type="spellStart"/>
-      <w:r>
-        <w:rPr>
-          <w:sz w:val="18"/>
-          <w:szCs w:val="22"/>
-        </w:rPr>
-        <w:t>որ</w:t>
-      </w:r>
-      <w:proofErr w:type="spellEnd"/>
-      <w:r>
-        <w:rPr>
-          <w:sz w:val="18"/>
-          <w:szCs w:val="22"/>
-        </w:rPr>
-        <w:t xml:space="preserve"> </w:t>
-      </w:r>
-      <w:proofErr w:type="spellStart"/>
-      <w:r>
-        <w:rPr>
-          <w:sz w:val="18"/>
-          <w:szCs w:val="22"/>
-        </w:rPr>
-        <w:t>գրավի</w:t>
-      </w:r>
-      <w:proofErr w:type="spellEnd"/>
-      <w:r>
-        <w:rPr>
-          <w:sz w:val="18"/>
-          <w:szCs w:val="22"/>
-        </w:rPr>
-        <w:t xml:space="preserve"> </w:t>
-      </w:r>
-      <w:proofErr w:type="spellStart"/>
-      <w:r>
-        <w:rPr>
-          <w:sz w:val="18"/>
-          <w:szCs w:val="22"/>
-        </w:rPr>
-        <w:t>առարկաները</w:t>
-      </w:r>
-      <w:proofErr w:type="spellEnd"/>
-      <w:r>
-        <w:rPr>
-          <w:sz w:val="18"/>
-          <w:szCs w:val="22"/>
-        </w:rPr>
-        <w:t xml:space="preserve"> </w:t>
-      </w:r>
-      <w:proofErr w:type="spellStart"/>
-      <w:r>
-        <w:rPr>
-          <w:sz w:val="18"/>
-          <w:szCs w:val="22"/>
-        </w:rPr>
-        <w:t>ամբողջությամբ</w:t>
-      </w:r>
-      <w:proofErr w:type="spellEnd"/>
-      <w:r>
-        <w:rPr>
-          <w:sz w:val="18"/>
-          <w:szCs w:val="22"/>
-        </w:rPr>
-        <w:t xml:space="preserve"> </w:t>
-      </w:r>
-      <w:proofErr w:type="spellStart"/>
-      <w:r>
-        <w:rPr>
-          <w:sz w:val="18"/>
-          <w:szCs w:val="22"/>
-        </w:rPr>
-        <w:t>սեփականության</w:t>
-      </w:r>
-      <w:proofErr w:type="spellEnd"/>
-      <w:r>
-        <w:rPr>
-          <w:sz w:val="18"/>
-          <w:szCs w:val="22"/>
-        </w:rPr>
-        <w:t xml:space="preserve"> </w:t>
-      </w:r>
-      <w:proofErr w:type="spellStart"/>
-      <w:r>
-        <w:rPr>
-          <w:sz w:val="18"/>
-          <w:szCs w:val="22"/>
-        </w:rPr>
-        <w:t>իրավունքով</w:t>
-      </w:r>
-      <w:proofErr w:type="spellEnd"/>
-      <w:r>
-        <w:rPr>
-          <w:sz w:val="18"/>
-          <w:szCs w:val="22"/>
-        </w:rPr>
-        <w:t xml:space="preserve"> </w:t>
-      </w:r>
-      <w:proofErr w:type="spellStart"/>
-      <w:r>
-        <w:rPr>
-          <w:sz w:val="18"/>
-          <w:szCs w:val="22"/>
-        </w:rPr>
-        <w:t>պատկանում</w:t>
-      </w:r>
-      <w:proofErr w:type="spellEnd"/>
-      <w:r>
-        <w:rPr>
-          <w:sz w:val="18"/>
-          <w:szCs w:val="22"/>
-        </w:rPr>
-        <w:t xml:space="preserve"> </w:t>
-      </w:r>
-      <w:proofErr w:type="spellStart"/>
-      <w:r>
-        <w:rPr>
-          <w:sz w:val="18"/>
-          <w:szCs w:val="22"/>
-        </w:rPr>
-        <w:t>են</w:t>
-      </w:r>
-      <w:proofErr w:type="spellEnd"/>
-      <w:r>
-        <w:rPr>
-          <w:sz w:val="18"/>
-          <w:szCs w:val="22"/>
-        </w:rPr>
-        <w:t xml:space="preserve"> </w:t>
-      </w:r>
-      <w:proofErr w:type="spellStart"/>
-      <w:r>
-        <w:rPr>
-          <w:sz w:val="18"/>
-          <w:szCs w:val="22"/>
-        </w:rPr>
-        <w:t>իրեն</w:t>
-      </w:r>
-      <w:proofErr w:type="spellEnd"/>
-      <w:r>
-        <w:rPr>
-          <w:sz w:val="18"/>
-          <w:szCs w:val="22"/>
-        </w:rPr>
-        <w:t xml:space="preserve">, </w:t>
-      </w:r>
-      <w:proofErr w:type="spellStart"/>
-      <w:r>
-        <w:rPr>
-          <w:sz w:val="18"/>
-          <w:szCs w:val="22"/>
-        </w:rPr>
-        <w:t>ազատ</w:t>
-      </w:r>
-      <w:proofErr w:type="spellEnd"/>
-      <w:r>
-        <w:rPr>
-          <w:sz w:val="18"/>
-          <w:szCs w:val="22"/>
-        </w:rPr>
-        <w:t xml:space="preserve"> </w:t>
-      </w:r>
-      <w:proofErr w:type="spellStart"/>
-      <w:r>
-        <w:rPr>
-          <w:sz w:val="18"/>
-          <w:szCs w:val="22"/>
-        </w:rPr>
-        <w:t>են</w:t>
-      </w:r>
-      <w:proofErr w:type="spellEnd"/>
-      <w:r>
-        <w:rPr>
-          <w:sz w:val="18"/>
-          <w:szCs w:val="22"/>
-        </w:rPr>
-        <w:t xml:space="preserve"> </w:t>
-      </w:r>
-      <w:proofErr w:type="spellStart"/>
-      <w:r>
-        <w:rPr>
-          <w:sz w:val="18"/>
-          <w:szCs w:val="22"/>
-        </w:rPr>
-        <w:t>այլ</w:t>
-      </w:r>
-      <w:proofErr w:type="spellEnd"/>
-      <w:r>
-        <w:rPr>
-          <w:sz w:val="18"/>
-          <w:szCs w:val="22"/>
-        </w:rPr>
-        <w:t xml:space="preserve"> </w:t>
-      </w:r>
-      <w:proofErr w:type="spellStart"/>
-      <w:r>
-        <w:rPr>
-          <w:sz w:val="18"/>
-          <w:szCs w:val="22"/>
-        </w:rPr>
-        <w:t>անձանց</w:t>
-      </w:r>
-      <w:proofErr w:type="spellEnd"/>
-      <w:r>
-        <w:rPr>
-          <w:sz w:val="18"/>
-          <w:szCs w:val="22"/>
-        </w:rPr>
-        <w:t xml:space="preserve"> </w:t>
-      </w:r>
-      <w:proofErr w:type="spellStart"/>
-      <w:r>
-        <w:rPr>
-          <w:sz w:val="18"/>
-          <w:szCs w:val="22"/>
-        </w:rPr>
-        <w:t>պահանջներից</w:t>
-      </w:r>
-      <w:proofErr w:type="spellEnd"/>
+        <w:t>Հանձնողը հավաստիացնում է, որ գրավի առարկաները ամբողջությամբ սեփականության իրավունքով պատկանում են իրեն, ազատ են այլ անձանց պահանջներից</w:t>
+      </w:r>
       <w:r>
         <w:rPr>
           <w:sz w:val="18"/>
@@ -11252,65 +10034,68 @@
                 <w:szCs w:val="18"/>
               </w:rPr>
             </w:pPr>
-            <w:proofErr w:type="spellStart"/>
             <w:r>
               <w:rPr>
                 <w:rFonts w:ascii="Times New Roman" w:hAnsi="Times New Roman" w:cs="Times New Roman"/>
                 <w:sz w:val="18"/>
                 <w:szCs w:val="18"/>
               </w:rPr>
-              <w:t>Ընդունեցին</w:t>
-            </w:r>
-            <w:proofErr w:type="spellEnd"/>
-            <w:r>
+              <w:t>Ընդունեցին՝</w:t>
+            </w:r>
+          </w:p>
+        </w:tc>
+        <w:tc>
+          <w:tcPr>
+            <w:tcW w:w="4189" w:type="dxa"/>
+            <w:gridSpan w:val="3"/>
+          </w:tcPr>
+          <w:p>
+            <w:pPr>
+              <w:spacing w:line="276" w:lineRule="auto"/>
               <w:rPr>
                 <w:rFonts w:ascii="Times New Roman" w:hAnsi="Times New Roman" w:cs="Times New Roman"/>
                 <w:sz w:val="18"/>
                 <w:szCs w:val="18"/>
               </w:rPr>
-              <w:t>՝</w:t>
-            </w:r>
-          </w:p>
-        </w:tc>
-        <w:tc>
-          <w:tcPr>
-            <w:tcW w:w="4189" w:type="dxa"/>
-            <w:gridSpan w:val="3"/>
-          </w:tcPr>
-          <w:p>
-            <w:pPr>
-              <w:spacing w:line="276" w:lineRule="auto"/>
+            </w:pPr>
+            <w:r>
               <w:rPr>
                 <w:rFonts w:ascii="Times New Roman" w:hAnsi="Times New Roman" w:cs="Times New Roman"/>
                 <w:sz w:val="18"/>
                 <w:szCs w:val="18"/>
               </w:rPr>
-            </w:pPr>
-            <w:proofErr w:type="spellStart"/>
-            <w:r>
+              <w:t xml:space="preserve">Հանձնեց՝      </w:t>
+            </w:r>
+          </w:p>
+        </w:tc>
+      </w:tr>
+      <w:tr>
+        <w:tc>
+          <w:tcPr>
+            <w:tcW w:w="1817" w:type="dxa"/>
+          </w:tcPr>
+          <w:p>
+            <w:pPr>
+              <w:spacing w:line="276" w:lineRule="auto"/>
               <w:rPr>
                 <w:rFonts w:ascii="Times New Roman" w:hAnsi="Times New Roman" w:cs="Times New Roman"/>
                 <w:sz w:val="18"/>
                 <w:szCs w:val="18"/>
               </w:rPr>
-              <w:t>Հանձնեց</w:t>
-            </w:r>
-            <w:proofErr w:type="spellEnd"/>
+            </w:pPr>
             <w:r>
               <w:rPr>
                 <w:rFonts w:ascii="Times New Roman" w:hAnsi="Times New Roman" w:cs="Times New Roman"/>
                 <w:sz w:val="18"/>
                 <w:szCs w:val="18"/>
               </w:rPr>
-              <w:t xml:space="preserve">՝      </w:t>
-            </w:r>
-          </w:p>
-        </w:tc>
-      </w:tr>
-      <w:tr>
-        <w:tc>
-          <w:tcPr>
-            <w:tcW w:w="1817" w:type="dxa"/>
+              <w:t>Գլխավոր տնօրեն</w:t>
+            </w:r>
+          </w:p>
+        </w:tc>
+        <w:tc>
+          <w:tcPr>
+            <w:tcW w:w="1174" w:type="dxa"/>
           </w:tcPr>
           <w:p>
             <w:pPr>
@@ -11321,118 +10106,53 @@
                 <w:szCs w:val="18"/>
               </w:rPr>
             </w:pPr>
-            <w:proofErr w:type="spellStart"/>
-            <w:r>
+          </w:p>
+        </w:tc>
+        <w:tc>
+          <w:tcPr>
+            <w:tcW w:w="2596" w:type="dxa"/>
+          </w:tcPr>
+          <w:p>
+            <w:pPr>
+              <w:spacing w:line="276" w:lineRule="auto"/>
+              <w:ind w:left="77"/>
               <w:rPr>
                 <w:rFonts w:ascii="Times New Roman" w:hAnsi="Times New Roman" w:cs="Times New Roman"/>
                 <w:sz w:val="18"/>
                 <w:szCs w:val="18"/>
               </w:rPr>
-              <w:t>Գլխավոր</w:t>
-            </w:r>
-            <w:proofErr w:type="spellEnd"/>
+            </w:pPr>
             <w:r>
               <w:rPr>
                 <w:rFonts w:ascii="Times New Roman" w:hAnsi="Times New Roman" w:cs="Times New Roman"/>
                 <w:sz w:val="18"/>
                 <w:szCs w:val="18"/>
               </w:rPr>
-              <w:t xml:space="preserve"> </w:t>
-            </w:r>
-            <w:proofErr w:type="spellStart"/>
-            <w:r>
+              <w:t>Գրիգոր Սահականը</w:t>
+            </w:r>
+          </w:p>
+        </w:tc>
+        <w:tc>
+          <w:tcPr>
+            <w:tcW w:w="1120" w:type="dxa"/>
+          </w:tcPr>
+          <w:p>
+            <w:pPr>
+              <w:spacing w:line="276" w:lineRule="auto"/>
               <w:rPr>
                 <w:rFonts w:ascii="Times New Roman" w:hAnsi="Times New Roman" w:cs="Times New Roman"/>
                 <w:sz w:val="18"/>
                 <w:szCs w:val="18"/>
               </w:rPr>
-              <w:t>տնօրեն</w:t>
-            </w:r>
-            <w:proofErr w:type="spellEnd"/>
-          </w:p>
-        </w:tc>
-        <w:tc>
-          <w:tcPr>
-            <w:tcW w:w="1174" w:type="dxa"/>
-          </w:tcPr>
-          <w:p>
-            <w:pPr>
-              <w:spacing w:line="276" w:lineRule="auto"/>
+            </w:pPr>
+            <w:r>
               <w:rPr>
                 <w:rFonts w:ascii="Times New Roman" w:hAnsi="Times New Roman" w:cs="Times New Roman"/>
                 <w:sz w:val="18"/>
                 <w:szCs w:val="18"/>
               </w:rPr>
-            </w:pPr>
-          </w:p>
-        </w:tc>
-        <w:tc>
-          <w:tcPr>
-            <w:tcW w:w="2596" w:type="dxa"/>
-          </w:tcPr>
-          <w:p>
-            <w:pPr>
-              <w:spacing w:line="276" w:lineRule="auto"/>
-              <w:ind w:left="77"/>
-              <w:rPr>
-                <w:rFonts w:ascii="Times New Roman" w:hAnsi="Times New Roman" w:cs="Times New Roman"/>
-                <w:sz w:val="18"/>
-                <w:szCs w:val="18"/>
-              </w:rPr>
-            </w:pPr>
-            <w:proofErr w:type="spellStart"/>
-            <w:r>
-              <w:rPr>
-                <w:rFonts w:ascii="Times New Roman" w:hAnsi="Times New Roman" w:cs="Times New Roman"/>
-                <w:sz w:val="18"/>
-                <w:szCs w:val="18"/>
-              </w:rPr>
-              <w:t>Գրիգոր</w:t>
-            </w:r>
-            <w:proofErr w:type="spellEnd"/>
-            <w:r>
-              <w:rPr>
-                <w:rFonts w:ascii="Times New Roman" w:hAnsi="Times New Roman" w:cs="Times New Roman"/>
-                <w:sz w:val="18"/>
-                <w:szCs w:val="18"/>
-              </w:rPr>
-              <w:t xml:space="preserve"> </w:t>
-            </w:r>
-            <w:proofErr w:type="spellStart"/>
-            <w:r>
-              <w:rPr>
-                <w:rFonts w:ascii="Times New Roman" w:hAnsi="Times New Roman" w:cs="Times New Roman"/>
-                <w:sz w:val="18"/>
-                <w:szCs w:val="18"/>
-              </w:rPr>
-              <w:t>Սահականը</w:t>
-            </w:r>
-            <w:proofErr w:type="spellEnd"/>
-          </w:p>
-        </w:tc>
-        <w:tc>
-          <w:tcPr>
-            <w:tcW w:w="1120" w:type="dxa"/>
-          </w:tcPr>
-          <w:p>
-            <w:pPr>
-              <w:spacing w:line="276" w:lineRule="auto"/>
-              <w:rPr>
-                <w:rFonts w:ascii="Times New Roman" w:hAnsi="Times New Roman" w:cs="Times New Roman"/>
-                <w:sz w:val="18"/>
-                <w:szCs w:val="18"/>
-              </w:rPr>
-            </w:pPr>
-            <w:proofErr w:type="spellStart"/>
-            <w:r>
-              <w:rPr>
-                <w:rFonts w:ascii="Times New Roman" w:hAnsi="Times New Roman" w:cs="Times New Roman"/>
-                <w:sz w:val="18"/>
-                <w:szCs w:val="18"/>
-              </w:rPr>
               <w:t>Գրավատու</w:t>
             </w:r>
-            <w:proofErr w:type="spellEnd"/>
           </w:p>
         </w:tc>
         <w:tc>
@@ -11513,7 +10233,6 @@
                 <w:szCs w:val="18"/>
               </w:rPr>
             </w:pPr>
-            <w:proofErr w:type="spellStart"/>
             <w:r>
               <w:rPr>
                 <w:rFonts w:ascii="Times New Roman" w:hAnsi="Times New Roman" w:cs="Times New Roman"/>
@@ -11522,7 +10241,6 @@
               </w:rPr>
               <w:t>Ոսկերիչ-մասնագետ</w:t>
             </w:r>
-            <w:proofErr w:type="spellEnd"/>
           </w:p>
         </w:tc>
         <w:tc>
@@ -11702,7 +10420,7 @@
               </wp:anchor>
             </w:drawing>
           </mc:Choice>
-          <mc:Fallback xmlns:w16du="http://schemas.microsoft.com/office/word/2023/wordml/word16du" xmlns:w16sdtfl="http://schemas.microsoft.com/office/word/2024/wordml/sdtformatlock">
+          <mc:Fallback xmlns:w16sdtfl="http://schemas.microsoft.com/office/word/2024/wordml/sdtformatlock" xmlns:w16du="http://schemas.microsoft.com/office/word/2023/wordml/word16du">
             <w:pict>
               <v:line w14:anchorId="6A9B0DF6" id="Straight Connector 2" o:spid="_x0000_s1026" style="position:absolute;z-index:251659264;visibility:visible;mso-wrap-style:square;mso-wrap-distance-left:9pt;mso-wrap-distance-top:0;mso-wrap-distance-right:9pt;mso-wrap-distance-bottom:0;mso-position-horizontal:absolute;mso-position-horizontal-relative:text;mso-position-vertical:absolute;mso-position-vertical-relative:text" from="-2.8pt,12.7pt" to="488.9pt,12.7pt" o:gfxdata="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" strokecolor="black [3213]" strokeweight="1.25pt">
                 <v:stroke linestyle="thinThick" joinstyle="miter"/>
@@ -11726,7 +10444,6 @@
           <w:lang w:val="en-GB"/>
         </w:rPr>
       </w:pPr>
-      <w:proofErr w:type="spellStart"/>
       <w:r>
         <w:rPr>
           <w:rFonts w:ascii="Times New Roman" w:hAnsi="Times New Roman" w:cs="Times New Roman"/>
@@ -11738,9 +10455,8 @@
           <w:szCs w:val="18"/>
           <w:lang w:val="en-GB"/>
         </w:rPr>
-        <w:t>Ոսկյա</w:t>
-      </w:r>
-      <w:proofErr w:type="spellEnd"/>
+        <w:t>Ոսկյա իրերի պարկի բացման և ս</w:t>
+      </w:r>
       <w:r>
         <w:rPr>
           <w:rFonts w:ascii="Times New Roman" w:hAnsi="Times New Roman" w:cs="Times New Roman"/>
@@ -11752,160 +10468,7 @@
           <w:szCs w:val="18"/>
           <w:lang w:val="en-GB"/>
         </w:rPr>
-        <w:t xml:space="preserve"> </w:t>
-      </w:r>
-      <w:proofErr w:type="spellStart"/>
-      <w:r>
-        <w:rPr>
-          <w:rFonts w:ascii="Times New Roman" w:hAnsi="Times New Roman" w:cs="Times New Roman"/>
-          <w:b/>
-          <w:bCs/>
-          <w:i/>
-          <w:iCs/>
-          <w:sz w:val="18"/>
-          <w:szCs w:val="18"/>
-          <w:lang w:val="en-GB"/>
-        </w:rPr>
-        <w:t>իրերի</w:t>
-      </w:r>
-      <w:proofErr w:type="spellEnd"/>
-      <w:r>
-        <w:rPr>
-          <w:rFonts w:ascii="Times New Roman" w:hAnsi="Times New Roman" w:cs="Times New Roman"/>
-          <w:b/>
-          <w:bCs/>
-          <w:i/>
-          <w:iCs/>
-          <w:sz w:val="18"/>
-          <w:szCs w:val="18"/>
-          <w:lang w:val="en-GB"/>
-        </w:rPr>
-        <w:t xml:space="preserve"> </w:t>
-      </w:r>
-      <w:proofErr w:type="spellStart"/>
-      <w:r>
-        <w:rPr>
-          <w:rFonts w:ascii="Times New Roman" w:hAnsi="Times New Roman" w:cs="Times New Roman"/>
-          <w:b/>
-          <w:bCs/>
-          <w:i/>
-          <w:iCs/>
-          <w:sz w:val="18"/>
-          <w:szCs w:val="18"/>
-          <w:lang w:val="en-GB"/>
-        </w:rPr>
-        <w:t>պարկի</w:t>
-      </w:r>
-      <w:proofErr w:type="spellEnd"/>
-      <w:r>
-        <w:rPr>
-          <w:rFonts w:ascii="Times New Roman" w:hAnsi="Times New Roman" w:cs="Times New Roman"/>
-          <w:b/>
-          <w:bCs/>
-          <w:i/>
-          <w:iCs/>
-          <w:sz w:val="18"/>
-          <w:szCs w:val="18"/>
-          <w:lang w:val="en-GB"/>
-        </w:rPr>
-        <w:t xml:space="preserve"> </w:t>
-      </w:r>
-      <w:proofErr w:type="spellStart"/>
-      <w:r>
-        <w:rPr>
-          <w:rFonts w:ascii="Times New Roman" w:hAnsi="Times New Roman" w:cs="Times New Roman"/>
-          <w:b/>
-          <w:bCs/>
-          <w:i/>
-          <w:iCs/>
-          <w:sz w:val="18"/>
-          <w:szCs w:val="18"/>
-          <w:lang w:val="en-GB"/>
-        </w:rPr>
-        <w:t>բացման</w:t>
-      </w:r>
-      <w:proofErr w:type="spellEnd"/>
-      <w:r>
-        <w:rPr>
-          <w:rFonts w:ascii="Times New Roman" w:hAnsi="Times New Roman" w:cs="Times New Roman"/>
-          <w:b/>
-          <w:bCs/>
-          <w:i/>
-          <w:iCs/>
-          <w:sz w:val="18"/>
-          <w:szCs w:val="18"/>
-          <w:lang w:val="en-GB"/>
-        </w:rPr>
-        <w:t xml:space="preserve"> և </w:t>
-      </w:r>
-      <w:proofErr w:type="spellStart"/>
-      <w:r>
-        <w:rPr>
-          <w:rFonts w:ascii="Times New Roman" w:hAnsi="Times New Roman" w:cs="Times New Roman"/>
-          <w:b/>
-          <w:bCs/>
-          <w:i/>
-          <w:iCs/>
-          <w:sz w:val="18"/>
-          <w:szCs w:val="18"/>
-          <w:lang w:val="en-GB"/>
-        </w:rPr>
-        <w:t>ս</w:t>
-      </w:r>
-      <w:r>
-        <w:rPr>
-          <w:rFonts w:ascii="Times New Roman" w:hAnsi="Times New Roman" w:cs="Times New Roman"/>
-          <w:b/>
-          <w:bCs/>
-          <w:i/>
-          <w:iCs/>
-          <w:sz w:val="18"/>
-          <w:szCs w:val="18"/>
-          <w:lang w:val="en-GB"/>
-        </w:rPr>
-        <w:t>տուգման</w:t>
-      </w:r>
-      <w:proofErr w:type="spellEnd"/>
-      <w:r>
-        <w:rPr>
-          <w:rFonts w:ascii="Times New Roman" w:hAnsi="Times New Roman" w:cs="Times New Roman"/>
-          <w:b/>
-          <w:bCs/>
-          <w:i/>
-          <w:iCs/>
-          <w:sz w:val="18"/>
-          <w:szCs w:val="18"/>
-          <w:lang w:val="en-GB"/>
-        </w:rPr>
-        <w:t xml:space="preserve"> </w:t>
-      </w:r>
-      <w:proofErr w:type="spellStart"/>
-      <w:r>
-        <w:rPr>
-          <w:rFonts w:ascii="Times New Roman" w:hAnsi="Times New Roman" w:cs="Times New Roman"/>
-          <w:b/>
-          <w:bCs/>
-          <w:i/>
-          <w:iCs/>
-          <w:sz w:val="18"/>
-          <w:szCs w:val="18"/>
-          <w:lang w:val="en-GB"/>
-        </w:rPr>
-        <w:t>արձանագրություն</w:t>
-      </w:r>
-      <w:proofErr w:type="spellEnd"/>
-      <w:r>
-        <w:rPr>
-          <w:rFonts w:ascii="Times New Roman" w:hAnsi="Times New Roman" w:cs="Times New Roman"/>
-          <w:b/>
-          <w:bCs/>
-          <w:i/>
-          <w:iCs/>
-          <w:sz w:val="18"/>
-          <w:szCs w:val="18"/>
-          <w:lang w:val="en-GB"/>
-        </w:rPr>
-        <w:t xml:space="preserve"> </w:t>
+        <w:t xml:space="preserve">տուգման արձանագրություն </w:t>
       </w:r>
     </w:p>
     <w:p>
@@ -11918,95 +10481,13 @@
           <w:lang w:val="en-GB"/>
         </w:rPr>
       </w:pPr>
-      <w:proofErr w:type="spellStart"/>
-      <w:r>
-        <w:rPr>
-          <w:rFonts w:ascii="Times New Roman" w:hAnsi="Times New Roman" w:cs="Times New Roman"/>
-          <w:sz w:val="18"/>
-          <w:szCs w:val="18"/>
-        </w:rPr>
-        <w:t>Ստուգման</w:t>
-      </w:r>
-      <w:proofErr w:type="spellEnd"/>
-      <w:r>
-        <w:rPr>
-          <w:rFonts w:ascii="Times New Roman" w:hAnsi="Times New Roman" w:cs="Times New Roman"/>
-          <w:sz w:val="18"/>
-          <w:szCs w:val="18"/>
-        </w:rPr>
-        <w:t xml:space="preserve"> </w:t>
-      </w:r>
-      <w:proofErr w:type="spellStart"/>
-      <w:r>
-        <w:rPr>
-          <w:rFonts w:ascii="Times New Roman" w:hAnsi="Times New Roman" w:cs="Times New Roman"/>
-          <w:sz w:val="18"/>
-          <w:szCs w:val="18"/>
-        </w:rPr>
-        <w:t>նպատակով</w:t>
-      </w:r>
-      <w:proofErr w:type="spellEnd"/>
-      <w:r>
-        <w:rPr>
-          <w:rFonts w:ascii="Times New Roman" w:hAnsi="Times New Roman" w:cs="Times New Roman"/>
-          <w:sz w:val="18"/>
-          <w:szCs w:val="18"/>
-        </w:rPr>
-        <w:t xml:space="preserve"> </w:t>
-      </w:r>
-      <w:proofErr w:type="spellStart"/>
-      <w:r>
-        <w:rPr>
-          <w:rFonts w:ascii="Times New Roman" w:hAnsi="Times New Roman" w:cs="Times New Roman"/>
-          <w:sz w:val="18"/>
-          <w:szCs w:val="18"/>
-        </w:rPr>
-        <w:t>պարկի</w:t>
-      </w:r>
-      <w:proofErr w:type="spellEnd"/>
-      <w:r>
-        <w:rPr>
-          <w:rFonts w:ascii="Times New Roman" w:hAnsi="Times New Roman" w:cs="Times New Roman"/>
-          <w:sz w:val="18"/>
-          <w:szCs w:val="18"/>
-        </w:rPr>
-        <w:t xml:space="preserve"> </w:t>
-      </w:r>
-      <w:proofErr w:type="spellStart"/>
-      <w:r>
-        <w:rPr>
-          <w:rFonts w:ascii="Times New Roman" w:hAnsi="Times New Roman" w:cs="Times New Roman"/>
-          <w:sz w:val="18"/>
-          <w:szCs w:val="18"/>
-        </w:rPr>
-        <w:t>բացման</w:t>
-      </w:r>
-      <w:proofErr w:type="spellEnd"/>
-      <w:r>
-        <w:rPr>
-          <w:rFonts w:ascii="Times New Roman" w:hAnsi="Times New Roman" w:cs="Times New Roman"/>
-          <w:sz w:val="18"/>
-          <w:szCs w:val="18"/>
-        </w:rPr>
-        <w:t xml:space="preserve"> </w:t>
-      </w:r>
-      <w:proofErr w:type="spellStart"/>
-      <w:r>
-        <w:rPr>
-          <w:rFonts w:ascii="Times New Roman" w:hAnsi="Times New Roman" w:cs="Times New Roman"/>
-          <w:sz w:val="18"/>
-          <w:szCs w:val="18"/>
-        </w:rPr>
-        <w:t>ամսաթիվը</w:t>
-      </w:r>
-      <w:proofErr w:type="spellEnd"/>
-      <w:r>
-        <w:rPr>
-          <w:rFonts w:ascii="Times New Roman" w:hAnsi="Times New Roman" w:cs="Times New Roman"/>
-          <w:sz w:val="18"/>
-          <w:szCs w:val="18"/>
-        </w:rPr>
-        <w:t xml:space="preserve">    __</w:t>
+      <w:r>
+        <w:rPr>
+          <w:rFonts w:ascii="Times New Roman" w:hAnsi="Times New Roman" w:cs="Times New Roman"/>
+          <w:sz w:val="18"/>
+          <w:szCs w:val="18"/>
+        </w:rPr>
+        <w:t>Ստուգման նպատակով պարկի բացման ամսաթիվը    __</w:t>
       </w:r>
       <w:r>
         <w:rPr>
@@ -12023,43 +10504,7 @@
           <w:sz w:val="18"/>
           <w:szCs w:val="18"/>
         </w:rPr>
-        <w:t xml:space="preserve">__/______/__________ </w:t>
-      </w:r>
-      <w:proofErr w:type="spellStart"/>
-      <w:r>
-        <w:rPr>
-          <w:rFonts w:ascii="Times New Roman" w:hAnsi="Times New Roman" w:cs="Times New Roman"/>
-          <w:sz w:val="18"/>
-          <w:szCs w:val="18"/>
-        </w:rPr>
-        <w:t>թվականին</w:t>
-      </w:r>
-      <w:proofErr w:type="spellEnd"/>
-      <w:r>
-        <w:rPr>
-          <w:rFonts w:ascii="Times New Roman" w:hAnsi="Times New Roman" w:cs="Times New Roman"/>
-          <w:sz w:val="18"/>
-          <w:szCs w:val="18"/>
-        </w:rPr>
-        <w:t xml:space="preserve"> </w:t>
-      </w:r>
-      <w:proofErr w:type="spellStart"/>
-      <w:r>
-        <w:rPr>
-          <w:rFonts w:ascii="Times New Roman" w:hAnsi="Times New Roman" w:cs="Times New Roman"/>
-          <w:sz w:val="18"/>
-          <w:szCs w:val="18"/>
-        </w:rPr>
-        <w:t>ժամը</w:t>
-      </w:r>
-      <w:proofErr w:type="spellEnd"/>
-      <w:r>
-        <w:rPr>
-          <w:rFonts w:ascii="Times New Roman" w:hAnsi="Times New Roman" w:cs="Times New Roman"/>
-          <w:sz w:val="18"/>
-          <w:szCs w:val="18"/>
-        </w:rPr>
-        <w:t xml:space="preserve"> _</w:t>
+        <w:t>__/______/__________ թվականին ժամը _</w:t>
       </w:r>
       <w:r>
         <w:rPr>
@@ -12137,136 +10582,76 @@
                 <w:szCs w:val="18"/>
               </w:rPr>
             </w:pPr>
-            <w:proofErr w:type="spellStart"/>
             <w:r>
               <w:rPr>
                 <w:rFonts w:ascii="Times New Roman" w:hAnsi="Times New Roman" w:cs="Times New Roman"/>
                 <w:sz w:val="18"/>
                 <w:szCs w:val="18"/>
               </w:rPr>
-              <w:t>Գլխավոր</w:t>
-            </w:r>
-            <w:proofErr w:type="spellEnd"/>
-            <w:r>
+              <w:t>Գլխավոր տնօրեն</w:t>
+            </w:r>
+          </w:p>
+        </w:tc>
+        <w:tc>
+          <w:tcPr>
+            <w:tcW w:w="1174" w:type="dxa"/>
+          </w:tcPr>
+          <w:p>
+            <w:pPr>
+              <w:spacing w:line="276" w:lineRule="auto"/>
               <w:rPr>
                 <w:rFonts w:ascii="Times New Roman" w:hAnsi="Times New Roman" w:cs="Times New Roman"/>
                 <w:sz w:val="18"/>
                 <w:szCs w:val="18"/>
               </w:rPr>
-              <w:t xml:space="preserve"> </w:t>
-            </w:r>
-            <w:proofErr w:type="spellStart"/>
-            <w:r>
+            </w:pPr>
+          </w:p>
+        </w:tc>
+        <w:tc>
+          <w:tcPr>
+            <w:tcW w:w="2112" w:type="dxa"/>
+          </w:tcPr>
+          <w:p>
+            <w:pPr>
+              <w:spacing w:line="276" w:lineRule="auto"/>
+              <w:ind w:left="77"/>
               <w:rPr>
                 <w:rFonts w:ascii="Times New Roman" w:hAnsi="Times New Roman" w:cs="Times New Roman"/>
                 <w:sz w:val="18"/>
                 <w:szCs w:val="18"/>
               </w:rPr>
-              <w:t>տնօրեն</w:t>
-            </w:r>
-            <w:proofErr w:type="spellEnd"/>
-          </w:p>
-        </w:tc>
-        <w:tc>
-          <w:tcPr>
-            <w:tcW w:w="1174" w:type="dxa"/>
-          </w:tcPr>
-          <w:p>
-            <w:pPr>
-              <w:spacing w:line="276" w:lineRule="auto"/>
+            </w:pPr>
+            <w:r>
               <w:rPr>
                 <w:rFonts w:ascii="Times New Roman" w:hAnsi="Times New Roman" w:cs="Times New Roman"/>
                 <w:sz w:val="18"/>
                 <w:szCs w:val="18"/>
               </w:rPr>
-            </w:pPr>
-          </w:p>
-        </w:tc>
-        <w:tc>
-          <w:tcPr>
-            <w:tcW w:w="2112" w:type="dxa"/>
+              <w:t>Գրիգոր Սահականը</w:t>
+            </w:r>
+          </w:p>
+        </w:tc>
+        <w:tc>
+          <w:tcPr>
+            <w:tcW w:w="1985" w:type="dxa"/>
           </w:tcPr>
           <w:p>
             <w:pPr>
               <w:spacing w:line="276" w:lineRule="auto"/>
-              <w:ind w:left="77"/>
               <w:rPr>
                 <w:rFonts w:ascii="Times New Roman" w:hAnsi="Times New Roman" w:cs="Times New Roman"/>
                 <w:sz w:val="18"/>
                 <w:szCs w:val="18"/>
               </w:rPr>
             </w:pPr>
-            <w:proofErr w:type="spellStart"/>
             <w:r>
               <w:rPr>
                 <w:rFonts w:ascii="Times New Roman" w:hAnsi="Times New Roman" w:cs="Times New Roman"/>
                 <w:sz w:val="18"/>
                 <w:szCs w:val="18"/>
               </w:rPr>
-              <w:t>Գրիգոր</w:t>
-            </w:r>
-            <w:proofErr w:type="spellEnd"/>
-            <w:r>
-              <w:rPr>
-                <w:rFonts w:ascii="Times New Roman" w:hAnsi="Times New Roman" w:cs="Times New Roman"/>
-                <w:sz w:val="18"/>
-                <w:szCs w:val="18"/>
-              </w:rPr>
-              <w:t xml:space="preserve"> </w:t>
-            </w:r>
-            <w:proofErr w:type="spellStart"/>
-            <w:r>
-              <w:rPr>
-                <w:rFonts w:ascii="Times New Roman" w:hAnsi="Times New Roman" w:cs="Times New Roman"/>
-                <w:sz w:val="18"/>
-                <w:szCs w:val="18"/>
-              </w:rPr>
-              <w:t>Սահականը</w:t>
-            </w:r>
-            <w:proofErr w:type="spellEnd"/>
-          </w:p>
-        </w:tc>
-        <w:tc>
-          <w:tcPr>
-            <w:tcW w:w="1985" w:type="dxa"/>
-          </w:tcPr>
-          <w:p>
-            <w:pPr>
-              <w:spacing w:line="276" w:lineRule="auto"/>
-              <w:rPr>
-                <w:rFonts w:ascii="Times New Roman" w:hAnsi="Times New Roman" w:cs="Times New Roman"/>
-                <w:sz w:val="18"/>
-                <w:szCs w:val="18"/>
-              </w:rPr>
-            </w:pPr>
-            <w:proofErr w:type="spellStart"/>
-            <w:r>
-              <w:rPr>
-                <w:rFonts w:ascii="Times New Roman" w:hAnsi="Times New Roman" w:cs="Times New Roman"/>
-                <w:sz w:val="18"/>
-                <w:szCs w:val="18"/>
-              </w:rPr>
-              <w:t>Վարկային</w:t>
-            </w:r>
-            <w:proofErr w:type="spellEnd"/>
-            <w:r>
-              <w:rPr>
-                <w:rFonts w:ascii="Times New Roman" w:hAnsi="Times New Roman" w:cs="Times New Roman"/>
-                <w:sz w:val="18"/>
-                <w:szCs w:val="18"/>
-              </w:rPr>
-              <w:t xml:space="preserve"> </w:t>
-            </w:r>
-            <w:proofErr w:type="spellStart"/>
-            <w:r>
-              <w:rPr>
-                <w:rFonts w:ascii="Times New Roman" w:hAnsi="Times New Roman" w:cs="Times New Roman"/>
-                <w:sz w:val="18"/>
-                <w:szCs w:val="18"/>
-              </w:rPr>
-              <w:t>մասնագետ</w:t>
-            </w:r>
-            <w:proofErr w:type="spellEnd"/>
+              <w:t>Վարկային մասնագետ</w:t>
+            </w:r>
           </w:p>
         </w:tc>
         <w:tc>
@@ -12337,7 +10722,6 @@
                 <w:szCs w:val="18"/>
               </w:rPr>
             </w:pPr>
-            <w:proofErr w:type="spellStart"/>
             <w:r>
               <w:rPr>
                 <w:rFonts w:ascii="Times New Roman" w:hAnsi="Times New Roman" w:cs="Times New Roman"/>
@@ -12346,7 +10730,6 @@
               </w:rPr>
               <w:t>Ոսկերիչ-մասնագետ</w:t>
             </w:r>
-            <w:proofErr w:type="spellEnd"/>
           </w:p>
         </w:tc>
         <w:tc>
@@ -12439,7 +10822,6 @@
                 <w:szCs w:val="18"/>
               </w:rPr>
             </w:pPr>
-            <w:proofErr w:type="spellStart"/>
             <w:r>
               <w:rPr>
                 <w:rFonts w:ascii="Times New Roman" w:hAnsi="Times New Roman" w:cs="Times New Roman"/>
@@ -12448,7 +10830,6 @@
               </w:rPr>
               <w:t>Գրավատու</w:t>
             </w:r>
-            <w:proofErr w:type="spellEnd"/>
           </w:p>
         </w:tc>
         <w:tc>
@@ -12557,7 +10938,7 @@
               </wp:anchor>
             </w:drawing>
           </mc:Choice>
-          <mc:Fallback xmlns:w16du="http://schemas.microsoft.com/office/word/2023/wordml/word16du" xmlns:w16sdtfl="http://schemas.microsoft.com/office/word/2024/wordml/sdtformatlock">
+          <mc:Fallback xmlns:w16sdtfl="http://schemas.microsoft.com/office/word/2024/wordml/sdtformatlock" xmlns:w16du="http://schemas.microsoft.com/office/word/2023/wordml/word16du">
             <w:pict>
               <v:line w14:anchorId="58052DD5" id="Straight Connector 2" o:spid="_x0000_s1026" style="position:absolute;z-index:251661312;visibility:visible;mso-wrap-style:square;mso-wrap-distance-left:9pt;mso-wrap-distance-top:0;mso-wrap-distance-right:9pt;mso-wrap-distance-bottom:0;mso-position-horizontal:absolute;mso-position-horizontal-relative:text;mso-position-vertical:absolute;mso-position-vertical-relative:text" from="0,13.4pt" to="491.7pt,13.4pt" o:gfxdata="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" strokecolor="black [3213]" strokeweight="1.25pt">
                 <v:stroke linestyle="thinThick" joinstyle="miter"/>
@@ -12582,7 +10963,6 @@
           <w:lang w:val="en-GB"/>
         </w:rPr>
       </w:pPr>
-      <w:proofErr w:type="spellStart"/>
       <w:r>
         <w:rPr>
           <w:rFonts w:ascii="Times New Roman" w:hAnsi="Times New Roman" w:cs="Times New Roman"/>
@@ -12594,37 +10974,8 @@
           <w:szCs w:val="18"/>
           <w:lang w:val="en-GB"/>
         </w:rPr>
-        <w:t>Վերադարձման</w:t>
-      </w:r>
-      <w:proofErr w:type="spellEnd"/>
-      <w:r>
-        <w:rPr>
-          <w:rFonts w:ascii="Times New Roman" w:hAnsi="Times New Roman" w:cs="Times New Roman"/>
-          <w:b/>
-          <w:bCs/>
-          <w:i/>
-          <w:iCs/>
-          <w:sz w:val="18"/>
-          <w:szCs w:val="18"/>
-          <w:lang w:val="en-GB"/>
-        </w:rPr>
-        <w:t xml:space="preserve"> </w:t>
-      </w:r>
-      <w:proofErr w:type="spellStart"/>
-      <w:r>
-        <w:rPr>
-          <w:rFonts w:ascii="Times New Roman" w:hAnsi="Times New Roman" w:cs="Times New Roman"/>
-          <w:b/>
-          <w:bCs/>
-          <w:i/>
-          <w:iCs/>
-          <w:sz w:val="18"/>
-          <w:szCs w:val="18"/>
-          <w:lang w:val="en-GB"/>
-        </w:rPr>
-        <w:t>ակտ</w:t>
-      </w:r>
-      <w:proofErr w:type="spellEnd"/>
+        <w:t>Վերադարձման ակտ</w:t>
+      </w:r>
     </w:p>
     <w:p>
       <w:pPr>
@@ -12649,204 +11000,19 @@
           <w:szCs w:val="22"/>
         </w:rPr>
       </w:pPr>
-      <w:proofErr w:type="spellStart"/>
       <w:r>
         <w:rPr>
           <w:sz w:val="18"/>
           <w:szCs w:val="22"/>
         </w:rPr>
-        <w:t>Գրավի</w:t>
-      </w:r>
-      <w:proofErr w:type="spellEnd"/>
+        <w:t>Գրավի ստուգման և Ընդունման-Հանձնման ակտ</w:t>
+      </w:r>
       <w:r>
         <w:rPr>
           <w:sz w:val="18"/>
           <w:szCs w:val="22"/>
         </w:rPr>
-        <w:t xml:space="preserve"> </w:t>
-      </w:r>
-      <w:proofErr w:type="spellStart"/>
-      <w:r>
-        <w:rPr>
-          <w:sz w:val="18"/>
-          <w:szCs w:val="22"/>
-        </w:rPr>
-        <w:t>ստուգման</w:t>
-      </w:r>
-      <w:proofErr w:type="spellEnd"/>
-      <w:r>
-        <w:rPr>
-          <w:sz w:val="18"/>
-          <w:szCs w:val="22"/>
-        </w:rPr>
-        <w:t xml:space="preserve"> և </w:t>
-      </w:r>
-      <w:proofErr w:type="spellStart"/>
-      <w:r>
-        <w:rPr>
-          <w:sz w:val="18"/>
-          <w:szCs w:val="22"/>
-        </w:rPr>
-        <w:t>Ընդունման-Հանձնման</w:t>
-      </w:r>
-      <w:proofErr w:type="spellEnd"/>
-      <w:r>
-        <w:rPr>
-          <w:sz w:val="18"/>
-          <w:szCs w:val="22"/>
-        </w:rPr>
-        <w:t xml:space="preserve"> </w:t>
-      </w:r>
-      <w:proofErr w:type="spellStart"/>
-      <w:r>
-        <w:rPr>
-          <w:sz w:val="18"/>
-          <w:szCs w:val="22"/>
-        </w:rPr>
-        <w:t>ակտ</w:t>
-      </w:r>
-      <w:r>
-        <w:rPr>
-          <w:sz w:val="18"/>
-          <w:szCs w:val="22"/>
-        </w:rPr>
-        <w:t>ում</w:t>
-      </w:r>
-      <w:proofErr w:type="spellEnd"/>
-      <w:r>
-        <w:rPr>
-          <w:sz w:val="18"/>
-          <w:szCs w:val="22"/>
-        </w:rPr>
-        <w:t xml:space="preserve"> </w:t>
-      </w:r>
-      <w:proofErr w:type="spellStart"/>
-      <w:r>
-        <w:rPr>
-          <w:sz w:val="18"/>
-          <w:szCs w:val="22"/>
-        </w:rPr>
-        <w:t>նշված</w:t>
-      </w:r>
-      <w:proofErr w:type="spellEnd"/>
-      <w:r>
-        <w:rPr>
-          <w:sz w:val="18"/>
-          <w:szCs w:val="22"/>
-        </w:rPr>
-        <w:t xml:space="preserve"> </w:t>
-      </w:r>
-      <w:proofErr w:type="spellStart"/>
-      <w:r>
-        <w:rPr>
-          <w:sz w:val="18"/>
-          <w:szCs w:val="22"/>
-        </w:rPr>
-        <w:t>Ոսկյա</w:t>
-      </w:r>
-      <w:proofErr w:type="spellEnd"/>
-      <w:r>
-        <w:rPr>
-          <w:sz w:val="18"/>
-          <w:szCs w:val="22"/>
-        </w:rPr>
-        <w:t xml:space="preserve"> </w:t>
-      </w:r>
-      <w:proofErr w:type="spellStart"/>
-      <w:r>
-        <w:rPr>
-          <w:sz w:val="18"/>
-          <w:szCs w:val="22"/>
-        </w:rPr>
-        <w:t>իրերը</w:t>
-      </w:r>
-      <w:proofErr w:type="spellEnd"/>
-      <w:r>
-        <w:rPr>
-          <w:sz w:val="18"/>
-          <w:szCs w:val="22"/>
-        </w:rPr>
-        <w:t xml:space="preserve"> </w:t>
-      </w:r>
-      <w:proofErr w:type="spellStart"/>
-      <w:r>
-        <w:rPr>
-          <w:sz w:val="18"/>
-          <w:szCs w:val="22"/>
-        </w:rPr>
-        <w:t>Գրավառուն</w:t>
-      </w:r>
-      <w:proofErr w:type="spellEnd"/>
-      <w:r>
-        <w:rPr>
-          <w:sz w:val="18"/>
-          <w:szCs w:val="22"/>
-        </w:rPr>
-        <w:t xml:space="preserve"> </w:t>
-      </w:r>
-      <w:proofErr w:type="spellStart"/>
-      <w:r>
-        <w:rPr>
-          <w:sz w:val="18"/>
-          <w:szCs w:val="22"/>
-        </w:rPr>
-        <w:t>ամբողջությամբ</w:t>
-      </w:r>
-      <w:proofErr w:type="spellEnd"/>
-      <w:r>
-        <w:rPr>
-          <w:sz w:val="18"/>
-          <w:szCs w:val="22"/>
-        </w:rPr>
-        <w:t xml:space="preserve">, </w:t>
-      </w:r>
-      <w:proofErr w:type="spellStart"/>
-      <w:r>
-        <w:rPr>
-          <w:sz w:val="18"/>
-          <w:szCs w:val="22"/>
-        </w:rPr>
-        <w:t>անվնաս</w:t>
-      </w:r>
-      <w:proofErr w:type="spellEnd"/>
-      <w:r>
-        <w:rPr>
-          <w:sz w:val="18"/>
-          <w:szCs w:val="22"/>
-        </w:rPr>
-        <w:t xml:space="preserve"> </w:t>
-      </w:r>
-      <w:proofErr w:type="spellStart"/>
-      <w:r>
-        <w:rPr>
-          <w:sz w:val="18"/>
-          <w:szCs w:val="22"/>
-        </w:rPr>
-        <w:t>հանձնեց</w:t>
-      </w:r>
-      <w:proofErr w:type="spellEnd"/>
-      <w:r>
-        <w:rPr>
-          <w:sz w:val="18"/>
-          <w:szCs w:val="22"/>
-        </w:rPr>
-        <w:t xml:space="preserve"> </w:t>
-      </w:r>
-      <w:proofErr w:type="spellStart"/>
-      <w:r>
-        <w:rPr>
-          <w:sz w:val="18"/>
-          <w:szCs w:val="22"/>
-        </w:rPr>
-        <w:t>Գրավատուին</w:t>
-      </w:r>
-      <w:proofErr w:type="spellEnd"/>
-      <w:r>
-        <w:rPr>
-          <w:sz w:val="18"/>
-          <w:szCs w:val="22"/>
-        </w:rPr>
-        <w:t xml:space="preserve">։ </w:t>
+        <w:t xml:space="preserve">ում նշված Ոսկյա իրերը Գրավառուն ամբողջությամբ, անվնաս հանձնեց Գրավատուին։ </w:t>
       </w:r>
     </w:p>
     <w:p>
@@ -12862,101 +11028,12 @@
           <w:szCs w:val="22"/>
         </w:rPr>
       </w:pPr>
-      <w:proofErr w:type="spellStart"/>
       <w:r>
         <w:rPr>
           <w:sz w:val="18"/>
           <w:szCs w:val="22"/>
         </w:rPr>
-        <w:t>Գրավատուն</w:t>
-      </w:r>
-      <w:proofErr w:type="spellEnd"/>
-      <w:r>
-        <w:rPr>
-          <w:sz w:val="18"/>
-          <w:szCs w:val="22"/>
-        </w:rPr>
-        <w:t xml:space="preserve"> </w:t>
-      </w:r>
-      <w:proofErr w:type="spellStart"/>
-      <w:r>
-        <w:rPr>
-          <w:sz w:val="18"/>
-          <w:szCs w:val="22"/>
-        </w:rPr>
-        <w:t>հավաստիացնում</w:t>
-      </w:r>
-      <w:proofErr w:type="spellEnd"/>
-      <w:r>
-        <w:rPr>
-          <w:sz w:val="18"/>
-          <w:szCs w:val="22"/>
-        </w:rPr>
-        <w:t xml:space="preserve"> է, </w:t>
-      </w:r>
-      <w:proofErr w:type="spellStart"/>
-      <w:r>
-        <w:rPr>
-          <w:sz w:val="18"/>
-          <w:szCs w:val="22"/>
-        </w:rPr>
-        <w:t>որ</w:t>
-      </w:r>
-      <w:proofErr w:type="spellEnd"/>
-      <w:r>
-        <w:rPr>
-          <w:sz w:val="18"/>
-          <w:szCs w:val="22"/>
-        </w:rPr>
-        <w:t xml:space="preserve"> </w:t>
-      </w:r>
-      <w:proofErr w:type="spellStart"/>
-      <w:r>
-        <w:rPr>
-          <w:sz w:val="18"/>
-          <w:szCs w:val="22"/>
-        </w:rPr>
-        <w:t>չունի</w:t>
-      </w:r>
-      <w:proofErr w:type="spellEnd"/>
-      <w:r>
-        <w:rPr>
-          <w:sz w:val="18"/>
-          <w:szCs w:val="22"/>
-        </w:rPr>
-        <w:t xml:space="preserve"> </w:t>
-      </w:r>
-      <w:proofErr w:type="spellStart"/>
-      <w:r>
-        <w:rPr>
-          <w:sz w:val="18"/>
-          <w:szCs w:val="22"/>
-        </w:rPr>
-        <w:t>որևէ</w:t>
-      </w:r>
-      <w:proofErr w:type="spellEnd"/>
-      <w:r>
-        <w:rPr>
-          <w:sz w:val="18"/>
-          <w:szCs w:val="22"/>
-        </w:rPr>
-        <w:t xml:space="preserve"> </w:t>
-      </w:r>
-      <w:proofErr w:type="spellStart"/>
-      <w:r>
-        <w:rPr>
-          <w:sz w:val="18"/>
-          <w:szCs w:val="22"/>
-        </w:rPr>
-        <w:t>պահանջ</w:t>
-      </w:r>
-      <w:proofErr w:type="spellEnd"/>
-      <w:r>
-        <w:rPr>
-          <w:sz w:val="18"/>
-          <w:szCs w:val="22"/>
-        </w:rPr>
-        <w:t xml:space="preserve">։ </w:t>
+        <w:t xml:space="preserve">Գրավատուն հավաստիացնում է, որ չունի որևէ պահանջ։ </w:t>
       </w:r>
     </w:p>
     <w:p>
@@ -12998,51 +11075,39 @@
                 <w:szCs w:val="18"/>
               </w:rPr>
             </w:pPr>
-            <w:proofErr w:type="spellStart"/>
             <w:r>
               <w:rPr>
                 <w:rFonts w:ascii="Times New Roman" w:hAnsi="Times New Roman" w:cs="Times New Roman"/>
                 <w:sz w:val="18"/>
                 <w:szCs w:val="18"/>
               </w:rPr>
-              <w:t>Հանձնեց</w:t>
-            </w:r>
-            <w:proofErr w:type="spellEnd"/>
-            <w:r>
+              <w:t>Հանձնեց՝</w:t>
+            </w:r>
+          </w:p>
+        </w:tc>
+      </w:tr>
+      <w:tr>
+        <w:tc>
+          <w:tcPr>
+            <w:tcW w:w="1817" w:type="dxa"/>
+          </w:tcPr>
+          <w:p>
+            <w:pPr>
+              <w:spacing w:line="276" w:lineRule="auto"/>
               <w:rPr>
                 <w:rFonts w:ascii="Times New Roman" w:hAnsi="Times New Roman" w:cs="Times New Roman"/>
                 <w:sz w:val="18"/>
                 <w:szCs w:val="18"/>
               </w:rPr>
-              <w:t>՝</w:t>
-            </w:r>
-          </w:p>
-        </w:tc>
-      </w:tr>
-      <w:tr>
-        <w:tc>
-          <w:tcPr>
-            <w:tcW w:w="1817" w:type="dxa"/>
-          </w:tcPr>
-          <w:p>
-            <w:pPr>
-              <w:spacing w:line="276" w:lineRule="auto"/>
+            </w:pPr>
+            <w:r>
               <w:rPr>
                 <w:rFonts w:ascii="Times New Roman" w:hAnsi="Times New Roman" w:cs="Times New Roman"/>
                 <w:sz w:val="18"/>
                 <w:szCs w:val="18"/>
               </w:rPr>
-            </w:pPr>
-            <w:proofErr w:type="spellStart"/>
-            <w:r>
-              <w:rPr>
-                <w:rFonts w:ascii="Times New Roman" w:hAnsi="Times New Roman" w:cs="Times New Roman"/>
-                <w:sz w:val="18"/>
-                <w:szCs w:val="18"/>
-              </w:rPr>
               <w:t>Ոսկերիչ-մասնագետ</w:t>
             </w:r>
-            <w:proofErr w:type="spellEnd"/>
           </w:p>
         </w:tc>
         <w:tc>
@@ -13098,7 +11163,6 @@
           <w:lang w:val="en-GB"/>
         </w:rPr>
       </w:pPr>
-      <w:proofErr w:type="spellStart"/>
       <w:r>
         <w:rPr>
           <w:rFonts w:ascii="Times New Roman" w:hAnsi="Times New Roman" w:cs="Times New Roman"/>
@@ -13107,7 +11171,6 @@
         </w:rPr>
         <w:t>Ես</w:t>
       </w:r>
-      <w:proofErr w:type="spellEnd"/>
       <w:r>
         <w:rPr>
           <w:rFonts w:ascii="Times New Roman" w:hAnsi="Times New Roman" w:cs="Times New Roman"/>
@@ -13123,347 +11186,7 @@
           <w:szCs w:val="18"/>
           <w:lang w:val="en-GB"/>
         </w:rPr>
-        <w:t xml:space="preserve">_____________________________________________________, </w:t>
-      </w:r>
-      <w:proofErr w:type="spellStart"/>
-      <w:r>
-        <w:rPr>
-          <w:rFonts w:ascii="Times New Roman" w:hAnsi="Times New Roman" w:cs="Times New Roman"/>
-          <w:sz w:val="18"/>
-          <w:szCs w:val="18"/>
-          <w:lang w:val="en-GB"/>
-        </w:rPr>
-        <w:t>ստացա</w:t>
-      </w:r>
-      <w:proofErr w:type="spellEnd"/>
-      <w:r>
-        <w:rPr>
-          <w:rFonts w:ascii="Times New Roman" w:hAnsi="Times New Roman" w:cs="Times New Roman"/>
-          <w:sz w:val="18"/>
-          <w:szCs w:val="18"/>
-          <w:lang w:val="en-GB"/>
-        </w:rPr>
-        <w:t xml:space="preserve"> </w:t>
-      </w:r>
-      <w:proofErr w:type="spellStart"/>
-      <w:r>
-        <w:rPr>
-          <w:rFonts w:ascii="Times New Roman" w:hAnsi="Times New Roman" w:cs="Times New Roman"/>
-          <w:sz w:val="18"/>
-          <w:szCs w:val="18"/>
-          <w:lang w:val="en-GB"/>
-        </w:rPr>
-        <w:t>Գրավի</w:t>
-      </w:r>
-      <w:proofErr w:type="spellEnd"/>
-      <w:r>
-        <w:rPr>
-          <w:rFonts w:ascii="Times New Roman" w:hAnsi="Times New Roman" w:cs="Times New Roman"/>
-          <w:sz w:val="18"/>
-          <w:szCs w:val="18"/>
-          <w:lang w:val="en-GB"/>
-        </w:rPr>
-        <w:t xml:space="preserve"> </w:t>
-      </w:r>
-      <w:proofErr w:type="spellStart"/>
-      <w:r>
-        <w:rPr>
-          <w:rFonts w:ascii="Times New Roman" w:hAnsi="Times New Roman" w:cs="Times New Roman"/>
-          <w:sz w:val="18"/>
-          <w:szCs w:val="18"/>
-          <w:lang w:val="en-GB"/>
-        </w:rPr>
-        <w:t>առարկան</w:t>
-      </w:r>
-      <w:proofErr w:type="spellEnd"/>
-      <w:r>
-        <w:rPr>
-          <w:rFonts w:ascii="Times New Roman" w:hAnsi="Times New Roman" w:cs="Times New Roman"/>
-          <w:sz w:val="18"/>
-          <w:szCs w:val="18"/>
-          <w:lang w:val="en-GB"/>
-        </w:rPr>
-        <w:t xml:space="preserve"> </w:t>
-      </w:r>
-      <w:proofErr w:type="spellStart"/>
-      <w:r>
-        <w:rPr>
-          <w:rFonts w:ascii="Times New Roman" w:hAnsi="Times New Roman" w:cs="Times New Roman"/>
-          <w:sz w:val="18"/>
-          <w:szCs w:val="18"/>
-          <w:lang w:val="en-GB"/>
-        </w:rPr>
-        <w:t>ամբողջությամբ</w:t>
-      </w:r>
-      <w:proofErr w:type="spellEnd"/>
-      <w:r>
-        <w:rPr>
-          <w:rFonts w:ascii="Times New Roman" w:hAnsi="Times New Roman" w:cs="Times New Roman"/>
-          <w:sz w:val="18"/>
-          <w:szCs w:val="18"/>
-          <w:lang w:val="en-GB"/>
-        </w:rPr>
-        <w:t xml:space="preserve">, </w:t>
-      </w:r>
-      <w:proofErr w:type="spellStart"/>
-      <w:r>
-        <w:rPr>
-          <w:rFonts w:ascii="Times New Roman" w:hAnsi="Times New Roman" w:cs="Times New Roman"/>
-          <w:sz w:val="18"/>
-          <w:szCs w:val="18"/>
-          <w:lang w:val="en-GB"/>
-        </w:rPr>
-        <w:t>այն</w:t>
-      </w:r>
-      <w:proofErr w:type="spellEnd"/>
-      <w:r>
-        <w:rPr>
-          <w:rFonts w:ascii="Times New Roman" w:hAnsi="Times New Roman" w:cs="Times New Roman"/>
-          <w:sz w:val="18"/>
-          <w:szCs w:val="18"/>
-          <w:lang w:val="en-GB"/>
-        </w:rPr>
-        <w:t xml:space="preserve"> </w:t>
-      </w:r>
-      <w:proofErr w:type="spellStart"/>
-      <w:r>
-        <w:rPr>
-          <w:rFonts w:ascii="Times New Roman" w:hAnsi="Times New Roman" w:cs="Times New Roman"/>
-          <w:sz w:val="18"/>
-          <w:szCs w:val="18"/>
-          <w:lang w:val="en-GB"/>
-        </w:rPr>
-        <w:t>վիճակում</w:t>
-      </w:r>
-      <w:proofErr w:type="spellEnd"/>
-      <w:r>
-        <w:rPr>
-          <w:rFonts w:ascii="Times New Roman" w:hAnsi="Times New Roman" w:cs="Times New Roman"/>
-          <w:sz w:val="18"/>
-          <w:szCs w:val="18"/>
-          <w:lang w:val="en-GB"/>
-        </w:rPr>
-        <w:t xml:space="preserve">, </w:t>
-      </w:r>
-      <w:proofErr w:type="spellStart"/>
-      <w:r>
-        <w:rPr>
-          <w:rFonts w:ascii="Times New Roman" w:hAnsi="Times New Roman" w:cs="Times New Roman"/>
-          <w:sz w:val="18"/>
-          <w:szCs w:val="18"/>
-          <w:lang w:val="en-GB"/>
-        </w:rPr>
-        <w:t>ինչպես</w:t>
-      </w:r>
-      <w:proofErr w:type="spellEnd"/>
-      <w:r>
-        <w:rPr>
-          <w:rFonts w:ascii="Times New Roman" w:hAnsi="Times New Roman" w:cs="Times New Roman"/>
-          <w:sz w:val="18"/>
-          <w:szCs w:val="18"/>
-          <w:lang w:val="en-GB"/>
-        </w:rPr>
-        <w:t xml:space="preserve"> </w:t>
-      </w:r>
-      <w:proofErr w:type="spellStart"/>
-      <w:r>
-        <w:rPr>
-          <w:rFonts w:ascii="Times New Roman" w:hAnsi="Times New Roman" w:cs="Times New Roman"/>
-          <w:sz w:val="18"/>
-          <w:szCs w:val="18"/>
-          <w:lang w:val="en-GB"/>
-        </w:rPr>
-        <w:t>հանձնել</w:t>
-      </w:r>
-      <w:proofErr w:type="spellEnd"/>
-      <w:r>
-        <w:rPr>
-          <w:rFonts w:ascii="Times New Roman" w:hAnsi="Times New Roman" w:cs="Times New Roman"/>
-          <w:sz w:val="18"/>
-          <w:szCs w:val="18"/>
-          <w:lang w:val="en-GB"/>
-        </w:rPr>
-        <w:t xml:space="preserve"> </w:t>
-      </w:r>
-      <w:proofErr w:type="spellStart"/>
-      <w:r>
-        <w:rPr>
-          <w:rFonts w:ascii="Times New Roman" w:hAnsi="Times New Roman" w:cs="Times New Roman"/>
-          <w:sz w:val="18"/>
-          <w:szCs w:val="18"/>
-          <w:lang w:val="en-GB"/>
-        </w:rPr>
-        <w:t>եմ</w:t>
-      </w:r>
-      <w:proofErr w:type="spellEnd"/>
-      <w:r>
-        <w:rPr>
-          <w:rFonts w:ascii="Times New Roman" w:hAnsi="Times New Roman" w:cs="Times New Roman"/>
-          <w:sz w:val="18"/>
-          <w:szCs w:val="18"/>
-          <w:lang w:val="en-GB"/>
-        </w:rPr>
-        <w:t xml:space="preserve"> </w:t>
-      </w:r>
-      <w:proofErr w:type="spellStart"/>
-      <w:r>
-        <w:rPr>
-          <w:rFonts w:ascii="Times New Roman" w:hAnsi="Times New Roman" w:cs="Times New Roman"/>
-          <w:sz w:val="18"/>
-          <w:szCs w:val="18"/>
-          <w:lang w:val="en-GB"/>
-        </w:rPr>
-        <w:t>Գրավի</w:t>
-      </w:r>
-      <w:proofErr w:type="spellEnd"/>
-      <w:r>
-        <w:rPr>
-          <w:rFonts w:ascii="Times New Roman" w:hAnsi="Times New Roman" w:cs="Times New Roman"/>
-          <w:sz w:val="18"/>
-          <w:szCs w:val="18"/>
-          <w:lang w:val="en-GB"/>
-        </w:rPr>
-        <w:t xml:space="preserve"> </w:t>
-      </w:r>
-      <w:proofErr w:type="spellStart"/>
-      <w:r>
-        <w:rPr>
-          <w:rFonts w:ascii="Times New Roman" w:hAnsi="Times New Roman" w:cs="Times New Roman"/>
-          <w:sz w:val="18"/>
-          <w:szCs w:val="18"/>
-          <w:lang w:val="en-GB"/>
-        </w:rPr>
-        <w:t>ստուգման</w:t>
-      </w:r>
-      <w:proofErr w:type="spellEnd"/>
-      <w:r>
-        <w:rPr>
-          <w:rFonts w:ascii="Times New Roman" w:hAnsi="Times New Roman" w:cs="Times New Roman"/>
-          <w:sz w:val="18"/>
-          <w:szCs w:val="18"/>
-          <w:lang w:val="en-GB"/>
-        </w:rPr>
-        <w:t xml:space="preserve"> և </w:t>
-      </w:r>
-      <w:proofErr w:type="spellStart"/>
-      <w:r>
-        <w:rPr>
-          <w:rFonts w:ascii="Times New Roman" w:hAnsi="Times New Roman" w:cs="Times New Roman"/>
-          <w:sz w:val="18"/>
-          <w:szCs w:val="18"/>
-          <w:lang w:val="en-GB"/>
-        </w:rPr>
-        <w:t>Ընդունման-Հանձնման</w:t>
-      </w:r>
-      <w:proofErr w:type="spellEnd"/>
-      <w:r>
-        <w:rPr>
-          <w:rFonts w:ascii="Times New Roman" w:hAnsi="Times New Roman" w:cs="Times New Roman"/>
-          <w:sz w:val="18"/>
-          <w:szCs w:val="18"/>
-          <w:lang w:val="en-GB"/>
-        </w:rPr>
-        <w:t xml:space="preserve"> </w:t>
-      </w:r>
-      <w:proofErr w:type="spellStart"/>
-      <w:r>
-        <w:rPr>
-          <w:rFonts w:ascii="Times New Roman" w:hAnsi="Times New Roman" w:cs="Times New Roman"/>
-          <w:sz w:val="18"/>
-          <w:szCs w:val="18"/>
-          <w:lang w:val="en-GB"/>
-        </w:rPr>
-        <w:t>ակտով</w:t>
-      </w:r>
-      <w:proofErr w:type="spellEnd"/>
-      <w:r>
-        <w:rPr>
-          <w:rFonts w:ascii="Times New Roman" w:hAnsi="Times New Roman" w:cs="Times New Roman"/>
-          <w:sz w:val="18"/>
-          <w:szCs w:val="18"/>
-          <w:lang w:val="en-GB"/>
-        </w:rPr>
-        <w:t xml:space="preserve">, </w:t>
-      </w:r>
-      <w:proofErr w:type="spellStart"/>
-      <w:r>
-        <w:rPr>
-          <w:rFonts w:ascii="Times New Roman" w:hAnsi="Times New Roman" w:cs="Times New Roman"/>
-          <w:sz w:val="18"/>
-          <w:szCs w:val="18"/>
-          <w:lang w:val="en-GB"/>
-        </w:rPr>
-        <w:t>որի</w:t>
-      </w:r>
-      <w:proofErr w:type="spellEnd"/>
-      <w:r>
-        <w:rPr>
-          <w:rFonts w:ascii="Times New Roman" w:hAnsi="Times New Roman" w:cs="Times New Roman"/>
-          <w:sz w:val="18"/>
-          <w:szCs w:val="18"/>
-          <w:lang w:val="en-GB"/>
-        </w:rPr>
-        <w:t xml:space="preserve"> </w:t>
-      </w:r>
-      <w:proofErr w:type="spellStart"/>
-      <w:r>
-        <w:rPr>
-          <w:rFonts w:ascii="Times New Roman" w:hAnsi="Times New Roman" w:cs="Times New Roman"/>
-          <w:sz w:val="18"/>
-          <w:szCs w:val="18"/>
-          <w:lang w:val="en-GB"/>
-        </w:rPr>
-        <w:t>համար</w:t>
-      </w:r>
-      <w:proofErr w:type="spellEnd"/>
-      <w:r>
-        <w:rPr>
-          <w:rFonts w:ascii="Times New Roman" w:hAnsi="Times New Roman" w:cs="Times New Roman"/>
-          <w:sz w:val="18"/>
-          <w:szCs w:val="18"/>
-          <w:lang w:val="en-GB"/>
-        </w:rPr>
-        <w:t xml:space="preserve"> </w:t>
-      </w:r>
-      <w:proofErr w:type="spellStart"/>
-      <w:r>
-        <w:rPr>
-          <w:rFonts w:ascii="Times New Roman" w:hAnsi="Times New Roman" w:cs="Times New Roman"/>
-          <w:sz w:val="18"/>
-          <w:szCs w:val="18"/>
-          <w:lang w:val="en-GB"/>
-        </w:rPr>
-        <w:t>ստորագրում</w:t>
-      </w:r>
-      <w:proofErr w:type="spellEnd"/>
-      <w:r>
-        <w:rPr>
-          <w:rFonts w:ascii="Times New Roman" w:hAnsi="Times New Roman" w:cs="Times New Roman"/>
-          <w:sz w:val="18"/>
-          <w:szCs w:val="18"/>
-          <w:lang w:val="en-GB"/>
-        </w:rPr>
-        <w:t xml:space="preserve"> </w:t>
-      </w:r>
-      <w:proofErr w:type="spellStart"/>
-      <w:r>
-        <w:rPr>
-          <w:rFonts w:ascii="Times New Roman" w:hAnsi="Times New Roman" w:cs="Times New Roman"/>
-          <w:sz w:val="18"/>
-          <w:szCs w:val="18"/>
-          <w:lang w:val="en-GB"/>
-        </w:rPr>
-        <w:t>եմ</w:t>
-      </w:r>
-      <w:proofErr w:type="spellEnd"/>
-      <w:r>
-        <w:rPr>
-          <w:rFonts w:ascii="Times New Roman" w:hAnsi="Times New Roman" w:cs="Times New Roman"/>
-          <w:sz w:val="18"/>
-          <w:szCs w:val="18"/>
-          <w:lang w:val="en-GB"/>
-        </w:rPr>
-        <w:t xml:space="preserve">։ </w:t>
+        <w:t xml:space="preserve">_____________________________________________________, ստացա Գրավի առարկան ամբողջությամբ, այն վիճակում, ինչպես հանձնել եմ Գրավի ստուգման և Ընդունման-Հանձնման ակտով, որի համար ստորագրում եմ։ </w:t>
       </w:r>
     </w:p>
     <w:tbl>
@@ -13500,51 +11223,39 @@
                 <w:szCs w:val="18"/>
               </w:rPr>
             </w:pPr>
-            <w:proofErr w:type="spellStart"/>
             <w:r>
               <w:rPr>
                 <w:rFonts w:ascii="Times New Roman" w:hAnsi="Times New Roman" w:cs="Times New Roman"/>
                 <w:sz w:val="18"/>
                 <w:szCs w:val="18"/>
               </w:rPr>
-              <w:t>Ընդունեց</w:t>
-            </w:r>
-            <w:proofErr w:type="spellEnd"/>
-            <w:r>
+              <w:t xml:space="preserve">Ընդունեց՝      </w:t>
+            </w:r>
+          </w:p>
+        </w:tc>
+      </w:tr>
+      <w:tr>
+        <w:tc>
+          <w:tcPr>
+            <w:tcW w:w="1120" w:type="dxa"/>
+          </w:tcPr>
+          <w:p>
+            <w:pPr>
+              <w:spacing w:line="276" w:lineRule="auto"/>
               <w:rPr>
                 <w:rFonts w:ascii="Times New Roman" w:hAnsi="Times New Roman" w:cs="Times New Roman"/>
                 <w:sz w:val="18"/>
                 <w:szCs w:val="18"/>
               </w:rPr>
-              <w:t xml:space="preserve">՝      </w:t>
-            </w:r>
-          </w:p>
-        </w:tc>
-      </w:tr>
-      <w:tr>
-        <w:tc>
-          <w:tcPr>
-            <w:tcW w:w="1120" w:type="dxa"/>
-          </w:tcPr>
-          <w:p>
-            <w:pPr>
-              <w:spacing w:line="276" w:lineRule="auto"/>
+            </w:pPr>
+            <w:r>
               <w:rPr>
                 <w:rFonts w:ascii="Times New Roman" w:hAnsi="Times New Roman" w:cs="Times New Roman"/>
                 <w:sz w:val="18"/>
                 <w:szCs w:val="18"/>
               </w:rPr>
-            </w:pPr>
-            <w:proofErr w:type="spellStart"/>
-            <w:r>
-              <w:rPr>
-                <w:rFonts w:ascii="Times New Roman" w:hAnsi="Times New Roman" w:cs="Times New Roman"/>
-                <w:sz w:val="18"/>
-                <w:szCs w:val="18"/>
-              </w:rPr>
               <w:t>Գրավատու</w:t>
             </w:r>
-            <w:proofErr w:type="spellEnd"/>
           </w:p>
         </w:tc>
         <w:tc>

</xml_diff>

<commit_message>
Change contract gold and care templates
</commit_message>
<xml_diff>
--- a/public/files/contract_gold_template.docx
+++ b/public/files/contract_gold_template.docx
@@ -2011,25 +2011,6 @@
                 <w:lang w:val="hy-AM"/>
               </w:rPr>
             </w:pPr>
-          </w:p>
-          <w:p>
-            <w:pPr>
-              <w:widowControl w:val="0"/>
-              <w:tabs>
-                <w:tab w:val="left" w:pos="993"/>
-              </w:tabs>
-              <w:spacing w:line="276" w:lineRule="auto"/>
-              <w:ind w:left="30" w:right="176"/>
-              <w:jc w:val="both"/>
-              <w:rPr>
-                <w:rFonts w:ascii="Times New Roman" w:hAnsi="Times New Roman" w:cs="Times New Roman"/>
-                <w:bCs/>
-                <w:iCs/>
-                <w:sz w:val="16"/>
-                <w:szCs w:val="16"/>
-                <w:lang w:val="hy-AM"/>
-              </w:rPr>
-            </w:pPr>
             <w:r>
               <w:rPr>
                 <w:rFonts w:ascii="Times New Roman" w:hAnsi="Times New Roman" w:cs="Times New Roman"/>
@@ -2383,7 +2364,18 @@
                 <w:szCs w:val="16"/>
                 <w:lang w:val="hy-AM"/>
               </w:rPr>
-              <w:t>սպառողական</w:t>
+              <w:t>Ս</w:t>
+            </w:r>
+            <w:r>
+              <w:rPr>
+                <w:rFonts w:ascii="Times New Roman" w:hAnsi="Times New Roman" w:cs="Times New Roman"/>
+                <w:bCs/>
+                <w:iCs/>
+                <w:sz w:val="16"/>
+                <w:szCs w:val="16"/>
+                <w:lang w:val="hy-AM"/>
+              </w:rPr>
+              <w:t>պառողական</w:t>
             </w:r>
           </w:p>
         </w:tc>
@@ -3079,7 +3071,6 @@
                 <w:szCs w:val="16"/>
                 <w:lang w:val="hy-AM"/>
               </w:rPr>
-              <w:lastRenderedPageBreak/>
               <w:t>ժամ</w:t>
             </w:r>
             <w:r>
@@ -3126,8 +3117,7 @@
                 <w:szCs w:val="16"/>
                 <w:lang w:val="hy-AM"/>
               </w:rPr>
-              <w:lastRenderedPageBreak/>
-              <w:t xml:space="preserve">Վարկի գումարը կամ տոկոսը կամ դրանց մի մասը ժամկետանց դառնալու օրվանից մինչև համապատասխանաբար Վարկի կամ ժամկետանց մասի կամ </w:t>
+              <w:t xml:space="preserve">Վարկի գումարը կամ տոկոսը կամ դրանց մի մասը ժամկետանց դառնալու օրվանից մինչև համապատասխանաբար Վարկի կամ ժամկետանց մասի կամ տոկոսի մարման օրը Վարկառուն պարտավոր է Վարկատուին վճարել </w:t>
             </w:r>
             <w:r>
               <w:rPr>
@@ -3139,7 +3129,7 @@
                 <w:lang w:val="hy-AM"/>
               </w:rPr>
               <w:lastRenderedPageBreak/>
-              <w:t xml:space="preserve">տոկոսի մարման օրը Վարկառուն պարտավոր է Վարկատուին վճարել ժամկետանց վարկի նկատմամբ Պայմանագրի հիման վրա հաշվարկվող անվանական տոկոսադրույքը և ժամկետանց վարկի և/կամ տոկոսի նկատմամբ հաշվարկված </w:t>
+              <w:t xml:space="preserve">ժամկետանց վարկի նկատմամբ Պայմանագրի հիման վրա հաշվարկվող անվանական տոկոսադրույքը և ժամկետանց վարկի և/կամ տոկոսի նկատմամբ հաշվարկված </w:t>
             </w:r>
             <w:r>
               <w:rPr>
@@ -4144,7 +4134,6 @@
           <w:szCs w:val="18"/>
           <w:lang w:val="hy-AM"/>
         </w:rPr>
-        <w:lastRenderedPageBreak/>
         <w:t xml:space="preserve">Վարկառուն </w:t>
       </w:r>
       <w:r>
@@ -4183,6 +4172,7 @@
           <w:szCs w:val="18"/>
           <w:lang w:val="hy-AM"/>
         </w:rPr>
+        <w:lastRenderedPageBreak/>
         <w:t xml:space="preserve">Վարկի գումարի չափով արգելանք է դրվել Վարկառուի գույքի նկատմամբ և այդ արգելանքը տևում է 5 օրից ավել։ </w:t>
       </w:r>
     </w:p>
@@ -4886,7 +4876,6 @@
           <w:szCs w:val="18"/>
           <w:lang w:val="hy-AM"/>
         </w:rPr>
-        <w:lastRenderedPageBreak/>
         <w:t>Վարկատուի կողմից սահմանված սակագների համապատասխան վճարումը կատարելուց հետո ստուգել գրավի առարկա ոսկյա իրերի առկայությունը, քանակը, զանգվածը, վիճակը.</w:t>
       </w:r>
     </w:p>
@@ -4915,6 +4904,7 @@
           <w:szCs w:val="18"/>
           <w:lang w:val="hy-AM"/>
         </w:rPr>
+        <w:lastRenderedPageBreak/>
         <w:t>Վարկառուն պարտավոր է՝</w:t>
       </w:r>
     </w:p>
@@ -5474,7 +5464,25 @@
           <w:szCs w:val="18"/>
           <w:lang w:val="hy-AM"/>
         </w:rPr>
-        <w:t xml:space="preserve">Պայմանագրով ստանձնած պարտավորությունները Վարկառուի կողմից չկատարելու դեպքում Գրավառուն գրավոր ծանուցում է Վարկառուին առանց դատարան դիմելու գրավի առարկայի նկատմամբ բռնագանձում տարածելու և իրացնելու մասին </w:t>
+        <w:t xml:space="preserve">Պայմանագրով ստանձնած պարտավորությունները Վարկառուի կողմից չկատարելու դեպքում </w:t>
+      </w:r>
+      <w:r>
+        <w:rPr>
+          <w:rFonts w:ascii="Times New Roman" w:hAnsi="Times New Roman" w:cs="Times New Roman"/>
+          <w:sz w:val="18"/>
+          <w:szCs w:val="18"/>
+          <w:lang w:val="hy-AM"/>
+        </w:rPr>
+        <w:t>(ներառյալ Պայմանագրի փոփոխության համաձայնագրերով տրամադրված կամ տրամադրվելիք վարկի գումարները)</w:t>
+      </w:r>
+      <w:r>
+        <w:rPr>
+          <w:rFonts w:ascii="Times New Roman" w:hAnsi="Times New Roman" w:cs="Times New Roman"/>
+          <w:sz w:val="18"/>
+          <w:szCs w:val="18"/>
+          <w:lang w:val="hy-AM"/>
+        </w:rPr>
+        <w:t xml:space="preserve">Գրավառուն գրավոր ծանուցում է Վարկառուին առանց դատարան դիմելու գրավի առարկայի նկատմամբ բռնագանձում տարածելու և իրացնելու մասին </w:t>
       </w:r>
       <w:r>
         <w:rPr>
@@ -5602,7 +5610,7 @@
           <w:szCs w:val="18"/>
           <w:lang w:val="hy-AM"/>
         </w:rPr>
-        <w:t xml:space="preserve">Պայմանագրով Գրավատուն տալիս է իր անվերապահ համաձայնությունը, առ այն, որ Գրավի առարկայի </w:t>
+        <w:t xml:space="preserve">Պայմանագրով Գրավատուն տալիս է իր անվերապահ համաձայնությունը, առ այն, որ Գրավի առարկայի ֆիզիական ստուգման ընթացքում Գրավառուն առանց Գրավատուի ներկայության բացի Գրավի առարկայի պահպանման փակ, թափանցիկ պարկը։ Պարկն առանց Գրավատուի բացելու դեպքում Գրավի առարկայի ստուգման </w:t>
       </w:r>
       <w:r>
         <w:rPr>
@@ -5612,7 +5620,7 @@
           <w:lang w:val="hy-AM"/>
         </w:rPr>
         <w:lastRenderedPageBreak/>
-        <w:t xml:space="preserve">ֆիզիական ստուգման ընթացքում Գրավառուն առանց Գրավատուի ներկայության բացի Գրավի առարկայի պահպանման փակ, թափանցիկ պարկը։ Պարկն առանց Գրավատուի բացելու դեպքում Գրավի առարկայի ստուգման արդյունքում կազմվում է արձանագրություն։ </w:t>
+        <w:t xml:space="preserve">արդյունքում կազմվում է արձանագրություն։ </w:t>
       </w:r>
     </w:p>
     <w:p>
@@ -5768,7 +5776,23 @@
           <w:sz w:val="18"/>
           <w:lang w:val="hy-AM"/>
         </w:rPr>
-        <w:t>կեղված</w:t>
+        <w:t>կեղ</w:t>
+      </w:r>
+      <w:r>
+        <w:rPr>
+          <w:rFonts w:ascii="Times New Roman" w:hAnsi="Times New Roman"/>
+          <w:sz w:val="18"/>
+          <w:lang w:val="hy-AM"/>
+        </w:rPr>
+        <w:t>ծ</w:t>
+      </w:r>
+      <w:r>
+        <w:rPr>
+          <w:rFonts w:ascii="Times New Roman" w:hAnsi="Times New Roman"/>
+          <w:sz w:val="18"/>
+          <w:lang w:val="hy-AM"/>
+        </w:rPr>
+        <w:t>ված</w:t>
       </w:r>
       <w:r>
         <w:rPr>
@@ -6112,26 +6136,35 @@
           <w:szCs w:val="18"/>
           <w:lang w:val="hy-AM"/>
         </w:rPr>
+        <w:t xml:space="preserve">Վարկատուից ստանա </w:t>
+      </w:r>
+      <w:r>
+        <w:rPr>
+          <w:rFonts w:ascii="Times New Roman" w:hAnsi="Times New Roman" w:cs="Times New Roman"/>
+          <w:sz w:val="18"/>
+          <w:szCs w:val="18"/>
+          <w:lang w:val="hy-AM"/>
+        </w:rPr>
+        <w:t>SMS հաղորդագրություններ, էլեկտրոնային կամ այլ նամակներ վարկի, տոկոսների և այլ վճարների հերթական</w:t>
+      </w:r>
+      <w:r>
+        <w:rPr>
+          <w:rFonts w:ascii="Times New Roman" w:hAnsi="Times New Roman" w:cs="Times New Roman"/>
+          <w:sz w:val="18"/>
+          <w:szCs w:val="18"/>
+          <w:lang w:val="hy-AM"/>
+        </w:rPr>
+        <w:t xml:space="preserve"> մարման, դրանց ժամկետանց դառնալու, իրեն ծանուցումներ ուղարկելու վերաբերյալ, ինչպես նաև Վարկատուի կողմից մատուցվող </w:t>
+      </w:r>
+      <w:r>
+        <w:rPr>
+          <w:rFonts w:ascii="Times New Roman" w:hAnsi="Times New Roman" w:cs="Times New Roman"/>
+          <w:sz w:val="18"/>
+          <w:szCs w:val="18"/>
+          <w:lang w:val="hy-AM"/>
+        </w:rPr>
         <w:lastRenderedPageBreak/>
-        <w:t xml:space="preserve">Վարկատուից ստանա </w:t>
-      </w:r>
-      <w:r>
-        <w:rPr>
-          <w:rFonts w:ascii="Times New Roman" w:hAnsi="Times New Roman" w:cs="Times New Roman"/>
-          <w:sz w:val="18"/>
-          <w:szCs w:val="18"/>
-          <w:lang w:val="hy-AM"/>
-        </w:rPr>
-        <w:t>SMS հաղորդագրություններ, էլեկտրոնային կամ այլ նամակներ վարկի, տոկոսների և այլ վճարների հերթական</w:t>
-      </w:r>
-      <w:r>
-        <w:rPr>
-          <w:rFonts w:ascii="Times New Roman" w:hAnsi="Times New Roman" w:cs="Times New Roman"/>
-          <w:sz w:val="18"/>
-          <w:szCs w:val="18"/>
-          <w:lang w:val="hy-AM"/>
-        </w:rPr>
-        <w:t xml:space="preserve"> մարման, դրանց ժամկետանց դառնալու, իրեն ծանուցումներ ուղարկելու վերաբերյալ, ինչպես նաև Վարկատուի կողմից մատուցվող ծառայությունների վերաբերյալ գովազդային, առևտրային կամ այլ բնույթի նյութեր։ </w:t>
+        <w:t xml:space="preserve">ծառայությունների վերաբերյալ գովազդային, առևտրային կամ այլ բնույթի նյութեր։ </w:t>
       </w:r>
       <w:r>
         <w:rPr>
@@ -6828,7 +6861,6 @@
           <w:szCs w:val="18"/>
           <w:lang w:val="hy-AM"/>
         </w:rPr>
-        <w:lastRenderedPageBreak/>
         <w:t>Վարկառուի՝ Պայմանագրի կնքումից հետո առաջացող պահանջները, դիմումները, բողոքները Վարկատուին ներկայացնելու կարգը, ինչպես նաև Վարկատուի կողմից պահանջն</w:t>
       </w:r>
       <w:r>
@@ -6876,6 +6908,7 @@
           <w:szCs w:val="18"/>
           <w:lang w:val="hy-AM"/>
         </w:rPr>
+        <w:lastRenderedPageBreak/>
         <w:t>Վարկառուի իրավունքները դատական կարգով, ինչպես նաև արբիտրաժային դատարանի և/կամ Ֆինանսական համակարգի հաշտարարի միջոցով պաշտպանելու հնարավորության մասին՝ տրամադրելով «Ինչ անել, եթե բողոք ունեք» ձևաթուղթը,</w:t>
       </w:r>
     </w:p>

</xml_diff>

<commit_message>
Add contract individual template
</commit_message>
<xml_diff>
--- a/public/files/contract_gold_template.docx
+++ b/public/files/contract_gold_template.docx
@@ -154,7 +154,33 @@
           <w:color w:val="000000" w:themeColor="text1"/>
           <w:lang w:val="en-GB"/>
         </w:rPr>
-        <w:t>${num}</w:t>
+        <w:t>${</w:t>
+      </w:r>
+      <w:proofErr w:type="spellStart"/>
+      <w:r>
+        <w:rPr>
+          <w:rFonts w:ascii="Times New Roman" w:eastAsia="Times New Roman" w:hAnsi="Times New Roman" w:cs="Times New Roman"/>
+          <w:b/>
+          <w:bCs/>
+          <w:i/>
+          <w:iCs/>
+          <w:color w:val="000000" w:themeColor="text1"/>
+          <w:lang w:val="en-GB"/>
+        </w:rPr>
+        <w:t>num</w:t>
+      </w:r>
+      <w:proofErr w:type="spellEnd"/>
+      <w:r>
+        <w:rPr>
+          <w:rFonts w:ascii="Times New Roman" w:eastAsia="Times New Roman" w:hAnsi="Times New Roman" w:cs="Times New Roman"/>
+          <w:b/>
+          <w:bCs/>
+          <w:i/>
+          <w:iCs/>
+          <w:color w:val="000000" w:themeColor="text1"/>
+          <w:lang w:val="en-GB"/>
+        </w:rPr>
+        <w:t>}</w:t>
       </w:r>
     </w:p>
     <w:tbl>
@@ -305,9 +331,8 @@
           <w:rFonts w:ascii="Times New Roman" w:hAnsi="Times New Roman"/>
           <w:color w:val="000000" w:themeColor="text1"/>
           <w:sz w:val="18"/>
-          <w:lang w:val="en-GB"/>
-        </w:rPr>
-        <w:t>000 000000</w:t>
+        </w:rPr>
+        <w:t>61</w:t>
       </w:r>
       <w:r>
         <w:rPr>
@@ -374,8 +399,86 @@
           <w:szCs w:val="18"/>
           <w:lang w:val="en-GB"/>
         </w:rPr>
-        <w:t>53 շենք, 35 ոչ բնակելի տարածք</w:t>
-      </w:r>
+        <w:t xml:space="preserve">53 </w:t>
+      </w:r>
+      <w:proofErr w:type="spellStart"/>
+      <w:r>
+        <w:rPr>
+          <w:rFonts w:ascii="Times New Roman" w:eastAsia="Times New Roman" w:hAnsi="Times New Roman" w:cs="Times New Roman"/>
+          <w:color w:val="000000" w:themeColor="text1"/>
+          <w:sz w:val="18"/>
+          <w:szCs w:val="18"/>
+          <w:lang w:val="en-GB"/>
+        </w:rPr>
+        <w:t>շենք</w:t>
+      </w:r>
+      <w:proofErr w:type="spellEnd"/>
+      <w:r>
+        <w:rPr>
+          <w:rFonts w:ascii="Times New Roman" w:eastAsia="Times New Roman" w:hAnsi="Times New Roman" w:cs="Times New Roman"/>
+          <w:color w:val="000000" w:themeColor="text1"/>
+          <w:sz w:val="18"/>
+          <w:szCs w:val="18"/>
+          <w:lang w:val="en-GB"/>
+        </w:rPr>
+        <w:t xml:space="preserve">, 35 </w:t>
+      </w:r>
+      <w:proofErr w:type="spellStart"/>
+      <w:r>
+        <w:rPr>
+          <w:rFonts w:ascii="Times New Roman" w:eastAsia="Times New Roman" w:hAnsi="Times New Roman" w:cs="Times New Roman"/>
+          <w:color w:val="000000" w:themeColor="text1"/>
+          <w:sz w:val="18"/>
+          <w:szCs w:val="18"/>
+          <w:lang w:val="en-GB"/>
+        </w:rPr>
+        <w:t>ոչ</w:t>
+      </w:r>
+      <w:proofErr w:type="spellEnd"/>
+      <w:r>
+        <w:rPr>
+          <w:rFonts w:ascii="Times New Roman" w:eastAsia="Times New Roman" w:hAnsi="Times New Roman" w:cs="Times New Roman"/>
+          <w:color w:val="000000" w:themeColor="text1"/>
+          <w:sz w:val="18"/>
+          <w:szCs w:val="18"/>
+          <w:lang w:val="en-GB"/>
+        </w:rPr>
+        <w:t xml:space="preserve"> </w:t>
+      </w:r>
+      <w:proofErr w:type="spellStart"/>
+      <w:r>
+        <w:rPr>
+          <w:rFonts w:ascii="Times New Roman" w:eastAsia="Times New Roman" w:hAnsi="Times New Roman" w:cs="Times New Roman"/>
+          <w:color w:val="000000" w:themeColor="text1"/>
+          <w:sz w:val="18"/>
+          <w:szCs w:val="18"/>
+          <w:lang w:val="en-GB"/>
+        </w:rPr>
+        <w:t>բնակելի</w:t>
+      </w:r>
+      <w:proofErr w:type="spellEnd"/>
+      <w:r>
+        <w:rPr>
+          <w:rFonts w:ascii="Times New Roman" w:eastAsia="Times New Roman" w:hAnsi="Times New Roman" w:cs="Times New Roman"/>
+          <w:color w:val="000000" w:themeColor="text1"/>
+          <w:sz w:val="18"/>
+          <w:szCs w:val="18"/>
+          <w:lang w:val="en-GB"/>
+        </w:rPr>
+        <w:t xml:space="preserve"> </w:t>
+      </w:r>
+      <w:proofErr w:type="spellStart"/>
+      <w:r>
+        <w:rPr>
+          <w:rFonts w:ascii="Times New Roman" w:eastAsia="Times New Roman" w:hAnsi="Times New Roman" w:cs="Times New Roman"/>
+          <w:color w:val="000000" w:themeColor="text1"/>
+          <w:sz w:val="18"/>
+          <w:szCs w:val="18"/>
+          <w:lang w:val="en-GB"/>
+        </w:rPr>
+        <w:t>տարածք</w:t>
+      </w:r>
+      <w:proofErr w:type="spellEnd"/>
       <w:r>
         <w:rPr>
           <w:rFonts w:ascii="Times New Roman" w:eastAsia="Times New Roman" w:hAnsi="Times New Roman" w:cs="Times New Roman"/>
@@ -1317,8 +1420,9 @@
                 <w:szCs w:val="16"/>
                 <w:lang w:val="en-GB"/>
               </w:rPr>
-              <w:t>${contra</w:t>
-            </w:r>
+              <w:t>${</w:t>
+            </w:r>
+            <w:proofErr w:type="spellStart"/>
             <w:r>
               <w:rPr>
                 <w:rFonts w:ascii="Times New Roman" w:hAnsi="Times New Roman" w:cs="Times New Roman"/>
@@ -1328,7 +1432,7 @@
                 <w:szCs w:val="16"/>
                 <w:lang w:val="en-GB"/>
               </w:rPr>
-              <w:t>c</w:t>
+              <w:t>contra</w:t>
             </w:r>
             <w:r>
               <w:rPr>
@@ -1339,7 +1443,30 @@
                 <w:szCs w:val="16"/>
                 <w:lang w:val="en-GB"/>
               </w:rPr>
-              <w:t>t_amount}</w:t>
+              <w:t>c</w:t>
+            </w:r>
+            <w:r>
+              <w:rPr>
+                <w:rFonts w:ascii="Times New Roman" w:hAnsi="Times New Roman" w:cs="Times New Roman"/>
+                <w:b/>
+                <w:i/>
+                <w:sz w:val="16"/>
+                <w:szCs w:val="16"/>
+                <w:lang w:val="en-GB"/>
+              </w:rPr>
+              <w:t>t_amount</w:t>
+            </w:r>
+            <w:proofErr w:type="spellEnd"/>
+            <w:r>
+              <w:rPr>
+                <w:rFonts w:ascii="Times New Roman" w:hAnsi="Times New Roman" w:cs="Times New Roman"/>
+                <w:b/>
+                <w:i/>
+                <w:sz w:val="16"/>
+                <w:szCs w:val="16"/>
+                <w:lang w:val="en-GB"/>
+              </w:rPr>
+              <w:t>}</w:t>
             </w:r>
             <w:r>
               <w:rPr>
@@ -1349,8 +1476,20 @@
                 <w:sz w:val="16"/>
                 <w:lang w:val="ru-RU"/>
               </w:rPr>
-              <w:t xml:space="preserve"> ՀՀ դրամ</w:t>
-            </w:r>
+              <w:t xml:space="preserve"> ՀՀ </w:t>
+            </w:r>
+            <w:proofErr w:type="spellStart"/>
+            <w:r>
+              <w:rPr>
+                <w:rFonts w:ascii="Times New Roman" w:hAnsi="Times New Roman"/>
+                <w:b/>
+                <w:i/>
+                <w:sz w:val="16"/>
+                <w:lang w:val="ru-RU"/>
+              </w:rPr>
+              <w:t>դրամ</w:t>
+            </w:r>
+            <w:proofErr w:type="spellEnd"/>
           </w:p>
         </w:tc>
       </w:tr>
@@ -1449,7 +1588,31 @@
                 <w:szCs w:val="16"/>
                 <w:lang w:val="ru-RU"/>
               </w:rPr>
-              <w:t>${interest_annual_rate}</w:t>
+              <w:t>${</w:t>
+            </w:r>
+            <w:proofErr w:type="spellStart"/>
+            <w:r>
+              <w:rPr>
+                <w:rFonts w:ascii="Times New Roman" w:hAnsi="Times New Roman" w:cs="Times New Roman"/>
+                <w:b/>
+                <w:i/>
+                <w:sz w:val="16"/>
+                <w:szCs w:val="16"/>
+                <w:lang w:val="ru-RU"/>
+              </w:rPr>
+              <w:t>interest_annual_rate</w:t>
+            </w:r>
+            <w:proofErr w:type="spellEnd"/>
+            <w:r>
+              <w:rPr>
+                <w:rFonts w:ascii="Times New Roman" w:hAnsi="Times New Roman" w:cs="Times New Roman"/>
+                <w:b/>
+                <w:i/>
+                <w:sz w:val="16"/>
+                <w:szCs w:val="16"/>
+                <w:lang w:val="ru-RU"/>
+              </w:rPr>
+              <w:t>}</w:t>
             </w:r>
           </w:p>
         </w:tc>
@@ -1549,7 +1712,31 @@
                 <w:szCs w:val="16"/>
                 <w:lang w:val="en-GB"/>
               </w:rPr>
-              <w:t>${effective_annual_rate}</w:t>
+              <w:t>${</w:t>
+            </w:r>
+            <w:proofErr w:type="spellStart"/>
+            <w:r>
+              <w:rPr>
+                <w:rFonts w:ascii="Times New Roman" w:hAnsi="Times New Roman" w:cs="Times New Roman"/>
+                <w:b/>
+                <w:i/>
+                <w:sz w:val="16"/>
+                <w:szCs w:val="16"/>
+                <w:lang w:val="en-GB"/>
+              </w:rPr>
+              <w:t>effective_annual_rate</w:t>
+            </w:r>
+            <w:proofErr w:type="spellEnd"/>
+            <w:r>
+              <w:rPr>
+                <w:rFonts w:ascii="Times New Roman" w:hAnsi="Times New Roman" w:cs="Times New Roman"/>
+                <w:b/>
+                <w:i/>
+                <w:sz w:val="16"/>
+                <w:szCs w:val="16"/>
+                <w:lang w:val="en-GB"/>
+              </w:rPr>
+              <w:t>}</w:t>
             </w:r>
           </w:p>
         </w:tc>
@@ -2979,7 +3166,31 @@
                 <w:szCs w:val="16"/>
                 <w:lang w:val="en-GB"/>
               </w:rPr>
-              <w:t>${mother_amount}</w:t>
+              <w:t>${</w:t>
+            </w:r>
+            <w:proofErr w:type="spellStart"/>
+            <w:r>
+              <w:rPr>
+                <w:rFonts w:ascii="Times New Roman" w:hAnsi="Times New Roman" w:cs="Times New Roman"/>
+                <w:bCs/>
+                <w:iCs/>
+                <w:sz w:val="16"/>
+                <w:szCs w:val="16"/>
+                <w:lang w:val="en-GB"/>
+              </w:rPr>
+              <w:t>mother_amount</w:t>
+            </w:r>
+            <w:proofErr w:type="spellEnd"/>
+            <w:r>
+              <w:rPr>
+                <w:rFonts w:ascii="Times New Roman" w:hAnsi="Times New Roman" w:cs="Times New Roman"/>
+                <w:bCs/>
+                <w:iCs/>
+                <w:sz w:val="16"/>
+                <w:szCs w:val="16"/>
+                <w:lang w:val="en-GB"/>
+              </w:rPr>
+              <w:t>}</w:t>
             </w:r>
             <w:r>
               <w:rPr>
@@ -2995,8 +3206,18 @@
                 <w:sz w:val="16"/>
                 <w:lang w:val="ru-RU"/>
               </w:rPr>
-              <w:t>ՀՀ դրամ</w:t>
-            </w:r>
+              <w:t xml:space="preserve">ՀՀ </w:t>
+            </w:r>
+            <w:proofErr w:type="spellStart"/>
+            <w:r>
+              <w:rPr>
+                <w:rFonts w:ascii="Times New Roman" w:hAnsi="Times New Roman"/>
+                <w:sz w:val="16"/>
+                <w:lang w:val="ru-RU"/>
+              </w:rPr>
+              <w:t>դրամ</w:t>
+            </w:r>
+            <w:proofErr w:type="spellEnd"/>
           </w:p>
         </w:tc>
       </w:tr>
@@ -8417,6 +8638,7 @@
           <w:lang w:val="en-GB"/>
         </w:rPr>
       </w:pPr>
+      <w:proofErr w:type="spellStart"/>
       <w:r>
         <w:rPr>
           <w:rFonts w:ascii="Times New Roman" w:eastAsia="Times New Roman" w:hAnsi="Times New Roman" w:cs="Times New Roman"/>
@@ -8427,13 +8649,10 @@
           <w:szCs w:val="13"/>
           <w:lang w:val="en-GB"/>
         </w:rPr>
-        <w:t xml:space="preserve">Վարկային կոդ՝ </w:t>
-      </w:r>
-    </w:p>
-    <w:p>
-      <w:pPr>
-        <w:spacing w:after="0" w:line="276" w:lineRule="auto"/>
-        <w:jc w:val="right"/>
+        <w:t>Վարկային</w:t>
+      </w:r>
+      <w:proofErr w:type="spellEnd"/>
+      <w:r>
         <w:rPr>
           <w:rFonts w:ascii="Times New Roman" w:eastAsia="Times New Roman" w:hAnsi="Times New Roman" w:cs="Times New Roman"/>
           <w:i/>
@@ -8443,7 +8662,9 @@
           <w:szCs w:val="13"/>
           <w:lang w:val="en-GB"/>
         </w:rPr>
-      </w:pPr>
+        <w:t xml:space="preserve"> </w:t>
+      </w:r>
+      <w:proofErr w:type="spellStart"/>
       <w:r>
         <w:rPr>
           <w:rFonts w:ascii="Times New Roman" w:eastAsia="Times New Roman" w:hAnsi="Times New Roman" w:cs="Times New Roman"/>
@@ -8452,10 +8673,11 @@
           <w:color w:val="000000" w:themeColor="text1"/>
           <w:sz w:val="18"/>
           <w:szCs w:val="13"/>
-          <w:lang w:val="hy-AM"/>
-        </w:rPr>
-        <w:t xml:space="preserve">Վարկային և ոսկյա իրերի գրավի խառը պայմանագիր </w:t>
-      </w:r>
+          <w:lang w:val="en-GB"/>
+        </w:rPr>
+        <w:t>կոդ</w:t>
+      </w:r>
+      <w:proofErr w:type="spellEnd"/>
       <w:r>
         <w:rPr>
           <w:rFonts w:ascii="Times New Roman" w:eastAsia="Times New Roman" w:hAnsi="Times New Roman" w:cs="Times New Roman"/>
@@ -8464,11 +8686,15 @@
           <w:color w:val="000000" w:themeColor="text1"/>
           <w:sz w:val="18"/>
           <w:szCs w:val="13"/>
-          <w:lang w:val="hy-AM"/>
-        </w:rPr>
-        <w:t xml:space="preserve">№ </w:t>
-      </w:r>
-      <w:r>
+          <w:lang w:val="en-GB"/>
+        </w:rPr>
+        <w:t xml:space="preserve">՝ </w:t>
+      </w:r>
+    </w:p>
+    <w:p>
+      <w:pPr>
+        <w:spacing w:after="0" w:line="276" w:lineRule="auto"/>
+        <w:jc w:val="right"/>
         <w:rPr>
           <w:rFonts w:ascii="Times New Roman" w:eastAsia="Times New Roman" w:hAnsi="Times New Roman" w:cs="Times New Roman"/>
           <w:i/>
@@ -8478,7 +8704,68 @@
           <w:szCs w:val="13"/>
           <w:lang w:val="en-GB"/>
         </w:rPr>
-        <w:t>${num}</w:t>
+      </w:pPr>
+      <w:r>
+        <w:rPr>
+          <w:rFonts w:ascii="Times New Roman" w:eastAsia="Times New Roman" w:hAnsi="Times New Roman" w:cs="Times New Roman"/>
+          <w:i/>
+          <w:iCs/>
+          <w:color w:val="000000" w:themeColor="text1"/>
+          <w:sz w:val="18"/>
+          <w:szCs w:val="13"/>
+          <w:lang w:val="hy-AM"/>
+        </w:rPr>
+        <w:t xml:space="preserve">Վարկային և ոսկյա իրերի գրավի խառը պայմանագիր </w:t>
+      </w:r>
+      <w:r>
+        <w:rPr>
+          <w:rFonts w:ascii="Times New Roman" w:eastAsia="Times New Roman" w:hAnsi="Times New Roman" w:cs="Times New Roman"/>
+          <w:i/>
+          <w:iCs/>
+          <w:color w:val="000000" w:themeColor="text1"/>
+          <w:sz w:val="18"/>
+          <w:szCs w:val="13"/>
+          <w:lang w:val="hy-AM"/>
+        </w:rPr>
+        <w:t xml:space="preserve">№ </w:t>
+      </w:r>
+      <w:r>
+        <w:rPr>
+          <w:rFonts w:ascii="Times New Roman" w:eastAsia="Times New Roman" w:hAnsi="Times New Roman" w:cs="Times New Roman"/>
+          <w:i/>
+          <w:iCs/>
+          <w:color w:val="000000" w:themeColor="text1"/>
+          <w:sz w:val="18"/>
+          <w:szCs w:val="13"/>
+          <w:lang w:val="en-GB"/>
+        </w:rPr>
+        <w:t>${</w:t>
+      </w:r>
+      <w:proofErr w:type="spellStart"/>
+      <w:r>
+        <w:rPr>
+          <w:rFonts w:ascii="Times New Roman" w:eastAsia="Times New Roman" w:hAnsi="Times New Roman" w:cs="Times New Roman"/>
+          <w:i/>
+          <w:iCs/>
+          <w:color w:val="000000" w:themeColor="text1"/>
+          <w:sz w:val="18"/>
+          <w:szCs w:val="13"/>
+          <w:lang w:val="en-GB"/>
+        </w:rPr>
+        <w:t>num</w:t>
+      </w:r>
+      <w:proofErr w:type="spellEnd"/>
+      <w:r>
+        <w:rPr>
+          <w:rFonts w:ascii="Times New Roman" w:eastAsia="Times New Roman" w:hAnsi="Times New Roman" w:cs="Times New Roman"/>
+          <w:i/>
+          <w:iCs/>
+          <w:color w:val="000000" w:themeColor="text1"/>
+          <w:sz w:val="18"/>
+          <w:szCs w:val="13"/>
+          <w:lang w:val="en-GB"/>
+        </w:rPr>
+        <w:t>}</w:t>
       </w:r>
     </w:p>
     <w:p>
@@ -9929,6 +10216,7 @@
           <w:lang w:val="en-GB"/>
         </w:rPr>
       </w:pPr>
+      <w:proofErr w:type="spellStart"/>
       <w:r>
         <w:rPr>
           <w:rFonts w:ascii="Times New Roman" w:eastAsia="Times New Roman" w:hAnsi="Times New Roman" w:cs="Times New Roman"/>
@@ -9939,13 +10227,10 @@
           <w:szCs w:val="13"/>
           <w:lang w:val="en-GB"/>
         </w:rPr>
-        <w:t>Վարկային կոդ՝</w:t>
-      </w:r>
-    </w:p>
-    <w:p>
-      <w:pPr>
-        <w:spacing w:after="0" w:line="276" w:lineRule="auto"/>
-        <w:jc w:val="right"/>
+        <w:t>Վարկային</w:t>
+      </w:r>
+      <w:proofErr w:type="spellEnd"/>
+      <w:r>
         <w:rPr>
           <w:rFonts w:ascii="Times New Roman" w:eastAsia="Times New Roman" w:hAnsi="Times New Roman" w:cs="Times New Roman"/>
           <w:i/>
@@ -9955,7 +10240,9 @@
           <w:szCs w:val="13"/>
           <w:lang w:val="en-GB"/>
         </w:rPr>
-      </w:pPr>
+        <w:t xml:space="preserve"> </w:t>
+      </w:r>
+      <w:proofErr w:type="spellStart"/>
       <w:r>
         <w:rPr>
           <w:rFonts w:ascii="Times New Roman" w:eastAsia="Times New Roman" w:hAnsi="Times New Roman" w:cs="Times New Roman"/>
@@ -9964,10 +10251,11 @@
           <w:color w:val="000000" w:themeColor="text1"/>
           <w:sz w:val="18"/>
           <w:szCs w:val="13"/>
-          <w:lang w:val="hy-AM"/>
-        </w:rPr>
-        <w:t xml:space="preserve">Վարկային և ոսկյա իրերի գրավի խառը պայմանագիր </w:t>
-      </w:r>
+          <w:lang w:val="en-GB"/>
+        </w:rPr>
+        <w:t>կոդ</w:t>
+      </w:r>
+      <w:proofErr w:type="spellEnd"/>
       <w:r>
         <w:rPr>
           <w:rFonts w:ascii="Times New Roman" w:eastAsia="Times New Roman" w:hAnsi="Times New Roman" w:cs="Times New Roman"/>
@@ -9976,11 +10264,15 @@
           <w:color w:val="000000" w:themeColor="text1"/>
           <w:sz w:val="18"/>
           <w:szCs w:val="13"/>
-          <w:lang w:val="hy-AM"/>
-        </w:rPr>
-        <w:t xml:space="preserve">№ </w:t>
-      </w:r>
-      <w:r>
+          <w:lang w:val="en-GB"/>
+        </w:rPr>
+        <w:t>՝</w:t>
+      </w:r>
+    </w:p>
+    <w:p>
+      <w:pPr>
+        <w:spacing w:after="0" w:line="276" w:lineRule="auto"/>
+        <w:jc w:val="right"/>
         <w:rPr>
           <w:rFonts w:ascii="Times New Roman" w:eastAsia="Times New Roman" w:hAnsi="Times New Roman" w:cs="Times New Roman"/>
           <w:i/>
@@ -9988,10 +10280,9 @@
           <w:color w:val="000000" w:themeColor="text1"/>
           <w:sz w:val="18"/>
           <w:szCs w:val="13"/>
-          <w:lang w:val="hy-AM"/>
-        </w:rPr>
-        <w:t>$</w:t>
-      </w:r>
+          <w:lang w:val="en-GB"/>
+        </w:rPr>
+      </w:pPr>
       <w:r>
         <w:rPr>
           <w:rFonts w:ascii="Times New Roman" w:eastAsia="Times New Roman" w:hAnsi="Times New Roman" w:cs="Times New Roman"/>
@@ -10000,9 +10291,71 @@
           <w:color w:val="000000" w:themeColor="text1"/>
           <w:sz w:val="18"/>
           <w:szCs w:val="13"/>
+          <w:lang w:val="hy-AM"/>
+        </w:rPr>
+        <w:t xml:space="preserve">Վարկային և ոսկյա իրերի գրավի խառը պայմանագիր </w:t>
+      </w:r>
+      <w:r>
+        <w:rPr>
+          <w:rFonts w:ascii="Times New Roman" w:eastAsia="Times New Roman" w:hAnsi="Times New Roman" w:cs="Times New Roman"/>
+          <w:i/>
+          <w:iCs/>
+          <w:color w:val="000000" w:themeColor="text1"/>
+          <w:sz w:val="18"/>
+          <w:szCs w:val="13"/>
+          <w:lang w:val="hy-AM"/>
+        </w:rPr>
+        <w:t xml:space="preserve">№ </w:t>
+      </w:r>
+      <w:r>
+        <w:rPr>
+          <w:rFonts w:ascii="Times New Roman" w:eastAsia="Times New Roman" w:hAnsi="Times New Roman" w:cs="Times New Roman"/>
+          <w:i/>
+          <w:iCs/>
+          <w:color w:val="000000" w:themeColor="text1"/>
+          <w:sz w:val="18"/>
+          <w:szCs w:val="13"/>
+          <w:lang w:val="hy-AM"/>
+        </w:rPr>
+        <w:t>$</w:t>
+      </w:r>
+      <w:r>
+        <w:rPr>
+          <w:rFonts w:ascii="Times New Roman" w:eastAsia="Times New Roman" w:hAnsi="Times New Roman" w:cs="Times New Roman"/>
+          <w:i/>
+          <w:iCs/>
+          <w:color w:val="000000" w:themeColor="text1"/>
+          <w:sz w:val="18"/>
+          <w:szCs w:val="13"/>
           <w:lang w:val="en-GB"/>
         </w:rPr>
-        <w:t>{num}</w:t>
+        <w:t>{</w:t>
+      </w:r>
+      <w:proofErr w:type="spellStart"/>
+      <w:r>
+        <w:rPr>
+          <w:rFonts w:ascii="Times New Roman" w:eastAsia="Times New Roman" w:hAnsi="Times New Roman" w:cs="Times New Roman"/>
+          <w:i/>
+          <w:iCs/>
+          <w:color w:val="000000" w:themeColor="text1"/>
+          <w:sz w:val="18"/>
+          <w:szCs w:val="13"/>
+          <w:lang w:val="en-GB"/>
+        </w:rPr>
+        <w:t>num</w:t>
+      </w:r>
+      <w:proofErr w:type="spellEnd"/>
+      <w:r>
+        <w:rPr>
+          <w:rFonts w:ascii="Times New Roman" w:eastAsia="Times New Roman" w:hAnsi="Times New Roman" w:cs="Times New Roman"/>
+          <w:i/>
+          <w:iCs/>
+          <w:color w:val="000000" w:themeColor="text1"/>
+          <w:sz w:val="18"/>
+          <w:szCs w:val="13"/>
+          <w:lang w:val="en-GB"/>
+        </w:rPr>
+        <w:t>}</w:t>
       </w:r>
     </w:p>
     <w:p>
@@ -10172,14 +10525,52 @@
                 <w:szCs w:val="16"/>
               </w:rPr>
             </w:pPr>
-            <w:r>
-              <w:rPr>
-                <w:rFonts w:ascii="Times New Roman" w:hAnsi="Times New Roman" w:cs="Times New Roman"/>
-                <w:sz w:val="16"/>
-                <w:szCs w:val="16"/>
-              </w:rPr>
-              <w:t>Գրավի առարկայի նկարագիրը</w:t>
-            </w:r>
+            <w:proofErr w:type="spellStart"/>
+            <w:r>
+              <w:rPr>
+                <w:rFonts w:ascii="Times New Roman" w:hAnsi="Times New Roman" w:cs="Times New Roman"/>
+                <w:sz w:val="16"/>
+                <w:szCs w:val="16"/>
+              </w:rPr>
+              <w:t>Գրավի</w:t>
+            </w:r>
+            <w:proofErr w:type="spellEnd"/>
+            <w:r>
+              <w:rPr>
+                <w:rFonts w:ascii="Times New Roman" w:hAnsi="Times New Roman" w:cs="Times New Roman"/>
+                <w:sz w:val="16"/>
+                <w:szCs w:val="16"/>
+              </w:rPr>
+              <w:t xml:space="preserve"> </w:t>
+            </w:r>
+            <w:proofErr w:type="spellStart"/>
+            <w:r>
+              <w:rPr>
+                <w:rFonts w:ascii="Times New Roman" w:hAnsi="Times New Roman" w:cs="Times New Roman"/>
+                <w:sz w:val="16"/>
+                <w:szCs w:val="16"/>
+              </w:rPr>
+              <w:t>առարկայի</w:t>
+            </w:r>
+            <w:proofErr w:type="spellEnd"/>
+            <w:r>
+              <w:rPr>
+                <w:rFonts w:ascii="Times New Roman" w:hAnsi="Times New Roman" w:cs="Times New Roman"/>
+                <w:sz w:val="16"/>
+                <w:szCs w:val="16"/>
+              </w:rPr>
+              <w:t xml:space="preserve"> </w:t>
+            </w:r>
+            <w:proofErr w:type="spellStart"/>
+            <w:r>
+              <w:rPr>
+                <w:rFonts w:ascii="Times New Roman" w:hAnsi="Times New Roman" w:cs="Times New Roman"/>
+                <w:sz w:val="16"/>
+                <w:szCs w:val="16"/>
+              </w:rPr>
+              <w:t>նկարագիրը</w:t>
+            </w:r>
+            <w:proofErr w:type="spellEnd"/>
           </w:p>
         </w:tc>
         <w:tc>
@@ -10197,6 +10588,7 @@
                 <w:szCs w:val="16"/>
               </w:rPr>
             </w:pPr>
+            <w:proofErr w:type="spellStart"/>
             <w:r>
               <w:rPr>
                 <w:rFonts w:ascii="Times New Roman" w:hAnsi="Times New Roman" w:cs="Times New Roman"/>
@@ -10205,6 +10597,7 @@
               </w:rPr>
               <w:t>Քանակը</w:t>
             </w:r>
+            <w:proofErr w:type="spellEnd"/>
           </w:p>
           <w:p>
             <w:pPr>
@@ -10215,6 +10608,7 @@
                 <w:szCs w:val="16"/>
               </w:rPr>
             </w:pPr>
+            <w:proofErr w:type="spellStart"/>
             <w:r>
               <w:rPr>
                 <w:rFonts w:ascii="Times New Roman" w:hAnsi="Times New Roman" w:cs="Times New Roman"/>
@@ -10223,6 +10617,7 @@
               </w:rPr>
               <w:t>հատ</w:t>
             </w:r>
+            <w:proofErr w:type="spellEnd"/>
           </w:p>
         </w:tc>
         <w:tc>
@@ -10243,6 +10638,7 @@
                 <w:szCs w:val="16"/>
               </w:rPr>
             </w:pPr>
+            <w:proofErr w:type="spellStart"/>
             <w:r>
               <w:rPr>
                 <w:rFonts w:ascii="Times New Roman" w:hAnsi="Times New Roman" w:cs="Times New Roman"/>
@@ -10251,6 +10647,7 @@
               </w:rPr>
               <w:t>Զանգվածը</w:t>
             </w:r>
+            <w:proofErr w:type="spellEnd"/>
           </w:p>
           <w:p>
             <w:pPr>
@@ -10261,6 +10658,7 @@
                 <w:szCs w:val="16"/>
               </w:rPr>
             </w:pPr>
+            <w:proofErr w:type="spellStart"/>
             <w:r>
               <w:rPr>
                 <w:rFonts w:ascii="Times New Roman" w:hAnsi="Times New Roman" w:cs="Times New Roman"/>
@@ -10269,6 +10667,7 @@
               </w:rPr>
               <w:t>գրամ</w:t>
             </w:r>
+            <w:proofErr w:type="spellEnd"/>
           </w:p>
         </w:tc>
         <w:tc>
@@ -10286,6 +10685,7 @@
                 <w:szCs w:val="16"/>
               </w:rPr>
             </w:pPr>
+            <w:proofErr w:type="spellStart"/>
             <w:r>
               <w:rPr>
                 <w:rFonts w:ascii="Times New Roman" w:hAnsi="Times New Roman" w:cs="Times New Roman"/>
@@ -10294,6 +10694,7 @@
               </w:rPr>
               <w:t>Հարգը</w:t>
             </w:r>
+            <w:proofErr w:type="spellEnd"/>
           </w:p>
         </w:tc>
         <w:tc>
@@ -10311,14 +10712,70 @@
                 <w:szCs w:val="16"/>
               </w:rPr>
             </w:pPr>
-            <w:r>
-              <w:rPr>
-                <w:rFonts w:ascii="Times New Roman" w:hAnsi="Times New Roman" w:cs="Times New Roman"/>
-                <w:sz w:val="16"/>
-                <w:szCs w:val="16"/>
-              </w:rPr>
-              <w:t>Մեկ գրամի արժեքը ՀՀ դրամով</w:t>
-            </w:r>
+            <w:proofErr w:type="spellStart"/>
+            <w:r>
+              <w:rPr>
+                <w:rFonts w:ascii="Times New Roman" w:hAnsi="Times New Roman" w:cs="Times New Roman"/>
+                <w:sz w:val="16"/>
+                <w:szCs w:val="16"/>
+              </w:rPr>
+              <w:t>Մեկ</w:t>
+            </w:r>
+            <w:proofErr w:type="spellEnd"/>
+            <w:r>
+              <w:rPr>
+                <w:rFonts w:ascii="Times New Roman" w:hAnsi="Times New Roman" w:cs="Times New Roman"/>
+                <w:sz w:val="16"/>
+                <w:szCs w:val="16"/>
+              </w:rPr>
+              <w:t xml:space="preserve"> </w:t>
+            </w:r>
+            <w:proofErr w:type="spellStart"/>
+            <w:r>
+              <w:rPr>
+                <w:rFonts w:ascii="Times New Roman" w:hAnsi="Times New Roman" w:cs="Times New Roman"/>
+                <w:sz w:val="16"/>
+                <w:szCs w:val="16"/>
+              </w:rPr>
+              <w:t>գրամի</w:t>
+            </w:r>
+            <w:proofErr w:type="spellEnd"/>
+            <w:r>
+              <w:rPr>
+                <w:rFonts w:ascii="Times New Roman" w:hAnsi="Times New Roman" w:cs="Times New Roman"/>
+                <w:sz w:val="16"/>
+                <w:szCs w:val="16"/>
+              </w:rPr>
+              <w:t xml:space="preserve"> </w:t>
+            </w:r>
+            <w:proofErr w:type="spellStart"/>
+            <w:r>
+              <w:rPr>
+                <w:rFonts w:ascii="Times New Roman" w:hAnsi="Times New Roman" w:cs="Times New Roman"/>
+                <w:sz w:val="16"/>
+                <w:szCs w:val="16"/>
+              </w:rPr>
+              <w:t>արժեքը</w:t>
+            </w:r>
+            <w:proofErr w:type="spellEnd"/>
+            <w:r>
+              <w:rPr>
+                <w:rFonts w:ascii="Times New Roman" w:hAnsi="Times New Roman" w:cs="Times New Roman"/>
+                <w:sz w:val="16"/>
+                <w:szCs w:val="16"/>
+              </w:rPr>
+              <w:t xml:space="preserve"> ՀՀ </w:t>
+            </w:r>
+            <w:proofErr w:type="spellStart"/>
+            <w:r>
+              <w:rPr>
+                <w:rFonts w:ascii="Times New Roman" w:hAnsi="Times New Roman" w:cs="Times New Roman"/>
+                <w:sz w:val="16"/>
+                <w:szCs w:val="16"/>
+              </w:rPr>
+              <w:t>դրամով</w:t>
+            </w:r>
+            <w:proofErr w:type="spellEnd"/>
           </w:p>
         </w:tc>
         <w:tc>
@@ -10336,14 +10793,52 @@
                 <w:szCs w:val="16"/>
               </w:rPr>
             </w:pPr>
-            <w:r>
-              <w:rPr>
-                <w:rFonts w:ascii="Times New Roman" w:hAnsi="Times New Roman" w:cs="Times New Roman"/>
-                <w:sz w:val="16"/>
-                <w:szCs w:val="16"/>
-              </w:rPr>
-              <w:t>Ընդհանւոր գումարի չափը</w:t>
-            </w:r>
+            <w:proofErr w:type="spellStart"/>
+            <w:r>
+              <w:rPr>
+                <w:rFonts w:ascii="Times New Roman" w:hAnsi="Times New Roman" w:cs="Times New Roman"/>
+                <w:sz w:val="16"/>
+                <w:szCs w:val="16"/>
+              </w:rPr>
+              <w:t>Ընդհանւոր</w:t>
+            </w:r>
+            <w:proofErr w:type="spellEnd"/>
+            <w:r>
+              <w:rPr>
+                <w:rFonts w:ascii="Times New Roman" w:hAnsi="Times New Roman" w:cs="Times New Roman"/>
+                <w:sz w:val="16"/>
+                <w:szCs w:val="16"/>
+              </w:rPr>
+              <w:t xml:space="preserve"> </w:t>
+            </w:r>
+            <w:proofErr w:type="spellStart"/>
+            <w:r>
+              <w:rPr>
+                <w:rFonts w:ascii="Times New Roman" w:hAnsi="Times New Roman" w:cs="Times New Roman"/>
+                <w:sz w:val="16"/>
+                <w:szCs w:val="16"/>
+              </w:rPr>
+              <w:t>գումարի</w:t>
+            </w:r>
+            <w:proofErr w:type="spellEnd"/>
+            <w:r>
+              <w:rPr>
+                <w:rFonts w:ascii="Times New Roman" w:hAnsi="Times New Roman" w:cs="Times New Roman"/>
+                <w:sz w:val="16"/>
+                <w:szCs w:val="16"/>
+              </w:rPr>
+              <w:t xml:space="preserve"> </w:t>
+            </w:r>
+            <w:proofErr w:type="spellStart"/>
+            <w:r>
+              <w:rPr>
+                <w:rFonts w:ascii="Times New Roman" w:hAnsi="Times New Roman" w:cs="Times New Roman"/>
+                <w:sz w:val="16"/>
+                <w:szCs w:val="16"/>
+              </w:rPr>
+              <w:t>չափը</w:t>
+            </w:r>
+            <w:proofErr w:type="spellEnd"/>
           </w:p>
         </w:tc>
       </w:tr>
@@ -10399,14 +10894,34 @@
                 <w:szCs w:val="16"/>
               </w:rPr>
             </w:pPr>
-            <w:r>
-              <w:rPr>
-                <w:rFonts w:ascii="Times New Roman" w:hAnsi="Times New Roman" w:cs="Times New Roman"/>
-                <w:sz w:val="16"/>
-                <w:szCs w:val="16"/>
-              </w:rPr>
-              <w:t>Ընդհանուր քաշ</w:t>
-            </w:r>
+            <w:proofErr w:type="spellStart"/>
+            <w:r>
+              <w:rPr>
+                <w:rFonts w:ascii="Times New Roman" w:hAnsi="Times New Roman" w:cs="Times New Roman"/>
+                <w:sz w:val="16"/>
+                <w:szCs w:val="16"/>
+              </w:rPr>
+              <w:t>Ընդհանուր</w:t>
+            </w:r>
+            <w:proofErr w:type="spellEnd"/>
+            <w:r>
+              <w:rPr>
+                <w:rFonts w:ascii="Times New Roman" w:hAnsi="Times New Roman" w:cs="Times New Roman"/>
+                <w:sz w:val="16"/>
+                <w:szCs w:val="16"/>
+              </w:rPr>
+              <w:t xml:space="preserve"> </w:t>
+            </w:r>
+            <w:proofErr w:type="spellStart"/>
+            <w:r>
+              <w:rPr>
+                <w:rFonts w:ascii="Times New Roman" w:hAnsi="Times New Roman" w:cs="Times New Roman"/>
+                <w:sz w:val="16"/>
+                <w:szCs w:val="16"/>
+              </w:rPr>
+              <w:t>քաշ</w:t>
+            </w:r>
+            <w:proofErr w:type="spellEnd"/>
           </w:p>
         </w:tc>
         <w:tc>
@@ -10426,14 +10941,34 @@
                 <w:szCs w:val="16"/>
               </w:rPr>
             </w:pPr>
-            <w:r>
-              <w:rPr>
-                <w:rFonts w:ascii="Times New Roman" w:hAnsi="Times New Roman" w:cs="Times New Roman"/>
-                <w:sz w:val="16"/>
-                <w:szCs w:val="16"/>
-              </w:rPr>
-              <w:t>մաքուր քաշ</w:t>
-            </w:r>
+            <w:proofErr w:type="spellStart"/>
+            <w:r>
+              <w:rPr>
+                <w:rFonts w:ascii="Times New Roman" w:hAnsi="Times New Roman" w:cs="Times New Roman"/>
+                <w:sz w:val="16"/>
+                <w:szCs w:val="16"/>
+              </w:rPr>
+              <w:t>մաքուր</w:t>
+            </w:r>
+            <w:proofErr w:type="spellEnd"/>
+            <w:r>
+              <w:rPr>
+                <w:rFonts w:ascii="Times New Roman" w:hAnsi="Times New Roman" w:cs="Times New Roman"/>
+                <w:sz w:val="16"/>
+                <w:szCs w:val="16"/>
+              </w:rPr>
+              <w:t xml:space="preserve"> </w:t>
+            </w:r>
+            <w:proofErr w:type="spellStart"/>
+            <w:r>
+              <w:rPr>
+                <w:rFonts w:ascii="Times New Roman" w:hAnsi="Times New Roman" w:cs="Times New Roman"/>
+                <w:sz w:val="16"/>
+                <w:szCs w:val="16"/>
+              </w:rPr>
+              <w:t>քաշ</w:t>
+            </w:r>
+            <w:proofErr w:type="spellEnd"/>
           </w:p>
         </w:tc>
         <w:tc>
@@ -10510,7 +11045,25 @@
                 <w:sz w:val="16"/>
                 <w:szCs w:val="16"/>
               </w:rPr>
-              <w:t>${i_desc}</w:t>
+              <w:t>${</w:t>
+            </w:r>
+            <w:proofErr w:type="spellStart"/>
+            <w:r>
+              <w:rPr>
+                <w:rFonts w:ascii="Times New Roman" w:hAnsi="Times New Roman" w:cs="Times New Roman"/>
+                <w:sz w:val="16"/>
+                <w:szCs w:val="16"/>
+              </w:rPr>
+              <w:t>i_desc</w:t>
+            </w:r>
+            <w:proofErr w:type="spellEnd"/>
+            <w:r>
+              <w:rPr>
+                <w:rFonts w:ascii="Times New Roman" w:hAnsi="Times New Roman" w:cs="Times New Roman"/>
+                <w:sz w:val="16"/>
+                <w:szCs w:val="16"/>
+              </w:rPr>
+              <w:t>}</w:t>
             </w:r>
           </w:p>
         </w:tc>
@@ -10532,7 +11085,25 @@
                 <w:sz w:val="16"/>
                 <w:szCs w:val="16"/>
               </w:rPr>
-              <w:t>${i_c}</w:t>
+              <w:t>${</w:t>
+            </w:r>
+            <w:proofErr w:type="spellStart"/>
+            <w:r>
+              <w:rPr>
+                <w:rFonts w:ascii="Times New Roman" w:hAnsi="Times New Roman" w:cs="Times New Roman"/>
+                <w:sz w:val="16"/>
+                <w:szCs w:val="16"/>
+              </w:rPr>
+              <w:t>i_c</w:t>
+            </w:r>
+            <w:proofErr w:type="spellEnd"/>
+            <w:r>
+              <w:rPr>
+                <w:rFonts w:ascii="Times New Roman" w:hAnsi="Times New Roman" w:cs="Times New Roman"/>
+                <w:sz w:val="16"/>
+                <w:szCs w:val="16"/>
+              </w:rPr>
+              <w:t>}</w:t>
             </w:r>
           </w:p>
         </w:tc>
@@ -10554,7 +11125,25 @@
                 <w:sz w:val="16"/>
                 <w:szCs w:val="16"/>
               </w:rPr>
-              <w:t>${i_w}</w:t>
+              <w:t>${</w:t>
+            </w:r>
+            <w:proofErr w:type="spellStart"/>
+            <w:r>
+              <w:rPr>
+                <w:rFonts w:ascii="Times New Roman" w:hAnsi="Times New Roman" w:cs="Times New Roman"/>
+                <w:sz w:val="16"/>
+                <w:szCs w:val="16"/>
+              </w:rPr>
+              <w:t>i_w</w:t>
+            </w:r>
+            <w:proofErr w:type="spellEnd"/>
+            <w:r>
+              <w:rPr>
+                <w:rFonts w:ascii="Times New Roman" w:hAnsi="Times New Roman" w:cs="Times New Roman"/>
+                <w:sz w:val="16"/>
+                <w:szCs w:val="16"/>
+              </w:rPr>
+              <w:t>}</w:t>
             </w:r>
           </w:p>
         </w:tc>
@@ -10576,7 +11165,25 @@
                 <w:sz w:val="16"/>
                 <w:szCs w:val="16"/>
               </w:rPr>
-              <w:t>${i_cw}</w:t>
+              <w:t>${</w:t>
+            </w:r>
+            <w:proofErr w:type="spellStart"/>
+            <w:r>
+              <w:rPr>
+                <w:rFonts w:ascii="Times New Roman" w:hAnsi="Times New Roman" w:cs="Times New Roman"/>
+                <w:sz w:val="16"/>
+                <w:szCs w:val="16"/>
+              </w:rPr>
+              <w:t>i_cw</w:t>
+            </w:r>
+            <w:proofErr w:type="spellEnd"/>
+            <w:r>
+              <w:rPr>
+                <w:rFonts w:ascii="Times New Roman" w:hAnsi="Times New Roman" w:cs="Times New Roman"/>
+                <w:sz w:val="16"/>
+                <w:szCs w:val="16"/>
+              </w:rPr>
+              <w:t>}</w:t>
             </w:r>
           </w:p>
         </w:tc>
@@ -10598,7 +11205,25 @@
                 <w:sz w:val="16"/>
                 <w:szCs w:val="16"/>
               </w:rPr>
-              <w:t>${i_h}</w:t>
+              <w:t>${</w:t>
+            </w:r>
+            <w:proofErr w:type="spellStart"/>
+            <w:r>
+              <w:rPr>
+                <w:rFonts w:ascii="Times New Roman" w:hAnsi="Times New Roman" w:cs="Times New Roman"/>
+                <w:sz w:val="16"/>
+                <w:szCs w:val="16"/>
+              </w:rPr>
+              <w:t>i_h</w:t>
+            </w:r>
+            <w:proofErr w:type="spellEnd"/>
+            <w:r>
+              <w:rPr>
+                <w:rFonts w:ascii="Times New Roman" w:hAnsi="Times New Roman" w:cs="Times New Roman"/>
+                <w:sz w:val="16"/>
+                <w:szCs w:val="16"/>
+              </w:rPr>
+              <w:t>}</w:t>
             </w:r>
           </w:p>
         </w:tc>
@@ -10634,7 +11259,16 @@
                 <w:sz w:val="16"/>
                 <w:szCs w:val="16"/>
               </w:rPr>
-              <w:t>${i</w:t>
+              <w:t>${</w:t>
+            </w:r>
+            <w:proofErr w:type="spellStart"/>
+            <w:r>
+              <w:rPr>
+                <w:rFonts w:ascii="Times New Roman" w:hAnsi="Times New Roman" w:cs="Times New Roman"/>
+                <w:sz w:val="16"/>
+                <w:szCs w:val="16"/>
+              </w:rPr>
+              <w:t>i</w:t>
             </w:r>
             <w:r>
               <w:rPr>
@@ -10660,6 +11294,7 @@
               </w:rPr>
               <w:t>m</w:t>
             </w:r>
+            <w:proofErr w:type="spellEnd"/>
             <w:r>
               <w:rPr>
                 <w:rFonts w:ascii="Times New Roman" w:hAnsi="Times New Roman" w:cs="Times New Roman"/>
@@ -10693,13 +11328,23 @@
                 <w:szCs w:val="16"/>
               </w:rPr>
             </w:pPr>
-            <w:r>
-              <w:rPr>
-                <w:rFonts w:ascii="Times New Roman" w:hAnsi="Times New Roman" w:cs="Times New Roman"/>
-                <w:sz w:val="16"/>
-                <w:szCs w:val="16"/>
-              </w:rPr>
-              <w:t>Ընդամենը՝</w:t>
+            <w:proofErr w:type="spellStart"/>
+            <w:r>
+              <w:rPr>
+                <w:rFonts w:ascii="Times New Roman" w:hAnsi="Times New Roman" w:cs="Times New Roman"/>
+                <w:sz w:val="16"/>
+                <w:szCs w:val="16"/>
+              </w:rPr>
+              <w:t>Ընդամենը</w:t>
+            </w:r>
+            <w:proofErr w:type="spellEnd"/>
+            <w:r>
+              <w:rPr>
+                <w:rFonts w:ascii="Times New Roman" w:hAnsi="Times New Roman" w:cs="Times New Roman"/>
+                <w:sz w:val="16"/>
+                <w:szCs w:val="16"/>
+              </w:rPr>
+              <w:t>՝</w:t>
             </w:r>
           </w:p>
         </w:tc>
@@ -10829,6 +11474,7 @@
               </w:rPr>
               <w:t>${</w:t>
             </w:r>
+            <w:proofErr w:type="spellStart"/>
             <w:r>
               <w:rPr>
                 <w:rFonts w:ascii="Times New Roman" w:hAnsi="Times New Roman" w:cs="Times New Roman"/>
@@ -10837,6 +11483,7 @@
               </w:rPr>
               <w:t>t_i_am</w:t>
             </w:r>
+            <w:proofErr w:type="spellEnd"/>
             <w:r>
               <w:rPr>
                 <w:rFonts w:ascii="Times New Roman" w:hAnsi="Times New Roman" w:cs="Times New Roman"/>
@@ -10867,6 +11514,7 @@
           <w:szCs w:val="22"/>
         </w:rPr>
       </w:pPr>
+      <w:proofErr w:type="spellStart"/>
       <w:r>
         <w:rPr>
           <w:sz w:val="18"/>
@@ -10879,15 +11527,121 @@
           <w:sz w:val="18"/>
           <w:szCs w:val="22"/>
         </w:rPr>
-        <w:t>ը խարտելու և թթվային թեստի եղանակով ստուգեց</w:t>
-      </w:r>
+        <w:t>ը</w:t>
+      </w:r>
+      <w:proofErr w:type="spellEnd"/>
       <w:r>
         <w:rPr>
           <w:sz w:val="18"/>
           <w:szCs w:val="22"/>
         </w:rPr>
-        <w:t xml:space="preserve"> Ոսկյա իրերը</w:t>
-      </w:r>
+        <w:t xml:space="preserve"> </w:t>
+      </w:r>
+      <w:proofErr w:type="spellStart"/>
+      <w:r>
+        <w:rPr>
+          <w:sz w:val="18"/>
+          <w:szCs w:val="22"/>
+        </w:rPr>
+        <w:t>խարտելու</w:t>
+      </w:r>
+      <w:proofErr w:type="spellEnd"/>
+      <w:r>
+        <w:rPr>
+          <w:sz w:val="18"/>
+          <w:szCs w:val="22"/>
+        </w:rPr>
+        <w:t xml:space="preserve"> և </w:t>
+      </w:r>
+      <w:proofErr w:type="spellStart"/>
+      <w:r>
+        <w:rPr>
+          <w:sz w:val="18"/>
+          <w:szCs w:val="22"/>
+        </w:rPr>
+        <w:t>թթվային</w:t>
+      </w:r>
+      <w:proofErr w:type="spellEnd"/>
+      <w:r>
+        <w:rPr>
+          <w:sz w:val="18"/>
+          <w:szCs w:val="22"/>
+        </w:rPr>
+        <w:t xml:space="preserve"> </w:t>
+      </w:r>
+      <w:proofErr w:type="spellStart"/>
+      <w:r>
+        <w:rPr>
+          <w:sz w:val="18"/>
+          <w:szCs w:val="22"/>
+        </w:rPr>
+        <w:t>թեստի</w:t>
+      </w:r>
+      <w:proofErr w:type="spellEnd"/>
+      <w:r>
+        <w:rPr>
+          <w:sz w:val="18"/>
+          <w:szCs w:val="22"/>
+        </w:rPr>
+        <w:t xml:space="preserve"> </w:t>
+      </w:r>
+      <w:proofErr w:type="spellStart"/>
+      <w:r>
+        <w:rPr>
+          <w:sz w:val="18"/>
+          <w:szCs w:val="22"/>
+        </w:rPr>
+        <w:t>եղանակով</w:t>
+      </w:r>
+      <w:proofErr w:type="spellEnd"/>
+      <w:r>
+        <w:rPr>
+          <w:sz w:val="18"/>
+          <w:szCs w:val="22"/>
+        </w:rPr>
+        <w:t xml:space="preserve"> </w:t>
+      </w:r>
+      <w:proofErr w:type="spellStart"/>
+      <w:r>
+        <w:rPr>
+          <w:sz w:val="18"/>
+          <w:szCs w:val="22"/>
+        </w:rPr>
+        <w:t>ստուգեց</w:t>
+      </w:r>
+      <w:proofErr w:type="spellEnd"/>
+      <w:r>
+        <w:rPr>
+          <w:sz w:val="18"/>
+          <w:szCs w:val="22"/>
+        </w:rPr>
+        <w:t xml:space="preserve"> </w:t>
+      </w:r>
+      <w:proofErr w:type="spellStart"/>
+      <w:r>
+        <w:rPr>
+          <w:sz w:val="18"/>
+          <w:szCs w:val="22"/>
+        </w:rPr>
+        <w:t>Ոսկյա</w:t>
+      </w:r>
+      <w:proofErr w:type="spellEnd"/>
+      <w:r>
+        <w:rPr>
+          <w:sz w:val="18"/>
+          <w:szCs w:val="22"/>
+        </w:rPr>
+        <w:t xml:space="preserve"> </w:t>
+      </w:r>
+      <w:proofErr w:type="spellStart"/>
+      <w:r>
+        <w:rPr>
+          <w:sz w:val="18"/>
+          <w:szCs w:val="22"/>
+        </w:rPr>
+        <w:t>իրերը</w:t>
+      </w:r>
+      <w:proofErr w:type="spellEnd"/>
       <w:r>
         <w:rPr>
           <w:sz w:val="18"/>
@@ -10905,21 +11659,58 @@
           <w:szCs w:val="22"/>
         </w:rPr>
       </w:pPr>
+      <w:proofErr w:type="spellStart"/>
       <w:r>
         <w:rPr>
           <w:sz w:val="18"/>
           <w:szCs w:val="22"/>
         </w:rPr>
-        <w:t>Պայմանագրով Գրավատուն</w:t>
-      </w:r>
+        <w:t>Պայմանագրով</w:t>
+      </w:r>
+      <w:proofErr w:type="spellEnd"/>
+      <w:r>
+        <w:rPr>
+          <w:sz w:val="18"/>
+          <w:szCs w:val="22"/>
+        </w:rPr>
+        <w:t xml:space="preserve"> </w:t>
+      </w:r>
+      <w:proofErr w:type="spellStart"/>
+      <w:r>
+        <w:rPr>
+          <w:sz w:val="18"/>
+          <w:szCs w:val="22"/>
+        </w:rPr>
+        <w:t>Գրավատուն</w:t>
+      </w:r>
+      <w:proofErr w:type="spellEnd"/>
       <w:r>
         <w:rPr>
           <w:sz w:val="18"/>
           <w:szCs w:val="22"/>
           <w:lang w:val="en-GB"/>
         </w:rPr>
-        <w:t xml:space="preserve"> (այսուհետ՝ </w:t>
-      </w:r>
+        <w:t xml:space="preserve"> (</w:t>
+      </w:r>
+      <w:proofErr w:type="spellStart"/>
+      <w:r>
+        <w:rPr>
+          <w:sz w:val="18"/>
+          <w:szCs w:val="22"/>
+          <w:lang w:val="en-GB"/>
+        </w:rPr>
+        <w:t>այսուհետ</w:t>
+      </w:r>
+      <w:proofErr w:type="spellEnd"/>
+      <w:r>
+        <w:rPr>
+          <w:sz w:val="18"/>
+          <w:szCs w:val="22"/>
+          <w:lang w:val="en-GB"/>
+        </w:rPr>
+        <w:t xml:space="preserve">՝ </w:t>
+      </w:r>
+      <w:proofErr w:type="spellStart"/>
       <w:r>
         <w:rPr>
           <w:b/>
@@ -10929,12 +11720,173 @@
         </w:rPr>
         <w:t>Հանձնող</w:t>
       </w:r>
+      <w:proofErr w:type="spellEnd"/>
       <w:r>
         <w:rPr>
           <w:sz w:val="18"/>
           <w:szCs w:val="22"/>
         </w:rPr>
-        <w:t>) հանձնեց, իսկ Գրավառուն ընդունեց վերը նշված աղյուսակում թվարկված ոսկյա իրերը։</w:t>
+        <w:t xml:space="preserve">) </w:t>
+      </w:r>
+      <w:proofErr w:type="spellStart"/>
+      <w:r>
+        <w:rPr>
+          <w:sz w:val="18"/>
+          <w:szCs w:val="22"/>
+        </w:rPr>
+        <w:t>հանձնեց</w:t>
+      </w:r>
+      <w:proofErr w:type="spellEnd"/>
+      <w:r>
+        <w:rPr>
+          <w:sz w:val="18"/>
+          <w:szCs w:val="22"/>
+        </w:rPr>
+        <w:t xml:space="preserve">, </w:t>
+      </w:r>
+      <w:proofErr w:type="spellStart"/>
+      <w:r>
+        <w:rPr>
+          <w:sz w:val="18"/>
+          <w:szCs w:val="22"/>
+        </w:rPr>
+        <w:t>իսկ</w:t>
+      </w:r>
+      <w:proofErr w:type="spellEnd"/>
+      <w:r>
+        <w:rPr>
+          <w:sz w:val="18"/>
+          <w:szCs w:val="22"/>
+        </w:rPr>
+        <w:t xml:space="preserve"> </w:t>
+      </w:r>
+      <w:proofErr w:type="spellStart"/>
+      <w:r>
+        <w:rPr>
+          <w:sz w:val="18"/>
+          <w:szCs w:val="22"/>
+        </w:rPr>
+        <w:t>Գրավառուն</w:t>
+      </w:r>
+      <w:proofErr w:type="spellEnd"/>
+      <w:r>
+        <w:rPr>
+          <w:sz w:val="18"/>
+          <w:szCs w:val="22"/>
+        </w:rPr>
+        <w:t xml:space="preserve"> </w:t>
+      </w:r>
+      <w:proofErr w:type="spellStart"/>
+      <w:r>
+        <w:rPr>
+          <w:sz w:val="18"/>
+          <w:szCs w:val="22"/>
+        </w:rPr>
+        <w:t>ընդունեց</w:t>
+      </w:r>
+      <w:proofErr w:type="spellEnd"/>
+      <w:r>
+        <w:rPr>
+          <w:sz w:val="18"/>
+          <w:szCs w:val="22"/>
+        </w:rPr>
+        <w:t xml:space="preserve"> </w:t>
+      </w:r>
+      <w:proofErr w:type="spellStart"/>
+      <w:r>
+        <w:rPr>
+          <w:sz w:val="18"/>
+          <w:szCs w:val="22"/>
+        </w:rPr>
+        <w:t>վերը</w:t>
+      </w:r>
+      <w:proofErr w:type="spellEnd"/>
+      <w:r>
+        <w:rPr>
+          <w:sz w:val="18"/>
+          <w:szCs w:val="22"/>
+        </w:rPr>
+        <w:t xml:space="preserve"> </w:t>
+      </w:r>
+      <w:proofErr w:type="spellStart"/>
+      <w:r>
+        <w:rPr>
+          <w:sz w:val="18"/>
+          <w:szCs w:val="22"/>
+        </w:rPr>
+        <w:t>նշված</w:t>
+      </w:r>
+      <w:proofErr w:type="spellEnd"/>
+      <w:r>
+        <w:rPr>
+          <w:sz w:val="18"/>
+          <w:szCs w:val="22"/>
+        </w:rPr>
+        <w:t xml:space="preserve"> </w:t>
+      </w:r>
+      <w:proofErr w:type="spellStart"/>
+      <w:r>
+        <w:rPr>
+          <w:sz w:val="18"/>
+          <w:szCs w:val="22"/>
+        </w:rPr>
+        <w:t>աղյուսակում</w:t>
+      </w:r>
+      <w:proofErr w:type="spellEnd"/>
+      <w:r>
+        <w:rPr>
+          <w:sz w:val="18"/>
+          <w:szCs w:val="22"/>
+        </w:rPr>
+        <w:t xml:space="preserve"> </w:t>
+      </w:r>
+      <w:proofErr w:type="spellStart"/>
+      <w:r>
+        <w:rPr>
+          <w:sz w:val="18"/>
+          <w:szCs w:val="22"/>
+        </w:rPr>
+        <w:t>թվարկված</w:t>
+      </w:r>
+      <w:proofErr w:type="spellEnd"/>
+      <w:r>
+        <w:rPr>
+          <w:sz w:val="18"/>
+          <w:szCs w:val="22"/>
+        </w:rPr>
+        <w:t xml:space="preserve"> </w:t>
+      </w:r>
+      <w:proofErr w:type="spellStart"/>
+      <w:r>
+        <w:rPr>
+          <w:sz w:val="18"/>
+          <w:szCs w:val="22"/>
+        </w:rPr>
+        <w:t>ոսկյա</w:t>
+      </w:r>
+      <w:proofErr w:type="spellEnd"/>
+      <w:r>
+        <w:rPr>
+          <w:sz w:val="18"/>
+          <w:szCs w:val="22"/>
+        </w:rPr>
+        <w:t xml:space="preserve"> </w:t>
+      </w:r>
+      <w:proofErr w:type="spellStart"/>
+      <w:r>
+        <w:rPr>
+          <w:sz w:val="18"/>
+          <w:szCs w:val="22"/>
+        </w:rPr>
+        <w:t>իրերը</w:t>
+      </w:r>
+      <w:proofErr w:type="spellEnd"/>
+      <w:r>
+        <w:rPr>
+          <w:sz w:val="18"/>
+          <w:szCs w:val="22"/>
+        </w:rPr>
+        <w:t>։</w:t>
       </w:r>
     </w:p>
     <w:p>
@@ -10946,13 +11898,239 @@
           <w:szCs w:val="22"/>
         </w:rPr>
       </w:pPr>
+      <w:proofErr w:type="spellStart"/>
       <w:r>
         <w:rPr>
           <w:sz w:val="18"/>
           <w:szCs w:val="22"/>
         </w:rPr>
-        <w:t>Հանձնողը հավաստիացնում է, որ գրավի առարկաները ամբողջությամբ սեփականության իրավունքով պատկանում են իրեն, ազատ են այլ անձանց պահանջներից</w:t>
-      </w:r>
+        <w:t>Հանձնողը</w:t>
+      </w:r>
+      <w:proofErr w:type="spellEnd"/>
+      <w:r>
+        <w:rPr>
+          <w:sz w:val="18"/>
+          <w:szCs w:val="22"/>
+        </w:rPr>
+        <w:t xml:space="preserve"> </w:t>
+      </w:r>
+      <w:proofErr w:type="spellStart"/>
+      <w:r>
+        <w:rPr>
+          <w:sz w:val="18"/>
+          <w:szCs w:val="22"/>
+        </w:rPr>
+        <w:t>հավաստիացնում</w:t>
+      </w:r>
+      <w:proofErr w:type="spellEnd"/>
+      <w:r>
+        <w:rPr>
+          <w:sz w:val="18"/>
+          <w:szCs w:val="22"/>
+        </w:rPr>
+        <w:t xml:space="preserve"> է, </w:t>
+      </w:r>
+      <w:proofErr w:type="spellStart"/>
+      <w:r>
+        <w:rPr>
+          <w:sz w:val="18"/>
+          <w:szCs w:val="22"/>
+        </w:rPr>
+        <w:t>որ</w:t>
+      </w:r>
+      <w:proofErr w:type="spellEnd"/>
+      <w:r>
+        <w:rPr>
+          <w:sz w:val="18"/>
+          <w:szCs w:val="22"/>
+        </w:rPr>
+        <w:t xml:space="preserve"> </w:t>
+      </w:r>
+      <w:proofErr w:type="spellStart"/>
+      <w:r>
+        <w:rPr>
+          <w:sz w:val="18"/>
+          <w:szCs w:val="22"/>
+        </w:rPr>
+        <w:t>գրավի</w:t>
+      </w:r>
+      <w:proofErr w:type="spellEnd"/>
+      <w:r>
+        <w:rPr>
+          <w:sz w:val="18"/>
+          <w:szCs w:val="22"/>
+        </w:rPr>
+        <w:t xml:space="preserve"> </w:t>
+      </w:r>
+      <w:proofErr w:type="spellStart"/>
+      <w:r>
+        <w:rPr>
+          <w:sz w:val="18"/>
+          <w:szCs w:val="22"/>
+        </w:rPr>
+        <w:t>առարկաները</w:t>
+      </w:r>
+      <w:proofErr w:type="spellEnd"/>
+      <w:r>
+        <w:rPr>
+          <w:sz w:val="18"/>
+          <w:szCs w:val="22"/>
+        </w:rPr>
+        <w:t xml:space="preserve"> ամբողջությամբ </w:t>
+      </w:r>
+      <w:proofErr w:type="spellStart"/>
+      <w:r>
+        <w:rPr>
+          <w:sz w:val="18"/>
+          <w:szCs w:val="22"/>
+        </w:rPr>
+        <w:t>սեփականության</w:t>
+      </w:r>
+      <w:proofErr w:type="spellEnd"/>
+      <w:r>
+        <w:rPr>
+          <w:sz w:val="18"/>
+          <w:szCs w:val="22"/>
+        </w:rPr>
+        <w:t xml:space="preserve"> </w:t>
+      </w:r>
+      <w:proofErr w:type="spellStart"/>
+      <w:r>
+        <w:rPr>
+          <w:sz w:val="18"/>
+          <w:szCs w:val="22"/>
+        </w:rPr>
+        <w:t>իրավունքով</w:t>
+      </w:r>
+      <w:proofErr w:type="spellEnd"/>
+      <w:r>
+        <w:rPr>
+          <w:sz w:val="18"/>
+          <w:szCs w:val="22"/>
+        </w:rPr>
+        <w:t xml:space="preserve"> </w:t>
+      </w:r>
+      <w:proofErr w:type="spellStart"/>
+      <w:r>
+        <w:rPr>
+          <w:sz w:val="18"/>
+          <w:szCs w:val="22"/>
+        </w:rPr>
+        <w:t>պատկանում</w:t>
+      </w:r>
+      <w:proofErr w:type="spellEnd"/>
+      <w:r>
+        <w:rPr>
+          <w:sz w:val="18"/>
+          <w:szCs w:val="22"/>
+        </w:rPr>
+        <w:t xml:space="preserve"> </w:t>
+      </w:r>
+      <w:proofErr w:type="spellStart"/>
+      <w:r>
+        <w:rPr>
+          <w:sz w:val="18"/>
+          <w:szCs w:val="22"/>
+        </w:rPr>
+        <w:t>են</w:t>
+      </w:r>
+      <w:proofErr w:type="spellEnd"/>
+      <w:r>
+        <w:rPr>
+          <w:sz w:val="18"/>
+          <w:szCs w:val="22"/>
+        </w:rPr>
+        <w:t xml:space="preserve"> </w:t>
+      </w:r>
+      <w:proofErr w:type="spellStart"/>
+      <w:r>
+        <w:rPr>
+          <w:sz w:val="18"/>
+          <w:szCs w:val="22"/>
+        </w:rPr>
+        <w:t>իրեն</w:t>
+      </w:r>
+      <w:proofErr w:type="spellEnd"/>
+      <w:r>
+        <w:rPr>
+          <w:sz w:val="18"/>
+          <w:szCs w:val="22"/>
+        </w:rPr>
+        <w:t xml:space="preserve">, </w:t>
+      </w:r>
+      <w:proofErr w:type="spellStart"/>
+      <w:r>
+        <w:rPr>
+          <w:sz w:val="18"/>
+          <w:szCs w:val="22"/>
+        </w:rPr>
+        <w:t>ազատ</w:t>
+      </w:r>
+      <w:proofErr w:type="spellEnd"/>
+      <w:r>
+        <w:rPr>
+          <w:sz w:val="18"/>
+          <w:szCs w:val="22"/>
+        </w:rPr>
+        <w:t xml:space="preserve"> </w:t>
+      </w:r>
+      <w:proofErr w:type="spellStart"/>
+      <w:r>
+        <w:rPr>
+          <w:sz w:val="18"/>
+          <w:szCs w:val="22"/>
+        </w:rPr>
+        <w:t>են</w:t>
+      </w:r>
+      <w:proofErr w:type="spellEnd"/>
+      <w:r>
+        <w:rPr>
+          <w:sz w:val="18"/>
+          <w:szCs w:val="22"/>
+        </w:rPr>
+        <w:t xml:space="preserve"> </w:t>
+      </w:r>
+      <w:proofErr w:type="spellStart"/>
+      <w:r>
+        <w:rPr>
+          <w:sz w:val="18"/>
+          <w:szCs w:val="22"/>
+        </w:rPr>
+        <w:t>այլ</w:t>
+      </w:r>
+      <w:proofErr w:type="spellEnd"/>
+      <w:r>
+        <w:rPr>
+          <w:sz w:val="18"/>
+          <w:szCs w:val="22"/>
+        </w:rPr>
+        <w:t xml:space="preserve"> </w:t>
+      </w:r>
+      <w:proofErr w:type="spellStart"/>
+      <w:r>
+        <w:rPr>
+          <w:sz w:val="18"/>
+          <w:szCs w:val="22"/>
+        </w:rPr>
+        <w:t>անձանց</w:t>
+      </w:r>
+      <w:proofErr w:type="spellEnd"/>
+      <w:r>
+        <w:rPr>
+          <w:sz w:val="18"/>
+          <w:szCs w:val="22"/>
+        </w:rPr>
+        <w:t xml:space="preserve"> </w:t>
+      </w:r>
+      <w:proofErr w:type="spellStart"/>
+      <w:r>
+        <w:rPr>
+          <w:sz w:val="18"/>
+          <w:szCs w:val="22"/>
+        </w:rPr>
+        <w:t>պահանջներից</w:t>
+      </w:r>
+      <w:proofErr w:type="spellEnd"/>
       <w:r>
         <w:rPr>
           <w:sz w:val="18"/>
@@ -11007,13 +12185,23 @@
                 <w:szCs w:val="18"/>
               </w:rPr>
             </w:pPr>
-            <w:r>
-              <w:rPr>
-                <w:rFonts w:ascii="Times New Roman" w:hAnsi="Times New Roman" w:cs="Times New Roman"/>
-                <w:sz w:val="18"/>
-                <w:szCs w:val="18"/>
-              </w:rPr>
-              <w:t>Ընդունեցին՝</w:t>
+            <w:proofErr w:type="spellStart"/>
+            <w:r>
+              <w:rPr>
+                <w:rFonts w:ascii="Times New Roman" w:hAnsi="Times New Roman" w:cs="Times New Roman"/>
+                <w:sz w:val="18"/>
+                <w:szCs w:val="18"/>
+              </w:rPr>
+              <w:t>Ընդունեցին</w:t>
+            </w:r>
+            <w:proofErr w:type="spellEnd"/>
+            <w:r>
+              <w:rPr>
+                <w:rFonts w:ascii="Times New Roman" w:hAnsi="Times New Roman" w:cs="Times New Roman"/>
+                <w:sz w:val="18"/>
+                <w:szCs w:val="18"/>
+              </w:rPr>
+              <w:t>՝</w:t>
             </w:r>
           </w:p>
         </w:tc>
@@ -11031,13 +12219,23 @@
                 <w:szCs w:val="18"/>
               </w:rPr>
             </w:pPr>
-            <w:r>
-              <w:rPr>
-                <w:rFonts w:ascii="Times New Roman" w:hAnsi="Times New Roman" w:cs="Times New Roman"/>
-                <w:sz w:val="18"/>
-                <w:szCs w:val="18"/>
-              </w:rPr>
-              <w:t xml:space="preserve">Հանձնեց՝      </w:t>
+            <w:proofErr w:type="spellStart"/>
+            <w:r>
+              <w:rPr>
+                <w:rFonts w:ascii="Times New Roman" w:hAnsi="Times New Roman" w:cs="Times New Roman"/>
+                <w:sz w:val="18"/>
+                <w:szCs w:val="18"/>
+              </w:rPr>
+              <w:t>Հանձնեց</w:t>
+            </w:r>
+            <w:proofErr w:type="spellEnd"/>
+            <w:r>
+              <w:rPr>
+                <w:rFonts w:ascii="Times New Roman" w:hAnsi="Times New Roman" w:cs="Times New Roman"/>
+                <w:sz w:val="18"/>
+                <w:szCs w:val="18"/>
+              </w:rPr>
+              <w:t xml:space="preserve">՝      </w:t>
             </w:r>
           </w:p>
         </w:tc>
@@ -11056,14 +12254,34 @@
                 <w:szCs w:val="18"/>
               </w:rPr>
             </w:pPr>
-            <w:r>
-              <w:rPr>
-                <w:rFonts w:ascii="Times New Roman" w:hAnsi="Times New Roman" w:cs="Times New Roman"/>
-                <w:sz w:val="18"/>
-                <w:szCs w:val="18"/>
-              </w:rPr>
-              <w:t>Գլխավոր տնօրեն</w:t>
-            </w:r>
+            <w:proofErr w:type="spellStart"/>
+            <w:r>
+              <w:rPr>
+                <w:rFonts w:ascii="Times New Roman" w:hAnsi="Times New Roman" w:cs="Times New Roman"/>
+                <w:sz w:val="18"/>
+                <w:szCs w:val="18"/>
+              </w:rPr>
+              <w:t>Գլխավոր</w:t>
+            </w:r>
+            <w:proofErr w:type="spellEnd"/>
+            <w:r>
+              <w:rPr>
+                <w:rFonts w:ascii="Times New Roman" w:hAnsi="Times New Roman" w:cs="Times New Roman"/>
+                <w:sz w:val="18"/>
+                <w:szCs w:val="18"/>
+              </w:rPr>
+              <w:t xml:space="preserve"> </w:t>
+            </w:r>
+            <w:proofErr w:type="spellStart"/>
+            <w:r>
+              <w:rPr>
+                <w:rFonts w:ascii="Times New Roman" w:hAnsi="Times New Roman" w:cs="Times New Roman"/>
+                <w:sz w:val="18"/>
+                <w:szCs w:val="18"/>
+              </w:rPr>
+              <w:t>տնօրեն</w:t>
+            </w:r>
+            <w:proofErr w:type="spellEnd"/>
           </w:p>
         </w:tc>
         <w:tc>
@@ -11095,14 +12313,34 @@
                 <w:szCs w:val="18"/>
               </w:rPr>
             </w:pPr>
-            <w:r>
-              <w:rPr>
-                <w:rFonts w:ascii="Times New Roman" w:hAnsi="Times New Roman" w:cs="Times New Roman"/>
-                <w:sz w:val="18"/>
-                <w:szCs w:val="18"/>
-              </w:rPr>
-              <w:t>Գրիգոր Սահականը</w:t>
-            </w:r>
+            <w:proofErr w:type="spellStart"/>
+            <w:r>
+              <w:rPr>
+                <w:rFonts w:ascii="Times New Roman" w:hAnsi="Times New Roman" w:cs="Times New Roman"/>
+                <w:sz w:val="18"/>
+                <w:szCs w:val="18"/>
+              </w:rPr>
+              <w:t>Գրիգոր</w:t>
+            </w:r>
+            <w:proofErr w:type="spellEnd"/>
+            <w:r>
+              <w:rPr>
+                <w:rFonts w:ascii="Times New Roman" w:hAnsi="Times New Roman" w:cs="Times New Roman"/>
+                <w:sz w:val="18"/>
+                <w:szCs w:val="18"/>
+              </w:rPr>
+              <w:t xml:space="preserve"> </w:t>
+            </w:r>
+            <w:proofErr w:type="spellStart"/>
+            <w:r>
+              <w:rPr>
+                <w:rFonts w:ascii="Times New Roman" w:hAnsi="Times New Roman" w:cs="Times New Roman"/>
+                <w:sz w:val="18"/>
+                <w:szCs w:val="18"/>
+              </w:rPr>
+              <w:t>Սահականը</w:t>
+            </w:r>
+            <w:proofErr w:type="spellEnd"/>
           </w:p>
         </w:tc>
         <w:tc>
@@ -11118,6 +12356,7 @@
                 <w:szCs w:val="18"/>
               </w:rPr>
             </w:pPr>
+            <w:proofErr w:type="spellStart"/>
             <w:r>
               <w:rPr>
                 <w:rFonts w:ascii="Times New Roman" w:hAnsi="Times New Roman" w:cs="Times New Roman"/>
@@ -11126,6 +12365,7 @@
               </w:rPr>
               <w:t>Գրավատու</w:t>
             </w:r>
+            <w:proofErr w:type="spellEnd"/>
           </w:p>
         </w:tc>
         <w:tc>
@@ -11161,12 +12401,13 @@
             </w:pPr>
             <w:r>
               <w:rPr>
-                <w:rFonts w:ascii="Times New Roman" w:hAnsi="Times New Roman" w:cs="Times New Roman"/>
-                <w:sz w:val="18"/>
-                <w:szCs w:val="18"/>
-                <w:lang w:val="hy-AM"/>
-              </w:rPr>
-              <w:t>${user_name}</w:t>
+                <w:rFonts w:ascii="Times New Roman" w:eastAsia="Times New Roman" w:hAnsi="Times New Roman" w:cs="Times New Roman"/>
+                <w:color w:val="000000" w:themeColor="text1"/>
+                <w:sz w:val="18"/>
+                <w:szCs w:val="18"/>
+                <w:lang w:val="hy-AM"/>
+              </w:rPr>
+              <w:t>${client}</w:t>
             </w:r>
           </w:p>
         </w:tc>
@@ -11205,6 +12446,7 @@
                 <w:szCs w:val="18"/>
               </w:rPr>
             </w:pPr>
+            <w:proofErr w:type="spellStart"/>
             <w:r>
               <w:rPr>
                 <w:rFonts w:ascii="Times New Roman" w:hAnsi="Times New Roman" w:cs="Times New Roman"/>
@@ -11213,6 +12455,7 @@
               </w:rPr>
               <w:t>Ոսկերիչ-մասնագետ</w:t>
             </w:r>
+            <w:proofErr w:type="spellEnd"/>
           </w:p>
         </w:tc>
         <w:tc>
@@ -11392,7 +12635,7 @@
               </wp:anchor>
             </w:drawing>
           </mc:Choice>
-          <mc:Fallback xmlns:w16du="http://schemas.microsoft.com/office/word/2023/wordml/word16du" xmlns:w16sdtfl="http://schemas.microsoft.com/office/word/2024/wordml/sdtformatlock">
+          <mc:Fallback xmlns:w16sdtfl="http://schemas.microsoft.com/office/word/2024/wordml/sdtformatlock" xmlns:w16du="http://schemas.microsoft.com/office/word/2023/wordml/word16du" xmlns="">
             <w:pict>
               <v:line w14:anchorId="6A9B0DF6" id="Straight Connector 2" o:spid="_x0000_s1026" style="position:absolute;z-index:251659264;visibility:visible;mso-wrap-style:square;mso-wrap-distance-left:9pt;mso-wrap-distance-top:0;mso-wrap-distance-right:9pt;mso-wrap-distance-bottom:0;mso-position-horizontal:absolute;mso-position-horizontal-relative:text;mso-position-vertical:absolute;mso-position-vertical-relative:text" from="-2.8pt,12.7pt" to="488.9pt,12.7pt" o:gfxdata="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" strokecolor="black [3213]" strokeweight="1.25pt">
                 <v:stroke linestyle="thinThick" joinstyle="miter"/>
@@ -11416,6 +12659,7 @@
           <w:lang w:val="en-GB"/>
         </w:rPr>
       </w:pPr>
+      <w:proofErr w:type="spellStart"/>
       <w:r>
         <w:rPr>
           <w:rFonts w:ascii="Times New Roman" w:hAnsi="Times New Roman" w:cs="Times New Roman"/>
@@ -11427,8 +12671,9 @@
           <w:szCs w:val="18"/>
           <w:lang w:val="en-GB"/>
         </w:rPr>
-        <w:t>Ոսկյա իրերի պարկի բացման և ս</w:t>
-      </w:r>
+        <w:t>Ոսկյա</w:t>
+      </w:r>
+      <w:proofErr w:type="spellEnd"/>
       <w:r>
         <w:rPr>
           <w:rFonts w:ascii="Times New Roman" w:hAnsi="Times New Roman" w:cs="Times New Roman"/>
@@ -11440,7 +12685,160 @@
           <w:szCs w:val="18"/>
           <w:lang w:val="en-GB"/>
         </w:rPr>
-        <w:t xml:space="preserve">տուգման արձանագրություն </w:t>
+        <w:t xml:space="preserve"> </w:t>
+      </w:r>
+      <w:proofErr w:type="spellStart"/>
+      <w:r>
+        <w:rPr>
+          <w:rFonts w:ascii="Times New Roman" w:hAnsi="Times New Roman" w:cs="Times New Roman"/>
+          <w:b/>
+          <w:bCs/>
+          <w:i/>
+          <w:iCs/>
+          <w:sz w:val="18"/>
+          <w:szCs w:val="18"/>
+          <w:lang w:val="en-GB"/>
+        </w:rPr>
+        <w:t>իրերի</w:t>
+      </w:r>
+      <w:proofErr w:type="spellEnd"/>
+      <w:r>
+        <w:rPr>
+          <w:rFonts w:ascii="Times New Roman" w:hAnsi="Times New Roman" w:cs="Times New Roman"/>
+          <w:b/>
+          <w:bCs/>
+          <w:i/>
+          <w:iCs/>
+          <w:sz w:val="18"/>
+          <w:szCs w:val="18"/>
+          <w:lang w:val="en-GB"/>
+        </w:rPr>
+        <w:t xml:space="preserve"> </w:t>
+      </w:r>
+      <w:proofErr w:type="spellStart"/>
+      <w:r>
+        <w:rPr>
+          <w:rFonts w:ascii="Times New Roman" w:hAnsi="Times New Roman" w:cs="Times New Roman"/>
+          <w:b/>
+          <w:bCs/>
+          <w:i/>
+          <w:iCs/>
+          <w:sz w:val="18"/>
+          <w:szCs w:val="18"/>
+          <w:lang w:val="en-GB"/>
+        </w:rPr>
+        <w:t>պարկի</w:t>
+      </w:r>
+      <w:proofErr w:type="spellEnd"/>
+      <w:r>
+        <w:rPr>
+          <w:rFonts w:ascii="Times New Roman" w:hAnsi="Times New Roman" w:cs="Times New Roman"/>
+          <w:b/>
+          <w:bCs/>
+          <w:i/>
+          <w:iCs/>
+          <w:sz w:val="18"/>
+          <w:szCs w:val="18"/>
+          <w:lang w:val="en-GB"/>
+        </w:rPr>
+        <w:t xml:space="preserve"> </w:t>
+      </w:r>
+      <w:proofErr w:type="spellStart"/>
+      <w:r>
+        <w:rPr>
+          <w:rFonts w:ascii="Times New Roman" w:hAnsi="Times New Roman" w:cs="Times New Roman"/>
+          <w:b/>
+          <w:bCs/>
+          <w:i/>
+          <w:iCs/>
+          <w:sz w:val="18"/>
+          <w:szCs w:val="18"/>
+          <w:lang w:val="en-GB"/>
+        </w:rPr>
+        <w:t>բացման</w:t>
+      </w:r>
+      <w:proofErr w:type="spellEnd"/>
+      <w:r>
+        <w:rPr>
+          <w:rFonts w:ascii="Times New Roman" w:hAnsi="Times New Roman" w:cs="Times New Roman"/>
+          <w:b/>
+          <w:bCs/>
+          <w:i/>
+          <w:iCs/>
+          <w:sz w:val="18"/>
+          <w:szCs w:val="18"/>
+          <w:lang w:val="en-GB"/>
+        </w:rPr>
+        <w:t xml:space="preserve"> և </w:t>
+      </w:r>
+      <w:proofErr w:type="spellStart"/>
+      <w:r>
+        <w:rPr>
+          <w:rFonts w:ascii="Times New Roman" w:hAnsi="Times New Roman" w:cs="Times New Roman"/>
+          <w:b/>
+          <w:bCs/>
+          <w:i/>
+          <w:iCs/>
+          <w:sz w:val="18"/>
+          <w:szCs w:val="18"/>
+          <w:lang w:val="en-GB"/>
+        </w:rPr>
+        <w:t>ս</w:t>
+      </w:r>
+      <w:r>
+        <w:rPr>
+          <w:rFonts w:ascii="Times New Roman" w:hAnsi="Times New Roman" w:cs="Times New Roman"/>
+          <w:b/>
+          <w:bCs/>
+          <w:i/>
+          <w:iCs/>
+          <w:sz w:val="18"/>
+          <w:szCs w:val="18"/>
+          <w:lang w:val="en-GB"/>
+        </w:rPr>
+        <w:t>տուգման</w:t>
+      </w:r>
+      <w:proofErr w:type="spellEnd"/>
+      <w:r>
+        <w:rPr>
+          <w:rFonts w:ascii="Times New Roman" w:hAnsi="Times New Roman" w:cs="Times New Roman"/>
+          <w:b/>
+          <w:bCs/>
+          <w:i/>
+          <w:iCs/>
+          <w:sz w:val="18"/>
+          <w:szCs w:val="18"/>
+          <w:lang w:val="en-GB"/>
+        </w:rPr>
+        <w:t xml:space="preserve"> </w:t>
+      </w:r>
+      <w:proofErr w:type="spellStart"/>
+      <w:r>
+        <w:rPr>
+          <w:rFonts w:ascii="Times New Roman" w:hAnsi="Times New Roman" w:cs="Times New Roman"/>
+          <w:b/>
+          <w:bCs/>
+          <w:i/>
+          <w:iCs/>
+          <w:sz w:val="18"/>
+          <w:szCs w:val="18"/>
+          <w:lang w:val="en-GB"/>
+        </w:rPr>
+        <w:t>արձանագրություն</w:t>
+      </w:r>
+      <w:proofErr w:type="spellEnd"/>
+      <w:r>
+        <w:rPr>
+          <w:rFonts w:ascii="Times New Roman" w:hAnsi="Times New Roman" w:cs="Times New Roman"/>
+          <w:b/>
+          <w:bCs/>
+          <w:i/>
+          <w:iCs/>
+          <w:sz w:val="18"/>
+          <w:szCs w:val="18"/>
+          <w:lang w:val="en-GB"/>
+        </w:rPr>
+        <w:t xml:space="preserve"> </w:t>
       </w:r>
     </w:p>
     <w:p>
@@ -11453,13 +12851,95 @@
           <w:lang w:val="en-GB"/>
         </w:rPr>
       </w:pPr>
-      <w:r>
-        <w:rPr>
-          <w:rFonts w:ascii="Times New Roman" w:hAnsi="Times New Roman" w:cs="Times New Roman"/>
-          <w:sz w:val="18"/>
-          <w:szCs w:val="18"/>
-        </w:rPr>
-        <w:t>Ստուգման նպատակով պարկի բացման ամսաթիվը    __</w:t>
+      <w:proofErr w:type="spellStart"/>
+      <w:r>
+        <w:rPr>
+          <w:rFonts w:ascii="Times New Roman" w:hAnsi="Times New Roman" w:cs="Times New Roman"/>
+          <w:sz w:val="18"/>
+          <w:szCs w:val="18"/>
+        </w:rPr>
+        <w:t>Ստուգման</w:t>
+      </w:r>
+      <w:proofErr w:type="spellEnd"/>
+      <w:r>
+        <w:rPr>
+          <w:rFonts w:ascii="Times New Roman" w:hAnsi="Times New Roman" w:cs="Times New Roman"/>
+          <w:sz w:val="18"/>
+          <w:szCs w:val="18"/>
+        </w:rPr>
+        <w:t xml:space="preserve"> </w:t>
+      </w:r>
+      <w:proofErr w:type="spellStart"/>
+      <w:r>
+        <w:rPr>
+          <w:rFonts w:ascii="Times New Roman" w:hAnsi="Times New Roman" w:cs="Times New Roman"/>
+          <w:sz w:val="18"/>
+          <w:szCs w:val="18"/>
+        </w:rPr>
+        <w:t>նպատակով</w:t>
+      </w:r>
+      <w:proofErr w:type="spellEnd"/>
+      <w:r>
+        <w:rPr>
+          <w:rFonts w:ascii="Times New Roman" w:hAnsi="Times New Roman" w:cs="Times New Roman"/>
+          <w:sz w:val="18"/>
+          <w:szCs w:val="18"/>
+        </w:rPr>
+        <w:t xml:space="preserve"> </w:t>
+      </w:r>
+      <w:proofErr w:type="spellStart"/>
+      <w:r>
+        <w:rPr>
+          <w:rFonts w:ascii="Times New Roman" w:hAnsi="Times New Roman" w:cs="Times New Roman"/>
+          <w:sz w:val="18"/>
+          <w:szCs w:val="18"/>
+        </w:rPr>
+        <w:t>պարկի</w:t>
+      </w:r>
+      <w:proofErr w:type="spellEnd"/>
+      <w:r>
+        <w:rPr>
+          <w:rFonts w:ascii="Times New Roman" w:hAnsi="Times New Roman" w:cs="Times New Roman"/>
+          <w:sz w:val="18"/>
+          <w:szCs w:val="18"/>
+        </w:rPr>
+        <w:t xml:space="preserve"> </w:t>
+      </w:r>
+      <w:proofErr w:type="spellStart"/>
+      <w:r>
+        <w:rPr>
+          <w:rFonts w:ascii="Times New Roman" w:hAnsi="Times New Roman" w:cs="Times New Roman"/>
+          <w:sz w:val="18"/>
+          <w:szCs w:val="18"/>
+        </w:rPr>
+        <w:t>բացման</w:t>
+      </w:r>
+      <w:proofErr w:type="spellEnd"/>
+      <w:r>
+        <w:rPr>
+          <w:rFonts w:ascii="Times New Roman" w:hAnsi="Times New Roman" w:cs="Times New Roman"/>
+          <w:sz w:val="18"/>
+          <w:szCs w:val="18"/>
+        </w:rPr>
+        <w:t xml:space="preserve"> </w:t>
+      </w:r>
+      <w:proofErr w:type="spellStart"/>
+      <w:r>
+        <w:rPr>
+          <w:rFonts w:ascii="Times New Roman" w:hAnsi="Times New Roman" w:cs="Times New Roman"/>
+          <w:sz w:val="18"/>
+          <w:szCs w:val="18"/>
+        </w:rPr>
+        <w:t>ամսաթիվը</w:t>
+      </w:r>
+      <w:proofErr w:type="spellEnd"/>
+      <w:r>
+        <w:rPr>
+          <w:rFonts w:ascii="Times New Roman" w:hAnsi="Times New Roman" w:cs="Times New Roman"/>
+          <w:sz w:val="18"/>
+          <w:szCs w:val="18"/>
+        </w:rPr>
+        <w:t xml:space="preserve">    __</w:t>
       </w:r>
       <w:r>
         <w:rPr>
@@ -11476,7 +12956,43 @@
           <w:sz w:val="18"/>
           <w:szCs w:val="18"/>
         </w:rPr>
-        <w:t>__/______/__________ թվականին ժամը _</w:t>
+        <w:t xml:space="preserve">__/______/__________ </w:t>
+      </w:r>
+      <w:proofErr w:type="spellStart"/>
+      <w:r>
+        <w:rPr>
+          <w:rFonts w:ascii="Times New Roman" w:hAnsi="Times New Roman" w:cs="Times New Roman"/>
+          <w:sz w:val="18"/>
+          <w:szCs w:val="18"/>
+        </w:rPr>
+        <w:t>թվականին</w:t>
+      </w:r>
+      <w:proofErr w:type="spellEnd"/>
+      <w:r>
+        <w:rPr>
+          <w:rFonts w:ascii="Times New Roman" w:hAnsi="Times New Roman" w:cs="Times New Roman"/>
+          <w:sz w:val="18"/>
+          <w:szCs w:val="18"/>
+        </w:rPr>
+        <w:t xml:space="preserve"> </w:t>
+      </w:r>
+      <w:proofErr w:type="spellStart"/>
+      <w:r>
+        <w:rPr>
+          <w:rFonts w:ascii="Times New Roman" w:hAnsi="Times New Roman" w:cs="Times New Roman"/>
+          <w:sz w:val="18"/>
+          <w:szCs w:val="18"/>
+        </w:rPr>
+        <w:t>ժամը</w:t>
+      </w:r>
+      <w:proofErr w:type="spellEnd"/>
+      <w:r>
+        <w:rPr>
+          <w:rFonts w:ascii="Times New Roman" w:hAnsi="Times New Roman" w:cs="Times New Roman"/>
+          <w:sz w:val="18"/>
+          <w:szCs w:val="18"/>
+        </w:rPr>
+        <w:t xml:space="preserve"> _</w:t>
       </w:r>
       <w:r>
         <w:rPr>
@@ -11554,14 +13070,34 @@
                 <w:szCs w:val="18"/>
               </w:rPr>
             </w:pPr>
-            <w:r>
-              <w:rPr>
-                <w:rFonts w:ascii="Times New Roman" w:hAnsi="Times New Roman" w:cs="Times New Roman"/>
-                <w:sz w:val="18"/>
-                <w:szCs w:val="18"/>
-              </w:rPr>
-              <w:t>Գլխավոր տնօրեն</w:t>
-            </w:r>
+            <w:proofErr w:type="spellStart"/>
+            <w:r>
+              <w:rPr>
+                <w:rFonts w:ascii="Times New Roman" w:hAnsi="Times New Roman" w:cs="Times New Roman"/>
+                <w:sz w:val="18"/>
+                <w:szCs w:val="18"/>
+              </w:rPr>
+              <w:t>Գլխավոր</w:t>
+            </w:r>
+            <w:proofErr w:type="spellEnd"/>
+            <w:r>
+              <w:rPr>
+                <w:rFonts w:ascii="Times New Roman" w:hAnsi="Times New Roman" w:cs="Times New Roman"/>
+                <w:sz w:val="18"/>
+                <w:szCs w:val="18"/>
+              </w:rPr>
+              <w:t xml:space="preserve"> </w:t>
+            </w:r>
+            <w:proofErr w:type="spellStart"/>
+            <w:r>
+              <w:rPr>
+                <w:rFonts w:ascii="Times New Roman" w:hAnsi="Times New Roman" w:cs="Times New Roman"/>
+                <w:sz w:val="18"/>
+                <w:szCs w:val="18"/>
+              </w:rPr>
+              <w:t>տնօրեն</w:t>
+            </w:r>
+            <w:proofErr w:type="spellEnd"/>
           </w:p>
         </w:tc>
         <w:tc>
@@ -11593,14 +13129,34 @@
                 <w:szCs w:val="18"/>
               </w:rPr>
             </w:pPr>
-            <w:r>
-              <w:rPr>
-                <w:rFonts w:ascii="Times New Roman" w:hAnsi="Times New Roman" w:cs="Times New Roman"/>
-                <w:sz w:val="18"/>
-                <w:szCs w:val="18"/>
-              </w:rPr>
-              <w:t>Գրիգոր Սահականը</w:t>
-            </w:r>
+            <w:proofErr w:type="spellStart"/>
+            <w:r>
+              <w:rPr>
+                <w:rFonts w:ascii="Times New Roman" w:hAnsi="Times New Roman" w:cs="Times New Roman"/>
+                <w:sz w:val="18"/>
+                <w:szCs w:val="18"/>
+              </w:rPr>
+              <w:t>Գրիգոր</w:t>
+            </w:r>
+            <w:proofErr w:type="spellEnd"/>
+            <w:r>
+              <w:rPr>
+                <w:rFonts w:ascii="Times New Roman" w:hAnsi="Times New Roman" w:cs="Times New Roman"/>
+                <w:sz w:val="18"/>
+                <w:szCs w:val="18"/>
+              </w:rPr>
+              <w:t xml:space="preserve"> </w:t>
+            </w:r>
+            <w:proofErr w:type="spellStart"/>
+            <w:r>
+              <w:rPr>
+                <w:rFonts w:ascii="Times New Roman" w:hAnsi="Times New Roman" w:cs="Times New Roman"/>
+                <w:sz w:val="18"/>
+                <w:szCs w:val="18"/>
+              </w:rPr>
+              <w:t>Սահականը</w:t>
+            </w:r>
+            <w:proofErr w:type="spellEnd"/>
           </w:p>
         </w:tc>
         <w:tc>
@@ -11616,14 +13172,34 @@
                 <w:szCs w:val="18"/>
               </w:rPr>
             </w:pPr>
-            <w:r>
-              <w:rPr>
-                <w:rFonts w:ascii="Times New Roman" w:hAnsi="Times New Roman" w:cs="Times New Roman"/>
-                <w:sz w:val="18"/>
-                <w:szCs w:val="18"/>
-              </w:rPr>
-              <w:t>Վարկային մասնագետ</w:t>
-            </w:r>
+            <w:proofErr w:type="spellStart"/>
+            <w:r>
+              <w:rPr>
+                <w:rFonts w:ascii="Times New Roman" w:hAnsi="Times New Roman" w:cs="Times New Roman"/>
+                <w:sz w:val="18"/>
+                <w:szCs w:val="18"/>
+              </w:rPr>
+              <w:t>Վարկային</w:t>
+            </w:r>
+            <w:proofErr w:type="spellEnd"/>
+            <w:r>
+              <w:rPr>
+                <w:rFonts w:ascii="Times New Roman" w:hAnsi="Times New Roman" w:cs="Times New Roman"/>
+                <w:sz w:val="18"/>
+                <w:szCs w:val="18"/>
+              </w:rPr>
+              <w:t xml:space="preserve"> </w:t>
+            </w:r>
+            <w:proofErr w:type="spellStart"/>
+            <w:r>
+              <w:rPr>
+                <w:rFonts w:ascii="Times New Roman" w:hAnsi="Times New Roman" w:cs="Times New Roman"/>
+                <w:sz w:val="18"/>
+                <w:szCs w:val="18"/>
+              </w:rPr>
+              <w:t>մասնագետ</w:t>
+            </w:r>
+            <w:proofErr w:type="spellEnd"/>
           </w:p>
         </w:tc>
         <w:tc>
@@ -11694,6 +13270,7 @@
                 <w:szCs w:val="18"/>
               </w:rPr>
             </w:pPr>
+            <w:proofErr w:type="spellStart"/>
             <w:r>
               <w:rPr>
                 <w:rFonts w:ascii="Times New Roman" w:hAnsi="Times New Roman" w:cs="Times New Roman"/>
@@ -11702,6 +13279,7 @@
               </w:rPr>
               <w:t>Ոսկերիչ-մասնագետ</w:t>
             </w:r>
+            <w:proofErr w:type="spellEnd"/>
           </w:p>
         </w:tc>
         <w:tc>
@@ -11794,6 +13372,7 @@
                 <w:szCs w:val="18"/>
               </w:rPr>
             </w:pPr>
+            <w:proofErr w:type="spellStart"/>
             <w:r>
               <w:rPr>
                 <w:rFonts w:ascii="Times New Roman" w:hAnsi="Times New Roman" w:cs="Times New Roman"/>
@@ -11802,6 +13381,7 @@
               </w:rPr>
               <w:t>Գրավատու</w:t>
             </w:r>
+            <w:proofErr w:type="spellEnd"/>
           </w:p>
         </w:tc>
         <w:tc>
@@ -11910,7 +13490,7 @@
               </wp:anchor>
             </w:drawing>
           </mc:Choice>
-          <mc:Fallback xmlns:w16du="http://schemas.microsoft.com/office/word/2023/wordml/word16du" xmlns:w16sdtfl="http://schemas.microsoft.com/office/word/2024/wordml/sdtformatlock">
+          <mc:Fallback xmlns:w16sdtfl="http://schemas.microsoft.com/office/word/2024/wordml/sdtformatlock" xmlns:w16du="http://schemas.microsoft.com/office/word/2023/wordml/word16du" xmlns="">
             <w:pict>
               <v:line w14:anchorId="58052DD5" id="Straight Connector 2" o:spid="_x0000_s1026" style="position:absolute;z-index:251661312;visibility:visible;mso-wrap-style:square;mso-wrap-distance-left:9pt;mso-wrap-distance-top:0;mso-wrap-distance-right:9pt;mso-wrap-distance-bottom:0;mso-position-horizontal:absolute;mso-position-horizontal-relative:text;mso-position-vertical:absolute;mso-position-vertical-relative:text" from="0,13.4pt" to="491.7pt,13.4pt" o:gfxdata="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" strokecolor="black [3213]" strokeweight="1.25pt">
                 <v:stroke linestyle="thinThick" joinstyle="miter"/>
@@ -11935,6 +13515,7 @@
           <w:lang w:val="en-GB"/>
         </w:rPr>
       </w:pPr>
+      <w:proofErr w:type="spellStart"/>
       <w:r>
         <w:rPr>
           <w:rFonts w:ascii="Times New Roman" w:hAnsi="Times New Roman" w:cs="Times New Roman"/>
@@ -11946,8 +13527,37 @@
           <w:szCs w:val="18"/>
           <w:lang w:val="en-GB"/>
         </w:rPr>
-        <w:t>Վերադարձման ակտ</w:t>
-      </w:r>
+        <w:t>Վերադարձման</w:t>
+      </w:r>
+      <w:proofErr w:type="spellEnd"/>
+      <w:r>
+        <w:rPr>
+          <w:rFonts w:ascii="Times New Roman" w:hAnsi="Times New Roman" w:cs="Times New Roman"/>
+          <w:b/>
+          <w:bCs/>
+          <w:i/>
+          <w:iCs/>
+          <w:sz w:val="18"/>
+          <w:szCs w:val="18"/>
+          <w:lang w:val="en-GB"/>
+        </w:rPr>
+        <w:t xml:space="preserve"> </w:t>
+      </w:r>
+      <w:proofErr w:type="spellStart"/>
+      <w:r>
+        <w:rPr>
+          <w:rFonts w:ascii="Times New Roman" w:hAnsi="Times New Roman" w:cs="Times New Roman"/>
+          <w:b/>
+          <w:bCs/>
+          <w:i/>
+          <w:iCs/>
+          <w:sz w:val="18"/>
+          <w:szCs w:val="18"/>
+          <w:lang w:val="en-GB"/>
+        </w:rPr>
+        <w:t>ակտ</w:t>
+      </w:r>
+      <w:proofErr w:type="spellEnd"/>
     </w:p>
     <w:p>
       <w:pPr>
@@ -11972,19 +13582,188 @@
           <w:szCs w:val="22"/>
         </w:rPr>
       </w:pPr>
+      <w:proofErr w:type="spellStart"/>
       <w:r>
         <w:rPr>
           <w:sz w:val="18"/>
           <w:szCs w:val="22"/>
         </w:rPr>
-        <w:t>Գրավի ստուգման և Ընդունման-Հանձնման ակտ</w:t>
-      </w:r>
+        <w:t>Գրավի</w:t>
+      </w:r>
+      <w:proofErr w:type="spellEnd"/>
       <w:r>
         <w:rPr>
           <w:sz w:val="18"/>
           <w:szCs w:val="22"/>
         </w:rPr>
-        <w:t xml:space="preserve">ում նշված Ոսկյա իրերը Գրավառուն ամբողջությամբ, անվնաս հանձնեց Գրավատուին։ </w:t>
+        <w:t xml:space="preserve"> </w:t>
+      </w:r>
+      <w:proofErr w:type="spellStart"/>
+      <w:r>
+        <w:rPr>
+          <w:sz w:val="18"/>
+          <w:szCs w:val="22"/>
+        </w:rPr>
+        <w:t>ստուգման</w:t>
+      </w:r>
+      <w:proofErr w:type="spellEnd"/>
+      <w:r>
+        <w:rPr>
+          <w:sz w:val="18"/>
+          <w:szCs w:val="22"/>
+        </w:rPr>
+        <w:t xml:space="preserve"> և </w:t>
+      </w:r>
+      <w:proofErr w:type="spellStart"/>
+      <w:r>
+        <w:rPr>
+          <w:sz w:val="18"/>
+          <w:szCs w:val="22"/>
+        </w:rPr>
+        <w:t>Ընդունման-Հանձնման</w:t>
+      </w:r>
+      <w:proofErr w:type="spellEnd"/>
+      <w:r>
+        <w:rPr>
+          <w:sz w:val="18"/>
+          <w:szCs w:val="22"/>
+        </w:rPr>
+        <w:t xml:space="preserve"> </w:t>
+      </w:r>
+      <w:proofErr w:type="spellStart"/>
+      <w:r>
+        <w:rPr>
+          <w:sz w:val="18"/>
+          <w:szCs w:val="22"/>
+        </w:rPr>
+        <w:t>ակտ</w:t>
+      </w:r>
+      <w:r>
+        <w:rPr>
+          <w:sz w:val="18"/>
+          <w:szCs w:val="22"/>
+        </w:rPr>
+        <w:t>ում</w:t>
+      </w:r>
+      <w:proofErr w:type="spellEnd"/>
+      <w:r>
+        <w:rPr>
+          <w:sz w:val="18"/>
+          <w:szCs w:val="22"/>
+        </w:rPr>
+        <w:t xml:space="preserve"> </w:t>
+      </w:r>
+      <w:proofErr w:type="spellStart"/>
+      <w:r>
+        <w:rPr>
+          <w:sz w:val="18"/>
+          <w:szCs w:val="22"/>
+        </w:rPr>
+        <w:t>նշված</w:t>
+      </w:r>
+      <w:proofErr w:type="spellEnd"/>
+      <w:r>
+        <w:rPr>
+          <w:sz w:val="18"/>
+          <w:szCs w:val="22"/>
+        </w:rPr>
+        <w:t xml:space="preserve"> </w:t>
+      </w:r>
+      <w:proofErr w:type="spellStart"/>
+      <w:r>
+        <w:rPr>
+          <w:sz w:val="18"/>
+          <w:szCs w:val="22"/>
+        </w:rPr>
+        <w:t>Ոսկյա</w:t>
+      </w:r>
+      <w:proofErr w:type="spellEnd"/>
+      <w:r>
+        <w:rPr>
+          <w:sz w:val="18"/>
+          <w:szCs w:val="22"/>
+        </w:rPr>
+        <w:t xml:space="preserve"> </w:t>
+      </w:r>
+      <w:proofErr w:type="spellStart"/>
+      <w:r>
+        <w:rPr>
+          <w:sz w:val="18"/>
+          <w:szCs w:val="22"/>
+        </w:rPr>
+        <w:t>իրերը</w:t>
+      </w:r>
+      <w:proofErr w:type="spellEnd"/>
+      <w:r>
+        <w:rPr>
+          <w:sz w:val="18"/>
+          <w:szCs w:val="22"/>
+        </w:rPr>
+        <w:t xml:space="preserve"> </w:t>
+      </w:r>
+      <w:proofErr w:type="spellStart"/>
+      <w:r>
+        <w:rPr>
+          <w:sz w:val="18"/>
+          <w:szCs w:val="22"/>
+        </w:rPr>
+        <w:t>Գրավառուն</w:t>
+      </w:r>
+      <w:proofErr w:type="spellEnd"/>
+      <w:r>
+        <w:rPr>
+          <w:sz w:val="18"/>
+          <w:szCs w:val="22"/>
+        </w:rPr>
+        <w:t xml:space="preserve"> ամբողջությամբ, </w:t>
+      </w:r>
+      <w:proofErr w:type="spellStart"/>
+      <w:r>
+        <w:rPr>
+          <w:sz w:val="18"/>
+          <w:szCs w:val="22"/>
+        </w:rPr>
+        <w:t>անվնաս</w:t>
+      </w:r>
+      <w:proofErr w:type="spellEnd"/>
+      <w:r>
+        <w:rPr>
+          <w:sz w:val="18"/>
+          <w:szCs w:val="22"/>
+        </w:rPr>
+        <w:t xml:space="preserve"> </w:t>
+      </w:r>
+      <w:proofErr w:type="spellStart"/>
+      <w:r>
+        <w:rPr>
+          <w:sz w:val="18"/>
+          <w:szCs w:val="22"/>
+        </w:rPr>
+        <w:t>հանձնեց</w:t>
+      </w:r>
+      <w:proofErr w:type="spellEnd"/>
+      <w:r>
+        <w:rPr>
+          <w:sz w:val="18"/>
+          <w:szCs w:val="22"/>
+        </w:rPr>
+        <w:t xml:space="preserve"> </w:t>
+      </w:r>
+      <w:proofErr w:type="spellStart"/>
+      <w:r>
+        <w:rPr>
+          <w:sz w:val="18"/>
+          <w:szCs w:val="22"/>
+        </w:rPr>
+        <w:t>Գրավատուին</w:t>
+      </w:r>
+      <w:proofErr w:type="spellEnd"/>
+      <w:r>
+        <w:rPr>
+          <w:sz w:val="18"/>
+          <w:szCs w:val="22"/>
+        </w:rPr>
+        <w:t xml:space="preserve">։ </w:t>
       </w:r>
     </w:p>
     <w:p>
@@ -12000,12 +13779,85 @@
           <w:szCs w:val="22"/>
         </w:rPr>
       </w:pPr>
+      <w:proofErr w:type="spellStart"/>
       <w:r>
         <w:rPr>
           <w:sz w:val="18"/>
           <w:szCs w:val="22"/>
         </w:rPr>
-        <w:t xml:space="preserve">Գրավատուն հավաստիացնում է, որ չունի որևէ պահանջ։ </w:t>
+        <w:t>Գրավատուն</w:t>
+      </w:r>
+      <w:proofErr w:type="spellEnd"/>
+      <w:r>
+        <w:rPr>
+          <w:sz w:val="18"/>
+          <w:szCs w:val="22"/>
+        </w:rPr>
+        <w:t xml:space="preserve"> </w:t>
+      </w:r>
+      <w:proofErr w:type="spellStart"/>
+      <w:r>
+        <w:rPr>
+          <w:sz w:val="18"/>
+          <w:szCs w:val="22"/>
+        </w:rPr>
+        <w:t>հավաստիացնում</w:t>
+      </w:r>
+      <w:proofErr w:type="spellEnd"/>
+      <w:r>
+        <w:rPr>
+          <w:sz w:val="18"/>
+          <w:szCs w:val="22"/>
+        </w:rPr>
+        <w:t xml:space="preserve"> է, </w:t>
+      </w:r>
+      <w:proofErr w:type="spellStart"/>
+      <w:r>
+        <w:rPr>
+          <w:sz w:val="18"/>
+          <w:szCs w:val="22"/>
+        </w:rPr>
+        <w:t>որ</w:t>
+      </w:r>
+      <w:proofErr w:type="spellEnd"/>
+      <w:r>
+        <w:rPr>
+          <w:sz w:val="18"/>
+          <w:szCs w:val="22"/>
+        </w:rPr>
+        <w:t xml:space="preserve"> </w:t>
+      </w:r>
+      <w:proofErr w:type="spellStart"/>
+      <w:r>
+        <w:rPr>
+          <w:sz w:val="18"/>
+          <w:szCs w:val="22"/>
+        </w:rPr>
+        <w:t>չունի</w:t>
+      </w:r>
+      <w:proofErr w:type="spellEnd"/>
+      <w:r>
+        <w:rPr>
+          <w:sz w:val="18"/>
+          <w:szCs w:val="22"/>
+        </w:rPr>
+        <w:t xml:space="preserve"> որևէ </w:t>
+      </w:r>
+      <w:proofErr w:type="spellStart"/>
+      <w:r>
+        <w:rPr>
+          <w:sz w:val="18"/>
+          <w:szCs w:val="22"/>
+        </w:rPr>
+        <w:t>պահանջ</w:t>
+      </w:r>
+      <w:proofErr w:type="spellEnd"/>
+      <w:r>
+        <w:rPr>
+          <w:sz w:val="18"/>
+          <w:szCs w:val="22"/>
+        </w:rPr>
+        <w:t xml:space="preserve">։ </w:t>
       </w:r>
     </w:p>
     <w:p>
@@ -12047,13 +13899,23 @@
                 <w:szCs w:val="18"/>
               </w:rPr>
             </w:pPr>
-            <w:r>
-              <w:rPr>
-                <w:rFonts w:ascii="Times New Roman" w:hAnsi="Times New Roman" w:cs="Times New Roman"/>
-                <w:sz w:val="18"/>
-                <w:szCs w:val="18"/>
-              </w:rPr>
-              <w:t>Հանձնեց՝</w:t>
+            <w:proofErr w:type="spellStart"/>
+            <w:r>
+              <w:rPr>
+                <w:rFonts w:ascii="Times New Roman" w:hAnsi="Times New Roman" w:cs="Times New Roman"/>
+                <w:sz w:val="18"/>
+                <w:szCs w:val="18"/>
+              </w:rPr>
+              <w:t>Հանձնեց</w:t>
+            </w:r>
+            <w:proofErr w:type="spellEnd"/>
+            <w:r>
+              <w:rPr>
+                <w:rFonts w:ascii="Times New Roman" w:hAnsi="Times New Roman" w:cs="Times New Roman"/>
+                <w:sz w:val="18"/>
+                <w:szCs w:val="18"/>
+              </w:rPr>
+              <w:t>՝</w:t>
             </w:r>
           </w:p>
         </w:tc>
@@ -12072,6 +13934,7 @@
                 <w:szCs w:val="18"/>
               </w:rPr>
             </w:pPr>
+            <w:proofErr w:type="spellStart"/>
             <w:r>
               <w:rPr>
                 <w:rFonts w:ascii="Times New Roman" w:hAnsi="Times New Roman" w:cs="Times New Roman"/>
@@ -12080,6 +13943,7 @@
               </w:rPr>
               <w:t>Ոսկերիչ-մասնագետ</w:t>
             </w:r>
+            <w:proofErr w:type="spellEnd"/>
           </w:p>
         </w:tc>
         <w:tc>
@@ -12135,6 +13999,7 @@
           <w:lang w:val="en-GB"/>
         </w:rPr>
       </w:pPr>
+      <w:proofErr w:type="spellStart"/>
       <w:r>
         <w:rPr>
           <w:rFonts w:ascii="Times New Roman" w:hAnsi="Times New Roman" w:cs="Times New Roman"/>
@@ -12143,6 +14008,7 @@
         </w:rPr>
         <w:t>Ես</w:t>
       </w:r>
+      <w:proofErr w:type="spellEnd"/>
       <w:r>
         <w:rPr>
           <w:rFonts w:ascii="Times New Roman" w:hAnsi="Times New Roman" w:cs="Times New Roman"/>
@@ -12158,7 +14024,327 @@
           <w:szCs w:val="18"/>
           <w:lang w:val="en-GB"/>
         </w:rPr>
-        <w:t xml:space="preserve">_____________________________________________________, ստացա Գրավի առարկան ամբողջությամբ, այն վիճակում, ինչպես հանձնել եմ Գրավի ստուգման և Ընդունման-Հանձնման ակտով, որի համար ստորագրում եմ։ </w:t>
+        <w:t xml:space="preserve">_____________________________________________________, </w:t>
+      </w:r>
+      <w:proofErr w:type="spellStart"/>
+      <w:r>
+        <w:rPr>
+          <w:rFonts w:ascii="Times New Roman" w:hAnsi="Times New Roman" w:cs="Times New Roman"/>
+          <w:sz w:val="18"/>
+          <w:szCs w:val="18"/>
+          <w:lang w:val="en-GB"/>
+        </w:rPr>
+        <w:t>ստացա</w:t>
+      </w:r>
+      <w:proofErr w:type="spellEnd"/>
+      <w:r>
+        <w:rPr>
+          <w:rFonts w:ascii="Times New Roman" w:hAnsi="Times New Roman" w:cs="Times New Roman"/>
+          <w:sz w:val="18"/>
+          <w:szCs w:val="18"/>
+          <w:lang w:val="en-GB"/>
+        </w:rPr>
+        <w:t xml:space="preserve"> </w:t>
+      </w:r>
+      <w:proofErr w:type="spellStart"/>
+      <w:r>
+        <w:rPr>
+          <w:rFonts w:ascii="Times New Roman" w:hAnsi="Times New Roman" w:cs="Times New Roman"/>
+          <w:sz w:val="18"/>
+          <w:szCs w:val="18"/>
+          <w:lang w:val="en-GB"/>
+        </w:rPr>
+        <w:t>Գրավի</w:t>
+      </w:r>
+      <w:proofErr w:type="spellEnd"/>
+      <w:r>
+        <w:rPr>
+          <w:rFonts w:ascii="Times New Roman" w:hAnsi="Times New Roman" w:cs="Times New Roman"/>
+          <w:sz w:val="18"/>
+          <w:szCs w:val="18"/>
+          <w:lang w:val="en-GB"/>
+        </w:rPr>
+        <w:t xml:space="preserve"> </w:t>
+      </w:r>
+      <w:proofErr w:type="spellStart"/>
+      <w:r>
+        <w:rPr>
+          <w:rFonts w:ascii="Times New Roman" w:hAnsi="Times New Roman" w:cs="Times New Roman"/>
+          <w:sz w:val="18"/>
+          <w:szCs w:val="18"/>
+          <w:lang w:val="en-GB"/>
+        </w:rPr>
+        <w:t>առարկան</w:t>
+      </w:r>
+      <w:proofErr w:type="spellEnd"/>
+      <w:r>
+        <w:rPr>
+          <w:rFonts w:ascii="Times New Roman" w:hAnsi="Times New Roman" w:cs="Times New Roman"/>
+          <w:sz w:val="18"/>
+          <w:szCs w:val="18"/>
+          <w:lang w:val="en-GB"/>
+        </w:rPr>
+        <w:t xml:space="preserve"> ամբողջությամբ, </w:t>
+      </w:r>
+      <w:proofErr w:type="spellStart"/>
+      <w:r>
+        <w:rPr>
+          <w:rFonts w:ascii="Times New Roman" w:hAnsi="Times New Roman" w:cs="Times New Roman"/>
+          <w:sz w:val="18"/>
+          <w:szCs w:val="18"/>
+          <w:lang w:val="en-GB"/>
+        </w:rPr>
+        <w:t>այն</w:t>
+      </w:r>
+      <w:proofErr w:type="spellEnd"/>
+      <w:r>
+        <w:rPr>
+          <w:rFonts w:ascii="Times New Roman" w:hAnsi="Times New Roman" w:cs="Times New Roman"/>
+          <w:sz w:val="18"/>
+          <w:szCs w:val="18"/>
+          <w:lang w:val="en-GB"/>
+        </w:rPr>
+        <w:t xml:space="preserve"> </w:t>
+      </w:r>
+      <w:proofErr w:type="spellStart"/>
+      <w:r>
+        <w:rPr>
+          <w:rFonts w:ascii="Times New Roman" w:hAnsi="Times New Roman" w:cs="Times New Roman"/>
+          <w:sz w:val="18"/>
+          <w:szCs w:val="18"/>
+          <w:lang w:val="en-GB"/>
+        </w:rPr>
+        <w:t>վիճակում</w:t>
+      </w:r>
+      <w:proofErr w:type="spellEnd"/>
+      <w:r>
+        <w:rPr>
+          <w:rFonts w:ascii="Times New Roman" w:hAnsi="Times New Roman" w:cs="Times New Roman"/>
+          <w:sz w:val="18"/>
+          <w:szCs w:val="18"/>
+          <w:lang w:val="en-GB"/>
+        </w:rPr>
+        <w:t xml:space="preserve">, </w:t>
+      </w:r>
+      <w:proofErr w:type="spellStart"/>
+      <w:r>
+        <w:rPr>
+          <w:rFonts w:ascii="Times New Roman" w:hAnsi="Times New Roman" w:cs="Times New Roman"/>
+          <w:sz w:val="18"/>
+          <w:szCs w:val="18"/>
+          <w:lang w:val="en-GB"/>
+        </w:rPr>
+        <w:t>ինչպես</w:t>
+      </w:r>
+      <w:proofErr w:type="spellEnd"/>
+      <w:r>
+        <w:rPr>
+          <w:rFonts w:ascii="Times New Roman" w:hAnsi="Times New Roman" w:cs="Times New Roman"/>
+          <w:sz w:val="18"/>
+          <w:szCs w:val="18"/>
+          <w:lang w:val="en-GB"/>
+        </w:rPr>
+        <w:t xml:space="preserve"> </w:t>
+      </w:r>
+      <w:proofErr w:type="spellStart"/>
+      <w:r>
+        <w:rPr>
+          <w:rFonts w:ascii="Times New Roman" w:hAnsi="Times New Roman" w:cs="Times New Roman"/>
+          <w:sz w:val="18"/>
+          <w:szCs w:val="18"/>
+          <w:lang w:val="en-GB"/>
+        </w:rPr>
+        <w:t>հանձնել</w:t>
+      </w:r>
+      <w:proofErr w:type="spellEnd"/>
+      <w:r>
+        <w:rPr>
+          <w:rFonts w:ascii="Times New Roman" w:hAnsi="Times New Roman" w:cs="Times New Roman"/>
+          <w:sz w:val="18"/>
+          <w:szCs w:val="18"/>
+          <w:lang w:val="en-GB"/>
+        </w:rPr>
+        <w:t xml:space="preserve"> </w:t>
+      </w:r>
+      <w:proofErr w:type="spellStart"/>
+      <w:r>
+        <w:rPr>
+          <w:rFonts w:ascii="Times New Roman" w:hAnsi="Times New Roman" w:cs="Times New Roman"/>
+          <w:sz w:val="18"/>
+          <w:szCs w:val="18"/>
+          <w:lang w:val="en-GB"/>
+        </w:rPr>
+        <w:t>եմ</w:t>
+      </w:r>
+      <w:proofErr w:type="spellEnd"/>
+      <w:r>
+        <w:rPr>
+          <w:rFonts w:ascii="Times New Roman" w:hAnsi="Times New Roman" w:cs="Times New Roman"/>
+          <w:sz w:val="18"/>
+          <w:szCs w:val="18"/>
+          <w:lang w:val="en-GB"/>
+        </w:rPr>
+        <w:t xml:space="preserve"> </w:t>
+      </w:r>
+      <w:proofErr w:type="spellStart"/>
+      <w:r>
+        <w:rPr>
+          <w:rFonts w:ascii="Times New Roman" w:hAnsi="Times New Roman" w:cs="Times New Roman"/>
+          <w:sz w:val="18"/>
+          <w:szCs w:val="18"/>
+          <w:lang w:val="en-GB"/>
+        </w:rPr>
+        <w:t>Գրավի</w:t>
+      </w:r>
+      <w:proofErr w:type="spellEnd"/>
+      <w:r>
+        <w:rPr>
+          <w:rFonts w:ascii="Times New Roman" w:hAnsi="Times New Roman" w:cs="Times New Roman"/>
+          <w:sz w:val="18"/>
+          <w:szCs w:val="18"/>
+          <w:lang w:val="en-GB"/>
+        </w:rPr>
+        <w:t xml:space="preserve"> </w:t>
+      </w:r>
+      <w:proofErr w:type="spellStart"/>
+      <w:r>
+        <w:rPr>
+          <w:rFonts w:ascii="Times New Roman" w:hAnsi="Times New Roman" w:cs="Times New Roman"/>
+          <w:sz w:val="18"/>
+          <w:szCs w:val="18"/>
+          <w:lang w:val="en-GB"/>
+        </w:rPr>
+        <w:t>ստուգման</w:t>
+      </w:r>
+      <w:proofErr w:type="spellEnd"/>
+      <w:r>
+        <w:rPr>
+          <w:rFonts w:ascii="Times New Roman" w:hAnsi="Times New Roman" w:cs="Times New Roman"/>
+          <w:sz w:val="18"/>
+          <w:szCs w:val="18"/>
+          <w:lang w:val="en-GB"/>
+        </w:rPr>
+        <w:t xml:space="preserve"> և </w:t>
+      </w:r>
+      <w:proofErr w:type="spellStart"/>
+      <w:r>
+        <w:rPr>
+          <w:rFonts w:ascii="Times New Roman" w:hAnsi="Times New Roman" w:cs="Times New Roman"/>
+          <w:sz w:val="18"/>
+          <w:szCs w:val="18"/>
+          <w:lang w:val="en-GB"/>
+        </w:rPr>
+        <w:t>Ընդունման-Հանձնման</w:t>
+      </w:r>
+      <w:proofErr w:type="spellEnd"/>
+      <w:r>
+        <w:rPr>
+          <w:rFonts w:ascii="Times New Roman" w:hAnsi="Times New Roman" w:cs="Times New Roman"/>
+          <w:sz w:val="18"/>
+          <w:szCs w:val="18"/>
+          <w:lang w:val="en-GB"/>
+        </w:rPr>
+        <w:t xml:space="preserve"> </w:t>
+      </w:r>
+      <w:proofErr w:type="spellStart"/>
+      <w:r>
+        <w:rPr>
+          <w:rFonts w:ascii="Times New Roman" w:hAnsi="Times New Roman" w:cs="Times New Roman"/>
+          <w:sz w:val="18"/>
+          <w:szCs w:val="18"/>
+          <w:lang w:val="en-GB"/>
+        </w:rPr>
+        <w:t>ակտով</w:t>
+      </w:r>
+      <w:proofErr w:type="spellEnd"/>
+      <w:r>
+        <w:rPr>
+          <w:rFonts w:ascii="Times New Roman" w:hAnsi="Times New Roman" w:cs="Times New Roman"/>
+          <w:sz w:val="18"/>
+          <w:szCs w:val="18"/>
+          <w:lang w:val="en-GB"/>
+        </w:rPr>
+        <w:t xml:space="preserve">, </w:t>
+      </w:r>
+      <w:proofErr w:type="spellStart"/>
+      <w:r>
+        <w:rPr>
+          <w:rFonts w:ascii="Times New Roman" w:hAnsi="Times New Roman" w:cs="Times New Roman"/>
+          <w:sz w:val="18"/>
+          <w:szCs w:val="18"/>
+          <w:lang w:val="en-GB"/>
+        </w:rPr>
+        <w:t>որի</w:t>
+      </w:r>
+      <w:proofErr w:type="spellEnd"/>
+      <w:r>
+        <w:rPr>
+          <w:rFonts w:ascii="Times New Roman" w:hAnsi="Times New Roman" w:cs="Times New Roman"/>
+          <w:sz w:val="18"/>
+          <w:szCs w:val="18"/>
+          <w:lang w:val="en-GB"/>
+        </w:rPr>
+        <w:t xml:space="preserve"> </w:t>
+      </w:r>
+      <w:proofErr w:type="spellStart"/>
+      <w:r>
+        <w:rPr>
+          <w:rFonts w:ascii="Times New Roman" w:hAnsi="Times New Roman" w:cs="Times New Roman"/>
+          <w:sz w:val="18"/>
+          <w:szCs w:val="18"/>
+          <w:lang w:val="en-GB"/>
+        </w:rPr>
+        <w:t>համար</w:t>
+      </w:r>
+      <w:proofErr w:type="spellEnd"/>
+      <w:r>
+        <w:rPr>
+          <w:rFonts w:ascii="Times New Roman" w:hAnsi="Times New Roman" w:cs="Times New Roman"/>
+          <w:sz w:val="18"/>
+          <w:szCs w:val="18"/>
+          <w:lang w:val="en-GB"/>
+        </w:rPr>
+        <w:t xml:space="preserve"> </w:t>
+      </w:r>
+      <w:proofErr w:type="spellStart"/>
+      <w:r>
+        <w:rPr>
+          <w:rFonts w:ascii="Times New Roman" w:hAnsi="Times New Roman" w:cs="Times New Roman"/>
+          <w:sz w:val="18"/>
+          <w:szCs w:val="18"/>
+          <w:lang w:val="en-GB"/>
+        </w:rPr>
+        <w:t>ստորագրում</w:t>
+      </w:r>
+      <w:proofErr w:type="spellEnd"/>
+      <w:r>
+        <w:rPr>
+          <w:rFonts w:ascii="Times New Roman" w:hAnsi="Times New Roman" w:cs="Times New Roman"/>
+          <w:sz w:val="18"/>
+          <w:szCs w:val="18"/>
+          <w:lang w:val="en-GB"/>
+        </w:rPr>
+        <w:t xml:space="preserve"> </w:t>
+      </w:r>
+      <w:proofErr w:type="spellStart"/>
+      <w:r>
+        <w:rPr>
+          <w:rFonts w:ascii="Times New Roman" w:hAnsi="Times New Roman" w:cs="Times New Roman"/>
+          <w:sz w:val="18"/>
+          <w:szCs w:val="18"/>
+          <w:lang w:val="en-GB"/>
+        </w:rPr>
+        <w:t>եմ</w:t>
+      </w:r>
+      <w:proofErr w:type="spellEnd"/>
+      <w:r>
+        <w:rPr>
+          <w:rFonts w:ascii="Times New Roman" w:hAnsi="Times New Roman" w:cs="Times New Roman"/>
+          <w:sz w:val="18"/>
+          <w:szCs w:val="18"/>
+          <w:lang w:val="en-GB"/>
+        </w:rPr>
+        <w:t xml:space="preserve">։ </w:t>
       </w:r>
     </w:p>
     <w:tbl>
@@ -12195,13 +14381,23 @@
                 <w:szCs w:val="18"/>
               </w:rPr>
             </w:pPr>
-            <w:r>
-              <w:rPr>
-                <w:rFonts w:ascii="Times New Roman" w:hAnsi="Times New Roman" w:cs="Times New Roman"/>
-                <w:sz w:val="18"/>
-                <w:szCs w:val="18"/>
-              </w:rPr>
-              <w:t xml:space="preserve">Ընդունեց՝      </w:t>
+            <w:proofErr w:type="spellStart"/>
+            <w:r>
+              <w:rPr>
+                <w:rFonts w:ascii="Times New Roman" w:hAnsi="Times New Roman" w:cs="Times New Roman"/>
+                <w:sz w:val="18"/>
+                <w:szCs w:val="18"/>
+              </w:rPr>
+              <w:t>Ընդունեց</w:t>
+            </w:r>
+            <w:proofErr w:type="spellEnd"/>
+            <w:r>
+              <w:rPr>
+                <w:rFonts w:ascii="Times New Roman" w:hAnsi="Times New Roman" w:cs="Times New Roman"/>
+                <w:sz w:val="18"/>
+                <w:szCs w:val="18"/>
+              </w:rPr>
+              <w:t xml:space="preserve">՝      </w:t>
             </w:r>
           </w:p>
         </w:tc>
@@ -12220,6 +14416,7 @@
                 <w:szCs w:val="18"/>
               </w:rPr>
             </w:pPr>
+            <w:proofErr w:type="spellStart"/>
             <w:r>
               <w:rPr>
                 <w:rFonts w:ascii="Times New Roman" w:hAnsi="Times New Roman" w:cs="Times New Roman"/>
@@ -12228,6 +14425,7 @@
               </w:rPr>
               <w:t>Գրավատու</w:t>
             </w:r>
+            <w:proofErr w:type="spellEnd"/>
           </w:p>
         </w:tc>
         <w:tc>

</xml_diff>